<commit_message>
docs(manual-usuario): acceso con restablecimiento de contraseña (F28)
Actualiza el cap. 2 (Acceso al sistema) tras la feature de reset de clave:
- 2.1: el Importante de bloqueo ahora deriva a restablecer la contraseña
  (al fijar la nueva clave la cuenta se desbloquea).
- 2.2 nueva "Recuperar el acceso (contraseña olvidada)": flujo de autoservicio
  real (usuario → ¿Olvidaste tu contraseña? → enlace al correo registrado →
  definir nueva clave), con Nota de la vía alternativa del Administrador.
- Renumera 2.3 Pantalla principal y 2.4 Cerrar sesión.
- Nueva figura 02_acceso_reset_01.png + guía de captura.

build.js: MU_OUT permite generar a otra ruta para previsualizar sin pisar el
.docx abierto en Word (EBUSY).
</commit_message>
<xml_diff>
--- a/doc/manual_usuario/MUESTRA_Manual_Usuario.docx
+++ b/doc/manual_usuario/MUESTRA_Manual_Usuario.docx
@@ -711,12 +711,241 @@
               <w:t xml:space="preserve">bloquea</w:t>
             </w:r>
             <w:r>
-              <w:t xml:space="preserve"> el usuario por seguridad. En ese caso, contacte al Administrador para restablecer el acceso.</w:t>
+              <w:t xml:space="preserve"> el usuario por seguridad. Para volver a ingresar, restablezca su contraseña (ver 2.2): al definir la nueva clave la cuenta se desbloquea.</w:t>
             </w:r>
           </w:p>
         </w:tc>
       </w:tr>
     </w:tbl>
+    <w:p>
+      <w:pPr>
+        <w:pStyle w:val="Heading2"/>
+        <w:spacing w:after="120" w:before="200"/>
+      </w:pPr>
+      <w:r>
+        <w:rPr>
+          <w:b/>
+          <w:bCs/>
+        </w:rPr>
+        <w:t xml:space="preserve">2.2. Recuperar el acceso (contraseña olvidada)</w:t>
+      </w:r>
+    </w:p>
+    <w:p>
+      <w:pPr>
+        <w:spacing w:after="160" w:before="0" w:line="360" w:lineRule="auto"/>
+        <w:jc w:val="both"/>
+      </w:pPr>
+      <w:r>
+        <w:t xml:space="preserve">Si olvidó su contraseña o su cuenta quedó bloqueada, puede restablecerla usted mismo desde la pantalla de inicio de sesión.</w:t>
+      </w:r>
+    </w:p>
+    <w:p>
+      <w:pPr>
+        <w:pStyle w:val="ListParagraph"/>
+        <w:numPr>
+          <w:ilvl w:val="0"/>
+          <w:numId w:val="3"/>
+        </w:numPr>
+        <w:spacing w:after="60" w:line="360" w:lineRule="auto"/>
+      </w:pPr>
+      <w:r>
+        <w:t xml:space="preserve">En la pantalla de inicio de sesión, escriba su </w:t>
+      </w:r>
+      <w:r>
+        <w:rPr>
+          <w:b/>
+          <w:bCs/>
+        </w:rPr>
+        <w:t xml:space="preserve">usuario</w:t>
+      </w:r>
+      <w:r>
+        <w:t xml:space="preserve">.</w:t>
+      </w:r>
+    </w:p>
+    <w:p>
+      <w:pPr>
+        <w:pStyle w:val="ListParagraph"/>
+        <w:numPr>
+          <w:ilvl w:val="0"/>
+          <w:numId w:val="3"/>
+        </w:numPr>
+        <w:spacing w:after="60" w:line="360" w:lineRule="auto"/>
+      </w:pPr>
+      <w:r>
+        <w:t xml:space="preserve">Haga clic en el enlace </w:t>
+      </w:r>
+      <w:r>
+        <w:rPr>
+          <w:b/>
+          <w:bCs/>
+        </w:rPr>
+        <w:t xml:space="preserve">¿Olvidaste tu contraseña?</w:t>
+      </w:r>
+      <w:r>
+        <w:t xml:space="preserve">.</w:t>
+      </w:r>
+    </w:p>
+    <w:p>
+      <w:pPr>
+        <w:pStyle w:val="ListParagraph"/>
+        <w:numPr>
+          <w:ilvl w:val="0"/>
+          <w:numId w:val="3"/>
+        </w:numPr>
+        <w:spacing w:after="60" w:line="360" w:lineRule="auto"/>
+      </w:pPr>
+      <w:r>
+        <w:t xml:space="preserve">El sistema envía un enlace de restablecimiento al </w:t>
+      </w:r>
+      <w:r>
+        <w:rPr>
+          <w:b/>
+          <w:bCs/>
+        </w:rPr>
+        <w:t xml:space="preserve">correo registrado</w:t>
+      </w:r>
+      <w:r>
+        <w:t xml:space="preserve"> de su cuenta y muestra un mensaje de confirmación.</w:t>
+      </w:r>
+    </w:p>
+    <w:p>
+      <w:pPr>
+        <w:pStyle w:val="ListParagraph"/>
+        <w:numPr>
+          <w:ilvl w:val="0"/>
+          <w:numId w:val="3"/>
+        </w:numPr>
+        <w:spacing w:after="60" w:line="360" w:lineRule="auto"/>
+      </w:pPr>
+      <w:r>
+        <w:t xml:space="preserve">Abra ese correo y haga clic en el </w:t>
+      </w:r>
+      <w:r>
+        <w:rPr>
+          <w:b/>
+          <w:bCs/>
+        </w:rPr>
+        <w:t xml:space="preserve">enlace</w:t>
+      </w:r>
+      <w:r>
+        <w:t xml:space="preserve">: se abre la pantalla para definir una nueva contraseña.</w:t>
+      </w:r>
+    </w:p>
+    <w:p>
+      <w:pPr>
+        <w:pStyle w:val="ListParagraph"/>
+        <w:numPr>
+          <w:ilvl w:val="0"/>
+          <w:numId w:val="3"/>
+        </w:numPr>
+        <w:spacing w:after="60" w:line="360" w:lineRule="auto"/>
+      </w:pPr>
+      <w:r>
+        <w:t xml:space="preserve">Escriba y confirme su </w:t>
+      </w:r>
+      <w:r>
+        <w:rPr>
+          <w:b/>
+          <w:bCs/>
+        </w:rPr>
+        <w:t xml:space="preserve">nueva contraseña</w:t>
+      </w:r>
+      <w:r>
+        <w:t xml:space="preserve"> y guárdela. Con esto la cuenta queda </w:t>
+      </w:r>
+      <w:r>
+        <w:rPr>
+          <w:b/>
+          <w:bCs/>
+        </w:rPr>
+        <w:t xml:space="preserve">desbloqueada</w:t>
+      </w:r>
+      <w:r>
+        <w:t xml:space="preserve"> y ya puede iniciar sesión con la nueva clave.</w:t>
+      </w:r>
+    </w:p>
+    <w:tbl>
+      <w:tblPr>
+        <w:tblW w:type="pct" w:w="100%"/>
+        <w:tblBorders>
+          <w:top w:val="single" w:color="auto" w:sz="4"/>
+          <w:left w:val="single" w:color="auto" w:sz="4"/>
+          <w:bottom w:val="single" w:color="auto" w:sz="4"/>
+          <w:right w:val="single" w:color="auto" w:sz="4"/>
+          <w:insideH w:val="single" w:color="auto" w:sz="4"/>
+          <w:insideV w:val="single" w:color="auto" w:sz="4"/>
+        </w:tblBorders>
+      </w:tblPr>
+      <w:tblGrid>
+        <w:gridCol w:w="100"/>
+      </w:tblGrid>
+      <w:tr>
+        <w:tc>
+          <w:tcPr>
+            <w:tcBorders>
+              <w:top w:val="dashed" w:color="9AA5B1" w:sz="6"/>
+              <w:left w:val="dashed" w:color="9AA5B1" w:sz="6"/>
+              <w:bottom w:val="dashed" w:color="9AA5B1" w:sz="6"/>
+              <w:right w:val="dashed" w:color="9AA5B1" w:sz="6"/>
+            </w:tcBorders>
+            <w:shd w:fill="F5F7FA" w:val="clear"/>
+            <w:tcMar>
+              <w:top w:type="dxa" w:w="300"/>
+              <w:left w:type="dxa" w:w="160"/>
+              <w:bottom w:type="dxa" w:w="300"/>
+              <w:right w:type="dxa" w:w="160"/>
+            </w:tcMar>
+          </w:tcPr>
+          <w:p>
+            <w:pPr>
+              <w:spacing w:after="40"/>
+              <w:jc w:val="center"/>
+            </w:pPr>
+            <w:r>
+              <w:rPr>
+                <w:b/>
+                <w:bCs/>
+                <w:color w:val="6B7683"/>
+                <w:sz w:val="22"/>
+                <w:szCs w:val="22"/>
+              </w:rPr>
+              <w:t xml:space="preserve">[ FIGURA PENDIENTE DE CAPTURA ]</w:t>
+            </w:r>
+          </w:p>
+          <w:p>
+            <w:pPr>
+              <w:spacing w:after="0"/>
+              <w:jc w:val="center"/>
+            </w:pPr>
+            <w:r>
+              <w:rPr>
+                <w:i/>
+                <w:iCs/>
+                <w:color w:val="9AA5B1"/>
+                <w:sz w:val="20"/>
+                <w:szCs w:val="20"/>
+              </w:rPr>
+              <w:t xml:space="preserve">02_acceso_reset_01.png</w:t>
+            </w:r>
+          </w:p>
+        </w:tc>
+      </w:tr>
+    </w:tbl>
+    <w:p>
+      <w:pPr>
+        <w:spacing w:after="200"/>
+        <w:jc w:val="center"/>
+      </w:pPr>
+      <w:r>
+        <w:rPr>
+          <w:i/>
+          <w:iCs/>
+          <w:sz w:val="20"/>
+          <w:szCs w:val="20"/>
+        </w:rPr>
+        <w:t xml:space="preserve">Figura 2. Pantalla de restablecimiento de contraseña.</w:t>
+      </w:r>
+    </w:p>
     <w:tbl>
       <w:tblPr>
         <w:tblW w:type="pct" w:w="100%"/>
@@ -763,7 +992,17 @@
               <w:t xml:space="preserve">Nota: </w:t>
             </w:r>
             <w:r>
-              <w:t xml:space="preserve">Si olvidó su contraseña, utilice la opción de restablecimiento de contraseña o solicítelo al Administrador.</w:t>
+              <w:t xml:space="preserve">Si no recibe el correo, revise la carpeta de correo no deseado. Como alternativa, el </w:t>
+            </w:r>
+            <w:r>
+              <w:rPr>
+                <w:b/>
+                <w:bCs/>
+              </w:rPr>
+              <w:t xml:space="preserve">Administrador</w:t>
+            </w:r>
+            <w:r>
+              <w:t xml:space="preserve"> puede restablecer su contraseña desde el módulo de Empleados y entregarle el enlace directamente.</w:t>
             </w:r>
           </w:p>
         </w:tc>
@@ -779,7 +1018,7 @@
           <w:b/>
           <w:bCs/>
         </w:rPr>
-        <w:t xml:space="preserve">2.2. La pantalla principal</w:t>
+        <w:t xml:space="preserve">2.3. La pantalla principal</w:t>
       </w:r>
     </w:p>
     <w:p>
@@ -880,7 +1119,7 @@
           <w:sz w:val="20"/>
           <w:szCs w:val="20"/>
         </w:rPr>
-        <w:t xml:space="preserve">Figura 2. Pantalla principal con el menú de navegación.</w:t>
+        <w:t xml:space="preserve">Figura 3. Pantalla principal con el menú de navegación.</w:t>
       </w:r>
     </w:p>
     <w:p>
@@ -893,7 +1132,7 @@
           <w:b/>
           <w:bCs/>
         </w:rPr>
-        <w:t xml:space="preserve">2.3. Cerrar sesión</w:t>
+        <w:t xml:space="preserve">2.4. Cerrar sesión</w:t>
       </w:r>
     </w:p>
     <w:p>
@@ -1846,7 +2085,7 @@
         <w:pStyle w:val="ListParagraph"/>
         <w:numPr>
           <w:ilvl w:val="0"/>
-          <w:numId w:val="3"/>
+          <w:numId w:val="4"/>
         </w:numPr>
         <w:spacing w:after="60" w:line="360" w:lineRule="auto"/>
       </w:pPr>
@@ -1869,7 +2108,7 @@
         <w:pStyle w:val="ListParagraph"/>
         <w:numPr>
           <w:ilvl w:val="0"/>
-          <w:numId w:val="3"/>
+          <w:numId w:val="4"/>
         </w:numPr>
         <w:spacing w:after="60" w:line="360" w:lineRule="auto"/>
       </w:pPr>
@@ -1882,7 +2121,7 @@
         <w:pStyle w:val="ListParagraph"/>
         <w:numPr>
           <w:ilvl w:val="0"/>
-          <w:numId w:val="3"/>
+          <w:numId w:val="4"/>
         </w:numPr>
         <w:spacing w:after="60" w:line="360" w:lineRule="auto"/>
       </w:pPr>
@@ -1905,7 +2144,7 @@
         <w:pStyle w:val="ListParagraph"/>
         <w:numPr>
           <w:ilvl w:val="0"/>
-          <w:numId w:val="3"/>
+          <w:numId w:val="4"/>
         </w:numPr>
         <w:spacing w:after="60" w:line="360" w:lineRule="auto"/>
       </w:pPr>
@@ -2022,7 +2261,7 @@
           <w:sz w:val="20"/>
           <w:szCs w:val="20"/>
         </w:rPr>
-        <w:t xml:space="preserve">Figura 3. Apertura de caja: montos de apertura.</w:t>
+        <w:t xml:space="preserve">Figura 4. Apertura de caja: montos de apertura.</w:t>
       </w:r>
     </w:p>
     <w:tbl>
@@ -2282,7 +2521,7 @@
         <w:pStyle w:val="ListParagraph"/>
         <w:numPr>
           <w:ilvl w:val="0"/>
-          <w:numId w:val="4"/>
+          <w:numId w:val="5"/>
         </w:numPr>
         <w:spacing w:after="60" w:line="360" w:lineRule="auto"/>
       </w:pPr>
@@ -2305,7 +2544,7 @@
         <w:pStyle w:val="ListParagraph"/>
         <w:numPr>
           <w:ilvl w:val="0"/>
-          <w:numId w:val="4"/>
+          <w:numId w:val="5"/>
         </w:numPr>
         <w:spacing w:after="60" w:line="360" w:lineRule="auto"/>
       </w:pPr>
@@ -2402,7 +2641,7 @@
           <w:sz w:val="20"/>
           <w:szCs w:val="20"/>
         </w:rPr>
-        <w:t xml:space="preserve">Figura 4. Proceso Ventas: lista de comprobantes y botón Crear.</w:t>
+        <w:t xml:space="preserve">Figura 5. Proceso Ventas: lista de comprobantes y botón Crear.</w:t>
       </w:r>
     </w:p>
     <w:p>
@@ -2410,7 +2649,7 @@
         <w:pStyle w:val="ListParagraph"/>
         <w:numPr>
           <w:ilvl w:val="0"/>
-          <w:numId w:val="4"/>
+          <w:numId w:val="5"/>
         </w:numPr>
         <w:spacing w:after="60" w:line="360" w:lineRule="auto"/>
       </w:pPr>
@@ -2517,7 +2756,7 @@
           <w:sz w:val="20"/>
           <w:szCs w:val="20"/>
         </w:rPr>
-        <w:t xml:space="preserve">Figura 5. Factura con el cliente y el detalle cargados.</w:t>
+        <w:t xml:space="preserve">Figura 6. Factura con el cliente y el detalle cargados.</w:t>
       </w:r>
     </w:p>
     <w:p>
@@ -2525,7 +2764,7 @@
         <w:pStyle w:val="ListParagraph"/>
         <w:numPr>
           <w:ilvl w:val="0"/>
-          <w:numId w:val="4"/>
+          <w:numId w:val="5"/>
         </w:numPr>
         <w:spacing w:after="60" w:line="360" w:lineRule="auto"/>
       </w:pPr>
@@ -2558,7 +2797,7 @@
         <w:pStyle w:val="ListParagraph"/>
         <w:numPr>
           <w:ilvl w:val="0"/>
-          <w:numId w:val="4"/>
+          <w:numId w:val="5"/>
         </w:numPr>
         <w:spacing w:after="60" w:line="360" w:lineRule="auto"/>
       </w:pPr>
@@ -2665,7 +2904,7 @@
           <w:sz w:val="20"/>
           <w:szCs w:val="20"/>
         </w:rPr>
-        <w:t xml:space="preserve">Figura 6. Forma de pago Contado: monto y vuelto.</w:t>
+        <w:t xml:space="preserve">Figura 7. Forma de pago Contado: monto y vuelto.</w:t>
       </w:r>
     </w:p>
     <w:p>
@@ -2673,7 +2912,7 @@
         <w:pStyle w:val="ListParagraph"/>
         <w:numPr>
           <w:ilvl w:val="0"/>
-          <w:numId w:val="4"/>
+          <w:numId w:val="5"/>
         </w:numPr>
         <w:spacing w:after="60" w:line="360" w:lineRule="auto"/>
       </w:pPr>
@@ -2696,7 +2935,7 @@
         <w:pStyle w:val="ListParagraph"/>
         <w:numPr>
           <w:ilvl w:val="0"/>
-          <w:numId w:val="4"/>
+          <w:numId w:val="5"/>
         </w:numPr>
         <w:spacing w:after="60" w:line="360" w:lineRule="auto"/>
       </w:pPr>
@@ -2793,7 +3032,7 @@
           <w:sz w:val="20"/>
           <w:szCs w:val="20"/>
         </w:rPr>
-        <w:t xml:space="preserve">Figura 7. Documento de la factura (KuDE).</w:t>
+        <w:t xml:space="preserve">Figura 8. Documento de la factura (KuDE).</w:t>
       </w:r>
     </w:p>
     <w:tbl>
@@ -2938,7 +3177,7 @@
         <w:pStyle w:val="ListParagraph"/>
         <w:numPr>
           <w:ilvl w:val="0"/>
-          <w:numId w:val="5"/>
+          <w:numId w:val="6"/>
         </w:numPr>
         <w:spacing w:after="60" w:line="360" w:lineRule="auto"/>
       </w:pPr>
@@ -2981,7 +3220,7 @@
         <w:pStyle w:val="ListParagraph"/>
         <w:numPr>
           <w:ilvl w:val="0"/>
-          <w:numId w:val="5"/>
+          <w:numId w:val="6"/>
         </w:numPr>
         <w:spacing w:after="60" w:line="360" w:lineRule="auto"/>
       </w:pPr>
@@ -3014,7 +3253,7 @@
         <w:pStyle w:val="ListParagraph"/>
         <w:numPr>
           <w:ilvl w:val="0"/>
-          <w:numId w:val="5"/>
+          <w:numId w:val="6"/>
         </w:numPr>
         <w:spacing w:after="60" w:line="360" w:lineRule="auto"/>
       </w:pPr>
@@ -3111,7 +3350,7 @@
           <w:sz w:val="20"/>
           <w:szCs w:val="20"/>
         </w:rPr>
-        <w:t xml:space="preserve">Figura 8. Forma de pago Crédito con plan de cuotas.</w:t>
+        <w:t xml:space="preserve">Figura 9. Forma de pago Crédito con plan de cuotas.</w:t>
       </w:r>
     </w:p>
     <w:p>
@@ -3119,7 +3358,7 @@
         <w:pStyle w:val="ListParagraph"/>
         <w:numPr>
           <w:ilvl w:val="0"/>
-          <w:numId w:val="5"/>
+          <w:numId w:val="6"/>
         </w:numPr>
         <w:spacing w:after="60" w:line="360" w:lineRule="auto"/>
       </w:pPr>
@@ -3372,7 +3611,7 @@
         <w:pStyle w:val="ListParagraph"/>
         <w:numPr>
           <w:ilvl w:val="0"/>
-          <w:numId w:val="6"/>
+          <w:numId w:val="7"/>
         </w:numPr>
         <w:spacing w:after="60" w:line="360" w:lineRule="auto"/>
       </w:pPr>
@@ -3395,7 +3634,7 @@
         <w:pStyle w:val="ListParagraph"/>
         <w:numPr>
           <w:ilvl w:val="0"/>
-          <w:numId w:val="6"/>
+          <w:numId w:val="7"/>
         </w:numPr>
         <w:spacing w:after="60" w:line="360" w:lineRule="auto"/>
       </w:pPr>
@@ -3408,7 +3647,7 @@
         <w:pStyle w:val="ListParagraph"/>
         <w:numPr>
           <w:ilvl w:val="0"/>
-          <w:numId w:val="6"/>
+          <w:numId w:val="7"/>
         </w:numPr>
         <w:spacing w:after="60" w:line="360" w:lineRule="auto"/>
       </w:pPr>
@@ -3515,7 +3754,7 @@
           <w:sz w:val="20"/>
           <w:szCs w:val="20"/>
         </w:rPr>
-        <w:t xml:space="preserve">Figura 9. Solicitud de anulación con el motivo.</w:t>
+        <w:t xml:space="preserve">Figura 10. Solicitud de anulación con el motivo.</w:t>
       </w:r>
     </w:p>
     <w:p>
@@ -3536,7 +3775,7 @@
         <w:pStyle w:val="ListParagraph"/>
         <w:numPr>
           <w:ilvl w:val="0"/>
-          <w:numId w:val="7"/>
+          <w:numId w:val="8"/>
         </w:numPr>
         <w:spacing w:after="60" w:line="360" w:lineRule="auto"/>
       </w:pPr>
@@ -3559,7 +3798,7 @@
         <w:pStyle w:val="ListParagraph"/>
         <w:numPr>
           <w:ilvl w:val="0"/>
-          <w:numId w:val="7"/>
+          <w:numId w:val="8"/>
         </w:numPr>
         <w:spacing w:after="60" w:line="360" w:lineRule="auto"/>
       </w:pPr>
@@ -3592,7 +3831,7 @@
         <w:pStyle w:val="ListParagraph"/>
         <w:numPr>
           <w:ilvl w:val="0"/>
-          <w:numId w:val="7"/>
+          <w:numId w:val="8"/>
         </w:numPr>
         <w:spacing w:after="60" w:line="360" w:lineRule="auto"/>
       </w:pPr>
@@ -3699,7 +3938,7 @@
           <w:sz w:val="20"/>
           <w:szCs w:val="20"/>
         </w:rPr>
-        <w:t xml:space="preserve">Figura 10. Aprobación o rechazo de la anulación.</w:t>
+        <w:t xml:space="preserve">Figura 11. Aprobación o rechazo de la anulación.</w:t>
       </w:r>
     </w:p>
     <w:tbl>
@@ -3835,7 +4074,7 @@
         <w:pStyle w:val="ListParagraph"/>
         <w:numPr>
           <w:ilvl w:val="0"/>
-          <w:numId w:val="8"/>
+          <w:numId w:val="9"/>
         </w:numPr>
         <w:spacing w:after="60" w:line="360" w:lineRule="auto"/>
       </w:pPr>
@@ -3858,7 +4097,7 @@
         <w:pStyle w:val="ListParagraph"/>
         <w:numPr>
           <w:ilvl w:val="0"/>
-          <w:numId w:val="8"/>
+          <w:numId w:val="9"/>
         </w:numPr>
         <w:spacing w:after="60" w:line="360" w:lineRule="auto"/>
       </w:pPr>
@@ -3891,7 +4130,7 @@
         <w:pStyle w:val="ListParagraph"/>
         <w:numPr>
           <w:ilvl w:val="0"/>
-          <w:numId w:val="8"/>
+          <w:numId w:val="9"/>
         </w:numPr>
         <w:spacing w:after="60" w:line="360" w:lineRule="auto"/>
       </w:pPr>
@@ -3978,7 +4217,7 @@
           <w:sz w:val="20"/>
           <w:szCs w:val="20"/>
         </w:rPr>
-        <w:t xml:space="preserve">Figura 11. Estado de caja: saldo por moneda y movimientos.</w:t>
+        <w:t xml:space="preserve">Figura 12. Estado de caja: saldo por moneda y movimientos.</w:t>
       </w:r>
     </w:p>
     <w:tbl>
@@ -4114,7 +4353,7 @@
         <w:pStyle w:val="ListParagraph"/>
         <w:numPr>
           <w:ilvl w:val="0"/>
-          <w:numId w:val="9"/>
+          <w:numId w:val="10"/>
         </w:numPr>
         <w:spacing w:after="60" w:line="360" w:lineRule="auto"/>
       </w:pPr>
@@ -4147,7 +4386,7 @@
         <w:pStyle w:val="ListParagraph"/>
         <w:numPr>
           <w:ilvl w:val="0"/>
-          <w:numId w:val="9"/>
+          <w:numId w:val="10"/>
         </w:numPr>
         <w:spacing w:after="60" w:line="360" w:lineRule="auto"/>
       </w:pPr>
@@ -4170,7 +4409,7 @@
         <w:pStyle w:val="ListParagraph"/>
         <w:numPr>
           <w:ilvl w:val="0"/>
-          <w:numId w:val="9"/>
+          <w:numId w:val="10"/>
         </w:numPr>
         <w:spacing w:after="60" w:line="360" w:lineRule="auto"/>
       </w:pPr>
@@ -4193,7 +4432,7 @@
         <w:pStyle w:val="ListParagraph"/>
         <w:numPr>
           <w:ilvl w:val="0"/>
-          <w:numId w:val="9"/>
+          <w:numId w:val="10"/>
         </w:numPr>
         <w:spacing w:after="60" w:line="360" w:lineRule="auto"/>
       </w:pPr>
@@ -4300,7 +4539,7 @@
           <w:sz w:val="20"/>
           <w:szCs w:val="20"/>
         </w:rPr>
-        <w:t xml:space="preserve">Figura 12. Cierre de caja: arqueo con el monto declarado.</w:t>
+        <w:t xml:space="preserve">Figura 13. Cierre de caja: arqueo con el monto declarado.</w:t>
       </w:r>
     </w:p>
     <w:p>
@@ -4308,7 +4547,7 @@
         <w:pStyle w:val="ListParagraph"/>
         <w:numPr>
           <w:ilvl w:val="0"/>
-          <w:numId w:val="9"/>
+          <w:numId w:val="10"/>
         </w:numPr>
         <w:spacing w:after="60" w:line="360" w:lineRule="auto"/>
       </w:pPr>
@@ -4405,7 +4644,7 @@
           <w:sz w:val="20"/>
           <w:szCs w:val="20"/>
         </w:rPr>
-        <w:t xml:space="preserve">Figura 13. Documento de arqueo de caja.</w:t>
+        <w:t xml:space="preserve">Figura 14. Documento de arqueo de caja.</w:t>
       </w:r>
     </w:p>
     <w:tbl>
@@ -4846,6 +5085,12 @@
     </w:lvlOverride>
   </w:num>
   <w:num w:numId="9">
+    <w:abstractNumId w:val="3"/>
+    <w:lvlOverride w:ilvl="0">
+      <w:startOverride w:val="1"/>
+    </w:lvlOverride>
+  </w:num>
+  <w:num w:numId="10">
     <w:abstractNumId w:val="3"/>
     <w:lvlOverride w:ilvl="0">
       <w:startOverride w:val="1"/>

</xml_diff>

<commit_message>
docs(manual-usuario): regenera el .docx con las capturas reales
Documento generado desde build.js (reproducible): 13 capturas embebidas, texto
con los ajustes del alumno y numeración de módulo "5." consistente. Reemplaza la
versión con placeholders. 17 páginas.
</commit_message>
<xml_diff>
--- a/doc/manual_usuario/MUESTRA_Manual_Usuario.docx
+++ b/doc/manual_usuario/MUESTRA_Manual_Usuario.docx
@@ -567,79 +567,58 @@
           <w:b/>
           <w:bCs/>
         </w:rPr>
-        <w:t xml:space="preserve">Iniciar sesión</w:t>
+        <w:t xml:space="preserve">Ingresar</w:t>
       </w:r>
       <w:r>
         <w:t xml:space="preserve">. Si los datos son correctos, ingresa a la pantalla principal.</w:t>
       </w:r>
     </w:p>
-    <w:tbl>
-      <w:tblPr>
-        <w:tblW w:type="pct" w:w="100%"/>
-        <w:tblBorders>
-          <w:top w:val="single" w:color="auto" w:sz="4"/>
-          <w:left w:val="single" w:color="auto" w:sz="4"/>
-          <w:bottom w:val="single" w:color="auto" w:sz="4"/>
-          <w:right w:val="single" w:color="auto" w:sz="4"/>
-          <w:insideH w:val="single" w:color="auto" w:sz="4"/>
-          <w:insideV w:val="single" w:color="auto" w:sz="4"/>
-        </w:tblBorders>
-      </w:tblPr>
-      <w:tblGrid>
-        <w:gridCol w:w="100"/>
-      </w:tblGrid>
-      <w:tr>
-        <w:tc>
-          <w:tcPr>
-            <w:tcBorders>
-              <w:top w:val="dashed" w:color="9AA5B1" w:sz="6"/>
-              <w:left w:val="dashed" w:color="9AA5B1" w:sz="6"/>
-              <w:bottom w:val="dashed" w:color="9AA5B1" w:sz="6"/>
-              <w:right w:val="dashed" w:color="9AA5B1" w:sz="6"/>
-            </w:tcBorders>
-            <w:shd w:fill="F5F7FA" w:val="clear"/>
-            <w:tcMar>
-              <w:top w:type="dxa" w:w="300"/>
-              <w:left w:type="dxa" w:w="160"/>
-              <w:bottom w:type="dxa" w:w="300"/>
-              <w:right w:type="dxa" w:w="160"/>
-            </w:tcMar>
-          </w:tcPr>
-          <w:p>
-            <w:pPr>
-              <w:spacing w:after="40"/>
-              <w:jc w:val="center"/>
-            </w:pPr>
-            <w:r>
-              <w:rPr>
-                <w:b/>
-                <w:bCs/>
-                <w:color w:val="6B7683"/>
-                <w:sz w:val="22"/>
-                <w:szCs w:val="22"/>
-              </w:rPr>
-              <w:t xml:space="preserve">[ FIGURA PENDIENTE DE CAPTURA ]</w:t>
-            </w:r>
-          </w:p>
-          <w:p>
-            <w:pPr>
-              <w:spacing w:after="0"/>
-              <w:jc w:val="center"/>
-            </w:pPr>
-            <w:r>
-              <w:rPr>
-                <w:i/>
-                <w:iCs/>
-                <w:color w:val="9AA5B1"/>
-                <w:sz w:val="20"/>
-                <w:szCs w:val="20"/>
-              </w:rPr>
-              <w:t xml:space="preserve">02_acceso_login_01.png</w:t>
-            </w:r>
-          </w:p>
-        </w:tc>
-      </w:tr>
-    </w:tbl>
+    <w:p>
+      <w:pPr>
+        <w:spacing w:after="80" w:before="120"/>
+        <w:jc w:val="center"/>
+      </w:pPr>
+      <w:r>
+        <w:drawing>
+          <wp:inline distT="0" distB="0" distL="0" distR="0">
+            <wp:extent cx="5334000" cy="2752725"/>
+            <wp:effectExtent t="0" r="0" b="0" l="0"/>
+            <wp:docPr id="1" name="02_acceso_login_01.png" descr="02_acceso_login_01.png" title="02_acceso_login_01.png"/>
+            <wp:cNvGraphicFramePr>
+              <a:graphicFrameLocks xmlns:a="http://schemas.openxmlformats.org/drawingml/2006/main" noChangeAspect="1"/>
+            </wp:cNvGraphicFramePr>
+            <a:graphic xmlns:a="http://schemas.openxmlformats.org/drawingml/2006/main">
+              <a:graphicData uri="http://schemas.openxmlformats.org/drawingml/2006/picture">
+                <pic:pic xmlns:pic="http://schemas.openxmlformats.org/drawingml/2006/picture">
+                  <pic:nvPicPr>
+                    <pic:cNvPr id="0" name="" descr=""/>
+                    <pic:cNvPicPr>
+                      <a:picLocks noChangeAspect="1" noChangeArrowheads="1"/>
+                    </pic:cNvPicPr>
+                  </pic:nvPicPr>
+                  <pic:blipFill>
+                    <a:blip r:embed="rId10" cstate="none"/>
+                    <a:srcRect/>
+                    <a:stretch>
+                      <a:fillRect/>
+                    </a:stretch>
+                  </pic:blipFill>
+                  <pic:spPr bwMode="auto">
+                    <a:xfrm>
+                      <a:off x="0" y="0"/>
+                      <a:ext cx="5334000" cy="2752725"/>
+                    </a:xfrm>
+                    <a:prstGeom prst="rect">
+                      <a:avLst/>
+                    </a:prstGeom>
+                  </pic:spPr>
+                </pic:pic>
+              </a:graphicData>
+            </a:graphic>
+          </wp:inline>
+        </w:drawing>
+      </w:r>
+    </w:p>
     <w:p>
       <w:pPr>
         <w:spacing w:after="200"/>
@@ -864,73 +843,52 @@
         <w:t xml:space="preserve"> y ya puede iniciar sesión con la nueva clave.</w:t>
       </w:r>
     </w:p>
-    <w:tbl>
-      <w:tblPr>
-        <w:tblW w:type="pct" w:w="100%"/>
-        <w:tblBorders>
-          <w:top w:val="single" w:color="auto" w:sz="4"/>
-          <w:left w:val="single" w:color="auto" w:sz="4"/>
-          <w:bottom w:val="single" w:color="auto" w:sz="4"/>
-          <w:right w:val="single" w:color="auto" w:sz="4"/>
-          <w:insideH w:val="single" w:color="auto" w:sz="4"/>
-          <w:insideV w:val="single" w:color="auto" w:sz="4"/>
-        </w:tblBorders>
-      </w:tblPr>
-      <w:tblGrid>
-        <w:gridCol w:w="100"/>
-      </w:tblGrid>
-      <w:tr>
-        <w:tc>
-          <w:tcPr>
-            <w:tcBorders>
-              <w:top w:val="dashed" w:color="9AA5B1" w:sz="6"/>
-              <w:left w:val="dashed" w:color="9AA5B1" w:sz="6"/>
-              <w:bottom w:val="dashed" w:color="9AA5B1" w:sz="6"/>
-              <w:right w:val="dashed" w:color="9AA5B1" w:sz="6"/>
-            </w:tcBorders>
-            <w:shd w:fill="F5F7FA" w:val="clear"/>
-            <w:tcMar>
-              <w:top w:type="dxa" w:w="300"/>
-              <w:left w:type="dxa" w:w="160"/>
-              <w:bottom w:type="dxa" w:w="300"/>
-              <w:right w:type="dxa" w:w="160"/>
-            </w:tcMar>
-          </w:tcPr>
-          <w:p>
-            <w:pPr>
-              <w:spacing w:after="40"/>
-              <w:jc w:val="center"/>
-            </w:pPr>
-            <w:r>
-              <w:rPr>
-                <w:b/>
-                <w:bCs/>
-                <w:color w:val="6B7683"/>
-                <w:sz w:val="22"/>
-                <w:szCs w:val="22"/>
-              </w:rPr>
-              <w:t xml:space="preserve">[ FIGURA PENDIENTE DE CAPTURA ]</w:t>
-            </w:r>
-          </w:p>
-          <w:p>
-            <w:pPr>
-              <w:spacing w:after="0"/>
-              <w:jc w:val="center"/>
-            </w:pPr>
-            <w:r>
-              <w:rPr>
-                <w:i/>
-                <w:iCs/>
-                <w:color w:val="9AA5B1"/>
-                <w:sz w:val="20"/>
-                <w:szCs w:val="20"/>
-              </w:rPr>
-              <w:t xml:space="preserve">02_acceso_reset_01.png</w:t>
-            </w:r>
-          </w:p>
-        </w:tc>
-      </w:tr>
-    </w:tbl>
+    <w:p>
+      <w:pPr>
+        <w:spacing w:after="80" w:before="120"/>
+        <w:jc w:val="center"/>
+      </w:pPr>
+      <w:r>
+        <w:drawing>
+          <wp:inline distT="0" distB="0" distL="0" distR="0">
+            <wp:extent cx="5334000" cy="3228975"/>
+            <wp:effectExtent t="0" r="0" b="0" l="0"/>
+            <wp:docPr id="1" name="02_acceso_reset_01.png" descr="02_acceso_reset_01.png" title="02_acceso_reset_01.png"/>
+            <wp:cNvGraphicFramePr>
+              <a:graphicFrameLocks xmlns:a="http://schemas.openxmlformats.org/drawingml/2006/main" noChangeAspect="1"/>
+            </wp:cNvGraphicFramePr>
+            <a:graphic xmlns:a="http://schemas.openxmlformats.org/drawingml/2006/main">
+              <a:graphicData uri="http://schemas.openxmlformats.org/drawingml/2006/picture">
+                <pic:pic xmlns:pic="http://schemas.openxmlformats.org/drawingml/2006/picture">
+                  <pic:nvPicPr>
+                    <pic:cNvPr id="0" name="" descr=""/>
+                    <pic:cNvPicPr>
+                      <a:picLocks noChangeAspect="1" noChangeArrowheads="1"/>
+                    </pic:cNvPicPr>
+                  </pic:nvPicPr>
+                  <pic:blipFill>
+                    <a:blip r:embed="rId11" cstate="none"/>
+                    <a:srcRect/>
+                    <a:stretch>
+                      <a:fillRect/>
+                    </a:stretch>
+                  </pic:blipFill>
+                  <pic:spPr bwMode="auto">
+                    <a:xfrm>
+                      <a:off x="0" y="0"/>
+                      <a:ext cx="5334000" cy="3228975"/>
+                    </a:xfrm>
+                    <a:prstGeom prst="rect">
+                      <a:avLst/>
+                    </a:prstGeom>
+                  </pic:spPr>
+                </pic:pic>
+              </a:graphicData>
+            </a:graphic>
+          </wp:inline>
+        </w:drawing>
+      </w:r>
+    </w:p>
     <w:p>
       <w:pPr>
         <w:spacing w:after="200"/>
@@ -1040,73 +998,52 @@
         <w:t xml:space="preserve">, organizado por módulos; desde ahí se accede a todas las tareas. Cada usuario ve únicamente las opciones habilitadas para su rol.</w:t>
       </w:r>
     </w:p>
-    <w:tbl>
-      <w:tblPr>
-        <w:tblW w:type="pct" w:w="100%"/>
-        <w:tblBorders>
-          <w:top w:val="single" w:color="auto" w:sz="4"/>
-          <w:left w:val="single" w:color="auto" w:sz="4"/>
-          <w:bottom w:val="single" w:color="auto" w:sz="4"/>
-          <w:right w:val="single" w:color="auto" w:sz="4"/>
-          <w:insideH w:val="single" w:color="auto" w:sz="4"/>
-          <w:insideV w:val="single" w:color="auto" w:sz="4"/>
-        </w:tblBorders>
-      </w:tblPr>
-      <w:tblGrid>
-        <w:gridCol w:w="100"/>
-      </w:tblGrid>
-      <w:tr>
-        <w:tc>
-          <w:tcPr>
-            <w:tcBorders>
-              <w:top w:val="dashed" w:color="9AA5B1" w:sz="6"/>
-              <w:left w:val="dashed" w:color="9AA5B1" w:sz="6"/>
-              <w:bottom w:val="dashed" w:color="9AA5B1" w:sz="6"/>
-              <w:right w:val="dashed" w:color="9AA5B1" w:sz="6"/>
-            </w:tcBorders>
-            <w:shd w:fill="F5F7FA" w:val="clear"/>
-            <w:tcMar>
-              <w:top w:type="dxa" w:w="300"/>
-              <w:left w:type="dxa" w:w="160"/>
-              <w:bottom w:type="dxa" w:w="300"/>
-              <w:right w:type="dxa" w:w="160"/>
-            </w:tcMar>
-          </w:tcPr>
-          <w:p>
-            <w:pPr>
-              <w:spacing w:after="40"/>
-              <w:jc w:val="center"/>
-            </w:pPr>
-            <w:r>
-              <w:rPr>
-                <w:b/>
-                <w:bCs/>
-                <w:color w:val="6B7683"/>
-                <w:sz w:val="22"/>
-                <w:szCs w:val="22"/>
-              </w:rPr>
-              <w:t xml:space="preserve">[ FIGURA PENDIENTE DE CAPTURA ]</w:t>
-            </w:r>
-          </w:p>
-          <w:p>
-            <w:pPr>
-              <w:spacing w:after="0"/>
-              <w:jc w:val="center"/>
-            </w:pPr>
-            <w:r>
-              <w:rPr>
-                <w:i/>
-                <w:iCs/>
-                <w:color w:val="9AA5B1"/>
-                <w:sz w:val="20"/>
-                <w:szCs w:val="20"/>
-              </w:rPr>
-              <w:t xml:space="preserve">02_acceso_menu_01.png</w:t>
-            </w:r>
-          </w:p>
-        </w:tc>
-      </w:tr>
-    </w:tbl>
+    <w:p>
+      <w:pPr>
+        <w:spacing w:after="80" w:before="120"/>
+        <w:jc w:val="center"/>
+      </w:pPr>
+      <w:r>
+        <w:drawing>
+          <wp:inline distT="0" distB="0" distL="0" distR="0">
+            <wp:extent cx="5334000" cy="2638425"/>
+            <wp:effectExtent t="0" r="0" b="0" l="0"/>
+            <wp:docPr id="1" name="02_acceso_menu_01.png" descr="02_acceso_menu_01.png" title="02_acceso_menu_01.png"/>
+            <wp:cNvGraphicFramePr>
+              <a:graphicFrameLocks xmlns:a="http://schemas.openxmlformats.org/drawingml/2006/main" noChangeAspect="1"/>
+            </wp:cNvGraphicFramePr>
+            <a:graphic xmlns:a="http://schemas.openxmlformats.org/drawingml/2006/main">
+              <a:graphicData uri="http://schemas.openxmlformats.org/drawingml/2006/picture">
+                <pic:pic xmlns:pic="http://schemas.openxmlformats.org/drawingml/2006/picture">
+                  <pic:nvPicPr>
+                    <pic:cNvPr id="0" name="" descr=""/>
+                    <pic:cNvPicPr>
+                      <a:picLocks noChangeAspect="1" noChangeArrowheads="1"/>
+                    </pic:cNvPicPr>
+                  </pic:nvPicPr>
+                  <pic:blipFill>
+                    <a:blip r:embed="rId12" cstate="none"/>
+                    <a:srcRect/>
+                    <a:stretch>
+                      <a:fillRect/>
+                    </a:stretch>
+                  </pic:blipFill>
+                  <pic:spPr bwMode="auto">
+                    <a:xfrm>
+                      <a:off x="0" y="0"/>
+                      <a:ext cx="5334000" cy="2638425"/>
+                    </a:xfrm>
+                    <a:prstGeom prst="rect">
+                      <a:avLst/>
+                    </a:prstGeom>
+                  </pic:spPr>
+                </pic:pic>
+              </a:graphicData>
+            </a:graphic>
+          </wp:inline>
+        </w:drawing>
+      </w:r>
+    </w:p>
     <w:p>
       <w:pPr>
         <w:spacing w:after="200"/>
@@ -2166,7 +2103,7 @@
           <w:b/>
           <w:bCs/>
         </w:rPr>
-        <w:t xml:space="preserve">Abrir caja</w:t>
+        <w:t xml:space="preserve">Crear</w:t>
       </w:r>
       <w:r>
         <w:t xml:space="preserve">). La caja queda </w:t>
@@ -2182,73 +2119,52 @@
         <w:t xml:space="preserve"> y lista para operar.</w:t>
       </w:r>
     </w:p>
-    <w:tbl>
-      <w:tblPr>
-        <w:tblW w:type="pct" w:w="100%"/>
-        <w:tblBorders>
-          <w:top w:val="single" w:color="auto" w:sz="4"/>
-          <w:left w:val="single" w:color="auto" w:sz="4"/>
-          <w:bottom w:val="single" w:color="auto" w:sz="4"/>
-          <w:right w:val="single" w:color="auto" w:sz="4"/>
-          <w:insideH w:val="single" w:color="auto" w:sz="4"/>
-          <w:insideV w:val="single" w:color="auto" w:sz="4"/>
-        </w:tblBorders>
-      </w:tblPr>
-      <w:tblGrid>
-        <w:gridCol w:w="100"/>
-      </w:tblGrid>
-      <w:tr>
-        <w:tc>
-          <w:tcPr>
-            <w:tcBorders>
-              <w:top w:val="dashed" w:color="9AA5B1" w:sz="6"/>
-              <w:left w:val="dashed" w:color="9AA5B1" w:sz="6"/>
-              <w:bottom w:val="dashed" w:color="9AA5B1" w:sz="6"/>
-              <w:right w:val="dashed" w:color="9AA5B1" w:sz="6"/>
-            </w:tcBorders>
-            <w:shd w:fill="F5F7FA" w:val="clear"/>
-            <w:tcMar>
-              <w:top w:type="dxa" w:w="300"/>
-              <w:left w:type="dxa" w:w="160"/>
-              <w:bottom w:type="dxa" w:w="300"/>
-              <w:right w:type="dxa" w:w="160"/>
-            </w:tcMar>
-          </w:tcPr>
-          <w:p>
-            <w:pPr>
-              <w:spacing w:after="40"/>
-              <w:jc w:val="center"/>
-            </w:pPr>
-            <w:r>
-              <w:rPr>
-                <w:b/>
-                <w:bCs/>
-                <w:color w:val="6B7683"/>
-                <w:sz w:val="22"/>
-                <w:szCs w:val="22"/>
-              </w:rPr>
-              <w:t xml:space="preserve">[ FIGURA PENDIENTE DE CAPTURA ]</w:t>
-            </w:r>
-          </w:p>
-          <w:p>
-            <w:pPr>
-              <w:spacing w:after="0"/>
-              <w:jc w:val="center"/>
-            </w:pPr>
-            <w:r>
-              <w:rPr>
-                <w:i/>
-                <w:iCs/>
-                <w:color w:val="9AA5B1"/>
-                <w:sz w:val="20"/>
-                <w:szCs w:val="20"/>
-              </w:rPr>
-              <w:t xml:space="preserve">05_caja_apertura_01.png</w:t>
-            </w:r>
-          </w:p>
-        </w:tc>
-      </w:tr>
-    </w:tbl>
+    <w:p>
+      <w:pPr>
+        <w:spacing w:after="80" w:before="120"/>
+        <w:jc w:val="center"/>
+      </w:pPr>
+      <w:r>
+        <w:drawing>
+          <wp:inline distT="0" distB="0" distL="0" distR="0">
+            <wp:extent cx="5334000" cy="2657475"/>
+            <wp:effectExtent t="0" r="0" b="0" l="0"/>
+            <wp:docPr id="1" name="05_caja_apertura_01.png" descr="05_caja_apertura_01.png" title="05_caja_apertura_01.png"/>
+            <wp:cNvGraphicFramePr>
+              <a:graphicFrameLocks xmlns:a="http://schemas.openxmlformats.org/drawingml/2006/main" noChangeAspect="1"/>
+            </wp:cNvGraphicFramePr>
+            <a:graphic xmlns:a="http://schemas.openxmlformats.org/drawingml/2006/main">
+              <a:graphicData uri="http://schemas.openxmlformats.org/drawingml/2006/picture">
+                <pic:pic xmlns:pic="http://schemas.openxmlformats.org/drawingml/2006/picture">
+                  <pic:nvPicPr>
+                    <pic:cNvPr id="0" name="" descr=""/>
+                    <pic:cNvPicPr>
+                      <a:picLocks noChangeAspect="1" noChangeArrowheads="1"/>
+                    </pic:cNvPicPr>
+                  </pic:nvPicPr>
+                  <pic:blipFill>
+                    <a:blip r:embed="rId13" cstate="none"/>
+                    <a:srcRect/>
+                    <a:stretch>
+                      <a:fillRect/>
+                    </a:stretch>
+                  </pic:blipFill>
+                  <pic:spPr bwMode="auto">
+                    <a:xfrm>
+                      <a:off x="0" y="0"/>
+                      <a:ext cx="5334000" cy="2657475"/>
+                    </a:xfrm>
+                    <a:prstGeom prst="rect">
+                      <a:avLst/>
+                    </a:prstGeom>
+                  </pic:spPr>
+                </pic:pic>
+              </a:graphicData>
+            </a:graphic>
+          </wp:inline>
+        </w:drawing>
+      </w:r>
+    </w:p>
     <w:p>
       <w:pPr>
         <w:spacing w:after="200"/>
@@ -2562,73 +2478,52 @@
         <w:t xml:space="preserve"> para iniciar una nueva factura.</w:t>
       </w:r>
     </w:p>
-    <w:tbl>
-      <w:tblPr>
-        <w:tblW w:type="pct" w:w="100%"/>
-        <w:tblBorders>
-          <w:top w:val="single" w:color="auto" w:sz="4"/>
-          <w:left w:val="single" w:color="auto" w:sz="4"/>
-          <w:bottom w:val="single" w:color="auto" w:sz="4"/>
-          <w:right w:val="single" w:color="auto" w:sz="4"/>
-          <w:insideH w:val="single" w:color="auto" w:sz="4"/>
-          <w:insideV w:val="single" w:color="auto" w:sz="4"/>
-        </w:tblBorders>
-      </w:tblPr>
-      <w:tblGrid>
-        <w:gridCol w:w="100"/>
-      </w:tblGrid>
-      <w:tr>
-        <w:tc>
-          <w:tcPr>
-            <w:tcBorders>
-              <w:top w:val="dashed" w:color="9AA5B1" w:sz="6"/>
-              <w:left w:val="dashed" w:color="9AA5B1" w:sz="6"/>
-              <w:bottom w:val="dashed" w:color="9AA5B1" w:sz="6"/>
-              <w:right w:val="dashed" w:color="9AA5B1" w:sz="6"/>
-            </w:tcBorders>
-            <w:shd w:fill="F5F7FA" w:val="clear"/>
-            <w:tcMar>
-              <w:top w:type="dxa" w:w="300"/>
-              <w:left w:type="dxa" w:w="160"/>
-              <w:bottom w:type="dxa" w:w="300"/>
-              <w:right w:type="dxa" w:w="160"/>
-            </w:tcMar>
-          </w:tcPr>
-          <w:p>
-            <w:pPr>
-              <w:spacing w:after="40"/>
-              <w:jc w:val="center"/>
-            </w:pPr>
-            <w:r>
-              <w:rPr>
-                <w:b/>
-                <w:bCs/>
-                <w:color w:val="6B7683"/>
-                <w:sz w:val="22"/>
-                <w:szCs w:val="22"/>
-              </w:rPr>
-              <w:t xml:space="preserve">[ FIGURA PENDIENTE DE CAPTURA ]</w:t>
-            </w:r>
-          </w:p>
-          <w:p>
-            <w:pPr>
-              <w:spacing w:after="0"/>
-              <w:jc w:val="center"/>
-            </w:pPr>
-            <w:r>
-              <w:rPr>
-                <w:i/>
-                <w:iCs/>
-                <w:color w:val="9AA5B1"/>
-                <w:sz w:val="20"/>
-                <w:szCs w:val="20"/>
-              </w:rPr>
-              <w:t xml:space="preserve">05_facturacion_contado_01.png</w:t>
-            </w:r>
-          </w:p>
-        </w:tc>
-      </w:tr>
-    </w:tbl>
+    <w:p>
+      <w:pPr>
+        <w:spacing w:after="80" w:before="120"/>
+        <w:jc w:val="center"/>
+      </w:pPr>
+      <w:r>
+        <w:drawing>
+          <wp:inline distT="0" distB="0" distL="0" distR="0">
+            <wp:extent cx="5334000" cy="2762250"/>
+            <wp:effectExtent t="0" r="0" b="0" l="0"/>
+            <wp:docPr id="1" name="05_facturacion_contado_01.png" descr="05_facturacion_contado_01.png" title="05_facturacion_contado_01.png"/>
+            <wp:cNvGraphicFramePr>
+              <a:graphicFrameLocks xmlns:a="http://schemas.openxmlformats.org/drawingml/2006/main" noChangeAspect="1"/>
+            </wp:cNvGraphicFramePr>
+            <a:graphic xmlns:a="http://schemas.openxmlformats.org/drawingml/2006/main">
+              <a:graphicData uri="http://schemas.openxmlformats.org/drawingml/2006/picture">
+                <pic:pic xmlns:pic="http://schemas.openxmlformats.org/drawingml/2006/picture">
+                  <pic:nvPicPr>
+                    <pic:cNvPr id="0" name="" descr=""/>
+                    <pic:cNvPicPr>
+                      <a:picLocks noChangeAspect="1" noChangeArrowheads="1"/>
+                    </pic:cNvPicPr>
+                  </pic:nvPicPr>
+                  <pic:blipFill>
+                    <a:blip r:embed="rId14" cstate="none"/>
+                    <a:srcRect/>
+                    <a:stretch>
+                      <a:fillRect/>
+                    </a:stretch>
+                  </pic:blipFill>
+                  <pic:spPr bwMode="auto">
+                    <a:xfrm>
+                      <a:off x="0" y="0"/>
+                      <a:ext cx="5334000" cy="2762250"/>
+                    </a:xfrm>
+                    <a:prstGeom prst="rect">
+                      <a:avLst/>
+                    </a:prstGeom>
+                  </pic:spPr>
+                </pic:pic>
+              </a:graphicData>
+            </a:graphic>
+          </wp:inline>
+        </w:drawing>
+      </w:r>
+    </w:p>
     <w:p>
       <w:pPr>
         <w:spacing w:after="200"/>
@@ -2677,73 +2572,52 @@
         <w:t xml:space="preserve"> a facturar. El sistema carga el detalle de productos y los totales.</w:t>
       </w:r>
     </w:p>
-    <w:tbl>
-      <w:tblPr>
-        <w:tblW w:type="pct" w:w="100%"/>
-        <w:tblBorders>
-          <w:top w:val="single" w:color="auto" w:sz="4"/>
-          <w:left w:val="single" w:color="auto" w:sz="4"/>
-          <w:bottom w:val="single" w:color="auto" w:sz="4"/>
-          <w:right w:val="single" w:color="auto" w:sz="4"/>
-          <w:insideH w:val="single" w:color="auto" w:sz="4"/>
-          <w:insideV w:val="single" w:color="auto" w:sz="4"/>
-        </w:tblBorders>
-      </w:tblPr>
-      <w:tblGrid>
-        <w:gridCol w:w="100"/>
-      </w:tblGrid>
-      <w:tr>
-        <w:tc>
-          <w:tcPr>
-            <w:tcBorders>
-              <w:top w:val="dashed" w:color="9AA5B1" w:sz="6"/>
-              <w:left w:val="dashed" w:color="9AA5B1" w:sz="6"/>
-              <w:bottom w:val="dashed" w:color="9AA5B1" w:sz="6"/>
-              <w:right w:val="dashed" w:color="9AA5B1" w:sz="6"/>
-            </w:tcBorders>
-            <w:shd w:fill="F5F7FA" w:val="clear"/>
-            <w:tcMar>
-              <w:top w:type="dxa" w:w="300"/>
-              <w:left w:type="dxa" w:w="160"/>
-              <w:bottom w:type="dxa" w:w="300"/>
-              <w:right w:type="dxa" w:w="160"/>
-            </w:tcMar>
-          </w:tcPr>
-          <w:p>
-            <w:pPr>
-              <w:spacing w:after="40"/>
-              <w:jc w:val="center"/>
-            </w:pPr>
-            <w:r>
-              <w:rPr>
-                <w:b/>
-                <w:bCs/>
-                <w:color w:val="6B7683"/>
-                <w:sz w:val="22"/>
-                <w:szCs w:val="22"/>
-              </w:rPr>
-              <w:t xml:space="preserve">[ FIGURA PENDIENTE DE CAPTURA ]</w:t>
-            </w:r>
-          </w:p>
-          <w:p>
-            <w:pPr>
-              <w:spacing w:after="0"/>
-              <w:jc w:val="center"/>
-            </w:pPr>
-            <w:r>
-              <w:rPr>
-                <w:i/>
-                <w:iCs/>
-                <w:color w:val="9AA5B1"/>
-                <w:sz w:val="20"/>
-                <w:szCs w:val="20"/>
-              </w:rPr>
-              <w:t xml:space="preserve">05_facturacion_contado_02.png</w:t>
-            </w:r>
-          </w:p>
-        </w:tc>
-      </w:tr>
-    </w:tbl>
+    <w:p>
+      <w:pPr>
+        <w:spacing w:after="80" w:before="120"/>
+        <w:jc w:val="center"/>
+      </w:pPr>
+      <w:r>
+        <w:drawing>
+          <wp:inline distT="0" distB="0" distL="0" distR="0">
+            <wp:extent cx="5334000" cy="3200400"/>
+            <wp:effectExtent t="0" r="0" b="0" l="0"/>
+            <wp:docPr id="1" name="05_facturacion_contado_02.png" descr="05_facturacion_contado_02.png" title="05_facturacion_contado_02.png"/>
+            <wp:cNvGraphicFramePr>
+              <a:graphicFrameLocks xmlns:a="http://schemas.openxmlformats.org/drawingml/2006/main" noChangeAspect="1"/>
+            </wp:cNvGraphicFramePr>
+            <a:graphic xmlns:a="http://schemas.openxmlformats.org/drawingml/2006/main">
+              <a:graphicData uri="http://schemas.openxmlformats.org/drawingml/2006/picture">
+                <pic:pic xmlns:pic="http://schemas.openxmlformats.org/drawingml/2006/picture">
+                  <pic:nvPicPr>
+                    <pic:cNvPr id="0" name="" descr=""/>
+                    <pic:cNvPicPr>
+                      <a:picLocks noChangeAspect="1" noChangeArrowheads="1"/>
+                    </pic:cNvPicPr>
+                  </pic:nvPicPr>
+                  <pic:blipFill>
+                    <a:blip r:embed="rId15" cstate="none"/>
+                    <a:srcRect/>
+                    <a:stretch>
+                      <a:fillRect/>
+                    </a:stretch>
+                  </pic:blipFill>
+                  <pic:spPr bwMode="auto">
+                    <a:xfrm>
+                      <a:off x="0" y="0"/>
+                      <a:ext cx="5334000" cy="3200400"/>
+                    </a:xfrm>
+                    <a:prstGeom prst="rect">
+                      <a:avLst/>
+                    </a:prstGeom>
+                  </pic:spPr>
+                </pic:pic>
+              </a:graphicData>
+            </a:graphic>
+          </wp:inline>
+        </w:drawing>
+      </w:r>
+    </w:p>
     <w:p>
       <w:pPr>
         <w:spacing w:after="200"/>
@@ -2825,73 +2699,52 @@
         <w:t xml:space="preserve">.</w:t>
       </w:r>
     </w:p>
-    <w:tbl>
-      <w:tblPr>
-        <w:tblW w:type="pct" w:w="100%"/>
-        <w:tblBorders>
-          <w:top w:val="single" w:color="auto" w:sz="4"/>
-          <w:left w:val="single" w:color="auto" w:sz="4"/>
-          <w:bottom w:val="single" w:color="auto" w:sz="4"/>
-          <w:right w:val="single" w:color="auto" w:sz="4"/>
-          <w:insideH w:val="single" w:color="auto" w:sz="4"/>
-          <w:insideV w:val="single" w:color="auto" w:sz="4"/>
-        </w:tblBorders>
-      </w:tblPr>
-      <w:tblGrid>
-        <w:gridCol w:w="100"/>
-      </w:tblGrid>
-      <w:tr>
-        <w:tc>
-          <w:tcPr>
-            <w:tcBorders>
-              <w:top w:val="dashed" w:color="9AA5B1" w:sz="6"/>
-              <w:left w:val="dashed" w:color="9AA5B1" w:sz="6"/>
-              <w:bottom w:val="dashed" w:color="9AA5B1" w:sz="6"/>
-              <w:right w:val="dashed" w:color="9AA5B1" w:sz="6"/>
-            </w:tcBorders>
-            <w:shd w:fill="F5F7FA" w:val="clear"/>
-            <w:tcMar>
-              <w:top w:type="dxa" w:w="300"/>
-              <w:left w:type="dxa" w:w="160"/>
-              <w:bottom w:type="dxa" w:w="300"/>
-              <w:right w:type="dxa" w:w="160"/>
-            </w:tcMar>
-          </w:tcPr>
-          <w:p>
-            <w:pPr>
-              <w:spacing w:after="40"/>
-              <w:jc w:val="center"/>
-            </w:pPr>
-            <w:r>
-              <w:rPr>
-                <w:b/>
-                <w:bCs/>
-                <w:color w:val="6B7683"/>
-                <w:sz w:val="22"/>
-                <w:szCs w:val="22"/>
-              </w:rPr>
-              <w:t xml:space="preserve">[ FIGURA PENDIENTE DE CAPTURA ]</w:t>
-            </w:r>
-          </w:p>
-          <w:p>
-            <w:pPr>
-              <w:spacing w:after="0"/>
-              <w:jc w:val="center"/>
-            </w:pPr>
-            <w:r>
-              <w:rPr>
-                <w:i/>
-                <w:iCs/>
-                <w:color w:val="9AA5B1"/>
-                <w:sz w:val="20"/>
-                <w:szCs w:val="20"/>
-              </w:rPr>
-              <w:t xml:space="preserve">05_facturacion_contado_03.png</w:t>
-            </w:r>
-          </w:p>
-        </w:tc>
-      </w:tr>
-    </w:tbl>
+    <w:p>
+      <w:pPr>
+        <w:spacing w:after="80" w:before="120"/>
+        <w:jc w:val="center"/>
+      </w:pPr>
+      <w:r>
+        <w:drawing>
+          <wp:inline distT="0" distB="0" distL="0" distR="0">
+            <wp:extent cx="5334000" cy="3714750"/>
+            <wp:effectExtent t="0" r="0" b="0" l="0"/>
+            <wp:docPr id="1" name="05_facturacion_contado_03.png" descr="05_facturacion_contado_03.png" title="05_facturacion_contado_03.png"/>
+            <wp:cNvGraphicFramePr>
+              <a:graphicFrameLocks xmlns:a="http://schemas.openxmlformats.org/drawingml/2006/main" noChangeAspect="1"/>
+            </wp:cNvGraphicFramePr>
+            <a:graphic xmlns:a="http://schemas.openxmlformats.org/drawingml/2006/main">
+              <a:graphicData uri="http://schemas.openxmlformats.org/drawingml/2006/picture">
+                <pic:pic xmlns:pic="http://schemas.openxmlformats.org/drawingml/2006/picture">
+                  <pic:nvPicPr>
+                    <pic:cNvPr id="0" name="" descr=""/>
+                    <pic:cNvPicPr>
+                      <a:picLocks noChangeAspect="1" noChangeArrowheads="1"/>
+                    </pic:cNvPicPr>
+                  </pic:nvPicPr>
+                  <pic:blipFill>
+                    <a:blip r:embed="rId16" cstate="none"/>
+                    <a:srcRect/>
+                    <a:stretch>
+                      <a:fillRect/>
+                    </a:stretch>
+                  </pic:blipFill>
+                  <pic:spPr bwMode="auto">
+                    <a:xfrm>
+                      <a:off x="0" y="0"/>
+                      <a:ext cx="5334000" cy="3714750"/>
+                    </a:xfrm>
+                    <a:prstGeom prst="rect">
+                      <a:avLst/>
+                    </a:prstGeom>
+                  </pic:spPr>
+                </pic:pic>
+              </a:graphicData>
+            </a:graphic>
+          </wp:inline>
+        </w:drawing>
+      </w:r>
+    </w:p>
     <w:p>
       <w:pPr>
         <w:spacing w:after="200"/>
@@ -2953,73 +2806,52 @@
         <w:t xml:space="preserve">, listo para imprimir o guardar.</w:t>
       </w:r>
     </w:p>
-    <w:tbl>
-      <w:tblPr>
-        <w:tblW w:type="pct" w:w="100%"/>
-        <w:tblBorders>
-          <w:top w:val="single" w:color="auto" w:sz="4"/>
-          <w:left w:val="single" w:color="auto" w:sz="4"/>
-          <w:bottom w:val="single" w:color="auto" w:sz="4"/>
-          <w:right w:val="single" w:color="auto" w:sz="4"/>
-          <w:insideH w:val="single" w:color="auto" w:sz="4"/>
-          <w:insideV w:val="single" w:color="auto" w:sz="4"/>
-        </w:tblBorders>
-      </w:tblPr>
-      <w:tblGrid>
-        <w:gridCol w:w="100"/>
-      </w:tblGrid>
-      <w:tr>
-        <w:tc>
-          <w:tcPr>
-            <w:tcBorders>
-              <w:top w:val="dashed" w:color="9AA5B1" w:sz="6"/>
-              <w:left w:val="dashed" w:color="9AA5B1" w:sz="6"/>
-              <w:bottom w:val="dashed" w:color="9AA5B1" w:sz="6"/>
-              <w:right w:val="dashed" w:color="9AA5B1" w:sz="6"/>
-            </w:tcBorders>
-            <w:shd w:fill="F5F7FA" w:val="clear"/>
-            <w:tcMar>
-              <w:top w:type="dxa" w:w="300"/>
-              <w:left w:type="dxa" w:w="160"/>
-              <w:bottom w:type="dxa" w:w="300"/>
-              <w:right w:type="dxa" w:w="160"/>
-            </w:tcMar>
-          </w:tcPr>
-          <w:p>
-            <w:pPr>
-              <w:spacing w:after="40"/>
-              <w:jc w:val="center"/>
-            </w:pPr>
-            <w:r>
-              <w:rPr>
-                <w:b/>
-                <w:bCs/>
-                <w:color w:val="6B7683"/>
-                <w:sz w:val="22"/>
-                <w:szCs w:val="22"/>
-              </w:rPr>
-              <w:t xml:space="preserve">[ FIGURA PENDIENTE DE CAPTURA ]</w:t>
-            </w:r>
-          </w:p>
-          <w:p>
-            <w:pPr>
-              <w:spacing w:after="0"/>
-              <w:jc w:val="center"/>
-            </w:pPr>
-            <w:r>
-              <w:rPr>
-                <w:i/>
-                <w:iCs/>
-                <w:color w:val="9AA5B1"/>
-                <w:sz w:val="20"/>
-                <w:szCs w:val="20"/>
-              </w:rPr>
-              <w:t xml:space="preserve">05_facturacion_contado_04.png</w:t>
-            </w:r>
-          </w:p>
-        </w:tc>
-      </w:tr>
-    </w:tbl>
+    <w:p>
+      <w:pPr>
+        <w:spacing w:after="80" w:before="120"/>
+        <w:jc w:val="center"/>
+      </w:pPr>
+      <w:r>
+        <w:drawing>
+          <wp:inline distT="0" distB="0" distL="0" distR="0">
+            <wp:extent cx="5334000" cy="5067300"/>
+            <wp:effectExtent t="0" r="0" b="0" l="0"/>
+            <wp:docPr id="1" name="05_facturacion_contado_04.png" descr="05_facturacion_contado_04.png" title="05_facturacion_contado_04.png"/>
+            <wp:cNvGraphicFramePr>
+              <a:graphicFrameLocks xmlns:a="http://schemas.openxmlformats.org/drawingml/2006/main" noChangeAspect="1"/>
+            </wp:cNvGraphicFramePr>
+            <a:graphic xmlns:a="http://schemas.openxmlformats.org/drawingml/2006/main">
+              <a:graphicData uri="http://schemas.openxmlformats.org/drawingml/2006/picture">
+                <pic:pic xmlns:pic="http://schemas.openxmlformats.org/drawingml/2006/picture">
+                  <pic:nvPicPr>
+                    <pic:cNvPr id="0" name="" descr=""/>
+                    <pic:cNvPicPr>
+                      <a:picLocks noChangeAspect="1" noChangeArrowheads="1"/>
+                    </pic:cNvPicPr>
+                  </pic:nvPicPr>
+                  <pic:blipFill>
+                    <a:blip r:embed="rId17" cstate="none"/>
+                    <a:srcRect/>
+                    <a:stretch>
+                      <a:fillRect/>
+                    </a:stretch>
+                  </pic:blipFill>
+                  <pic:spPr bwMode="auto">
+                    <a:xfrm>
+                      <a:off x="0" y="0"/>
+                      <a:ext cx="5334000" cy="5067300"/>
+                    </a:xfrm>
+                    <a:prstGeom prst="rect">
+                      <a:avLst/>
+                    </a:prstGeom>
+                  </pic:spPr>
+                </pic:pic>
+              </a:graphicData>
+            </a:graphic>
+          </wp:inline>
+        </w:drawing>
+      </w:r>
+    </w:p>
     <w:p>
       <w:pPr>
         <w:spacing w:after="200"/>
@@ -3271,88 +3103,6 @@
         <w:t xml:space="preserve"> con el que se financiará la venta.</w:t>
       </w:r>
     </w:p>
-    <w:tbl>
-      <w:tblPr>
-        <w:tblW w:type="pct" w:w="100%"/>
-        <w:tblBorders>
-          <w:top w:val="single" w:color="auto" w:sz="4"/>
-          <w:left w:val="single" w:color="auto" w:sz="4"/>
-          <w:bottom w:val="single" w:color="auto" w:sz="4"/>
-          <w:right w:val="single" w:color="auto" w:sz="4"/>
-          <w:insideH w:val="single" w:color="auto" w:sz="4"/>
-          <w:insideV w:val="single" w:color="auto" w:sz="4"/>
-        </w:tblBorders>
-      </w:tblPr>
-      <w:tblGrid>
-        <w:gridCol w:w="100"/>
-      </w:tblGrid>
-      <w:tr>
-        <w:tc>
-          <w:tcPr>
-            <w:tcBorders>
-              <w:top w:val="dashed" w:color="9AA5B1" w:sz="6"/>
-              <w:left w:val="dashed" w:color="9AA5B1" w:sz="6"/>
-              <w:bottom w:val="dashed" w:color="9AA5B1" w:sz="6"/>
-              <w:right w:val="dashed" w:color="9AA5B1" w:sz="6"/>
-            </w:tcBorders>
-            <w:shd w:fill="F5F7FA" w:val="clear"/>
-            <w:tcMar>
-              <w:top w:type="dxa" w:w="300"/>
-              <w:left w:type="dxa" w:w="160"/>
-              <w:bottom w:type="dxa" w:w="300"/>
-              <w:right w:type="dxa" w:w="160"/>
-            </w:tcMar>
-          </w:tcPr>
-          <w:p>
-            <w:pPr>
-              <w:spacing w:after="40"/>
-              <w:jc w:val="center"/>
-            </w:pPr>
-            <w:r>
-              <w:rPr>
-                <w:b/>
-                <w:bCs/>
-                <w:color w:val="6B7683"/>
-                <w:sz w:val="22"/>
-                <w:szCs w:val="22"/>
-              </w:rPr>
-              <w:t xml:space="preserve">[ FIGURA PENDIENTE DE CAPTURA ]</w:t>
-            </w:r>
-          </w:p>
-          <w:p>
-            <w:pPr>
-              <w:spacing w:after="0"/>
-              <w:jc w:val="center"/>
-            </w:pPr>
-            <w:r>
-              <w:rPr>
-                <w:i/>
-                <w:iCs/>
-                <w:color w:val="9AA5B1"/>
-                <w:sz w:val="20"/>
-                <w:szCs w:val="20"/>
-              </w:rPr>
-              <w:t xml:space="preserve">05_facturacion_credito_01.png</w:t>
-            </w:r>
-          </w:p>
-        </w:tc>
-      </w:tr>
-    </w:tbl>
-    <w:p>
-      <w:pPr>
-        <w:spacing w:after="200"/>
-        <w:jc w:val="center"/>
-      </w:pPr>
-      <w:r>
-        <w:rPr>
-          <w:i/>
-          <w:iCs/>
-          <w:sz w:val="20"/>
-          <w:szCs w:val="20"/>
-        </w:rPr>
-        <w:t xml:space="preserve">Figura 9. Forma de pago Crédito con plan de cuotas.</w:t>
-      </w:r>
-    </w:p>
     <w:p>
       <w:pPr>
         <w:pStyle w:val="ListParagraph"/>
@@ -3623,7 +3373,7 @@
           <w:b/>
           <w:bCs/>
         </w:rPr>
-        <w:t xml:space="preserve">Ventas → Anulaciones de Facturas</w:t>
+        <w:t xml:space="preserve">Ventas → Proceso Ventas</w:t>
       </w:r>
       <w:r>
         <w:t xml:space="preserve">.</w:t>
@@ -3675,73 +3425,52 @@
         <w:t xml:space="preserve">.</w:t>
       </w:r>
     </w:p>
-    <w:tbl>
-      <w:tblPr>
-        <w:tblW w:type="pct" w:w="100%"/>
-        <w:tblBorders>
-          <w:top w:val="single" w:color="auto" w:sz="4"/>
-          <w:left w:val="single" w:color="auto" w:sz="4"/>
-          <w:bottom w:val="single" w:color="auto" w:sz="4"/>
-          <w:right w:val="single" w:color="auto" w:sz="4"/>
-          <w:insideH w:val="single" w:color="auto" w:sz="4"/>
-          <w:insideV w:val="single" w:color="auto" w:sz="4"/>
-        </w:tblBorders>
-      </w:tblPr>
-      <w:tblGrid>
-        <w:gridCol w:w="100"/>
-      </w:tblGrid>
-      <w:tr>
-        <w:tc>
-          <w:tcPr>
-            <w:tcBorders>
-              <w:top w:val="dashed" w:color="9AA5B1" w:sz="6"/>
-              <w:left w:val="dashed" w:color="9AA5B1" w:sz="6"/>
-              <w:bottom w:val="dashed" w:color="9AA5B1" w:sz="6"/>
-              <w:right w:val="dashed" w:color="9AA5B1" w:sz="6"/>
-            </w:tcBorders>
-            <w:shd w:fill="F5F7FA" w:val="clear"/>
-            <w:tcMar>
-              <w:top w:type="dxa" w:w="300"/>
-              <w:left w:type="dxa" w:w="160"/>
-              <w:bottom w:type="dxa" w:w="300"/>
-              <w:right w:type="dxa" w:w="160"/>
-            </w:tcMar>
-          </w:tcPr>
-          <w:p>
-            <w:pPr>
-              <w:spacing w:after="40"/>
-              <w:jc w:val="center"/>
-            </w:pPr>
-            <w:r>
-              <w:rPr>
-                <w:b/>
-                <w:bCs/>
-                <w:color w:val="6B7683"/>
-                <w:sz w:val="22"/>
-                <w:szCs w:val="22"/>
-              </w:rPr>
-              <w:t xml:space="preserve">[ FIGURA PENDIENTE DE CAPTURA ]</w:t>
-            </w:r>
-          </w:p>
-          <w:p>
-            <w:pPr>
-              <w:spacing w:after="0"/>
-              <w:jc w:val="center"/>
-            </w:pPr>
-            <w:r>
-              <w:rPr>
-                <w:i/>
-                <w:iCs/>
-                <w:color w:val="9AA5B1"/>
-                <w:sz w:val="20"/>
-                <w:szCs w:val="20"/>
-              </w:rPr>
-              <w:t xml:space="preserve">05_anulacion_solicitud_01.png</w:t>
-            </w:r>
-          </w:p>
-        </w:tc>
-      </w:tr>
-    </w:tbl>
+    <w:p>
+      <w:pPr>
+        <w:spacing w:after="80" w:before="120"/>
+        <w:jc w:val="center"/>
+      </w:pPr>
+      <w:r>
+        <w:drawing>
+          <wp:inline distT="0" distB="0" distL="0" distR="0">
+            <wp:extent cx="5334000" cy="2724150"/>
+            <wp:effectExtent t="0" r="0" b="0" l="0"/>
+            <wp:docPr id="1" name="05_anulacion_solicitud_01.png" descr="05_anulacion_solicitud_01.png" title="05_anulacion_solicitud_01.png"/>
+            <wp:cNvGraphicFramePr>
+              <a:graphicFrameLocks xmlns:a="http://schemas.openxmlformats.org/drawingml/2006/main" noChangeAspect="1"/>
+            </wp:cNvGraphicFramePr>
+            <a:graphic xmlns:a="http://schemas.openxmlformats.org/drawingml/2006/main">
+              <a:graphicData uri="http://schemas.openxmlformats.org/drawingml/2006/picture">
+                <pic:pic xmlns:pic="http://schemas.openxmlformats.org/drawingml/2006/picture">
+                  <pic:nvPicPr>
+                    <pic:cNvPr id="0" name="" descr=""/>
+                    <pic:cNvPicPr>
+                      <a:picLocks noChangeAspect="1" noChangeArrowheads="1"/>
+                    </pic:cNvPicPr>
+                  </pic:nvPicPr>
+                  <pic:blipFill>
+                    <a:blip r:embed="rId18" cstate="none"/>
+                    <a:srcRect/>
+                    <a:stretch>
+                      <a:fillRect/>
+                    </a:stretch>
+                  </pic:blipFill>
+                  <pic:spPr bwMode="auto">
+                    <a:xfrm>
+                      <a:off x="0" y="0"/>
+                      <a:ext cx="5334000" cy="2724150"/>
+                    </a:xfrm>
+                    <a:prstGeom prst="rect">
+                      <a:avLst/>
+                    </a:prstGeom>
+                  </pic:spPr>
+                </pic:pic>
+              </a:graphicData>
+            </a:graphic>
+          </wp:inline>
+        </w:drawing>
+      </w:r>
+    </w:p>
     <w:p>
       <w:pPr>
         <w:spacing w:after="200"/>
@@ -3754,7 +3483,7 @@
           <w:sz w:val="20"/>
           <w:szCs w:val="20"/>
         </w:rPr>
-        <w:t xml:space="preserve">Figura 10. Solicitud de anulación con el motivo.</w:t>
+        <w:t xml:space="preserve">Figura 9. Solicitud de anulación con el motivo.</w:t>
       </w:r>
     </w:p>
     <w:p>
@@ -3859,73 +3588,52 @@
         <w:t xml:space="preserve">.</w:t>
       </w:r>
     </w:p>
-    <w:tbl>
-      <w:tblPr>
-        <w:tblW w:type="pct" w:w="100%"/>
-        <w:tblBorders>
-          <w:top w:val="single" w:color="auto" w:sz="4"/>
-          <w:left w:val="single" w:color="auto" w:sz="4"/>
-          <w:bottom w:val="single" w:color="auto" w:sz="4"/>
-          <w:right w:val="single" w:color="auto" w:sz="4"/>
-          <w:insideH w:val="single" w:color="auto" w:sz="4"/>
-          <w:insideV w:val="single" w:color="auto" w:sz="4"/>
-        </w:tblBorders>
-      </w:tblPr>
-      <w:tblGrid>
-        <w:gridCol w:w="100"/>
-      </w:tblGrid>
-      <w:tr>
-        <w:tc>
-          <w:tcPr>
-            <w:tcBorders>
-              <w:top w:val="dashed" w:color="9AA5B1" w:sz="6"/>
-              <w:left w:val="dashed" w:color="9AA5B1" w:sz="6"/>
-              <w:bottom w:val="dashed" w:color="9AA5B1" w:sz="6"/>
-              <w:right w:val="dashed" w:color="9AA5B1" w:sz="6"/>
-            </w:tcBorders>
-            <w:shd w:fill="F5F7FA" w:val="clear"/>
-            <w:tcMar>
-              <w:top w:type="dxa" w:w="300"/>
-              <w:left w:type="dxa" w:w="160"/>
-              <w:bottom w:type="dxa" w:w="300"/>
-              <w:right w:type="dxa" w:w="160"/>
-            </w:tcMar>
-          </w:tcPr>
-          <w:p>
-            <w:pPr>
-              <w:spacing w:after="40"/>
-              <w:jc w:val="center"/>
-            </w:pPr>
-            <w:r>
-              <w:rPr>
-                <w:b/>
-                <w:bCs/>
-                <w:color w:val="6B7683"/>
-                <w:sz w:val="22"/>
-                <w:szCs w:val="22"/>
-              </w:rPr>
-              <w:t xml:space="preserve">[ FIGURA PENDIENTE DE CAPTURA ]</w:t>
-            </w:r>
-          </w:p>
-          <w:p>
-            <w:pPr>
-              <w:spacing w:after="0"/>
-              <w:jc w:val="center"/>
-            </w:pPr>
-            <w:r>
-              <w:rPr>
-                <w:i/>
-                <w:iCs/>
-                <w:color w:val="9AA5B1"/>
-                <w:sz w:val="20"/>
-                <w:szCs w:val="20"/>
-              </w:rPr>
-              <w:t xml:space="preserve">05_anulacion_aprobacion_01.png</w:t>
-            </w:r>
-          </w:p>
-        </w:tc>
-      </w:tr>
-    </w:tbl>
+    <w:p>
+      <w:pPr>
+        <w:spacing w:after="80" w:before="120"/>
+        <w:jc w:val="center"/>
+      </w:pPr>
+      <w:r>
+        <w:drawing>
+          <wp:inline distT="0" distB="0" distL="0" distR="0">
+            <wp:extent cx="5334000" cy="3362325"/>
+            <wp:effectExtent t="0" r="0" b="0" l="0"/>
+            <wp:docPr id="1" name="05_anulacion_aprobacion_01.png" descr="05_anulacion_aprobacion_01.png" title="05_anulacion_aprobacion_01.png"/>
+            <wp:cNvGraphicFramePr>
+              <a:graphicFrameLocks xmlns:a="http://schemas.openxmlformats.org/drawingml/2006/main" noChangeAspect="1"/>
+            </wp:cNvGraphicFramePr>
+            <a:graphic xmlns:a="http://schemas.openxmlformats.org/drawingml/2006/main">
+              <a:graphicData uri="http://schemas.openxmlformats.org/drawingml/2006/picture">
+                <pic:pic xmlns:pic="http://schemas.openxmlformats.org/drawingml/2006/picture">
+                  <pic:nvPicPr>
+                    <pic:cNvPr id="0" name="" descr=""/>
+                    <pic:cNvPicPr>
+                      <a:picLocks noChangeAspect="1" noChangeArrowheads="1"/>
+                    </pic:cNvPicPr>
+                  </pic:nvPicPr>
+                  <pic:blipFill>
+                    <a:blip r:embed="rId19" cstate="none"/>
+                    <a:srcRect/>
+                    <a:stretch>
+                      <a:fillRect/>
+                    </a:stretch>
+                  </pic:blipFill>
+                  <pic:spPr bwMode="auto">
+                    <a:xfrm>
+                      <a:off x="0" y="0"/>
+                      <a:ext cx="5334000" cy="3362325"/>
+                    </a:xfrm>
+                    <a:prstGeom prst="rect">
+                      <a:avLst/>
+                    </a:prstGeom>
+                  </pic:spPr>
+                </pic:pic>
+              </a:graphicData>
+            </a:graphic>
+          </wp:inline>
+        </w:drawing>
+      </w:r>
+    </w:p>
     <w:p>
       <w:pPr>
         <w:spacing w:after="200"/>
@@ -3938,7 +3646,7 @@
           <w:sz w:val="20"/>
           <w:szCs w:val="20"/>
         </w:rPr>
-        <w:t xml:space="preserve">Figura 11. Aprobación o rechazo de la anulación.</w:t>
+        <w:t xml:space="preserve">Figura 10. Aprobación o rechazo de la anulación.</w:t>
       </w:r>
     </w:p>
     <w:tbl>
@@ -4138,73 +3846,52 @@
         <w:t xml:space="preserve">Puede filtrar los movimientos por tipo para ubicarlos más rápido.</w:t>
       </w:r>
     </w:p>
-    <w:tbl>
-      <w:tblPr>
-        <w:tblW w:type="pct" w:w="100%"/>
-        <w:tblBorders>
-          <w:top w:val="single" w:color="auto" w:sz="4"/>
-          <w:left w:val="single" w:color="auto" w:sz="4"/>
-          <w:bottom w:val="single" w:color="auto" w:sz="4"/>
-          <w:right w:val="single" w:color="auto" w:sz="4"/>
-          <w:insideH w:val="single" w:color="auto" w:sz="4"/>
-          <w:insideV w:val="single" w:color="auto" w:sz="4"/>
-        </w:tblBorders>
-      </w:tblPr>
-      <w:tblGrid>
-        <w:gridCol w:w="100"/>
-      </w:tblGrid>
-      <w:tr>
-        <w:tc>
-          <w:tcPr>
-            <w:tcBorders>
-              <w:top w:val="dashed" w:color="9AA5B1" w:sz="6"/>
-              <w:left w:val="dashed" w:color="9AA5B1" w:sz="6"/>
-              <w:bottom w:val="dashed" w:color="9AA5B1" w:sz="6"/>
-              <w:right w:val="dashed" w:color="9AA5B1" w:sz="6"/>
-            </w:tcBorders>
-            <w:shd w:fill="F5F7FA" w:val="clear"/>
-            <w:tcMar>
-              <w:top w:type="dxa" w:w="300"/>
-              <w:left w:type="dxa" w:w="160"/>
-              <w:bottom w:type="dxa" w:w="300"/>
-              <w:right w:type="dxa" w:w="160"/>
-            </w:tcMar>
-          </w:tcPr>
-          <w:p>
-            <w:pPr>
-              <w:spacing w:after="40"/>
-              <w:jc w:val="center"/>
-            </w:pPr>
-            <w:r>
-              <w:rPr>
-                <w:b/>
-                <w:bCs/>
-                <w:color w:val="6B7683"/>
-                <w:sz w:val="22"/>
-                <w:szCs w:val="22"/>
-              </w:rPr>
-              <w:t xml:space="preserve">[ FIGURA PENDIENTE DE CAPTURA ]</w:t>
-            </w:r>
-          </w:p>
-          <w:p>
-            <w:pPr>
-              <w:spacing w:after="0"/>
-              <w:jc w:val="center"/>
-            </w:pPr>
-            <w:r>
-              <w:rPr>
-                <w:i/>
-                <w:iCs/>
-                <w:color w:val="9AA5B1"/>
-                <w:sz w:val="20"/>
-                <w:szCs w:val="20"/>
-              </w:rPr>
-              <w:t xml:space="preserve">05_estado_caja_01.png</w:t>
-            </w:r>
-          </w:p>
-        </w:tc>
-      </w:tr>
-    </w:tbl>
+    <w:p>
+      <w:pPr>
+        <w:spacing w:after="80" w:before="120"/>
+        <w:jc w:val="center"/>
+      </w:pPr>
+      <w:r>
+        <w:drawing>
+          <wp:inline distT="0" distB="0" distL="0" distR="0">
+            <wp:extent cx="5334000" cy="2657475"/>
+            <wp:effectExtent t="0" r="0" b="0" l="0"/>
+            <wp:docPr id="1" name="05_estado_caja_01.png" descr="05_estado_caja_01.png" title="05_estado_caja_01.png"/>
+            <wp:cNvGraphicFramePr>
+              <a:graphicFrameLocks xmlns:a="http://schemas.openxmlformats.org/drawingml/2006/main" noChangeAspect="1"/>
+            </wp:cNvGraphicFramePr>
+            <a:graphic xmlns:a="http://schemas.openxmlformats.org/drawingml/2006/main">
+              <a:graphicData uri="http://schemas.openxmlformats.org/drawingml/2006/picture">
+                <pic:pic xmlns:pic="http://schemas.openxmlformats.org/drawingml/2006/picture">
+                  <pic:nvPicPr>
+                    <pic:cNvPr id="0" name="" descr=""/>
+                    <pic:cNvPicPr>
+                      <a:picLocks noChangeAspect="1" noChangeArrowheads="1"/>
+                    </pic:cNvPicPr>
+                  </pic:nvPicPr>
+                  <pic:blipFill>
+                    <a:blip r:embed="rId20" cstate="none"/>
+                    <a:srcRect/>
+                    <a:stretch>
+                      <a:fillRect/>
+                    </a:stretch>
+                  </pic:blipFill>
+                  <pic:spPr bwMode="auto">
+                    <a:xfrm>
+                      <a:off x="0" y="0"/>
+                      <a:ext cx="5334000" cy="2657475"/>
+                    </a:xfrm>
+                    <a:prstGeom prst="rect">
+                      <a:avLst/>
+                    </a:prstGeom>
+                  </pic:spPr>
+                </pic:pic>
+              </a:graphicData>
+            </a:graphic>
+          </wp:inline>
+        </w:drawing>
+      </w:r>
+    </w:p>
     <w:p>
       <w:pPr>
         <w:spacing w:after="200"/>
@@ -4217,7 +3904,7 @@
           <w:sz w:val="20"/>
           <w:szCs w:val="20"/>
         </w:rPr>
-        <w:t xml:space="preserve">Figura 12. Estado de caja: saldo por moneda y movimientos.</w:t>
+        <w:t xml:space="preserve">Figura 11. Estado de caja: saldo por moneda y movimientos.</w:t>
       </w:r>
     </w:p>
     <w:tbl>
@@ -4460,73 +4147,52 @@
         <w:t xml:space="preserve">.</w:t>
       </w:r>
     </w:p>
-    <w:tbl>
-      <w:tblPr>
-        <w:tblW w:type="pct" w:w="100%"/>
-        <w:tblBorders>
-          <w:top w:val="single" w:color="auto" w:sz="4"/>
-          <w:left w:val="single" w:color="auto" w:sz="4"/>
-          <w:bottom w:val="single" w:color="auto" w:sz="4"/>
-          <w:right w:val="single" w:color="auto" w:sz="4"/>
-          <w:insideH w:val="single" w:color="auto" w:sz="4"/>
-          <w:insideV w:val="single" w:color="auto" w:sz="4"/>
-        </w:tblBorders>
-      </w:tblPr>
-      <w:tblGrid>
-        <w:gridCol w:w="100"/>
-      </w:tblGrid>
-      <w:tr>
-        <w:tc>
-          <w:tcPr>
-            <w:tcBorders>
-              <w:top w:val="dashed" w:color="9AA5B1" w:sz="6"/>
-              <w:left w:val="dashed" w:color="9AA5B1" w:sz="6"/>
-              <w:bottom w:val="dashed" w:color="9AA5B1" w:sz="6"/>
-              <w:right w:val="dashed" w:color="9AA5B1" w:sz="6"/>
-            </w:tcBorders>
-            <w:shd w:fill="F5F7FA" w:val="clear"/>
-            <w:tcMar>
-              <w:top w:type="dxa" w:w="300"/>
-              <w:left w:type="dxa" w:w="160"/>
-              <w:bottom w:type="dxa" w:w="300"/>
-              <w:right w:type="dxa" w:w="160"/>
-            </w:tcMar>
-          </w:tcPr>
-          <w:p>
-            <w:pPr>
-              <w:spacing w:after="40"/>
-              <w:jc w:val="center"/>
-            </w:pPr>
-            <w:r>
-              <w:rPr>
-                <w:b/>
-                <w:bCs/>
-                <w:color w:val="6B7683"/>
-                <w:sz w:val="22"/>
-                <w:szCs w:val="22"/>
-              </w:rPr>
-              <w:t xml:space="preserve">[ FIGURA PENDIENTE DE CAPTURA ]</w:t>
-            </w:r>
-          </w:p>
-          <w:p>
-            <w:pPr>
-              <w:spacing w:after="0"/>
-              <w:jc w:val="center"/>
-            </w:pPr>
-            <w:r>
-              <w:rPr>
-                <w:i/>
-                <w:iCs/>
-                <w:color w:val="9AA5B1"/>
-                <w:sz w:val="20"/>
-                <w:szCs w:val="20"/>
-              </w:rPr>
-              <w:t xml:space="preserve">05_cierre_caja_01.png</w:t>
-            </w:r>
-          </w:p>
-        </w:tc>
-      </w:tr>
-    </w:tbl>
+    <w:p>
+      <w:pPr>
+        <w:spacing w:after="80" w:before="120"/>
+        <w:jc w:val="center"/>
+      </w:pPr>
+      <w:r>
+        <w:drawing>
+          <wp:inline distT="0" distB="0" distL="0" distR="0">
+            <wp:extent cx="5334000" cy="2714625"/>
+            <wp:effectExtent t="0" r="0" b="0" l="0"/>
+            <wp:docPr id="1" name="05_cierre_caja_01.png" descr="05_cierre_caja_01.png" title="05_cierre_caja_01.png"/>
+            <wp:cNvGraphicFramePr>
+              <a:graphicFrameLocks xmlns:a="http://schemas.openxmlformats.org/drawingml/2006/main" noChangeAspect="1"/>
+            </wp:cNvGraphicFramePr>
+            <a:graphic xmlns:a="http://schemas.openxmlformats.org/drawingml/2006/main">
+              <a:graphicData uri="http://schemas.openxmlformats.org/drawingml/2006/picture">
+                <pic:pic xmlns:pic="http://schemas.openxmlformats.org/drawingml/2006/picture">
+                  <pic:nvPicPr>
+                    <pic:cNvPr id="0" name="" descr=""/>
+                    <pic:cNvPicPr>
+                      <a:picLocks noChangeAspect="1" noChangeArrowheads="1"/>
+                    </pic:cNvPicPr>
+                  </pic:nvPicPr>
+                  <pic:blipFill>
+                    <a:blip r:embed="rId21" cstate="none"/>
+                    <a:srcRect/>
+                    <a:stretch>
+                      <a:fillRect/>
+                    </a:stretch>
+                  </pic:blipFill>
+                  <pic:spPr bwMode="auto">
+                    <a:xfrm>
+                      <a:off x="0" y="0"/>
+                      <a:ext cx="5334000" cy="2714625"/>
+                    </a:xfrm>
+                    <a:prstGeom prst="rect">
+                      <a:avLst/>
+                    </a:prstGeom>
+                  </pic:spPr>
+                </pic:pic>
+              </a:graphicData>
+            </a:graphic>
+          </wp:inline>
+        </w:drawing>
+      </w:r>
+    </w:p>
     <w:p>
       <w:pPr>
         <w:spacing w:after="200"/>
@@ -4539,7 +4205,7 @@
           <w:sz w:val="20"/>
           <w:szCs w:val="20"/>
         </w:rPr>
-        <w:t xml:space="preserve">Figura 13. Cierre de caja: arqueo con el monto declarado.</w:t>
+        <w:t xml:space="preserve">Figura 12. Cierre de caja: arqueo con el monto declarado.</w:t>
       </w:r>
     </w:p>
     <w:p>
@@ -4565,73 +4231,52 @@
         <w:t xml:space="preserve">, listo para imprimir.</w:t>
       </w:r>
     </w:p>
-    <w:tbl>
-      <w:tblPr>
-        <w:tblW w:type="pct" w:w="100%"/>
-        <w:tblBorders>
-          <w:top w:val="single" w:color="auto" w:sz="4"/>
-          <w:left w:val="single" w:color="auto" w:sz="4"/>
-          <w:bottom w:val="single" w:color="auto" w:sz="4"/>
-          <w:right w:val="single" w:color="auto" w:sz="4"/>
-          <w:insideH w:val="single" w:color="auto" w:sz="4"/>
-          <w:insideV w:val="single" w:color="auto" w:sz="4"/>
-        </w:tblBorders>
-      </w:tblPr>
-      <w:tblGrid>
-        <w:gridCol w:w="100"/>
-      </w:tblGrid>
-      <w:tr>
-        <w:tc>
-          <w:tcPr>
-            <w:tcBorders>
-              <w:top w:val="dashed" w:color="9AA5B1" w:sz="6"/>
-              <w:left w:val="dashed" w:color="9AA5B1" w:sz="6"/>
-              <w:bottom w:val="dashed" w:color="9AA5B1" w:sz="6"/>
-              <w:right w:val="dashed" w:color="9AA5B1" w:sz="6"/>
-            </w:tcBorders>
-            <w:shd w:fill="F5F7FA" w:val="clear"/>
-            <w:tcMar>
-              <w:top w:type="dxa" w:w="300"/>
-              <w:left w:type="dxa" w:w="160"/>
-              <w:bottom w:type="dxa" w:w="300"/>
-              <w:right w:type="dxa" w:w="160"/>
-            </w:tcMar>
-          </w:tcPr>
-          <w:p>
-            <w:pPr>
-              <w:spacing w:after="40"/>
-              <w:jc w:val="center"/>
-            </w:pPr>
-            <w:r>
-              <w:rPr>
-                <w:b/>
-                <w:bCs/>
-                <w:color w:val="6B7683"/>
-                <w:sz w:val="22"/>
-                <w:szCs w:val="22"/>
-              </w:rPr>
-              <w:t xml:space="preserve">[ FIGURA PENDIENTE DE CAPTURA ]</w:t>
-            </w:r>
-          </w:p>
-          <w:p>
-            <w:pPr>
-              <w:spacing w:after="0"/>
-              <w:jc w:val="center"/>
-            </w:pPr>
-            <w:r>
-              <w:rPr>
-                <w:i/>
-                <w:iCs/>
-                <w:color w:val="9AA5B1"/>
-                <w:sz w:val="20"/>
-                <w:szCs w:val="20"/>
-              </w:rPr>
-              <w:t xml:space="preserve">05_cierre_caja_02.png</w:t>
-            </w:r>
-          </w:p>
-        </w:tc>
-      </w:tr>
-    </w:tbl>
+    <w:p>
+      <w:pPr>
+        <w:spacing w:after="80" w:before="120"/>
+        <w:jc w:val="center"/>
+      </w:pPr>
+      <w:r>
+        <w:drawing>
+          <wp:inline distT="0" distB="0" distL="0" distR="0">
+            <wp:extent cx="5334000" cy="2619375"/>
+            <wp:effectExtent t="0" r="0" b="0" l="0"/>
+            <wp:docPr id="1" name="05_cierre_caja_02.png" descr="05_cierre_caja_02.png" title="05_cierre_caja_02.png"/>
+            <wp:cNvGraphicFramePr>
+              <a:graphicFrameLocks xmlns:a="http://schemas.openxmlformats.org/drawingml/2006/main" noChangeAspect="1"/>
+            </wp:cNvGraphicFramePr>
+            <a:graphic xmlns:a="http://schemas.openxmlformats.org/drawingml/2006/main">
+              <a:graphicData uri="http://schemas.openxmlformats.org/drawingml/2006/picture">
+                <pic:pic xmlns:pic="http://schemas.openxmlformats.org/drawingml/2006/picture">
+                  <pic:nvPicPr>
+                    <pic:cNvPr id="0" name="" descr=""/>
+                    <pic:cNvPicPr>
+                      <a:picLocks noChangeAspect="1" noChangeArrowheads="1"/>
+                    </pic:cNvPicPr>
+                  </pic:nvPicPr>
+                  <pic:blipFill>
+                    <a:blip r:embed="rId22" cstate="none"/>
+                    <a:srcRect/>
+                    <a:stretch>
+                      <a:fillRect/>
+                    </a:stretch>
+                  </pic:blipFill>
+                  <pic:spPr bwMode="auto">
+                    <a:xfrm>
+                      <a:off x="0" y="0"/>
+                      <a:ext cx="5334000" cy="2619375"/>
+                    </a:xfrm>
+                    <a:prstGeom prst="rect">
+                      <a:avLst/>
+                    </a:prstGeom>
+                  </pic:spPr>
+                </pic:pic>
+              </a:graphicData>
+            </a:graphic>
+          </wp:inline>
+        </w:drawing>
+      </w:r>
+    </w:p>
     <w:p>
       <w:pPr>
         <w:spacing w:after="200"/>
@@ -4644,7 +4289,7 @@
           <w:sz w:val="20"/>
           <w:szCs w:val="20"/>
         </w:rPr>
-        <w:t xml:space="preserve">Figura 14. Documento de arqueo de caja.</w:t>
+        <w:t xml:space="preserve">Figura 13. Documento de arqueo de caja.</w:t>
       </w:r>
     </w:p>
     <w:tbl>

</xml_diff>

<commit_message>
docs(manual-usuario): agrega el módulo Cobranzas (cap. 6)
Escala el molde validado al 2º módulo. Tareas (Rol: Cajero): cobrar una cuota y
emitir el recibo (Cobranzas → Cobros → Detalle de Cuotas → Cobro de Cuotas,
método de pago + monto recibido → Cobrar/Imprimir = recibo), reimprimir un recibo
(Recibos de Cobro) y consultar las cuentas por cobrar de un cliente. Pasos y
pantallas tomados de la app real; sin inventar el "estado de cuenta" (no existe
como página, se reencuadra como consulta de la cuenta por cobrar).

Slots de figura con placeholder (6 capturas pendientes del alumno, en la guía).
Se retira el subtítulo "Piloto" de la portada (el documento ya es multi-módulo).
</commit_message>
<xml_diff>
--- a/doc/manual_usuario/MUESTRA_Manual_Usuario.docx
+++ b/doc/manual_usuario/MUESTRA_Manual_Usuario.docx
@@ -39,19 +39,6 @@
           <w:szCs w:val="36"/>
         </w:rPr>
         <w:t xml:space="preserve">MANUAL DE USUARIO</w:t>
-      </w:r>
-    </w:p>
-    <w:p>
-      <w:pPr>
-        <w:spacing w:after="0" w:line="360" w:lineRule="auto"/>
-        <w:jc w:val="center"/>
-      </w:pPr>
-      <w:r>
-        <w:rPr>
-          <w:sz w:val="36"/>
-          <w:szCs w:val="36"/>
-        </w:rPr>
-        <w:t xml:space="preserve">(Piloto — Módulo Facturación y Caja)</w:t>
       </w:r>
     </w:p>
     <w:p>
@@ -4349,6 +4336,1420 @@
             </w:r>
             <w:r>
               <w:t xml:space="preserve"> positiva indica sobrante y una negativa, faltante.</w:t>
+            </w:r>
+          </w:p>
+        </w:tc>
+      </w:tr>
+    </w:tbl>
+    <w:p>
+      <w:pPr>
+        <w:pageBreakBefore/>
+      </w:pPr>
+      <w:r>
+        <w:t xml:space="preserve"/>
+      </w:r>
+    </w:p>
+    <w:p>
+      <w:pPr>
+        <w:pStyle w:val="Heading1"/>
+        <w:spacing w:after="160" w:before="240"/>
+      </w:pPr>
+      <w:r>
+        <w:rPr>
+          <w:b/>
+          <w:bCs/>
+        </w:rPr>
+        <w:t xml:space="preserve">6. Cobranzas</w:t>
+      </w:r>
+    </w:p>
+    <w:p>
+      <w:pPr>
+        <w:spacing w:after="160" w:before="0" w:line="360" w:lineRule="auto"/>
+        <w:jc w:val="both"/>
+      </w:pPr>
+      <w:r>
+        <w:t xml:space="preserve">Este módulo permite registrar el cobro de las cuotas de las ventas a crédito y emitir el recibo correspondiente, reimprimir recibos ya emitidos y consultar las cuentas por cobrar de un cliente. La siguiente tabla indica qué tarea realiza cada rol.</w:t>
+      </w:r>
+    </w:p>
+    <w:tbl>
+      <w:tblPr>
+        <w:tblW w:type="pct" w:w="100%"/>
+        <w:tblBorders>
+          <w:top w:val="single" w:color="auto" w:sz="4"/>
+          <w:left w:val="single" w:color="auto" w:sz="4"/>
+          <w:bottom w:val="single" w:color="auto" w:sz="4"/>
+          <w:right w:val="single" w:color="auto" w:sz="4"/>
+          <w:insideH w:val="single" w:color="auto" w:sz="4"/>
+          <w:insideV w:val="single" w:color="auto" w:sz="4"/>
+        </w:tblBorders>
+      </w:tblPr>
+      <w:tblGrid>
+        <w:gridCol w:w="100"/>
+        <w:gridCol w:w="100"/>
+      </w:tblGrid>
+      <w:tr>
+        <w:trPr>
+          <w:tblHeader/>
+        </w:trPr>
+        <w:tc>
+          <w:tcPr>
+            <w:tcW w:type="pct" w:w="26%"/>
+            <w:tcBorders>
+              <w:top w:val="single" w:color="AAB4C0" w:sz="2"/>
+              <w:left w:val="single" w:color="AAB4C0" w:sz="2"/>
+              <w:bottom w:val="single" w:color="AAB4C0" w:sz="2"/>
+              <w:right w:val="single" w:color="AAB4C0" w:sz="2"/>
+            </w:tcBorders>
+            <w:shd w:fill="DCE9F5" w:val="clear"/>
+            <w:tcMar>
+              <w:top w:type="dxa" w:w="20"/>
+              <w:left w:type="dxa" w:w="70"/>
+              <w:bottom w:type="dxa" w:w="20"/>
+              <w:right w:type="dxa" w:w="70"/>
+            </w:tcMar>
+            <w:vAlign w:val="center"/>
+          </w:tcPr>
+          <w:p>
+            <w:pPr>
+              <w:spacing w:after="0" w:line="240" w:lineRule="auto"/>
+              <w:jc w:val="center"/>
+            </w:pPr>
+            <w:r>
+              <w:rPr>
+                <w:rFonts w:ascii="Times New Roman" w:cs="Times New Roman" w:eastAsia="Times New Roman" w:hAnsi="Times New Roman"/>
+                <w:b/>
+                <w:bCs/>
+                <w:sz w:val="18"/>
+                <w:szCs w:val="18"/>
+              </w:rPr>
+              <w:t xml:space="preserve">Rol</w:t>
+            </w:r>
+          </w:p>
+        </w:tc>
+        <w:tc>
+          <w:tcPr>
+            <w:tcW w:type="pct" w:w="74%"/>
+            <w:tcBorders>
+              <w:top w:val="single" w:color="AAB4C0" w:sz="2"/>
+              <w:left w:val="single" w:color="AAB4C0" w:sz="2"/>
+              <w:bottom w:val="single" w:color="AAB4C0" w:sz="2"/>
+              <w:right w:val="single" w:color="AAB4C0" w:sz="2"/>
+            </w:tcBorders>
+            <w:shd w:fill="DCE9F5" w:val="clear"/>
+            <w:tcMar>
+              <w:top w:type="dxa" w:w="20"/>
+              <w:left w:type="dxa" w:w="70"/>
+              <w:bottom w:type="dxa" w:w="20"/>
+              <w:right w:type="dxa" w:w="70"/>
+            </w:tcMar>
+            <w:vAlign w:val="center"/>
+          </w:tcPr>
+          <w:p>
+            <w:pPr>
+              <w:spacing w:after="0" w:line="240" w:lineRule="auto"/>
+              <w:jc w:val="center"/>
+            </w:pPr>
+            <w:r>
+              <w:rPr>
+                <w:rFonts w:ascii="Times New Roman" w:cs="Times New Roman" w:eastAsia="Times New Roman" w:hAnsi="Times New Roman"/>
+                <w:b/>
+                <w:bCs/>
+                <w:sz w:val="18"/>
+                <w:szCs w:val="18"/>
+              </w:rPr>
+              <w:t xml:space="preserve">Tareas</w:t>
+            </w:r>
+          </w:p>
+        </w:tc>
+      </w:tr>
+      <w:tr>
+        <w:tc>
+          <w:tcPr>
+            <w:tcW w:type="pct" w:w="26%"/>
+            <w:tcBorders>
+              <w:top w:val="single" w:color="AAB4C0" w:sz="2"/>
+              <w:left w:val="single" w:color="AAB4C0" w:sz="2"/>
+              <w:bottom w:val="single" w:color="AAB4C0" w:sz="2"/>
+              <w:right w:val="single" w:color="AAB4C0" w:sz="2"/>
+            </w:tcBorders>
+            <w:tcMar>
+              <w:top w:type="dxa" w:w="20"/>
+              <w:left w:type="dxa" w:w="70"/>
+              <w:bottom w:type="dxa" w:w="20"/>
+              <w:right w:type="dxa" w:w="70"/>
+            </w:tcMar>
+            <w:vAlign w:val="center"/>
+          </w:tcPr>
+          <w:p>
+            <w:pPr>
+              <w:spacing w:after="0" w:line="240" w:lineRule="auto"/>
+              <w:jc w:val="left"/>
+            </w:pPr>
+            <w:r>
+              <w:rPr>
+                <w:rFonts w:ascii="Times New Roman" w:cs="Times New Roman" w:eastAsia="Times New Roman" w:hAnsi="Times New Roman"/>
+                <w:sz w:val="18"/>
+                <w:szCs w:val="18"/>
+              </w:rPr>
+              <w:t xml:space="preserve">Cajero</w:t>
+            </w:r>
+          </w:p>
+        </w:tc>
+        <w:tc>
+          <w:tcPr>
+            <w:tcW w:type="pct" w:w="74%"/>
+            <w:tcBorders>
+              <w:top w:val="single" w:color="AAB4C0" w:sz="2"/>
+              <w:left w:val="single" w:color="AAB4C0" w:sz="2"/>
+              <w:bottom w:val="single" w:color="AAB4C0" w:sz="2"/>
+              <w:right w:val="single" w:color="AAB4C0" w:sz="2"/>
+            </w:tcBorders>
+            <w:tcMar>
+              <w:top w:type="dxa" w:w="20"/>
+              <w:left w:type="dxa" w:w="70"/>
+              <w:bottom w:type="dxa" w:w="20"/>
+              <w:right w:type="dxa" w:w="70"/>
+            </w:tcMar>
+            <w:vAlign w:val="center"/>
+          </w:tcPr>
+          <w:p>
+            <w:pPr>
+              <w:spacing w:after="0" w:line="240" w:lineRule="auto"/>
+              <w:jc w:val="left"/>
+            </w:pPr>
+            <w:r>
+              <w:rPr>
+                <w:rFonts w:ascii="Times New Roman" w:cs="Times New Roman" w:eastAsia="Times New Roman" w:hAnsi="Times New Roman"/>
+                <w:sz w:val="18"/>
+                <w:szCs w:val="18"/>
+              </w:rPr>
+              <w:t xml:space="preserve">Cobrar una cuota y emitir el recibo · Reimprimir un recibo · Consultar las cuentas por cobrar de un cliente.</w:t>
+            </w:r>
+          </w:p>
+        </w:tc>
+      </w:tr>
+    </w:tbl>
+    <w:p>
+      <w:pPr>
+        <w:spacing w:after="200"/>
+        <w:jc w:val="center"/>
+      </w:pPr>
+      <w:r>
+        <w:rPr>
+          <w:i/>
+          <w:iCs/>
+          <w:sz w:val="20"/>
+          <w:szCs w:val="20"/>
+        </w:rPr>
+        <w:t xml:space="preserve">Tabla 3. Roles y tareas del módulo Cobranzas.</w:t>
+      </w:r>
+    </w:p>
+    <w:p>
+      <w:pPr>
+        <w:pStyle w:val="Heading2"/>
+        <w:spacing w:after="120" w:before="200"/>
+      </w:pPr>
+      <w:r>
+        <w:rPr>
+          <w:b/>
+          <w:bCs/>
+        </w:rPr>
+        <w:t xml:space="preserve">6.1. Cobrar una cuota y emitir el recibo</w:t>
+      </w:r>
+    </w:p>
+    <w:p>
+      <w:pPr>
+        <w:spacing w:after="160" w:line="360" w:lineRule="auto"/>
+        <w:jc w:val="both"/>
+      </w:pPr>
+      <w:r>
+        <w:rPr>
+          <w:b/>
+          <w:bCs/>
+        </w:rPr>
+        <w:t xml:space="preserve">Rol: </w:t>
+      </w:r>
+      <w:r>
+        <w:t xml:space="preserve">Cajero.</w:t>
+      </w:r>
+    </w:p>
+    <w:p>
+      <w:pPr>
+        <w:spacing w:after="160" w:line="360" w:lineRule="auto"/>
+        <w:jc w:val="both"/>
+      </w:pPr>
+      <w:r>
+        <w:rPr>
+          <w:b/>
+          <w:bCs/>
+        </w:rPr>
+        <w:t xml:space="preserve">Objetivo: </w:t>
+      </w:r>
+      <w:r>
+        <w:t xml:space="preserve">registrar el pago de una cuota pendiente de una venta a crédito y emitir el recibo.</w:t>
+      </w:r>
+    </w:p>
+    <w:tbl>
+      <w:tblPr>
+        <w:tblW w:type="pct" w:w="100%"/>
+        <w:tblBorders>
+          <w:top w:val="single" w:color="auto" w:sz="4"/>
+          <w:left w:val="single" w:color="auto" w:sz="4"/>
+          <w:bottom w:val="single" w:color="auto" w:sz="4"/>
+          <w:right w:val="single" w:color="auto" w:sz="4"/>
+          <w:insideH w:val="single" w:color="auto" w:sz="4"/>
+          <w:insideV w:val="single" w:color="auto" w:sz="4"/>
+        </w:tblBorders>
+      </w:tblPr>
+      <w:tblGrid>
+        <w:gridCol w:w="100"/>
+      </w:tblGrid>
+      <w:tr>
+        <w:tc>
+          <w:tcPr>
+            <w:tcBorders>
+              <w:top w:val="single" w:color="C0392B" w:sz="2"/>
+              <w:left w:val="single" w:color="C0392B" w:sz="24"/>
+              <w:bottom w:val="single" w:color="C0392B" w:sz="2"/>
+              <w:right w:val="single" w:color="C0392B" w:sz="2"/>
+            </w:tcBorders>
+            <w:shd w:fill="FDECEA" w:val="clear"/>
+            <w:tcMar>
+              <w:top w:type="dxa" w:w="80"/>
+              <w:left w:type="dxa" w:w="160"/>
+              <w:bottom w:type="dxa" w:w="80"/>
+              <w:right w:type="dxa" w:w="160"/>
+            </w:tcMar>
+          </w:tcPr>
+          <w:p>
+            <w:pPr>
+              <w:spacing w:after="0" w:line="300"/>
+              <w:jc w:val="both"/>
+            </w:pPr>
+            <w:r>
+              <w:rPr>
+                <w:b/>
+                <w:bCs/>
+                <w:color w:val="C0392B"/>
+              </w:rPr>
+              <w:t xml:space="preserve">Importante: </w:t>
+            </w:r>
+            <w:r>
+              <w:t xml:space="preserve">Para cobrar debe tener su </w:t>
+            </w:r>
+            <w:r>
+              <w:rPr>
+                <w:b/>
+                <w:bCs/>
+              </w:rPr>
+              <w:t xml:space="preserve">caja abierta</w:t>
+            </w:r>
+            <w:r>
+              <w:t xml:space="preserve"> (ver 5.1) y un </w:t>
+            </w:r>
+            <w:r>
+              <w:rPr>
+                <w:b/>
+                <w:bCs/>
+              </w:rPr>
+              <w:t xml:space="preserve">talonario de recibo</w:t>
+            </w:r>
+            <w:r>
+              <w:t xml:space="preserve"> vigente. El cobro corresponde a facturas emitidas </w:t>
+            </w:r>
+            <w:r>
+              <w:rPr>
+                <w:b/>
+                <w:bCs/>
+              </w:rPr>
+              <w:t xml:space="preserve">a crédito</w:t>
+            </w:r>
+            <w:r>
+              <w:t xml:space="preserve">.</w:t>
+            </w:r>
+          </w:p>
+        </w:tc>
+      </w:tr>
+    </w:tbl>
+    <w:p>
+      <w:pPr>
+        <w:pStyle w:val="Heading3"/>
+        <w:spacing w:after="60" w:before="160"/>
+      </w:pPr>
+      <w:r>
+        <w:rPr>
+          <w:b/>
+          <w:bCs/>
+        </w:rPr>
+        <w:t xml:space="preserve">Pasos</w:t>
+      </w:r>
+    </w:p>
+    <w:p>
+      <w:pPr>
+        <w:pStyle w:val="ListParagraph"/>
+        <w:numPr>
+          <w:ilvl w:val="0"/>
+          <w:numId w:val="11"/>
+        </w:numPr>
+        <w:spacing w:after="60" w:line="360" w:lineRule="auto"/>
+      </w:pPr>
+      <w:r>
+        <w:t xml:space="preserve">En el menú, ingrese a </w:t>
+      </w:r>
+      <w:r>
+        <w:rPr>
+          <w:b/>
+          <w:bCs/>
+        </w:rPr>
+        <w:t xml:space="preserve">Cobranzas → Cobros</w:t>
+      </w:r>
+      <w:r>
+        <w:t xml:space="preserve">. Se muestra la lista de cuentas por cobrar.</w:t>
+      </w:r>
+    </w:p>
+    <w:p>
+      <w:pPr>
+        <w:pStyle w:val="ListParagraph"/>
+        <w:numPr>
+          <w:ilvl w:val="0"/>
+          <w:numId w:val="11"/>
+        </w:numPr>
+        <w:spacing w:after="60" w:line="360" w:lineRule="auto"/>
+      </w:pPr>
+      <w:r>
+        <w:t xml:space="preserve">Ubique la cuenta por cobrar del cliente y ábrala. Se muestra el </w:t>
+      </w:r>
+      <w:r>
+        <w:rPr>
+          <w:b/>
+          <w:bCs/>
+        </w:rPr>
+        <w:t xml:space="preserve">Detalle de Cuotas</w:t>
+      </w:r>
+      <w:r>
+        <w:t xml:space="preserve">.</w:t>
+      </w:r>
+    </w:p>
+    <w:tbl>
+      <w:tblPr>
+        <w:tblW w:type="pct" w:w="100%"/>
+        <w:tblBorders>
+          <w:top w:val="single" w:color="auto" w:sz="4"/>
+          <w:left w:val="single" w:color="auto" w:sz="4"/>
+          <w:bottom w:val="single" w:color="auto" w:sz="4"/>
+          <w:right w:val="single" w:color="auto" w:sz="4"/>
+          <w:insideH w:val="single" w:color="auto" w:sz="4"/>
+          <w:insideV w:val="single" w:color="auto" w:sz="4"/>
+        </w:tblBorders>
+      </w:tblPr>
+      <w:tblGrid>
+        <w:gridCol w:w="100"/>
+      </w:tblGrid>
+      <w:tr>
+        <w:tc>
+          <w:tcPr>
+            <w:tcBorders>
+              <w:top w:val="dashed" w:color="9AA5B1" w:sz="6"/>
+              <w:left w:val="dashed" w:color="9AA5B1" w:sz="6"/>
+              <w:bottom w:val="dashed" w:color="9AA5B1" w:sz="6"/>
+              <w:right w:val="dashed" w:color="9AA5B1" w:sz="6"/>
+            </w:tcBorders>
+            <w:shd w:fill="F5F7FA" w:val="clear"/>
+            <w:tcMar>
+              <w:top w:type="dxa" w:w="300"/>
+              <w:left w:type="dxa" w:w="160"/>
+              <w:bottom w:type="dxa" w:w="300"/>
+              <w:right w:type="dxa" w:w="160"/>
+            </w:tcMar>
+          </w:tcPr>
+          <w:p>
+            <w:pPr>
+              <w:spacing w:after="40"/>
+              <w:jc w:val="center"/>
+            </w:pPr>
+            <w:r>
+              <w:rPr>
+                <w:b/>
+                <w:bCs/>
+                <w:color w:val="6B7683"/>
+                <w:sz w:val="22"/>
+                <w:szCs w:val="22"/>
+              </w:rPr>
+              <w:t xml:space="preserve">[ FIGURA PENDIENTE DE CAPTURA ]</w:t>
+            </w:r>
+          </w:p>
+          <w:p>
+            <w:pPr>
+              <w:spacing w:after="0"/>
+              <w:jc w:val="center"/>
+            </w:pPr>
+            <w:r>
+              <w:rPr>
+                <w:i/>
+                <w:iCs/>
+                <w:color w:val="9AA5B1"/>
+                <w:sz w:val="20"/>
+                <w:szCs w:val="20"/>
+              </w:rPr>
+              <w:t xml:space="preserve">06_cobros_lista_01.png</w:t>
+            </w:r>
+          </w:p>
+        </w:tc>
+      </w:tr>
+    </w:tbl>
+    <w:p>
+      <w:pPr>
+        <w:spacing w:after="200"/>
+        <w:jc w:val="center"/>
+      </w:pPr>
+      <w:r>
+        <w:rPr>
+          <w:i/>
+          <w:iCs/>
+          <w:sz w:val="20"/>
+          <w:szCs w:val="20"/>
+        </w:rPr>
+        <w:t xml:space="preserve">Figura 14. Cobros: lista de cuentas por cobrar.</w:t>
+      </w:r>
+    </w:p>
+    <w:p>
+      <w:pPr>
+        <w:pStyle w:val="ListParagraph"/>
+        <w:numPr>
+          <w:ilvl w:val="0"/>
+          <w:numId w:val="11"/>
+        </w:numPr>
+        <w:spacing w:after="60" w:line="360" w:lineRule="auto"/>
+      </w:pPr>
+      <w:r>
+        <w:t xml:space="preserve">Seleccione la </w:t>
+      </w:r>
+      <w:r>
+        <w:rPr>
+          <w:b/>
+          <w:bCs/>
+        </w:rPr>
+        <w:t xml:space="preserve">cuota pendiente</w:t>
+      </w:r>
+      <w:r>
+        <w:t xml:space="preserve"> que va a cobrar. Se abre el formulario de </w:t>
+      </w:r>
+      <w:r>
+        <w:rPr>
+          <w:b/>
+          <w:bCs/>
+        </w:rPr>
+        <w:t xml:space="preserve">Cobro de Cuotas</w:t>
+      </w:r>
+      <w:r>
+        <w:t xml:space="preserve">.</w:t>
+      </w:r>
+    </w:p>
+    <w:tbl>
+      <w:tblPr>
+        <w:tblW w:type="pct" w:w="100%"/>
+        <w:tblBorders>
+          <w:top w:val="single" w:color="auto" w:sz="4"/>
+          <w:left w:val="single" w:color="auto" w:sz="4"/>
+          <w:bottom w:val="single" w:color="auto" w:sz="4"/>
+          <w:right w:val="single" w:color="auto" w:sz="4"/>
+          <w:insideH w:val="single" w:color="auto" w:sz="4"/>
+          <w:insideV w:val="single" w:color="auto" w:sz="4"/>
+        </w:tblBorders>
+      </w:tblPr>
+      <w:tblGrid>
+        <w:gridCol w:w="100"/>
+      </w:tblGrid>
+      <w:tr>
+        <w:tc>
+          <w:tcPr>
+            <w:tcBorders>
+              <w:top w:val="dashed" w:color="9AA5B1" w:sz="6"/>
+              <w:left w:val="dashed" w:color="9AA5B1" w:sz="6"/>
+              <w:bottom w:val="dashed" w:color="9AA5B1" w:sz="6"/>
+              <w:right w:val="dashed" w:color="9AA5B1" w:sz="6"/>
+            </w:tcBorders>
+            <w:shd w:fill="F5F7FA" w:val="clear"/>
+            <w:tcMar>
+              <w:top w:type="dxa" w:w="300"/>
+              <w:left w:type="dxa" w:w="160"/>
+              <w:bottom w:type="dxa" w:w="300"/>
+              <w:right w:type="dxa" w:w="160"/>
+            </w:tcMar>
+          </w:tcPr>
+          <w:p>
+            <w:pPr>
+              <w:spacing w:after="40"/>
+              <w:jc w:val="center"/>
+            </w:pPr>
+            <w:r>
+              <w:rPr>
+                <w:b/>
+                <w:bCs/>
+                <w:color w:val="6B7683"/>
+                <w:sz w:val="22"/>
+                <w:szCs w:val="22"/>
+              </w:rPr>
+              <w:t xml:space="preserve">[ FIGURA PENDIENTE DE CAPTURA ]</w:t>
+            </w:r>
+          </w:p>
+          <w:p>
+            <w:pPr>
+              <w:spacing w:after="0"/>
+              <w:jc w:val="center"/>
+            </w:pPr>
+            <w:r>
+              <w:rPr>
+                <w:i/>
+                <w:iCs/>
+                <w:color w:val="9AA5B1"/>
+                <w:sz w:val="20"/>
+                <w:szCs w:val="20"/>
+              </w:rPr>
+              <w:t xml:space="preserve">06_cobros_cuotas_01.png</w:t>
+            </w:r>
+          </w:p>
+        </w:tc>
+      </w:tr>
+    </w:tbl>
+    <w:p>
+      <w:pPr>
+        <w:spacing w:after="200"/>
+        <w:jc w:val="center"/>
+      </w:pPr>
+      <w:r>
+        <w:rPr>
+          <w:i/>
+          <w:iCs/>
+          <w:sz w:val="20"/>
+          <w:szCs w:val="20"/>
+        </w:rPr>
+        <w:t xml:space="preserve">Figura 15. Detalle de cuotas de la cuenta por cobrar.</w:t>
+      </w:r>
+    </w:p>
+    <w:p>
+      <w:pPr>
+        <w:pStyle w:val="ListParagraph"/>
+        <w:numPr>
+          <w:ilvl w:val="0"/>
+          <w:numId w:val="11"/>
+        </w:numPr>
+        <w:spacing w:after="60" w:line="360" w:lineRule="auto"/>
+      </w:pPr>
+      <w:r>
+        <w:t xml:space="preserve">Elija el </w:t>
+      </w:r>
+      <w:r>
+        <w:rPr>
+          <w:b/>
+          <w:bCs/>
+        </w:rPr>
+        <w:t xml:space="preserve">Método de Pago</w:t>
+      </w:r>
+      <w:r>
+        <w:t xml:space="preserve"> e ingrese el </w:t>
+      </w:r>
+      <w:r>
+        <w:rPr>
+          <w:b/>
+          <w:bCs/>
+        </w:rPr>
+        <w:t xml:space="preserve">Monto Pago Recibido</w:t>
+      </w:r>
+      <w:r>
+        <w:t xml:space="preserve"> (el efectivo que entrega el cliente). El sistema calcula el </w:t>
+      </w:r>
+      <w:r>
+        <w:rPr>
+          <w:b/>
+          <w:bCs/>
+        </w:rPr>
+        <w:t xml:space="preserve">vuelto</w:t>
+      </w:r>
+      <w:r>
+        <w:t xml:space="preserve">. Si corresponde, indique el </w:t>
+      </w:r>
+      <w:r>
+        <w:rPr>
+          <w:b/>
+          <w:bCs/>
+        </w:rPr>
+        <w:t xml:space="preserve">nº de referencia</w:t>
+      </w:r>
+      <w:r>
+        <w:t xml:space="preserve">.</w:t>
+      </w:r>
+    </w:p>
+    <w:p>
+      <w:pPr>
+        <w:pStyle w:val="ListParagraph"/>
+        <w:numPr>
+          <w:ilvl w:val="0"/>
+          <w:numId w:val="11"/>
+        </w:numPr>
+        <w:spacing w:after="60" w:line="360" w:lineRule="auto"/>
+      </w:pPr>
+      <w:r>
+        <w:t xml:space="preserve">Presione </w:t>
+      </w:r>
+      <w:r>
+        <w:rPr>
+          <w:b/>
+          <w:bCs/>
+        </w:rPr>
+        <w:t xml:space="preserve">Cobrar</w:t>
+      </w:r>
+      <w:r>
+        <w:t xml:space="preserve">. El sistema registra el cobro, marca la cuota </w:t>
+      </w:r>
+      <w:r>
+        <w:rPr>
+          <w:b/>
+          <w:bCs/>
+        </w:rPr>
+        <w:t xml:space="preserve">Pagada</w:t>
+      </w:r>
+      <w:r>
+        <w:t xml:space="preserve">, descuenta el saldo de la cuenta por cobrar y genera el </w:t>
+      </w:r>
+      <w:r>
+        <w:rPr>
+          <w:b/>
+          <w:bCs/>
+        </w:rPr>
+        <w:t xml:space="preserve">número de recibo</w:t>
+      </w:r>
+      <w:r>
+        <w:t xml:space="preserve">.</w:t>
+      </w:r>
+    </w:p>
+    <w:tbl>
+      <w:tblPr>
+        <w:tblW w:type="pct" w:w="100%"/>
+        <w:tblBorders>
+          <w:top w:val="single" w:color="auto" w:sz="4"/>
+          <w:left w:val="single" w:color="auto" w:sz="4"/>
+          <w:bottom w:val="single" w:color="auto" w:sz="4"/>
+          <w:right w:val="single" w:color="auto" w:sz="4"/>
+          <w:insideH w:val="single" w:color="auto" w:sz="4"/>
+          <w:insideV w:val="single" w:color="auto" w:sz="4"/>
+        </w:tblBorders>
+      </w:tblPr>
+      <w:tblGrid>
+        <w:gridCol w:w="100"/>
+      </w:tblGrid>
+      <w:tr>
+        <w:tc>
+          <w:tcPr>
+            <w:tcBorders>
+              <w:top w:val="dashed" w:color="9AA5B1" w:sz="6"/>
+              <w:left w:val="dashed" w:color="9AA5B1" w:sz="6"/>
+              <w:bottom w:val="dashed" w:color="9AA5B1" w:sz="6"/>
+              <w:right w:val="dashed" w:color="9AA5B1" w:sz="6"/>
+            </w:tcBorders>
+            <w:shd w:fill="F5F7FA" w:val="clear"/>
+            <w:tcMar>
+              <w:top w:type="dxa" w:w="300"/>
+              <w:left w:type="dxa" w:w="160"/>
+              <w:bottom w:type="dxa" w:w="300"/>
+              <w:right w:type="dxa" w:w="160"/>
+            </w:tcMar>
+          </w:tcPr>
+          <w:p>
+            <w:pPr>
+              <w:spacing w:after="40"/>
+              <w:jc w:val="center"/>
+            </w:pPr>
+            <w:r>
+              <w:rPr>
+                <w:b/>
+                <w:bCs/>
+                <w:color w:val="6B7683"/>
+                <w:sz w:val="22"/>
+                <w:szCs w:val="22"/>
+              </w:rPr>
+              <w:t xml:space="preserve">[ FIGURA PENDIENTE DE CAPTURA ]</w:t>
+            </w:r>
+          </w:p>
+          <w:p>
+            <w:pPr>
+              <w:spacing w:after="0"/>
+              <w:jc w:val="center"/>
+            </w:pPr>
+            <w:r>
+              <w:rPr>
+                <w:i/>
+                <w:iCs/>
+                <w:color w:val="9AA5B1"/>
+                <w:sz w:val="20"/>
+                <w:szCs w:val="20"/>
+              </w:rPr>
+              <w:t xml:space="preserve">06_cobros_pago_01.png</w:t>
+            </w:r>
+          </w:p>
+        </w:tc>
+      </w:tr>
+    </w:tbl>
+    <w:p>
+      <w:pPr>
+        <w:spacing w:after="200"/>
+        <w:jc w:val="center"/>
+      </w:pPr>
+      <w:r>
+        <w:rPr>
+          <w:i/>
+          <w:iCs/>
+          <w:sz w:val="20"/>
+          <w:szCs w:val="20"/>
+        </w:rPr>
+        <w:t xml:space="preserve">Figura 16. Cobro de cuota: método de pago y monto recibido.</w:t>
+      </w:r>
+    </w:p>
+    <w:p>
+      <w:pPr>
+        <w:pStyle w:val="ListParagraph"/>
+        <w:numPr>
+          <w:ilvl w:val="0"/>
+          <w:numId w:val="11"/>
+        </w:numPr>
+        <w:spacing w:after="60" w:line="360" w:lineRule="auto"/>
+      </w:pPr>
+      <w:r>
+        <w:t xml:space="preserve">Presione </w:t>
+      </w:r>
+      <w:r>
+        <w:rPr>
+          <w:b/>
+          <w:bCs/>
+        </w:rPr>
+        <w:t xml:space="preserve">Imprimir</w:t>
+      </w:r>
+      <w:r>
+        <w:t xml:space="preserve"> para ver el </w:t>
+      </w:r>
+      <w:r>
+        <w:rPr>
+          <w:b/>
+          <w:bCs/>
+        </w:rPr>
+        <w:t xml:space="preserve">documento del recibo</w:t>
+      </w:r>
+      <w:r>
+        <w:t xml:space="preserve">, listo para imprimir o guardar.</w:t>
+      </w:r>
+    </w:p>
+    <w:tbl>
+      <w:tblPr>
+        <w:tblW w:type="pct" w:w="100%"/>
+        <w:tblBorders>
+          <w:top w:val="single" w:color="auto" w:sz="4"/>
+          <w:left w:val="single" w:color="auto" w:sz="4"/>
+          <w:bottom w:val="single" w:color="auto" w:sz="4"/>
+          <w:right w:val="single" w:color="auto" w:sz="4"/>
+          <w:insideH w:val="single" w:color="auto" w:sz="4"/>
+          <w:insideV w:val="single" w:color="auto" w:sz="4"/>
+        </w:tblBorders>
+      </w:tblPr>
+      <w:tblGrid>
+        <w:gridCol w:w="100"/>
+      </w:tblGrid>
+      <w:tr>
+        <w:tc>
+          <w:tcPr>
+            <w:tcBorders>
+              <w:top w:val="dashed" w:color="9AA5B1" w:sz="6"/>
+              <w:left w:val="dashed" w:color="9AA5B1" w:sz="6"/>
+              <w:bottom w:val="dashed" w:color="9AA5B1" w:sz="6"/>
+              <w:right w:val="dashed" w:color="9AA5B1" w:sz="6"/>
+            </w:tcBorders>
+            <w:shd w:fill="F5F7FA" w:val="clear"/>
+            <w:tcMar>
+              <w:top w:type="dxa" w:w="300"/>
+              <w:left w:type="dxa" w:w="160"/>
+              <w:bottom w:type="dxa" w:w="300"/>
+              <w:right w:type="dxa" w:w="160"/>
+            </w:tcMar>
+          </w:tcPr>
+          <w:p>
+            <w:pPr>
+              <w:spacing w:after="40"/>
+              <w:jc w:val="center"/>
+            </w:pPr>
+            <w:r>
+              <w:rPr>
+                <w:b/>
+                <w:bCs/>
+                <w:color w:val="6B7683"/>
+                <w:sz w:val="22"/>
+                <w:szCs w:val="22"/>
+              </w:rPr>
+              <w:t xml:space="preserve">[ FIGURA PENDIENTE DE CAPTURA ]</w:t>
+            </w:r>
+          </w:p>
+          <w:p>
+            <w:pPr>
+              <w:spacing w:after="0"/>
+              <w:jc w:val="center"/>
+            </w:pPr>
+            <w:r>
+              <w:rPr>
+                <w:i/>
+                <w:iCs/>
+                <w:color w:val="9AA5B1"/>
+                <w:sz w:val="20"/>
+                <w:szCs w:val="20"/>
+              </w:rPr>
+              <w:t xml:space="preserve">06_cobros_recibo_01.png</w:t>
+            </w:r>
+          </w:p>
+        </w:tc>
+      </w:tr>
+    </w:tbl>
+    <w:p>
+      <w:pPr>
+        <w:spacing w:after="200"/>
+        <w:jc w:val="center"/>
+      </w:pPr>
+      <w:r>
+        <w:rPr>
+          <w:i/>
+          <w:iCs/>
+          <w:sz w:val="20"/>
+          <w:szCs w:val="20"/>
+        </w:rPr>
+        <w:t xml:space="preserve">Figura 17. Documento del recibo de cobro.</w:t>
+      </w:r>
+    </w:p>
+    <w:tbl>
+      <w:tblPr>
+        <w:tblW w:type="pct" w:w="100%"/>
+        <w:tblBorders>
+          <w:top w:val="single" w:color="auto" w:sz="4"/>
+          <w:left w:val="single" w:color="auto" w:sz="4"/>
+          <w:bottom w:val="single" w:color="auto" w:sz="4"/>
+          <w:right w:val="single" w:color="auto" w:sz="4"/>
+          <w:insideH w:val="single" w:color="auto" w:sz="4"/>
+          <w:insideV w:val="single" w:color="auto" w:sz="4"/>
+        </w:tblBorders>
+      </w:tblPr>
+      <w:tblGrid>
+        <w:gridCol w:w="100"/>
+      </w:tblGrid>
+      <w:tr>
+        <w:tc>
+          <w:tcPr>
+            <w:tcBorders>
+              <w:top w:val="single" w:color="2E6DA4" w:sz="2"/>
+              <w:left w:val="single" w:color="2E6DA4" w:sz="24"/>
+              <w:bottom w:val="single" w:color="2E6DA4" w:sz="2"/>
+              <w:right w:val="single" w:color="2E6DA4" w:sz="2"/>
+            </w:tcBorders>
+            <w:shd w:fill="E8F1FB" w:val="clear"/>
+            <w:tcMar>
+              <w:top w:type="dxa" w:w="80"/>
+              <w:left w:type="dxa" w:w="160"/>
+              <w:bottom w:type="dxa" w:w="80"/>
+              <w:right w:type="dxa" w:w="160"/>
+            </w:tcMar>
+          </w:tcPr>
+          <w:p>
+            <w:pPr>
+              <w:spacing w:after="0" w:line="300"/>
+              <w:jc w:val="both"/>
+            </w:pPr>
+            <w:r>
+              <w:rPr>
+                <w:b/>
+                <w:bCs/>
+                <w:color w:val="2E6DA4"/>
+              </w:rPr>
+              <w:t xml:space="preserve">Nota: </w:t>
+            </w:r>
+            <w:r>
+              <w:t xml:space="preserve">Si la cuota estaba </w:t>
+            </w:r>
+            <w:r>
+              <w:rPr>
+                <w:b/>
+                <w:bCs/>
+              </w:rPr>
+              <w:t xml:space="preserve">vencida</w:t>
+            </w:r>
+            <w:r>
+              <w:t xml:space="preserve">, igual puede cobrarse. Al cobrar la última cuota, la cuenta por cobrar queda </w:t>
+            </w:r>
+            <w:r>
+              <w:rPr>
+                <w:b/>
+                <w:bCs/>
+              </w:rPr>
+              <w:t xml:space="preserve">saldada</w:t>
+            </w:r>
+            <w:r>
+              <w:t xml:space="preserve"> (Pagada).</w:t>
+            </w:r>
+          </w:p>
+        </w:tc>
+      </w:tr>
+    </w:tbl>
+    <w:p>
+      <w:pPr>
+        <w:pageBreakBefore/>
+      </w:pPr>
+      <w:r>
+        <w:t xml:space="preserve"/>
+      </w:r>
+    </w:p>
+    <w:p>
+      <w:pPr>
+        <w:pStyle w:val="Heading2"/>
+        <w:spacing w:after="120" w:before="200"/>
+      </w:pPr>
+      <w:r>
+        <w:rPr>
+          <w:b/>
+          <w:bCs/>
+        </w:rPr>
+        <w:t xml:space="preserve">6.2. Reimprimir un recibo</w:t>
+      </w:r>
+    </w:p>
+    <w:p>
+      <w:pPr>
+        <w:spacing w:after="160" w:line="360" w:lineRule="auto"/>
+        <w:jc w:val="both"/>
+      </w:pPr>
+      <w:r>
+        <w:rPr>
+          <w:b/>
+          <w:bCs/>
+        </w:rPr>
+        <w:t xml:space="preserve">Rol: </w:t>
+      </w:r>
+      <w:r>
+        <w:t xml:space="preserve">Cajero.</w:t>
+      </w:r>
+    </w:p>
+    <w:p>
+      <w:pPr>
+        <w:spacing w:after="160" w:line="360" w:lineRule="auto"/>
+        <w:jc w:val="both"/>
+      </w:pPr>
+      <w:r>
+        <w:rPr>
+          <w:b/>
+          <w:bCs/>
+        </w:rPr>
+        <w:t xml:space="preserve">Objetivo: </w:t>
+      </w:r>
+      <w:r>
+        <w:t xml:space="preserve">volver a imprimir un recibo de cobro ya emitido.</w:t>
+      </w:r>
+    </w:p>
+    <w:p>
+      <w:pPr>
+        <w:pStyle w:val="Heading3"/>
+        <w:spacing w:after="60" w:before="160"/>
+      </w:pPr>
+      <w:r>
+        <w:rPr>
+          <w:b/>
+          <w:bCs/>
+        </w:rPr>
+        <w:t xml:space="preserve">Pasos</w:t>
+      </w:r>
+    </w:p>
+    <w:p>
+      <w:pPr>
+        <w:pStyle w:val="ListParagraph"/>
+        <w:numPr>
+          <w:ilvl w:val="0"/>
+          <w:numId w:val="12"/>
+        </w:numPr>
+        <w:spacing w:after="60" w:line="360" w:lineRule="auto"/>
+      </w:pPr>
+      <w:r>
+        <w:t xml:space="preserve">En el menú, ingrese a </w:t>
+      </w:r>
+      <w:r>
+        <w:rPr>
+          <w:b/>
+          <w:bCs/>
+        </w:rPr>
+        <w:t xml:space="preserve">Cobranzas → Recibos de Cobro</w:t>
+      </w:r>
+      <w:r>
+        <w:t xml:space="preserve">. Se muestra la lista de recibos emitidos.</w:t>
+      </w:r>
+    </w:p>
+    <w:p>
+      <w:pPr>
+        <w:pStyle w:val="ListParagraph"/>
+        <w:numPr>
+          <w:ilvl w:val="0"/>
+          <w:numId w:val="12"/>
+        </w:numPr>
+        <w:spacing w:after="60" w:line="360" w:lineRule="auto"/>
+      </w:pPr>
+      <w:r>
+        <w:t xml:space="preserve">Ubique el recibo y ábralo. Se muestra el </w:t>
+      </w:r>
+      <w:r>
+        <w:rPr>
+          <w:b/>
+          <w:bCs/>
+        </w:rPr>
+        <w:t xml:space="preserve">documento del recibo</w:t>
+      </w:r>
+      <w:r>
+        <w:t xml:space="preserve">, listo para reimprimir o guardar.</w:t>
+      </w:r>
+    </w:p>
+    <w:tbl>
+      <w:tblPr>
+        <w:tblW w:type="pct" w:w="100%"/>
+        <w:tblBorders>
+          <w:top w:val="single" w:color="auto" w:sz="4"/>
+          <w:left w:val="single" w:color="auto" w:sz="4"/>
+          <w:bottom w:val="single" w:color="auto" w:sz="4"/>
+          <w:right w:val="single" w:color="auto" w:sz="4"/>
+          <w:insideH w:val="single" w:color="auto" w:sz="4"/>
+          <w:insideV w:val="single" w:color="auto" w:sz="4"/>
+        </w:tblBorders>
+      </w:tblPr>
+      <w:tblGrid>
+        <w:gridCol w:w="100"/>
+      </w:tblGrid>
+      <w:tr>
+        <w:tc>
+          <w:tcPr>
+            <w:tcBorders>
+              <w:top w:val="dashed" w:color="9AA5B1" w:sz="6"/>
+              <w:left w:val="dashed" w:color="9AA5B1" w:sz="6"/>
+              <w:bottom w:val="dashed" w:color="9AA5B1" w:sz="6"/>
+              <w:right w:val="dashed" w:color="9AA5B1" w:sz="6"/>
+            </w:tcBorders>
+            <w:shd w:fill="F5F7FA" w:val="clear"/>
+            <w:tcMar>
+              <w:top w:type="dxa" w:w="300"/>
+              <w:left w:type="dxa" w:w="160"/>
+              <w:bottom w:type="dxa" w:w="300"/>
+              <w:right w:type="dxa" w:w="160"/>
+            </w:tcMar>
+          </w:tcPr>
+          <w:p>
+            <w:pPr>
+              <w:spacing w:after="40"/>
+              <w:jc w:val="center"/>
+            </w:pPr>
+            <w:r>
+              <w:rPr>
+                <w:b/>
+                <w:bCs/>
+                <w:color w:val="6B7683"/>
+                <w:sz w:val="22"/>
+                <w:szCs w:val="22"/>
+              </w:rPr>
+              <w:t xml:space="preserve">[ FIGURA PENDIENTE DE CAPTURA ]</w:t>
+            </w:r>
+          </w:p>
+          <w:p>
+            <w:pPr>
+              <w:spacing w:after="0"/>
+              <w:jc w:val="center"/>
+            </w:pPr>
+            <w:r>
+              <w:rPr>
+                <w:i/>
+                <w:iCs/>
+                <w:color w:val="9AA5B1"/>
+                <w:sz w:val="20"/>
+                <w:szCs w:val="20"/>
+              </w:rPr>
+              <w:t xml:space="preserve">06_recibos_reimpresion_01.png</w:t>
+            </w:r>
+          </w:p>
+        </w:tc>
+      </w:tr>
+    </w:tbl>
+    <w:p>
+      <w:pPr>
+        <w:spacing w:after="200"/>
+        <w:jc w:val="center"/>
+      </w:pPr>
+      <w:r>
+        <w:rPr>
+          <w:i/>
+          <w:iCs/>
+          <w:sz w:val="20"/>
+          <w:szCs w:val="20"/>
+        </w:rPr>
+        <w:t xml:space="preserve">Figura 18. Recibos de Cobro: lista para reimprimir.</w:t>
+      </w:r>
+    </w:p>
+    <w:p>
+      <w:pPr>
+        <w:pageBreakBefore/>
+      </w:pPr>
+      <w:r>
+        <w:t xml:space="preserve"/>
+      </w:r>
+    </w:p>
+    <w:p>
+      <w:pPr>
+        <w:pStyle w:val="Heading2"/>
+        <w:spacing w:after="120" w:before="200"/>
+      </w:pPr>
+      <w:r>
+        <w:rPr>
+          <w:b/>
+          <w:bCs/>
+        </w:rPr>
+        <w:t xml:space="preserve">6.3. Consultar las cuentas por cobrar de un cliente</w:t>
+      </w:r>
+    </w:p>
+    <w:p>
+      <w:pPr>
+        <w:spacing w:after="160" w:line="360" w:lineRule="auto"/>
+        <w:jc w:val="both"/>
+      </w:pPr>
+      <w:r>
+        <w:rPr>
+          <w:b/>
+          <w:bCs/>
+        </w:rPr>
+        <w:t xml:space="preserve">Rol: </w:t>
+      </w:r>
+      <w:r>
+        <w:t xml:space="preserve">Cajero.</w:t>
+      </w:r>
+    </w:p>
+    <w:p>
+      <w:pPr>
+        <w:spacing w:after="160" w:line="360" w:lineRule="auto"/>
+        <w:jc w:val="both"/>
+      </w:pPr>
+      <w:r>
+        <w:rPr>
+          <w:b/>
+          <w:bCs/>
+        </w:rPr>
+        <w:t xml:space="preserve">Objetivo: </w:t>
+      </w:r>
+      <w:r>
+        <w:t xml:space="preserve">revisar las cuotas y el saldo pendiente de un cliente.</w:t>
+      </w:r>
+    </w:p>
+    <w:p>
+      <w:pPr>
+        <w:pStyle w:val="Heading3"/>
+        <w:spacing w:after="60" w:before="160"/>
+      </w:pPr>
+      <w:r>
+        <w:rPr>
+          <w:b/>
+          <w:bCs/>
+        </w:rPr>
+        <w:t xml:space="preserve">Pasos</w:t>
+      </w:r>
+    </w:p>
+    <w:p>
+      <w:pPr>
+        <w:pStyle w:val="ListParagraph"/>
+        <w:numPr>
+          <w:ilvl w:val="0"/>
+          <w:numId w:val="13"/>
+        </w:numPr>
+        <w:spacing w:after="60" w:line="360" w:lineRule="auto"/>
+      </w:pPr>
+      <w:r>
+        <w:t xml:space="preserve">En el menú, ingrese a </w:t>
+      </w:r>
+      <w:r>
+        <w:rPr>
+          <w:b/>
+          <w:bCs/>
+        </w:rPr>
+        <w:t xml:space="preserve">Cobranzas → Cobros</w:t>
+      </w:r>
+      <w:r>
+        <w:t xml:space="preserve">.</w:t>
+      </w:r>
+    </w:p>
+    <w:p>
+      <w:pPr>
+        <w:pStyle w:val="ListParagraph"/>
+        <w:numPr>
+          <w:ilvl w:val="0"/>
+          <w:numId w:val="13"/>
+        </w:numPr>
+        <w:spacing w:after="60" w:line="360" w:lineRule="auto"/>
+      </w:pPr>
+      <w:r>
+        <w:t xml:space="preserve">Ubique la cuenta por cobrar del cliente en la lista.</w:t>
+      </w:r>
+    </w:p>
+    <w:p>
+      <w:pPr>
+        <w:pStyle w:val="ListParagraph"/>
+        <w:numPr>
+          <w:ilvl w:val="0"/>
+          <w:numId w:val="13"/>
+        </w:numPr>
+        <w:spacing w:after="60" w:line="360" w:lineRule="auto"/>
+      </w:pPr>
+      <w:r>
+        <w:t xml:space="preserve">Ábrala para ver el </w:t>
+      </w:r>
+      <w:r>
+        <w:rPr>
+          <w:b/>
+          <w:bCs/>
+        </w:rPr>
+        <w:t xml:space="preserve">Detalle de Cuotas</w:t>
+      </w:r>
+      <w:r>
+        <w:t xml:space="preserve">: número de cuota, vencimiento, monto, estado (pendiente, pagada o vencida) y el saldo pendiente.</w:t>
+      </w:r>
+    </w:p>
+    <w:tbl>
+      <w:tblPr>
+        <w:tblW w:type="pct" w:w="100%"/>
+        <w:tblBorders>
+          <w:top w:val="single" w:color="auto" w:sz="4"/>
+          <w:left w:val="single" w:color="auto" w:sz="4"/>
+          <w:bottom w:val="single" w:color="auto" w:sz="4"/>
+          <w:right w:val="single" w:color="auto" w:sz="4"/>
+          <w:insideH w:val="single" w:color="auto" w:sz="4"/>
+          <w:insideV w:val="single" w:color="auto" w:sz="4"/>
+        </w:tblBorders>
+      </w:tblPr>
+      <w:tblGrid>
+        <w:gridCol w:w="100"/>
+      </w:tblGrid>
+      <w:tr>
+        <w:tc>
+          <w:tcPr>
+            <w:tcBorders>
+              <w:top w:val="dashed" w:color="9AA5B1" w:sz="6"/>
+              <w:left w:val="dashed" w:color="9AA5B1" w:sz="6"/>
+              <w:bottom w:val="dashed" w:color="9AA5B1" w:sz="6"/>
+              <w:right w:val="dashed" w:color="9AA5B1" w:sz="6"/>
+            </w:tcBorders>
+            <w:shd w:fill="F5F7FA" w:val="clear"/>
+            <w:tcMar>
+              <w:top w:type="dxa" w:w="300"/>
+              <w:left w:type="dxa" w:w="160"/>
+              <w:bottom w:type="dxa" w:w="300"/>
+              <w:right w:type="dxa" w:w="160"/>
+            </w:tcMar>
+          </w:tcPr>
+          <w:p>
+            <w:pPr>
+              <w:spacing w:after="40"/>
+              <w:jc w:val="center"/>
+            </w:pPr>
+            <w:r>
+              <w:rPr>
+                <w:b/>
+                <w:bCs/>
+                <w:color w:val="6B7683"/>
+                <w:sz w:val="22"/>
+                <w:szCs w:val="22"/>
+              </w:rPr>
+              <w:t xml:space="preserve">[ FIGURA PENDIENTE DE CAPTURA ]</w:t>
+            </w:r>
+          </w:p>
+          <w:p>
+            <w:pPr>
+              <w:spacing w:after="0"/>
+              <w:jc w:val="center"/>
+            </w:pPr>
+            <w:r>
+              <w:rPr>
+                <w:i/>
+                <w:iCs/>
+                <w:color w:val="9AA5B1"/>
+                <w:sz w:val="20"/>
+                <w:szCs w:val="20"/>
+              </w:rPr>
+              <w:t xml:space="preserve">06_cuenta_cliente_01.png</w:t>
+            </w:r>
+          </w:p>
+        </w:tc>
+      </w:tr>
+    </w:tbl>
+    <w:p>
+      <w:pPr>
+        <w:spacing w:after="200"/>
+        <w:jc w:val="center"/>
+      </w:pPr>
+      <w:r>
+        <w:rPr>
+          <w:i/>
+          <w:iCs/>
+          <w:sz w:val="20"/>
+          <w:szCs w:val="20"/>
+        </w:rPr>
+        <w:t xml:space="preserve">Figura 19. Detalle de cuotas y saldo del cliente.</w:t>
+      </w:r>
+    </w:p>
+    <w:tbl>
+      <w:tblPr>
+        <w:tblW w:type="pct" w:w="100%"/>
+        <w:tblBorders>
+          <w:top w:val="single" w:color="auto" w:sz="4"/>
+          <w:left w:val="single" w:color="auto" w:sz="4"/>
+          <w:bottom w:val="single" w:color="auto" w:sz="4"/>
+          <w:right w:val="single" w:color="auto" w:sz="4"/>
+          <w:insideH w:val="single" w:color="auto" w:sz="4"/>
+          <w:insideV w:val="single" w:color="auto" w:sz="4"/>
+        </w:tblBorders>
+      </w:tblPr>
+      <w:tblGrid>
+        <w:gridCol w:w="100"/>
+      </w:tblGrid>
+      <w:tr>
+        <w:tc>
+          <w:tcPr>
+            <w:tcBorders>
+              <w:top w:val="single" w:color="2E6DA4" w:sz="2"/>
+              <w:left w:val="single" w:color="2E6DA4" w:sz="24"/>
+              <w:bottom w:val="single" w:color="2E6DA4" w:sz="2"/>
+              <w:right w:val="single" w:color="2E6DA4" w:sz="2"/>
+            </w:tcBorders>
+            <w:shd w:fill="E8F1FB" w:val="clear"/>
+            <w:tcMar>
+              <w:top w:type="dxa" w:w="80"/>
+              <w:left w:type="dxa" w:w="160"/>
+              <w:bottom w:type="dxa" w:w="80"/>
+              <w:right w:type="dxa" w:w="160"/>
+            </w:tcMar>
+          </w:tcPr>
+          <w:p>
+            <w:pPr>
+              <w:spacing w:after="0" w:line="300"/>
+              <w:jc w:val="both"/>
+            </w:pPr>
+            <w:r>
+              <w:rPr>
+                <w:b/>
+                <w:bCs/>
+                <w:color w:val="2E6DA4"/>
+              </w:rPr>
+              <w:t xml:space="preserve">Nota: </w:t>
+            </w:r>
+            <w:r>
+              <w:t xml:space="preserve">Desde esta vista también puede iniciar el </w:t>
+            </w:r>
+            <w:r>
+              <w:rPr>
+                <w:b/>
+                <w:bCs/>
+              </w:rPr>
+              <w:t xml:space="preserve">cobro</w:t>
+            </w:r>
+            <w:r>
+              <w:t xml:space="preserve"> de una cuota (ver 6.1).</w:t>
             </w:r>
           </w:p>
         </w:tc>
@@ -4736,6 +6137,24 @@
     </w:lvlOverride>
   </w:num>
   <w:num w:numId="10">
+    <w:abstractNumId w:val="3"/>
+    <w:lvlOverride w:ilvl="0">
+      <w:startOverride w:val="1"/>
+    </w:lvlOverride>
+  </w:num>
+  <w:num w:numId="11">
+    <w:abstractNumId w:val="3"/>
+    <w:lvlOverride w:ilvl="0">
+      <w:startOverride w:val="1"/>
+    </w:lvlOverride>
+  </w:num>
+  <w:num w:numId="12">
+    <w:abstractNumId w:val="3"/>
+    <w:lvlOverride w:ilvl="0">
+      <w:startOverride w:val="1"/>
+    </w:lvlOverride>
+  </w:num>
+  <w:num w:numId="13">
     <w:abstractNumId w:val="3"/>
     <w:lvlOverride w:ilvl="0">
       <w:startOverride w:val="1"/>

</xml_diff>

<commit_message>
docs(manual-usuario): agrega el módulo Notas de Crédito (cap. 7)
Tercer módulo. Tareas (Rol: Supervisor): solicitar una nota de crédito (desde la
factura en Ventas → Proceso Ventas → Solicitar NC: motivo, tipo total/parcial,
Cantidad para devolución o Precio Nuevo para descuento/ajuste), aprobar o rechazar
(Ventas → Notas de Crédito, con desglose y efectos stock/caja/CxC según motivo) e
imprimir el documento. Pantallas y flujo tomados de la app real (P124/P125/P126/P127).

Slots de figura con placeholder (5 capturas pendientes, en la guía).
</commit_message>
<xml_diff>
--- a/doc/manual_usuario/MUESTRA_Manual_Usuario.docx
+++ b/doc/manual_usuario/MUESTRA_Manual_Usuario.docx
@@ -5755,6 +5755,1313 @@
         </w:tc>
       </w:tr>
     </w:tbl>
+    <w:p>
+      <w:pPr>
+        <w:pageBreakBefore/>
+      </w:pPr>
+      <w:r>
+        <w:t xml:space="preserve"/>
+      </w:r>
+    </w:p>
+    <w:p>
+      <w:pPr>
+        <w:pStyle w:val="Heading1"/>
+        <w:spacing w:after="160" w:before="240"/>
+      </w:pPr>
+      <w:r>
+        <w:rPr>
+          <w:b/>
+          <w:bCs/>
+        </w:rPr>
+        <w:t xml:space="preserve">7. Notas de Crédito</w:t>
+      </w:r>
+    </w:p>
+    <w:p>
+      <w:pPr>
+        <w:spacing w:after="160" w:before="0" w:line="360" w:lineRule="auto"/>
+        <w:jc w:val="both"/>
+      </w:pPr>
+      <w:r>
+        <w:t xml:space="preserve">Una nota de crédito permite revertir total o parcialmente una factura cuando ya pasó el plazo de anulación (48 horas). A diferencia de la anulación, la factura original permanece activa y la nota de crédito es un documento nuevo. Según el motivo, al aprobarse reingresa stock (devolución), afecta la caja (si la factura fue de contado) o ajusta la cuenta por cobrar (si fue a crédito). La siguiente tabla indica qué tarea realiza cada rol.</w:t>
+      </w:r>
+    </w:p>
+    <w:tbl>
+      <w:tblPr>
+        <w:tblW w:type="pct" w:w="100%"/>
+        <w:tblBorders>
+          <w:top w:val="single" w:color="auto" w:sz="4"/>
+          <w:left w:val="single" w:color="auto" w:sz="4"/>
+          <w:bottom w:val="single" w:color="auto" w:sz="4"/>
+          <w:right w:val="single" w:color="auto" w:sz="4"/>
+          <w:insideH w:val="single" w:color="auto" w:sz="4"/>
+          <w:insideV w:val="single" w:color="auto" w:sz="4"/>
+        </w:tblBorders>
+      </w:tblPr>
+      <w:tblGrid>
+        <w:gridCol w:w="100"/>
+        <w:gridCol w:w="100"/>
+      </w:tblGrid>
+      <w:tr>
+        <w:trPr>
+          <w:tblHeader/>
+        </w:trPr>
+        <w:tc>
+          <w:tcPr>
+            <w:tcW w:type="pct" w:w="26%"/>
+            <w:tcBorders>
+              <w:top w:val="single" w:color="AAB4C0" w:sz="2"/>
+              <w:left w:val="single" w:color="AAB4C0" w:sz="2"/>
+              <w:bottom w:val="single" w:color="AAB4C0" w:sz="2"/>
+              <w:right w:val="single" w:color="AAB4C0" w:sz="2"/>
+            </w:tcBorders>
+            <w:shd w:fill="DCE9F5" w:val="clear"/>
+            <w:tcMar>
+              <w:top w:type="dxa" w:w="20"/>
+              <w:left w:type="dxa" w:w="70"/>
+              <w:bottom w:type="dxa" w:w="20"/>
+              <w:right w:type="dxa" w:w="70"/>
+            </w:tcMar>
+            <w:vAlign w:val="center"/>
+          </w:tcPr>
+          <w:p>
+            <w:pPr>
+              <w:spacing w:after="0" w:line="240" w:lineRule="auto"/>
+              <w:jc w:val="center"/>
+            </w:pPr>
+            <w:r>
+              <w:rPr>
+                <w:rFonts w:ascii="Times New Roman" w:cs="Times New Roman" w:eastAsia="Times New Roman" w:hAnsi="Times New Roman"/>
+                <w:b/>
+                <w:bCs/>
+                <w:sz w:val="18"/>
+                <w:szCs w:val="18"/>
+              </w:rPr>
+              <w:t xml:space="preserve">Rol</w:t>
+            </w:r>
+          </w:p>
+        </w:tc>
+        <w:tc>
+          <w:tcPr>
+            <w:tcW w:type="pct" w:w="74%"/>
+            <w:tcBorders>
+              <w:top w:val="single" w:color="AAB4C0" w:sz="2"/>
+              <w:left w:val="single" w:color="AAB4C0" w:sz="2"/>
+              <w:bottom w:val="single" w:color="AAB4C0" w:sz="2"/>
+              <w:right w:val="single" w:color="AAB4C0" w:sz="2"/>
+            </w:tcBorders>
+            <w:shd w:fill="DCE9F5" w:val="clear"/>
+            <w:tcMar>
+              <w:top w:type="dxa" w:w="20"/>
+              <w:left w:type="dxa" w:w="70"/>
+              <w:bottom w:type="dxa" w:w="20"/>
+              <w:right w:type="dxa" w:w="70"/>
+            </w:tcMar>
+            <w:vAlign w:val="center"/>
+          </w:tcPr>
+          <w:p>
+            <w:pPr>
+              <w:spacing w:after="0" w:line="240" w:lineRule="auto"/>
+              <w:jc w:val="center"/>
+            </w:pPr>
+            <w:r>
+              <w:rPr>
+                <w:rFonts w:ascii="Times New Roman" w:cs="Times New Roman" w:eastAsia="Times New Roman" w:hAnsi="Times New Roman"/>
+                <w:b/>
+                <w:bCs/>
+                <w:sz w:val="18"/>
+                <w:szCs w:val="18"/>
+              </w:rPr>
+              <w:t xml:space="preserve">Tareas</w:t>
+            </w:r>
+          </w:p>
+        </w:tc>
+      </w:tr>
+      <w:tr>
+        <w:tc>
+          <w:tcPr>
+            <w:tcW w:type="pct" w:w="26%"/>
+            <w:tcBorders>
+              <w:top w:val="single" w:color="AAB4C0" w:sz="2"/>
+              <w:left w:val="single" w:color="AAB4C0" w:sz="2"/>
+              <w:bottom w:val="single" w:color="AAB4C0" w:sz="2"/>
+              <w:right w:val="single" w:color="AAB4C0" w:sz="2"/>
+            </w:tcBorders>
+            <w:tcMar>
+              <w:top w:type="dxa" w:w="20"/>
+              <w:left w:type="dxa" w:w="70"/>
+              <w:bottom w:type="dxa" w:w="20"/>
+              <w:right w:type="dxa" w:w="70"/>
+            </w:tcMar>
+            <w:vAlign w:val="center"/>
+          </w:tcPr>
+          <w:p>
+            <w:pPr>
+              <w:spacing w:after="0" w:line="240" w:lineRule="auto"/>
+              <w:jc w:val="left"/>
+            </w:pPr>
+            <w:r>
+              <w:rPr>
+                <w:rFonts w:ascii="Times New Roman" w:cs="Times New Roman" w:eastAsia="Times New Roman" w:hAnsi="Times New Roman"/>
+                <w:sz w:val="18"/>
+                <w:szCs w:val="18"/>
+              </w:rPr>
+              <w:t xml:space="preserve">Supervisor</w:t>
+            </w:r>
+          </w:p>
+        </w:tc>
+        <w:tc>
+          <w:tcPr>
+            <w:tcW w:type="pct" w:w="74%"/>
+            <w:tcBorders>
+              <w:top w:val="single" w:color="AAB4C0" w:sz="2"/>
+              <w:left w:val="single" w:color="AAB4C0" w:sz="2"/>
+              <w:bottom w:val="single" w:color="AAB4C0" w:sz="2"/>
+              <w:right w:val="single" w:color="AAB4C0" w:sz="2"/>
+            </w:tcBorders>
+            <w:tcMar>
+              <w:top w:type="dxa" w:w="20"/>
+              <w:left w:type="dxa" w:w="70"/>
+              <w:bottom w:type="dxa" w:w="20"/>
+              <w:right w:type="dxa" w:w="70"/>
+            </w:tcMar>
+            <w:vAlign w:val="center"/>
+          </w:tcPr>
+          <w:p>
+            <w:pPr>
+              <w:spacing w:after="0" w:line="240" w:lineRule="auto"/>
+              <w:jc w:val="left"/>
+            </w:pPr>
+            <w:r>
+              <w:rPr>
+                <w:rFonts w:ascii="Times New Roman" w:cs="Times New Roman" w:eastAsia="Times New Roman" w:hAnsi="Times New Roman"/>
+                <w:sz w:val="18"/>
+                <w:szCs w:val="18"/>
+              </w:rPr>
+              <w:t xml:space="preserve">Solicitar una nota de crédito · Aprobar o rechazar una solicitud · Imprimir la nota de crédito.</w:t>
+            </w:r>
+          </w:p>
+        </w:tc>
+      </w:tr>
+    </w:tbl>
+    <w:p>
+      <w:pPr>
+        <w:spacing w:after="200"/>
+        <w:jc w:val="center"/>
+      </w:pPr>
+      <w:r>
+        <w:rPr>
+          <w:i/>
+          <w:iCs/>
+          <w:sz w:val="20"/>
+          <w:szCs w:val="20"/>
+        </w:rPr>
+        <w:t xml:space="preserve">Tabla 4. Roles y tareas del módulo Notas de Crédito.</w:t>
+      </w:r>
+    </w:p>
+    <w:p>
+      <w:pPr>
+        <w:pStyle w:val="Heading2"/>
+        <w:spacing w:after="120" w:before="200"/>
+      </w:pPr>
+      <w:r>
+        <w:rPr>
+          <w:b/>
+          <w:bCs/>
+        </w:rPr>
+        <w:t xml:space="preserve">7.1. Solicitar una nota de crédito</w:t>
+      </w:r>
+    </w:p>
+    <w:p>
+      <w:pPr>
+        <w:spacing w:after="160" w:line="360" w:lineRule="auto"/>
+        <w:jc w:val="both"/>
+      </w:pPr>
+      <w:r>
+        <w:rPr>
+          <w:b/>
+          <w:bCs/>
+        </w:rPr>
+        <w:t xml:space="preserve">Rol: </w:t>
+      </w:r>
+      <w:r>
+        <w:t xml:space="preserve">Supervisor.</w:t>
+      </w:r>
+    </w:p>
+    <w:p>
+      <w:pPr>
+        <w:spacing w:after="160" w:line="360" w:lineRule="auto"/>
+        <w:jc w:val="both"/>
+      </w:pPr>
+      <w:r>
+        <w:rPr>
+          <w:b/>
+          <w:bCs/>
+        </w:rPr>
+        <w:t xml:space="preserve">Objetivo: </w:t>
+      </w:r>
+      <w:r>
+        <w:t xml:space="preserve">registrar una solicitud de nota de crédito sobre una factura, indicando el motivo y las líneas o importes a acreditar.</w:t>
+      </w:r>
+    </w:p>
+    <w:p>
+      <w:pPr>
+        <w:pStyle w:val="Heading3"/>
+        <w:spacing w:after="60" w:before="160"/>
+      </w:pPr>
+      <w:r>
+        <w:rPr>
+          <w:b/>
+          <w:bCs/>
+        </w:rPr>
+        <w:t xml:space="preserve">Pasos</w:t>
+      </w:r>
+    </w:p>
+    <w:p>
+      <w:pPr>
+        <w:pStyle w:val="ListParagraph"/>
+        <w:numPr>
+          <w:ilvl w:val="0"/>
+          <w:numId w:val="14"/>
+        </w:numPr>
+        <w:spacing w:after="60" w:line="360" w:lineRule="auto"/>
+      </w:pPr>
+      <w:r>
+        <w:t xml:space="preserve">En el menú, ingrese a </w:t>
+      </w:r>
+      <w:r>
+        <w:rPr>
+          <w:b/>
+          <w:bCs/>
+        </w:rPr>
+        <w:t xml:space="preserve">Ventas → Proceso Ventas</w:t>
+      </w:r>
+      <w:r>
+        <w:t xml:space="preserve"> y ubique la </w:t>
+      </w:r>
+      <w:r>
+        <w:rPr>
+          <w:b/>
+          <w:bCs/>
+        </w:rPr>
+        <w:t xml:space="preserve">factura</w:t>
+      </w:r>
+      <w:r>
+        <w:t xml:space="preserve"> sobre la que emitirá la nota de crédito.</w:t>
+      </w:r>
+    </w:p>
+    <w:p>
+      <w:pPr>
+        <w:pStyle w:val="ListParagraph"/>
+        <w:numPr>
+          <w:ilvl w:val="0"/>
+          <w:numId w:val="14"/>
+        </w:numPr>
+        <w:spacing w:after="60" w:line="360" w:lineRule="auto"/>
+      </w:pPr>
+      <w:r>
+        <w:t xml:space="preserve">Elija la acción </w:t>
+      </w:r>
+      <w:r>
+        <w:rPr>
+          <w:b/>
+          <w:bCs/>
+        </w:rPr>
+        <w:t xml:space="preserve">Solicitar Nota de Crédito</w:t>
+      </w:r>
+      <w:r>
+        <w:t xml:space="preserve">. Se abre el formulario con los datos de la factura.</w:t>
+      </w:r>
+    </w:p>
+    <w:tbl>
+      <w:tblPr>
+        <w:tblW w:type="pct" w:w="100%"/>
+        <w:tblBorders>
+          <w:top w:val="single" w:color="auto" w:sz="4"/>
+          <w:left w:val="single" w:color="auto" w:sz="4"/>
+          <w:bottom w:val="single" w:color="auto" w:sz="4"/>
+          <w:right w:val="single" w:color="auto" w:sz="4"/>
+          <w:insideH w:val="single" w:color="auto" w:sz="4"/>
+          <w:insideV w:val="single" w:color="auto" w:sz="4"/>
+        </w:tblBorders>
+      </w:tblPr>
+      <w:tblGrid>
+        <w:gridCol w:w="100"/>
+      </w:tblGrid>
+      <w:tr>
+        <w:tc>
+          <w:tcPr>
+            <w:tcBorders>
+              <w:top w:val="dashed" w:color="9AA5B1" w:sz="6"/>
+              <w:left w:val="dashed" w:color="9AA5B1" w:sz="6"/>
+              <w:bottom w:val="dashed" w:color="9AA5B1" w:sz="6"/>
+              <w:right w:val="dashed" w:color="9AA5B1" w:sz="6"/>
+            </w:tcBorders>
+            <w:shd w:fill="F5F7FA" w:val="clear"/>
+            <w:tcMar>
+              <w:top w:type="dxa" w:w="300"/>
+              <w:left w:type="dxa" w:w="160"/>
+              <w:bottom w:type="dxa" w:w="300"/>
+              <w:right w:type="dxa" w:w="160"/>
+            </w:tcMar>
+          </w:tcPr>
+          <w:p>
+            <w:pPr>
+              <w:spacing w:after="40"/>
+              <w:jc w:val="center"/>
+            </w:pPr>
+            <w:r>
+              <w:rPr>
+                <w:b/>
+                <w:bCs/>
+                <w:color w:val="6B7683"/>
+                <w:sz w:val="22"/>
+                <w:szCs w:val="22"/>
+              </w:rPr>
+              <w:t xml:space="preserve">[ FIGURA PENDIENTE DE CAPTURA ]</w:t>
+            </w:r>
+          </w:p>
+          <w:p>
+            <w:pPr>
+              <w:spacing w:after="0"/>
+              <w:jc w:val="center"/>
+            </w:pPr>
+            <w:r>
+              <w:rPr>
+                <w:i/>
+                <w:iCs/>
+                <w:color w:val="9AA5B1"/>
+                <w:sz w:val="20"/>
+                <w:szCs w:val="20"/>
+              </w:rPr>
+              <w:t xml:space="preserve">07_nc_solicitar_01.png</w:t>
+            </w:r>
+          </w:p>
+        </w:tc>
+      </w:tr>
+    </w:tbl>
+    <w:p>
+      <w:pPr>
+        <w:spacing w:after="200"/>
+        <w:jc w:val="center"/>
+      </w:pPr>
+      <w:r>
+        <w:rPr>
+          <w:i/>
+          <w:iCs/>
+          <w:sz w:val="20"/>
+          <w:szCs w:val="20"/>
+        </w:rPr>
+        <w:t xml:space="preserve">Figura 20. Solicitud de nota de crédito desde la factura.</w:t>
+      </w:r>
+    </w:p>
+    <w:p>
+      <w:pPr>
+        <w:pStyle w:val="ListParagraph"/>
+        <w:numPr>
+          <w:ilvl w:val="0"/>
+          <w:numId w:val="14"/>
+        </w:numPr>
+        <w:spacing w:after="60" w:line="360" w:lineRule="auto"/>
+      </w:pPr>
+      <w:r>
+        <w:t xml:space="preserve">Seleccione el </w:t>
+      </w:r>
+      <w:r>
+        <w:rPr>
+          <w:b/>
+          <w:bCs/>
+        </w:rPr>
+        <w:t xml:space="preserve">Motivo</w:t>
+      </w:r>
+      <w:r>
+        <w:t xml:space="preserve"> de la nota de crédito y el </w:t>
+      </w:r>
+      <w:r>
+        <w:rPr>
+          <w:b/>
+          <w:bCs/>
+        </w:rPr>
+        <w:t xml:space="preserve">Tipo</w:t>
+      </w:r>
+      <w:r>
+        <w:t xml:space="preserve"> (total o parcial).</w:t>
+      </w:r>
+    </w:p>
+    <w:p>
+      <w:pPr>
+        <w:pStyle w:val="ListParagraph"/>
+        <w:numPr>
+          <w:ilvl w:val="0"/>
+          <w:numId w:val="14"/>
+        </w:numPr>
+        <w:spacing w:after="60" w:line="360" w:lineRule="auto"/>
+      </w:pPr>
+      <w:r>
+        <w:t xml:space="preserve">Para cada línea indique lo que se acredita: en una </w:t>
+      </w:r>
+      <w:r>
+        <w:rPr>
+          <w:b/>
+          <w:bCs/>
+        </w:rPr>
+        <w:t xml:space="preserve">devolución</w:t>
+      </w:r>
+      <w:r>
+        <w:t xml:space="preserve">, la </w:t>
+      </w:r>
+      <w:r>
+        <w:rPr>
+          <w:b/>
+          <w:bCs/>
+        </w:rPr>
+        <w:t xml:space="preserve">Cantidad</w:t>
+      </w:r>
+      <w:r>
+        <w:t xml:space="preserve"> devuelta; en un </w:t>
+      </w:r>
+      <w:r>
+        <w:rPr>
+          <w:b/>
+          <w:bCs/>
+        </w:rPr>
+        <w:t xml:space="preserve">descuento</w:t>
+      </w:r>
+      <w:r>
+        <w:t xml:space="preserve"> o </w:t>
+      </w:r>
+      <w:r>
+        <w:rPr>
+          <w:b/>
+          <w:bCs/>
+        </w:rPr>
+        <w:t xml:space="preserve">ajuste</w:t>
+      </w:r>
+      <w:r>
+        <w:t xml:space="preserve">, el </w:t>
+      </w:r>
+      <w:r>
+        <w:rPr>
+          <w:b/>
+          <w:bCs/>
+        </w:rPr>
+        <w:t xml:space="preserve">Precio Nuevo</w:t>
+      </w:r>
+      <w:r>
+        <w:t xml:space="preserve"> (el sistema acredita la diferencia).</w:t>
+      </w:r>
+    </w:p>
+    <w:p>
+      <w:pPr>
+        <w:pStyle w:val="ListParagraph"/>
+        <w:numPr>
+          <w:ilvl w:val="0"/>
+          <w:numId w:val="14"/>
+        </w:numPr>
+        <w:spacing w:after="60" w:line="360" w:lineRule="auto"/>
+      </w:pPr>
+      <w:r>
+        <w:t xml:space="preserve">Si corresponde, escriba una </w:t>
+      </w:r>
+      <w:r>
+        <w:rPr>
+          <w:b/>
+          <w:bCs/>
+        </w:rPr>
+        <w:t xml:space="preserve">observación</w:t>
+      </w:r>
+      <w:r>
+        <w:t xml:space="preserve"> y presione </w:t>
+      </w:r>
+      <w:r>
+        <w:rPr>
+          <w:b/>
+          <w:bCs/>
+        </w:rPr>
+        <w:t xml:space="preserve">Solicitar</w:t>
+      </w:r>
+      <w:r>
+        <w:t xml:space="preserve">. La solicitud queda </w:t>
+      </w:r>
+      <w:r>
+        <w:rPr>
+          <w:b/>
+          <w:bCs/>
+        </w:rPr>
+        <w:t xml:space="preserve">pendiente</w:t>
+      </w:r>
+      <w:r>
+        <w:t xml:space="preserve"> de aprobación.</w:t>
+      </w:r>
+    </w:p>
+    <w:tbl>
+      <w:tblPr>
+        <w:tblW w:type="pct" w:w="100%"/>
+        <w:tblBorders>
+          <w:top w:val="single" w:color="auto" w:sz="4"/>
+          <w:left w:val="single" w:color="auto" w:sz="4"/>
+          <w:bottom w:val="single" w:color="auto" w:sz="4"/>
+          <w:right w:val="single" w:color="auto" w:sz="4"/>
+          <w:insideH w:val="single" w:color="auto" w:sz="4"/>
+          <w:insideV w:val="single" w:color="auto" w:sz="4"/>
+        </w:tblBorders>
+      </w:tblPr>
+      <w:tblGrid>
+        <w:gridCol w:w="100"/>
+      </w:tblGrid>
+      <w:tr>
+        <w:tc>
+          <w:tcPr>
+            <w:tcBorders>
+              <w:top w:val="dashed" w:color="9AA5B1" w:sz="6"/>
+              <w:left w:val="dashed" w:color="9AA5B1" w:sz="6"/>
+              <w:bottom w:val="dashed" w:color="9AA5B1" w:sz="6"/>
+              <w:right w:val="dashed" w:color="9AA5B1" w:sz="6"/>
+            </w:tcBorders>
+            <w:shd w:fill="F5F7FA" w:val="clear"/>
+            <w:tcMar>
+              <w:top w:type="dxa" w:w="300"/>
+              <w:left w:type="dxa" w:w="160"/>
+              <w:bottom w:type="dxa" w:w="300"/>
+              <w:right w:type="dxa" w:w="160"/>
+            </w:tcMar>
+          </w:tcPr>
+          <w:p>
+            <w:pPr>
+              <w:spacing w:after="40"/>
+              <w:jc w:val="center"/>
+            </w:pPr>
+            <w:r>
+              <w:rPr>
+                <w:b/>
+                <w:bCs/>
+                <w:color w:val="6B7683"/>
+                <w:sz w:val="22"/>
+                <w:szCs w:val="22"/>
+              </w:rPr>
+              <w:t xml:space="preserve">[ FIGURA PENDIENTE DE CAPTURA ]</w:t>
+            </w:r>
+          </w:p>
+          <w:p>
+            <w:pPr>
+              <w:spacing w:after="0"/>
+              <w:jc w:val="center"/>
+            </w:pPr>
+            <w:r>
+              <w:rPr>
+                <w:i/>
+                <w:iCs/>
+                <w:color w:val="9AA5B1"/>
+                <w:sz w:val="20"/>
+                <w:szCs w:val="20"/>
+              </w:rPr>
+              <w:t xml:space="preserve">07_nc_solicitar_02.png</w:t>
+            </w:r>
+          </w:p>
+        </w:tc>
+      </w:tr>
+    </w:tbl>
+    <w:p>
+      <w:pPr>
+        <w:spacing w:after="200"/>
+        <w:jc w:val="center"/>
+      </w:pPr>
+      <w:r>
+        <w:rPr>
+          <w:i/>
+          <w:iCs/>
+          <w:sz w:val="20"/>
+          <w:szCs w:val="20"/>
+        </w:rPr>
+        <w:t xml:space="preserve">Figura 21. Formulario de solicitud: motivo y líneas a acreditar.</w:t>
+      </w:r>
+    </w:p>
+    <w:tbl>
+      <w:tblPr>
+        <w:tblW w:type="pct" w:w="100%"/>
+        <w:tblBorders>
+          <w:top w:val="single" w:color="auto" w:sz="4"/>
+          <w:left w:val="single" w:color="auto" w:sz="4"/>
+          <w:bottom w:val="single" w:color="auto" w:sz="4"/>
+          <w:right w:val="single" w:color="auto" w:sz="4"/>
+          <w:insideH w:val="single" w:color="auto" w:sz="4"/>
+          <w:insideV w:val="single" w:color="auto" w:sz="4"/>
+        </w:tblBorders>
+      </w:tblPr>
+      <w:tblGrid>
+        <w:gridCol w:w="100"/>
+      </w:tblGrid>
+      <w:tr>
+        <w:tc>
+          <w:tcPr>
+            <w:tcBorders>
+              <w:top w:val="single" w:color="C0392B" w:sz="2"/>
+              <w:left w:val="single" w:color="C0392B" w:sz="24"/>
+              <w:bottom w:val="single" w:color="C0392B" w:sz="2"/>
+              <w:right w:val="single" w:color="C0392B" w:sz="2"/>
+            </w:tcBorders>
+            <w:shd w:fill="FDECEA" w:val="clear"/>
+            <w:tcMar>
+              <w:top w:type="dxa" w:w="80"/>
+              <w:left w:type="dxa" w:w="160"/>
+              <w:bottom w:type="dxa" w:w="80"/>
+              <w:right w:type="dxa" w:w="160"/>
+            </w:tcMar>
+          </w:tcPr>
+          <w:p>
+            <w:pPr>
+              <w:spacing w:after="0" w:line="300"/>
+              <w:jc w:val="both"/>
+            </w:pPr>
+            <w:r>
+              <w:rPr>
+                <w:b/>
+                <w:bCs/>
+                <w:color w:val="C0392B"/>
+              </w:rPr>
+              <w:t xml:space="preserve">Importante: </w:t>
+            </w:r>
+            <w:r>
+              <w:t xml:space="preserve">La nota de crédito </w:t>
+            </w:r>
+            <w:r>
+              <w:rPr>
+                <w:b/>
+                <w:bCs/>
+              </w:rPr>
+              <w:t xml:space="preserve">no anula</w:t>
+            </w:r>
+            <w:r>
+              <w:t xml:space="preserve"> la factura: es un documento nuevo. Si la factura tiene menos de 48 horas y desea dejarla sin efecto, conviene </w:t>
+            </w:r>
+            <w:r>
+              <w:rPr>
+                <w:b/>
+                <w:bCs/>
+              </w:rPr>
+              <w:t xml:space="preserve">anularla</w:t>
+            </w:r>
+            <w:r>
+              <w:t xml:space="preserve"> (ver 5.4) en lugar de emitir una nota de crédito.</w:t>
+            </w:r>
+          </w:p>
+        </w:tc>
+      </w:tr>
+    </w:tbl>
+    <w:p>
+      <w:pPr>
+        <w:pageBreakBefore/>
+      </w:pPr>
+      <w:r>
+        <w:t xml:space="preserve"/>
+      </w:r>
+    </w:p>
+    <w:p>
+      <w:pPr>
+        <w:pStyle w:val="Heading2"/>
+        <w:spacing w:after="120" w:before="200"/>
+      </w:pPr>
+      <w:r>
+        <w:rPr>
+          <w:b/>
+          <w:bCs/>
+        </w:rPr>
+        <w:t xml:space="preserve">7.2. Aprobar o rechazar una nota de crédito</w:t>
+      </w:r>
+    </w:p>
+    <w:p>
+      <w:pPr>
+        <w:spacing w:after="160" w:line="360" w:lineRule="auto"/>
+        <w:jc w:val="both"/>
+      </w:pPr>
+      <w:r>
+        <w:rPr>
+          <w:b/>
+          <w:bCs/>
+        </w:rPr>
+        <w:t xml:space="preserve">Rol: </w:t>
+      </w:r>
+      <w:r>
+        <w:t xml:space="preserve">Supervisor.</w:t>
+      </w:r>
+    </w:p>
+    <w:p>
+      <w:pPr>
+        <w:spacing w:after="160" w:line="360" w:lineRule="auto"/>
+        <w:jc w:val="both"/>
+      </w:pPr>
+      <w:r>
+        <w:rPr>
+          <w:b/>
+          <w:bCs/>
+        </w:rPr>
+        <w:t xml:space="preserve">Objetivo: </w:t>
+      </w:r>
+      <w:r>
+        <w:t xml:space="preserve">revisar una solicitud de nota de crédito y resolverla.</w:t>
+      </w:r>
+    </w:p>
+    <w:p>
+      <w:pPr>
+        <w:pStyle w:val="Heading3"/>
+        <w:spacing w:after="60" w:before="160"/>
+      </w:pPr>
+      <w:r>
+        <w:rPr>
+          <w:b/>
+          <w:bCs/>
+        </w:rPr>
+        <w:t xml:space="preserve">Pasos</w:t>
+      </w:r>
+    </w:p>
+    <w:p>
+      <w:pPr>
+        <w:pStyle w:val="ListParagraph"/>
+        <w:numPr>
+          <w:ilvl w:val="0"/>
+          <w:numId w:val="15"/>
+        </w:numPr>
+        <w:spacing w:after="60" w:line="360" w:lineRule="auto"/>
+      </w:pPr>
+      <w:r>
+        <w:t xml:space="preserve">En el menú, ingrese a </w:t>
+      </w:r>
+      <w:r>
+        <w:rPr>
+          <w:b/>
+          <w:bCs/>
+        </w:rPr>
+        <w:t xml:space="preserve">Ventas → Notas de Crédito</w:t>
+      </w:r>
+      <w:r>
+        <w:t xml:space="preserve">. Se muestra la lista de solicitudes y notas de crédito.</w:t>
+      </w:r>
+    </w:p>
+    <w:tbl>
+      <w:tblPr>
+        <w:tblW w:type="pct" w:w="100%"/>
+        <w:tblBorders>
+          <w:top w:val="single" w:color="auto" w:sz="4"/>
+          <w:left w:val="single" w:color="auto" w:sz="4"/>
+          <w:bottom w:val="single" w:color="auto" w:sz="4"/>
+          <w:right w:val="single" w:color="auto" w:sz="4"/>
+          <w:insideH w:val="single" w:color="auto" w:sz="4"/>
+          <w:insideV w:val="single" w:color="auto" w:sz="4"/>
+        </w:tblBorders>
+      </w:tblPr>
+      <w:tblGrid>
+        <w:gridCol w:w="100"/>
+      </w:tblGrid>
+      <w:tr>
+        <w:tc>
+          <w:tcPr>
+            <w:tcBorders>
+              <w:top w:val="dashed" w:color="9AA5B1" w:sz="6"/>
+              <w:left w:val="dashed" w:color="9AA5B1" w:sz="6"/>
+              <w:bottom w:val="dashed" w:color="9AA5B1" w:sz="6"/>
+              <w:right w:val="dashed" w:color="9AA5B1" w:sz="6"/>
+            </w:tcBorders>
+            <w:shd w:fill="F5F7FA" w:val="clear"/>
+            <w:tcMar>
+              <w:top w:type="dxa" w:w="300"/>
+              <w:left w:type="dxa" w:w="160"/>
+              <w:bottom w:type="dxa" w:w="300"/>
+              <w:right w:type="dxa" w:w="160"/>
+            </w:tcMar>
+          </w:tcPr>
+          <w:p>
+            <w:pPr>
+              <w:spacing w:after="40"/>
+              <w:jc w:val="center"/>
+            </w:pPr>
+            <w:r>
+              <w:rPr>
+                <w:b/>
+                <w:bCs/>
+                <w:color w:val="6B7683"/>
+                <w:sz w:val="22"/>
+                <w:szCs w:val="22"/>
+              </w:rPr>
+              <w:t xml:space="preserve">[ FIGURA PENDIENTE DE CAPTURA ]</w:t>
+            </w:r>
+          </w:p>
+          <w:p>
+            <w:pPr>
+              <w:spacing w:after="0"/>
+              <w:jc w:val="center"/>
+            </w:pPr>
+            <w:r>
+              <w:rPr>
+                <w:i/>
+                <w:iCs/>
+                <w:color w:val="9AA5B1"/>
+                <w:sz w:val="20"/>
+                <w:szCs w:val="20"/>
+              </w:rPr>
+              <w:t xml:space="preserve">07_nc_lista_01.png</w:t>
+            </w:r>
+          </w:p>
+        </w:tc>
+      </w:tr>
+    </w:tbl>
+    <w:p>
+      <w:pPr>
+        <w:spacing w:after="200"/>
+        <w:jc w:val="center"/>
+      </w:pPr>
+      <w:r>
+        <w:rPr>
+          <w:i/>
+          <w:iCs/>
+          <w:sz w:val="20"/>
+          <w:szCs w:val="20"/>
+        </w:rPr>
+        <w:t xml:space="preserve">Figura 22. Notas de Crédito: lista de solicitudes.</w:t>
+      </w:r>
+    </w:p>
+    <w:p>
+      <w:pPr>
+        <w:pStyle w:val="ListParagraph"/>
+        <w:numPr>
+          <w:ilvl w:val="0"/>
+          <w:numId w:val="15"/>
+        </w:numPr>
+        <w:spacing w:after="60" w:line="360" w:lineRule="auto"/>
+      </w:pPr>
+      <w:r>
+        <w:t xml:space="preserve">Abra la solicitud </w:t>
+      </w:r>
+      <w:r>
+        <w:rPr>
+          <w:b/>
+          <w:bCs/>
+        </w:rPr>
+        <w:t xml:space="preserve">pendiente</w:t>
+      </w:r>
+      <w:r>
+        <w:t xml:space="preserve">. Se muestra el desglose de lo que se acreditará.</w:t>
+      </w:r>
+    </w:p>
+    <w:p>
+      <w:pPr>
+        <w:pStyle w:val="ListParagraph"/>
+        <w:numPr>
+          <w:ilvl w:val="0"/>
+          <w:numId w:val="15"/>
+        </w:numPr>
+        <w:spacing w:after="60" w:line="360" w:lineRule="auto"/>
+      </w:pPr>
+      <w:r>
+        <w:t xml:space="preserve">Presione </w:t>
+      </w:r>
+      <w:r>
+        <w:rPr>
+          <w:b/>
+          <w:bCs/>
+        </w:rPr>
+        <w:t xml:space="preserve">Aprobar</w:t>
+      </w:r>
+      <w:r>
+        <w:t xml:space="preserve"> o </w:t>
+      </w:r>
+      <w:r>
+        <w:rPr>
+          <w:b/>
+          <w:bCs/>
+        </w:rPr>
+        <w:t xml:space="preserve">Rechazar</w:t>
+      </w:r>
+      <w:r>
+        <w:t xml:space="preserve">. Al </w:t>
+      </w:r>
+      <w:r>
+        <w:rPr>
+          <w:b/>
+          <w:bCs/>
+        </w:rPr>
+        <w:t xml:space="preserve">aprobar</w:t>
+      </w:r>
+      <w:r>
+        <w:t xml:space="preserve">, el sistema reserva el número de nota de crédito y aplica los efectos según el motivo: reingreso de </w:t>
+      </w:r>
+      <w:r>
+        <w:rPr>
+          <w:b/>
+          <w:bCs/>
+        </w:rPr>
+        <w:t xml:space="preserve">stock</w:t>
+      </w:r>
+      <w:r>
+        <w:t xml:space="preserve"> (devolución), </w:t>
+      </w:r>
+      <w:r>
+        <w:rPr>
+          <w:b/>
+          <w:bCs/>
+        </w:rPr>
+        <w:t xml:space="preserve">egreso de caja</w:t>
+      </w:r>
+      <w:r>
+        <w:t xml:space="preserve"> (si la factura fue de contado del día) o ajuste de la </w:t>
+      </w:r>
+      <w:r>
+        <w:rPr>
+          <w:b/>
+          <w:bCs/>
+        </w:rPr>
+        <w:t xml:space="preserve">cuenta por cobrar</w:t>
+      </w:r>
+      <w:r>
+        <w:t xml:space="preserve"> (si fue a crédito).</w:t>
+      </w:r>
+    </w:p>
+    <w:tbl>
+      <w:tblPr>
+        <w:tblW w:type="pct" w:w="100%"/>
+        <w:tblBorders>
+          <w:top w:val="single" w:color="auto" w:sz="4"/>
+          <w:left w:val="single" w:color="auto" w:sz="4"/>
+          <w:bottom w:val="single" w:color="auto" w:sz="4"/>
+          <w:right w:val="single" w:color="auto" w:sz="4"/>
+          <w:insideH w:val="single" w:color="auto" w:sz="4"/>
+          <w:insideV w:val="single" w:color="auto" w:sz="4"/>
+        </w:tblBorders>
+      </w:tblPr>
+      <w:tblGrid>
+        <w:gridCol w:w="100"/>
+      </w:tblGrid>
+      <w:tr>
+        <w:tc>
+          <w:tcPr>
+            <w:tcBorders>
+              <w:top w:val="dashed" w:color="9AA5B1" w:sz="6"/>
+              <w:left w:val="dashed" w:color="9AA5B1" w:sz="6"/>
+              <w:bottom w:val="dashed" w:color="9AA5B1" w:sz="6"/>
+              <w:right w:val="dashed" w:color="9AA5B1" w:sz="6"/>
+            </w:tcBorders>
+            <w:shd w:fill="F5F7FA" w:val="clear"/>
+            <w:tcMar>
+              <w:top w:type="dxa" w:w="300"/>
+              <w:left w:type="dxa" w:w="160"/>
+              <w:bottom w:type="dxa" w:w="300"/>
+              <w:right w:type="dxa" w:w="160"/>
+            </w:tcMar>
+          </w:tcPr>
+          <w:p>
+            <w:pPr>
+              <w:spacing w:after="40"/>
+              <w:jc w:val="center"/>
+            </w:pPr>
+            <w:r>
+              <w:rPr>
+                <w:b/>
+                <w:bCs/>
+                <w:color w:val="6B7683"/>
+                <w:sz w:val="22"/>
+                <w:szCs w:val="22"/>
+              </w:rPr>
+              <w:t xml:space="preserve">[ FIGURA PENDIENTE DE CAPTURA ]</w:t>
+            </w:r>
+          </w:p>
+          <w:p>
+            <w:pPr>
+              <w:spacing w:after="0"/>
+              <w:jc w:val="center"/>
+            </w:pPr>
+            <w:r>
+              <w:rPr>
+                <w:i/>
+                <w:iCs/>
+                <w:color w:val="9AA5B1"/>
+                <w:sz w:val="20"/>
+                <w:szCs w:val="20"/>
+              </w:rPr>
+              <w:t xml:space="preserve">07_nc_aprobar_01.png</w:t>
+            </w:r>
+          </w:p>
+        </w:tc>
+      </w:tr>
+    </w:tbl>
+    <w:p>
+      <w:pPr>
+        <w:spacing w:after="200"/>
+        <w:jc w:val="center"/>
+      </w:pPr>
+      <w:r>
+        <w:rPr>
+          <w:i/>
+          <w:iCs/>
+          <w:sz w:val="20"/>
+          <w:szCs w:val="20"/>
+        </w:rPr>
+        <w:t xml:space="preserve">Figura 23. Aprobar o rechazar la nota de crédito, con el desglose.</w:t>
+      </w:r>
+    </w:p>
+    <w:tbl>
+      <w:tblPr>
+        <w:tblW w:type="pct" w:w="100%"/>
+        <w:tblBorders>
+          <w:top w:val="single" w:color="auto" w:sz="4"/>
+          <w:left w:val="single" w:color="auto" w:sz="4"/>
+          <w:bottom w:val="single" w:color="auto" w:sz="4"/>
+          <w:right w:val="single" w:color="auto" w:sz="4"/>
+          <w:insideH w:val="single" w:color="auto" w:sz="4"/>
+          <w:insideV w:val="single" w:color="auto" w:sz="4"/>
+        </w:tblBorders>
+      </w:tblPr>
+      <w:tblGrid>
+        <w:gridCol w:w="100"/>
+      </w:tblGrid>
+      <w:tr>
+        <w:tc>
+          <w:tcPr>
+            <w:tcBorders>
+              <w:top w:val="single" w:color="2E6DA4" w:sz="2"/>
+              <w:left w:val="single" w:color="2E6DA4" w:sz="24"/>
+              <w:bottom w:val="single" w:color="2E6DA4" w:sz="2"/>
+              <w:right w:val="single" w:color="2E6DA4" w:sz="2"/>
+            </w:tcBorders>
+            <w:shd w:fill="E8F1FB" w:val="clear"/>
+            <w:tcMar>
+              <w:top w:type="dxa" w:w="80"/>
+              <w:left w:type="dxa" w:w="160"/>
+              <w:bottom w:type="dxa" w:w="80"/>
+              <w:right w:type="dxa" w:w="160"/>
+            </w:tcMar>
+          </w:tcPr>
+          <w:p>
+            <w:pPr>
+              <w:spacing w:after="0" w:line="300"/>
+              <w:jc w:val="both"/>
+            </w:pPr>
+            <w:r>
+              <w:rPr>
+                <w:b/>
+                <w:bCs/>
+                <w:color w:val="2E6DA4"/>
+              </w:rPr>
+              <w:t xml:space="preserve">Nota: </w:t>
+            </w:r>
+            <w:r>
+              <w:t xml:space="preserve">Si </w:t>
+            </w:r>
+            <w:r>
+              <w:rPr>
+                <w:b/>
+                <w:bCs/>
+              </w:rPr>
+              <w:t xml:space="preserve">rechaza</w:t>
+            </w:r>
+            <w:r>
+              <w:t xml:space="preserve"> la solicitud, no se produce ningún efecto y la factura queda igual.</w:t>
+            </w:r>
+          </w:p>
+        </w:tc>
+      </w:tr>
+    </w:tbl>
+    <w:p>
+      <w:pPr>
+        <w:pageBreakBefore/>
+      </w:pPr>
+      <w:r>
+        <w:t xml:space="preserve"/>
+      </w:r>
+    </w:p>
+    <w:p>
+      <w:pPr>
+        <w:pStyle w:val="Heading2"/>
+        <w:spacing w:after="120" w:before="200"/>
+      </w:pPr>
+      <w:r>
+        <w:rPr>
+          <w:b/>
+          <w:bCs/>
+        </w:rPr>
+        <w:t xml:space="preserve">7.3. Imprimir la nota de crédito</w:t>
+      </w:r>
+    </w:p>
+    <w:p>
+      <w:pPr>
+        <w:spacing w:after="160" w:line="360" w:lineRule="auto"/>
+        <w:jc w:val="both"/>
+      </w:pPr>
+      <w:r>
+        <w:rPr>
+          <w:b/>
+          <w:bCs/>
+        </w:rPr>
+        <w:t xml:space="preserve">Rol: </w:t>
+      </w:r>
+      <w:r>
+        <w:t xml:space="preserve">Supervisor.</w:t>
+      </w:r>
+    </w:p>
+    <w:p>
+      <w:pPr>
+        <w:spacing w:after="160" w:line="360" w:lineRule="auto"/>
+        <w:jc w:val="both"/>
+      </w:pPr>
+      <w:r>
+        <w:rPr>
+          <w:b/>
+          <w:bCs/>
+        </w:rPr>
+        <w:t xml:space="preserve">Objetivo: </w:t>
+      </w:r>
+      <w:r>
+        <w:t xml:space="preserve">obtener el documento de una nota de crédito aprobada.</w:t>
+      </w:r>
+    </w:p>
+    <w:p>
+      <w:pPr>
+        <w:pStyle w:val="Heading3"/>
+        <w:spacing w:after="60" w:before="160"/>
+      </w:pPr>
+      <w:r>
+        <w:rPr>
+          <w:b/>
+          <w:bCs/>
+        </w:rPr>
+        <w:t xml:space="preserve">Pasos</w:t>
+      </w:r>
+    </w:p>
+    <w:p>
+      <w:pPr>
+        <w:pStyle w:val="ListParagraph"/>
+        <w:numPr>
+          <w:ilvl w:val="0"/>
+          <w:numId w:val="16"/>
+        </w:numPr>
+        <w:spacing w:after="60" w:line="360" w:lineRule="auto"/>
+      </w:pPr>
+      <w:r>
+        <w:t xml:space="preserve">En </w:t>
+      </w:r>
+      <w:r>
+        <w:rPr>
+          <w:b/>
+          <w:bCs/>
+        </w:rPr>
+        <w:t xml:space="preserve">Ventas → Notas de Crédito</w:t>
+      </w:r>
+      <w:r>
+        <w:t xml:space="preserve">, ubique la nota de crédito </w:t>
+      </w:r>
+      <w:r>
+        <w:rPr>
+          <w:b/>
+          <w:bCs/>
+        </w:rPr>
+        <w:t xml:space="preserve">aprobada</w:t>
+      </w:r>
+      <w:r>
+        <w:t xml:space="preserve">.</w:t>
+      </w:r>
+    </w:p>
+    <w:p>
+      <w:pPr>
+        <w:pStyle w:val="ListParagraph"/>
+        <w:numPr>
+          <w:ilvl w:val="0"/>
+          <w:numId w:val="16"/>
+        </w:numPr>
+        <w:spacing w:after="60" w:line="360" w:lineRule="auto"/>
+      </w:pPr>
+      <w:r>
+        <w:t xml:space="preserve">Ábrala para ver el </w:t>
+      </w:r>
+      <w:r>
+        <w:rPr>
+          <w:b/>
+          <w:bCs/>
+        </w:rPr>
+        <w:t xml:space="preserve">documento de la nota de crédito</w:t>
+      </w:r>
+      <w:r>
+        <w:t xml:space="preserve">, listo para imprimir o guardar.</w:t>
+      </w:r>
+    </w:p>
+    <w:tbl>
+      <w:tblPr>
+        <w:tblW w:type="pct" w:w="100%"/>
+        <w:tblBorders>
+          <w:top w:val="single" w:color="auto" w:sz="4"/>
+          <w:left w:val="single" w:color="auto" w:sz="4"/>
+          <w:bottom w:val="single" w:color="auto" w:sz="4"/>
+          <w:right w:val="single" w:color="auto" w:sz="4"/>
+          <w:insideH w:val="single" w:color="auto" w:sz="4"/>
+          <w:insideV w:val="single" w:color="auto" w:sz="4"/>
+        </w:tblBorders>
+      </w:tblPr>
+      <w:tblGrid>
+        <w:gridCol w:w="100"/>
+      </w:tblGrid>
+      <w:tr>
+        <w:tc>
+          <w:tcPr>
+            <w:tcBorders>
+              <w:top w:val="dashed" w:color="9AA5B1" w:sz="6"/>
+              <w:left w:val="dashed" w:color="9AA5B1" w:sz="6"/>
+              <w:bottom w:val="dashed" w:color="9AA5B1" w:sz="6"/>
+              <w:right w:val="dashed" w:color="9AA5B1" w:sz="6"/>
+            </w:tcBorders>
+            <w:shd w:fill="F5F7FA" w:val="clear"/>
+            <w:tcMar>
+              <w:top w:type="dxa" w:w="300"/>
+              <w:left w:type="dxa" w:w="160"/>
+              <w:bottom w:type="dxa" w:w="300"/>
+              <w:right w:type="dxa" w:w="160"/>
+            </w:tcMar>
+          </w:tcPr>
+          <w:p>
+            <w:pPr>
+              <w:spacing w:after="40"/>
+              <w:jc w:val="center"/>
+            </w:pPr>
+            <w:r>
+              <w:rPr>
+                <w:b/>
+                <w:bCs/>
+                <w:color w:val="6B7683"/>
+                <w:sz w:val="22"/>
+                <w:szCs w:val="22"/>
+              </w:rPr>
+              <w:t xml:space="preserve">[ FIGURA PENDIENTE DE CAPTURA ]</w:t>
+            </w:r>
+          </w:p>
+          <w:p>
+            <w:pPr>
+              <w:spacing w:after="0"/>
+              <w:jc w:val="center"/>
+            </w:pPr>
+            <w:r>
+              <w:rPr>
+                <w:i/>
+                <w:iCs/>
+                <w:color w:val="9AA5B1"/>
+                <w:sz w:val="20"/>
+                <w:szCs w:val="20"/>
+              </w:rPr>
+              <w:t xml:space="preserve">07_nc_documento_01.png</w:t>
+            </w:r>
+          </w:p>
+        </w:tc>
+      </w:tr>
+    </w:tbl>
+    <w:p>
+      <w:pPr>
+        <w:spacing w:after="200"/>
+        <w:jc w:val="center"/>
+      </w:pPr>
+      <w:r>
+        <w:rPr>
+          <w:i/>
+          <w:iCs/>
+          <w:sz w:val="20"/>
+          <w:szCs w:val="20"/>
+        </w:rPr>
+        <w:t xml:space="preserve">Figura 24. Documento de la nota de crédito.</w:t>
+      </w:r>
+    </w:p>
     <w:sectPr>
       <w:headerReference w:type="default" r:id="rId8"/>
       <w:footerReference w:type="default" r:id="rId9"/>
@@ -6155,6 +7462,24 @@
     </w:lvlOverride>
   </w:num>
   <w:num w:numId="13">
+    <w:abstractNumId w:val="3"/>
+    <w:lvlOverride w:ilvl="0">
+      <w:startOverride w:val="1"/>
+    </w:lvlOverride>
+  </w:num>
+  <w:num w:numId="14">
+    <w:abstractNumId w:val="3"/>
+    <w:lvlOverride w:ilvl="0">
+      <w:startOverride w:val="1"/>
+    </w:lvlOverride>
+  </w:num>
+  <w:num w:numId="15">
+    <w:abstractNumId w:val="3"/>
+    <w:lvlOverride w:ilvl="0">
+      <w:startOverride w:val="1"/>
+    </w:lvlOverride>
+  </w:num>
+  <w:num w:numId="16">
     <w:abstractNumId w:val="3"/>
     <w:lvlOverride w:ilvl="0">
       <w:startOverride w:val="1"/>

</xml_diff>

<commit_message>
docs(manual-usuario): agrega el módulo Compras (cap. 8)
Módulo más extenso: 7 tareas del ciclo de compras. Comprador: crear orden de
compra (Compras y Pagos → Orden de Compra), recepcionar (Recepción de Orden de
Compra), registrar factura de proveedor (Proceso de Compras: proveedor, timbrado,
condición contado/crédito → genera CxP si es crédito), generar orden de pago
(Deuda a Proveedores → Generar Orden de Pago, queda Borrador) y registrar nota de
crédito de proveedor (captura). Supervisor: aprobar orden de compra (Aprobación de
Órdenes de Compra) y confirmar/anular orden de pago (Órdenes de Pago → Resolver →
Confirmar pago/Anular). Pantallas reales P69/P70/P71/P107/P110/P146/P147/P148/P150/P94.

8 capturas pendientes del alumno (en la guía). Figuras 1..37 y tablas 1..6.
</commit_message>
<xml_diff>
--- a/doc/manual_usuario/MUESTRA_Manual_Usuario.docx
+++ b/doc/manual_usuario/MUESTRA_Manual_Usuario.docx
@@ -8480,6 +8480,2345 @@
         <w:t xml:space="preserve">Figura 29. Documento de la nota de crédito.</w:t>
       </w:r>
     </w:p>
+    <w:p>
+      <w:pPr>
+        <w:pageBreakBefore/>
+      </w:pPr>
+      <w:r>
+        <w:t xml:space="preserve"/>
+      </w:r>
+    </w:p>
+    <w:p>
+      <w:pPr>
+        <w:pStyle w:val="Heading1"/>
+        <w:spacing w:after="160" w:before="240"/>
+      </w:pPr>
+      <w:r>
+        <w:rPr>
+          <w:b/>
+          <w:bCs/>
+        </w:rPr>
+        <w:t xml:space="preserve">8. Compras</w:t>
+      </w:r>
+    </w:p>
+    <w:p>
+      <w:pPr>
+        <w:spacing w:after="160" w:before="0" w:line="360" w:lineRule="auto"/>
+        <w:jc w:val="both"/>
+      </w:pPr>
+      <w:r>
+        <w:t xml:space="preserve">Este módulo cubre el ciclo de compras: emitir una orden de compra a un proveedor, aprobarla, recepcionar la mercadería, registrar la factura del proveedor y pagarla mediante una orden de pago. También permite registrar la nota de crédito que emite el proveedor. La siguiente tabla indica qué tarea realiza cada rol.</w:t>
+      </w:r>
+    </w:p>
+    <w:tbl>
+      <w:tblPr>
+        <w:tblW w:type="pct" w:w="100%"/>
+        <w:tblBorders>
+          <w:top w:val="single" w:color="auto" w:sz="4"/>
+          <w:left w:val="single" w:color="auto" w:sz="4"/>
+          <w:bottom w:val="single" w:color="auto" w:sz="4"/>
+          <w:right w:val="single" w:color="auto" w:sz="4"/>
+          <w:insideH w:val="single" w:color="auto" w:sz="4"/>
+          <w:insideV w:val="single" w:color="auto" w:sz="4"/>
+        </w:tblBorders>
+      </w:tblPr>
+      <w:tblGrid>
+        <w:gridCol w:w="100"/>
+        <w:gridCol w:w="100"/>
+      </w:tblGrid>
+      <w:tr>
+        <w:trPr>
+          <w:tblHeader/>
+        </w:trPr>
+        <w:tc>
+          <w:tcPr>
+            <w:tcW w:type="pct" w:w="26%"/>
+            <w:tcBorders>
+              <w:top w:val="single" w:color="AAB4C0" w:sz="2"/>
+              <w:left w:val="single" w:color="AAB4C0" w:sz="2"/>
+              <w:bottom w:val="single" w:color="AAB4C0" w:sz="2"/>
+              <w:right w:val="single" w:color="AAB4C0" w:sz="2"/>
+            </w:tcBorders>
+            <w:shd w:fill="DCE9F5" w:val="clear"/>
+            <w:tcMar>
+              <w:top w:type="dxa" w:w="20"/>
+              <w:left w:type="dxa" w:w="70"/>
+              <w:bottom w:type="dxa" w:w="20"/>
+              <w:right w:type="dxa" w:w="70"/>
+            </w:tcMar>
+            <w:vAlign w:val="center"/>
+          </w:tcPr>
+          <w:p>
+            <w:pPr>
+              <w:spacing w:after="0" w:line="240" w:lineRule="auto"/>
+              <w:jc w:val="center"/>
+            </w:pPr>
+            <w:r>
+              <w:rPr>
+                <w:rFonts w:ascii="Times New Roman" w:cs="Times New Roman" w:eastAsia="Times New Roman" w:hAnsi="Times New Roman"/>
+                <w:b/>
+                <w:bCs/>
+                <w:sz w:val="18"/>
+                <w:szCs w:val="18"/>
+              </w:rPr>
+              <w:t xml:space="preserve">Rol</w:t>
+            </w:r>
+          </w:p>
+        </w:tc>
+        <w:tc>
+          <w:tcPr>
+            <w:tcW w:type="pct" w:w="74%"/>
+            <w:tcBorders>
+              <w:top w:val="single" w:color="AAB4C0" w:sz="2"/>
+              <w:left w:val="single" w:color="AAB4C0" w:sz="2"/>
+              <w:bottom w:val="single" w:color="AAB4C0" w:sz="2"/>
+              <w:right w:val="single" w:color="AAB4C0" w:sz="2"/>
+            </w:tcBorders>
+            <w:shd w:fill="DCE9F5" w:val="clear"/>
+            <w:tcMar>
+              <w:top w:type="dxa" w:w="20"/>
+              <w:left w:type="dxa" w:w="70"/>
+              <w:bottom w:type="dxa" w:w="20"/>
+              <w:right w:type="dxa" w:w="70"/>
+            </w:tcMar>
+            <w:vAlign w:val="center"/>
+          </w:tcPr>
+          <w:p>
+            <w:pPr>
+              <w:spacing w:after="0" w:line="240" w:lineRule="auto"/>
+              <w:jc w:val="center"/>
+            </w:pPr>
+            <w:r>
+              <w:rPr>
+                <w:rFonts w:ascii="Times New Roman" w:cs="Times New Roman" w:eastAsia="Times New Roman" w:hAnsi="Times New Roman"/>
+                <w:b/>
+                <w:bCs/>
+                <w:sz w:val="18"/>
+                <w:szCs w:val="18"/>
+              </w:rPr>
+              <w:t xml:space="preserve">Tareas</w:t>
+            </w:r>
+          </w:p>
+        </w:tc>
+      </w:tr>
+      <w:tr>
+        <w:tc>
+          <w:tcPr>
+            <w:tcW w:type="pct" w:w="26%"/>
+            <w:tcBorders>
+              <w:top w:val="single" w:color="AAB4C0" w:sz="2"/>
+              <w:left w:val="single" w:color="AAB4C0" w:sz="2"/>
+              <w:bottom w:val="single" w:color="AAB4C0" w:sz="2"/>
+              <w:right w:val="single" w:color="AAB4C0" w:sz="2"/>
+            </w:tcBorders>
+            <w:tcMar>
+              <w:top w:type="dxa" w:w="20"/>
+              <w:left w:type="dxa" w:w="70"/>
+              <w:bottom w:type="dxa" w:w="20"/>
+              <w:right w:type="dxa" w:w="70"/>
+            </w:tcMar>
+            <w:vAlign w:val="center"/>
+          </w:tcPr>
+          <w:p>
+            <w:pPr>
+              <w:spacing w:after="0" w:line="240" w:lineRule="auto"/>
+              <w:jc w:val="left"/>
+            </w:pPr>
+            <w:r>
+              <w:rPr>
+                <w:rFonts w:ascii="Times New Roman" w:cs="Times New Roman" w:eastAsia="Times New Roman" w:hAnsi="Times New Roman"/>
+                <w:sz w:val="18"/>
+                <w:szCs w:val="18"/>
+              </w:rPr>
+              <w:t xml:space="preserve">Comprador</w:t>
+            </w:r>
+          </w:p>
+        </w:tc>
+        <w:tc>
+          <w:tcPr>
+            <w:tcW w:type="pct" w:w="74%"/>
+            <w:tcBorders>
+              <w:top w:val="single" w:color="AAB4C0" w:sz="2"/>
+              <w:left w:val="single" w:color="AAB4C0" w:sz="2"/>
+              <w:bottom w:val="single" w:color="AAB4C0" w:sz="2"/>
+              <w:right w:val="single" w:color="AAB4C0" w:sz="2"/>
+            </w:tcBorders>
+            <w:tcMar>
+              <w:top w:type="dxa" w:w="20"/>
+              <w:left w:type="dxa" w:w="70"/>
+              <w:bottom w:type="dxa" w:w="20"/>
+              <w:right w:type="dxa" w:w="70"/>
+            </w:tcMar>
+            <w:vAlign w:val="center"/>
+          </w:tcPr>
+          <w:p>
+            <w:pPr>
+              <w:spacing w:after="0" w:line="240" w:lineRule="auto"/>
+              <w:jc w:val="left"/>
+            </w:pPr>
+            <w:r>
+              <w:rPr>
+                <w:rFonts w:ascii="Times New Roman" w:cs="Times New Roman" w:eastAsia="Times New Roman" w:hAnsi="Times New Roman"/>
+                <w:sz w:val="18"/>
+                <w:szCs w:val="18"/>
+              </w:rPr>
+              <w:t xml:space="preserve">Crear una orden de compra · Recepcionar una orden de compra · Registrar la factura del proveedor · Generar una orden de pago · Registrar una nota de crédito de proveedor.</w:t>
+            </w:r>
+          </w:p>
+        </w:tc>
+      </w:tr>
+      <w:tr>
+        <w:tc>
+          <w:tcPr>
+            <w:tcW w:type="pct" w:w="26%"/>
+            <w:tcBorders>
+              <w:top w:val="single" w:color="AAB4C0" w:sz="2"/>
+              <w:left w:val="single" w:color="AAB4C0" w:sz="2"/>
+              <w:bottom w:val="single" w:color="AAB4C0" w:sz="2"/>
+              <w:right w:val="single" w:color="AAB4C0" w:sz="2"/>
+            </w:tcBorders>
+            <w:tcMar>
+              <w:top w:type="dxa" w:w="20"/>
+              <w:left w:type="dxa" w:w="70"/>
+              <w:bottom w:type="dxa" w:w="20"/>
+              <w:right w:type="dxa" w:w="70"/>
+            </w:tcMar>
+            <w:vAlign w:val="center"/>
+          </w:tcPr>
+          <w:p>
+            <w:pPr>
+              <w:spacing w:after="0" w:line="240" w:lineRule="auto"/>
+              <w:jc w:val="left"/>
+            </w:pPr>
+            <w:r>
+              <w:rPr>
+                <w:rFonts w:ascii="Times New Roman" w:cs="Times New Roman" w:eastAsia="Times New Roman" w:hAnsi="Times New Roman"/>
+                <w:sz w:val="18"/>
+                <w:szCs w:val="18"/>
+              </w:rPr>
+              <w:t xml:space="preserve">Supervisor</w:t>
+            </w:r>
+          </w:p>
+        </w:tc>
+        <w:tc>
+          <w:tcPr>
+            <w:tcW w:type="pct" w:w="74%"/>
+            <w:tcBorders>
+              <w:top w:val="single" w:color="AAB4C0" w:sz="2"/>
+              <w:left w:val="single" w:color="AAB4C0" w:sz="2"/>
+              <w:bottom w:val="single" w:color="AAB4C0" w:sz="2"/>
+              <w:right w:val="single" w:color="AAB4C0" w:sz="2"/>
+            </w:tcBorders>
+            <w:tcMar>
+              <w:top w:type="dxa" w:w="20"/>
+              <w:left w:type="dxa" w:w="70"/>
+              <w:bottom w:type="dxa" w:w="20"/>
+              <w:right w:type="dxa" w:w="70"/>
+            </w:tcMar>
+            <w:vAlign w:val="center"/>
+          </w:tcPr>
+          <w:p>
+            <w:pPr>
+              <w:spacing w:after="0" w:line="240" w:lineRule="auto"/>
+              <w:jc w:val="left"/>
+            </w:pPr>
+            <w:r>
+              <w:rPr>
+                <w:rFonts w:ascii="Times New Roman" w:cs="Times New Roman" w:eastAsia="Times New Roman" w:hAnsi="Times New Roman"/>
+                <w:sz w:val="18"/>
+                <w:szCs w:val="18"/>
+              </w:rPr>
+              <w:t xml:space="preserve">Aprobar una orden de compra · Confirmar o anular una orden de pago.</w:t>
+            </w:r>
+          </w:p>
+        </w:tc>
+      </w:tr>
+    </w:tbl>
+    <w:p>
+      <w:pPr>
+        <w:spacing w:after="200"/>
+        <w:jc w:val="center"/>
+      </w:pPr>
+      <w:r>
+        <w:rPr>
+          <w:i/>
+          <w:iCs/>
+          <w:sz w:val="20"/>
+          <w:szCs w:val="20"/>
+        </w:rPr>
+        <w:t xml:space="preserve">Tabla 6. Roles y tareas del módulo Compras.</w:t>
+      </w:r>
+    </w:p>
+    <w:p>
+      <w:pPr>
+        <w:pStyle w:val="Heading2"/>
+        <w:spacing w:after="120" w:before="200"/>
+      </w:pPr>
+      <w:r>
+        <w:rPr>
+          <w:b/>
+          <w:bCs/>
+        </w:rPr>
+        <w:t xml:space="preserve">8.1. Crear una orden de compra</w:t>
+      </w:r>
+    </w:p>
+    <w:p>
+      <w:pPr>
+        <w:spacing w:after="160" w:line="360" w:lineRule="auto"/>
+        <w:jc w:val="both"/>
+      </w:pPr>
+      <w:r>
+        <w:rPr>
+          <w:b/>
+          <w:bCs/>
+        </w:rPr>
+        <w:t xml:space="preserve">Rol: </w:t>
+      </w:r>
+      <w:r>
+        <w:t xml:space="preserve">Comprador.</w:t>
+      </w:r>
+    </w:p>
+    <w:p>
+      <w:pPr>
+        <w:spacing w:after="160" w:line="360" w:lineRule="auto"/>
+        <w:jc w:val="both"/>
+      </w:pPr>
+      <w:r>
+        <w:rPr>
+          <w:b/>
+          <w:bCs/>
+        </w:rPr>
+        <w:t xml:space="preserve">Objetivo: </w:t>
+      </w:r>
+      <w:r>
+        <w:t xml:space="preserve">emitir una orden de compra a un proveedor con los productos a comprar.</w:t>
+      </w:r>
+    </w:p>
+    <w:p>
+      <w:pPr>
+        <w:pStyle w:val="Heading3"/>
+        <w:spacing w:after="60" w:before="160"/>
+      </w:pPr>
+      <w:r>
+        <w:rPr>
+          <w:b/>
+          <w:bCs/>
+        </w:rPr>
+        <w:t xml:space="preserve">Pasos</w:t>
+      </w:r>
+    </w:p>
+    <w:p>
+      <w:pPr>
+        <w:pStyle w:val="ListParagraph"/>
+        <w:numPr>
+          <w:ilvl w:val="0"/>
+          <w:numId w:val="20"/>
+        </w:numPr>
+        <w:spacing w:after="60" w:line="360" w:lineRule="auto"/>
+      </w:pPr>
+      <w:r>
+        <w:t xml:space="preserve">En el menú, ingrese a </w:t>
+      </w:r>
+      <w:r>
+        <w:rPr>
+          <w:b/>
+          <w:bCs/>
+        </w:rPr>
+        <w:t xml:space="preserve">Compras y Pagos → Orden de Compra</w:t>
+      </w:r>
+      <w:r>
+        <w:t xml:space="preserve">.</w:t>
+      </w:r>
+    </w:p>
+    <w:p>
+      <w:pPr>
+        <w:pStyle w:val="ListParagraph"/>
+        <w:numPr>
+          <w:ilvl w:val="0"/>
+          <w:numId w:val="20"/>
+        </w:numPr>
+        <w:spacing w:after="60" w:line="360" w:lineRule="auto"/>
+      </w:pPr>
+      <w:r>
+        <w:t xml:space="preserve">Seleccione el </w:t>
+      </w:r>
+      <w:r>
+        <w:rPr>
+          <w:b/>
+          <w:bCs/>
+        </w:rPr>
+        <w:t xml:space="preserve">Proveedor</w:t>
+      </w:r>
+      <w:r>
+        <w:t xml:space="preserve">.</w:t>
+      </w:r>
+    </w:p>
+    <w:p>
+      <w:pPr>
+        <w:pStyle w:val="ListParagraph"/>
+        <w:numPr>
+          <w:ilvl w:val="0"/>
+          <w:numId w:val="20"/>
+        </w:numPr>
+        <w:spacing w:after="60" w:line="360" w:lineRule="auto"/>
+      </w:pPr>
+      <w:r>
+        <w:t xml:space="preserve">Agregue los productos: elija el </w:t>
+      </w:r>
+      <w:r>
+        <w:rPr>
+          <w:b/>
+          <w:bCs/>
+        </w:rPr>
+        <w:t xml:space="preserve">Producto</w:t>
+      </w:r>
+      <w:r>
+        <w:t xml:space="preserve"> y la </w:t>
+      </w:r>
+      <w:r>
+        <w:rPr>
+          <w:b/>
+          <w:bCs/>
+        </w:rPr>
+        <w:t xml:space="preserve">Cantidad</w:t>
+      </w:r>
+      <w:r>
+        <w:t xml:space="preserve"> (y el precio, si corresponde). Repita por cada producto.</w:t>
+      </w:r>
+    </w:p>
+    <w:p>
+      <w:pPr>
+        <w:pStyle w:val="ListParagraph"/>
+        <w:numPr>
+          <w:ilvl w:val="0"/>
+          <w:numId w:val="20"/>
+        </w:numPr>
+        <w:spacing w:after="60" w:line="360" w:lineRule="auto"/>
+      </w:pPr>
+      <w:r>
+        <w:t xml:space="preserve">Presione </w:t>
+      </w:r>
+      <w:r>
+        <w:rPr>
+          <w:b/>
+          <w:bCs/>
+        </w:rPr>
+        <w:t xml:space="preserve">Crear</w:t>
+      </w:r>
+      <w:r>
+        <w:t xml:space="preserve">. La orden de compra queda registrada, </w:t>
+      </w:r>
+      <w:r>
+        <w:rPr>
+          <w:b/>
+          <w:bCs/>
+        </w:rPr>
+        <w:t xml:space="preserve">pendiente de aprobación</w:t>
+      </w:r>
+      <w:r>
+        <w:t xml:space="preserve">.</w:t>
+      </w:r>
+    </w:p>
+    <w:tbl>
+      <w:tblPr>
+        <w:tblW w:type="pct" w:w="100%"/>
+        <w:tblBorders>
+          <w:top w:val="single" w:color="auto" w:sz="4"/>
+          <w:left w:val="single" w:color="auto" w:sz="4"/>
+          <w:bottom w:val="single" w:color="auto" w:sz="4"/>
+          <w:right w:val="single" w:color="auto" w:sz="4"/>
+          <w:insideH w:val="single" w:color="auto" w:sz="4"/>
+          <w:insideV w:val="single" w:color="auto" w:sz="4"/>
+        </w:tblBorders>
+      </w:tblPr>
+      <w:tblGrid>
+        <w:gridCol w:w="100"/>
+      </w:tblGrid>
+      <w:tr>
+        <w:tc>
+          <w:tcPr>
+            <w:tcBorders>
+              <w:top w:val="dashed" w:color="9AA5B1" w:sz="6"/>
+              <w:left w:val="dashed" w:color="9AA5B1" w:sz="6"/>
+              <w:bottom w:val="dashed" w:color="9AA5B1" w:sz="6"/>
+              <w:right w:val="dashed" w:color="9AA5B1" w:sz="6"/>
+            </w:tcBorders>
+            <w:shd w:fill="F5F7FA" w:val="clear"/>
+            <w:tcMar>
+              <w:top w:type="dxa" w:w="300"/>
+              <w:left w:type="dxa" w:w="160"/>
+              <w:bottom w:type="dxa" w:w="300"/>
+              <w:right w:type="dxa" w:w="160"/>
+            </w:tcMar>
+          </w:tcPr>
+          <w:p>
+            <w:pPr>
+              <w:spacing w:after="40"/>
+              <w:jc w:val="center"/>
+            </w:pPr>
+            <w:r>
+              <w:rPr>
+                <w:b/>
+                <w:bCs/>
+                <w:color w:val="6B7683"/>
+                <w:sz w:val="22"/>
+                <w:szCs w:val="22"/>
+              </w:rPr>
+              <w:t xml:space="preserve">[ FIGURA PENDIENTE DE CAPTURA ]</w:t>
+            </w:r>
+          </w:p>
+          <w:p>
+            <w:pPr>
+              <w:spacing w:after="0"/>
+              <w:jc w:val="center"/>
+            </w:pPr>
+            <w:r>
+              <w:rPr>
+                <w:i/>
+                <w:iCs/>
+                <w:color w:val="9AA5B1"/>
+                <w:sz w:val="20"/>
+                <w:szCs w:val="20"/>
+              </w:rPr>
+              <w:t xml:space="preserve">08_oc_alta_01.png</w:t>
+            </w:r>
+          </w:p>
+        </w:tc>
+      </w:tr>
+    </w:tbl>
+    <w:p>
+      <w:pPr>
+        <w:spacing w:after="200"/>
+        <w:jc w:val="center"/>
+      </w:pPr>
+      <w:r>
+        <w:rPr>
+          <w:i/>
+          <w:iCs/>
+          <w:sz w:val="20"/>
+          <w:szCs w:val="20"/>
+        </w:rPr>
+        <w:t xml:space="preserve">Figura 30. Alta de una orden de compra.</w:t>
+      </w:r>
+    </w:p>
+    <w:p>
+      <w:pPr>
+        <w:pageBreakBefore/>
+      </w:pPr>
+      <w:r>
+        <w:t xml:space="preserve"/>
+      </w:r>
+    </w:p>
+    <w:p>
+      <w:pPr>
+        <w:pStyle w:val="Heading2"/>
+        <w:spacing w:after="120" w:before="200"/>
+      </w:pPr>
+      <w:r>
+        <w:rPr>
+          <w:b/>
+          <w:bCs/>
+        </w:rPr>
+        <w:t xml:space="preserve">8.2. Aprobar una orden de compra</w:t>
+      </w:r>
+    </w:p>
+    <w:p>
+      <w:pPr>
+        <w:spacing w:after="160" w:line="360" w:lineRule="auto"/>
+        <w:jc w:val="both"/>
+      </w:pPr>
+      <w:r>
+        <w:rPr>
+          <w:b/>
+          <w:bCs/>
+        </w:rPr>
+        <w:t xml:space="preserve">Rol: </w:t>
+      </w:r>
+      <w:r>
+        <w:t xml:space="preserve">Supervisor.</w:t>
+      </w:r>
+    </w:p>
+    <w:p>
+      <w:pPr>
+        <w:spacing w:after="160" w:line="360" w:lineRule="auto"/>
+        <w:jc w:val="both"/>
+      </w:pPr>
+      <w:r>
+        <w:rPr>
+          <w:b/>
+          <w:bCs/>
+        </w:rPr>
+        <w:t xml:space="preserve">Objetivo: </w:t>
+      </w:r>
+      <w:r>
+        <w:t xml:space="preserve">revisar y aprobar una orden de compra para que pueda recepcionarse.</w:t>
+      </w:r>
+    </w:p>
+    <w:p>
+      <w:pPr>
+        <w:pStyle w:val="Heading3"/>
+        <w:spacing w:after="60" w:before="160"/>
+      </w:pPr>
+      <w:r>
+        <w:rPr>
+          <w:b/>
+          <w:bCs/>
+        </w:rPr>
+        <w:t xml:space="preserve">Pasos</w:t>
+      </w:r>
+    </w:p>
+    <w:p>
+      <w:pPr>
+        <w:pStyle w:val="ListParagraph"/>
+        <w:numPr>
+          <w:ilvl w:val="0"/>
+          <w:numId w:val="21"/>
+        </w:numPr>
+        <w:spacing w:after="60" w:line="360" w:lineRule="auto"/>
+      </w:pPr>
+      <w:r>
+        <w:t xml:space="preserve">En el menú, ingrese a </w:t>
+      </w:r>
+      <w:r>
+        <w:rPr>
+          <w:b/>
+          <w:bCs/>
+        </w:rPr>
+        <w:t xml:space="preserve">Compras y Pagos → Aprobación de Órdenes de Compra</w:t>
+      </w:r>
+      <w:r>
+        <w:t xml:space="preserve">.</w:t>
+      </w:r>
+    </w:p>
+    <w:p>
+      <w:pPr>
+        <w:pStyle w:val="ListParagraph"/>
+        <w:numPr>
+          <w:ilvl w:val="0"/>
+          <w:numId w:val="21"/>
+        </w:numPr>
+        <w:spacing w:after="60" w:line="360" w:lineRule="auto"/>
+      </w:pPr>
+      <w:r>
+        <w:t xml:space="preserve">Abra la orden </w:t>
+      </w:r>
+      <w:r>
+        <w:rPr>
+          <w:b/>
+          <w:bCs/>
+        </w:rPr>
+        <w:t xml:space="preserve">pendiente</w:t>
+      </w:r>
+      <w:r>
+        <w:t xml:space="preserve"> y revise el detalle.</w:t>
+      </w:r>
+    </w:p>
+    <w:p>
+      <w:pPr>
+        <w:pStyle w:val="ListParagraph"/>
+        <w:numPr>
+          <w:ilvl w:val="0"/>
+          <w:numId w:val="21"/>
+        </w:numPr>
+        <w:spacing w:after="60" w:line="360" w:lineRule="auto"/>
+      </w:pPr>
+      <w:r>
+        <w:rPr>
+          <w:b/>
+          <w:bCs/>
+        </w:rPr>
+        <w:t xml:space="preserve">Apruebe</w:t>
+      </w:r>
+      <w:r>
+        <w:t xml:space="preserve"> la orden (o recházela). Aprobada, queda lista para la recepción.</w:t>
+      </w:r>
+    </w:p>
+    <w:tbl>
+      <w:tblPr>
+        <w:tblW w:type="pct" w:w="100%"/>
+        <w:tblBorders>
+          <w:top w:val="single" w:color="auto" w:sz="4"/>
+          <w:left w:val="single" w:color="auto" w:sz="4"/>
+          <w:bottom w:val="single" w:color="auto" w:sz="4"/>
+          <w:right w:val="single" w:color="auto" w:sz="4"/>
+          <w:insideH w:val="single" w:color="auto" w:sz="4"/>
+          <w:insideV w:val="single" w:color="auto" w:sz="4"/>
+        </w:tblBorders>
+      </w:tblPr>
+      <w:tblGrid>
+        <w:gridCol w:w="100"/>
+      </w:tblGrid>
+      <w:tr>
+        <w:tc>
+          <w:tcPr>
+            <w:tcBorders>
+              <w:top w:val="dashed" w:color="9AA5B1" w:sz="6"/>
+              <w:left w:val="dashed" w:color="9AA5B1" w:sz="6"/>
+              <w:bottom w:val="dashed" w:color="9AA5B1" w:sz="6"/>
+              <w:right w:val="dashed" w:color="9AA5B1" w:sz="6"/>
+            </w:tcBorders>
+            <w:shd w:fill="F5F7FA" w:val="clear"/>
+            <w:tcMar>
+              <w:top w:type="dxa" w:w="300"/>
+              <w:left w:type="dxa" w:w="160"/>
+              <w:bottom w:type="dxa" w:w="300"/>
+              <w:right w:type="dxa" w:w="160"/>
+            </w:tcMar>
+          </w:tcPr>
+          <w:p>
+            <w:pPr>
+              <w:spacing w:after="40"/>
+              <w:jc w:val="center"/>
+            </w:pPr>
+            <w:r>
+              <w:rPr>
+                <w:b/>
+                <w:bCs/>
+                <w:color w:val="6B7683"/>
+                <w:sz w:val="22"/>
+                <w:szCs w:val="22"/>
+              </w:rPr>
+              <w:t xml:space="preserve">[ FIGURA PENDIENTE DE CAPTURA ]</w:t>
+            </w:r>
+          </w:p>
+          <w:p>
+            <w:pPr>
+              <w:spacing w:after="0"/>
+              <w:jc w:val="center"/>
+            </w:pPr>
+            <w:r>
+              <w:rPr>
+                <w:i/>
+                <w:iCs/>
+                <w:color w:val="9AA5B1"/>
+                <w:sz w:val="20"/>
+                <w:szCs w:val="20"/>
+              </w:rPr>
+              <w:t xml:space="preserve">08_oc_aprobar_01.png</w:t>
+            </w:r>
+          </w:p>
+        </w:tc>
+      </w:tr>
+    </w:tbl>
+    <w:p>
+      <w:pPr>
+        <w:spacing w:after="200"/>
+        <w:jc w:val="center"/>
+      </w:pPr>
+      <w:r>
+        <w:rPr>
+          <w:i/>
+          <w:iCs/>
+          <w:sz w:val="20"/>
+          <w:szCs w:val="20"/>
+        </w:rPr>
+        <w:t xml:space="preserve">Figura 31. Aprobación de una orden de compra.</w:t>
+      </w:r>
+    </w:p>
+    <w:tbl>
+      <w:tblPr>
+        <w:tblW w:type="pct" w:w="100%"/>
+        <w:tblBorders>
+          <w:top w:val="single" w:color="auto" w:sz="4"/>
+          <w:left w:val="single" w:color="auto" w:sz="4"/>
+          <w:bottom w:val="single" w:color="auto" w:sz="4"/>
+          <w:right w:val="single" w:color="auto" w:sz="4"/>
+          <w:insideH w:val="single" w:color="auto" w:sz="4"/>
+          <w:insideV w:val="single" w:color="auto" w:sz="4"/>
+        </w:tblBorders>
+      </w:tblPr>
+      <w:tblGrid>
+        <w:gridCol w:w="100"/>
+      </w:tblGrid>
+      <w:tr>
+        <w:tc>
+          <w:tcPr>
+            <w:tcBorders>
+              <w:top w:val="single" w:color="2E6DA4" w:sz="2"/>
+              <w:left w:val="single" w:color="2E6DA4" w:sz="24"/>
+              <w:bottom w:val="single" w:color="2E6DA4" w:sz="2"/>
+              <w:right w:val="single" w:color="2E6DA4" w:sz="2"/>
+            </w:tcBorders>
+            <w:shd w:fill="E8F1FB" w:val="clear"/>
+            <w:tcMar>
+              <w:top w:type="dxa" w:w="80"/>
+              <w:left w:type="dxa" w:w="160"/>
+              <w:bottom w:type="dxa" w:w="80"/>
+              <w:right w:type="dxa" w:w="160"/>
+            </w:tcMar>
+          </w:tcPr>
+          <w:p>
+            <w:pPr>
+              <w:spacing w:after="0" w:line="300"/>
+              <w:jc w:val="both"/>
+            </w:pPr>
+            <w:r>
+              <w:rPr>
+                <w:b/>
+                <w:bCs/>
+                <w:color w:val="2E6DA4"/>
+              </w:rPr>
+              <w:t xml:space="preserve">Nota: </w:t>
+            </w:r>
+            <w:r>
+              <w:t xml:space="preserve">Solo las órdenes de compra </w:t>
+            </w:r>
+            <w:r>
+              <w:rPr>
+                <w:b/>
+                <w:bCs/>
+              </w:rPr>
+              <w:t xml:space="preserve">aprobadas</w:t>
+            </w:r>
+            <w:r>
+              <w:t xml:space="preserve"> pueden recepcionarse.</w:t>
+            </w:r>
+          </w:p>
+        </w:tc>
+      </w:tr>
+    </w:tbl>
+    <w:p>
+      <w:pPr>
+        <w:pageBreakBefore/>
+      </w:pPr>
+      <w:r>
+        <w:t xml:space="preserve"/>
+      </w:r>
+    </w:p>
+    <w:p>
+      <w:pPr>
+        <w:pStyle w:val="Heading2"/>
+        <w:spacing w:after="120" w:before="200"/>
+      </w:pPr>
+      <w:r>
+        <w:rPr>
+          <w:b/>
+          <w:bCs/>
+        </w:rPr>
+        <w:t xml:space="preserve">8.3. Recepcionar una orden de compra</w:t>
+      </w:r>
+    </w:p>
+    <w:p>
+      <w:pPr>
+        <w:spacing w:after="160" w:line="360" w:lineRule="auto"/>
+        <w:jc w:val="both"/>
+      </w:pPr>
+      <w:r>
+        <w:rPr>
+          <w:b/>
+          <w:bCs/>
+        </w:rPr>
+        <w:t xml:space="preserve">Rol: </w:t>
+      </w:r>
+      <w:r>
+        <w:t xml:space="preserve">Comprador.</w:t>
+      </w:r>
+    </w:p>
+    <w:p>
+      <w:pPr>
+        <w:spacing w:after="160" w:line="360" w:lineRule="auto"/>
+        <w:jc w:val="both"/>
+      </w:pPr>
+      <w:r>
+        <w:rPr>
+          <w:b/>
+          <w:bCs/>
+        </w:rPr>
+        <w:t xml:space="preserve">Objetivo: </w:t>
+      </w:r>
+      <w:r>
+        <w:t xml:space="preserve">registrar la entrada de la mercadería recibida contra una orden de compra.</w:t>
+      </w:r>
+    </w:p>
+    <w:p>
+      <w:pPr>
+        <w:pStyle w:val="Heading3"/>
+        <w:spacing w:after="60" w:before="160"/>
+      </w:pPr>
+      <w:r>
+        <w:rPr>
+          <w:b/>
+          <w:bCs/>
+        </w:rPr>
+        <w:t xml:space="preserve">Pasos</w:t>
+      </w:r>
+    </w:p>
+    <w:p>
+      <w:pPr>
+        <w:pStyle w:val="ListParagraph"/>
+        <w:numPr>
+          <w:ilvl w:val="0"/>
+          <w:numId w:val="22"/>
+        </w:numPr>
+        <w:spacing w:after="60" w:line="360" w:lineRule="auto"/>
+      </w:pPr>
+      <w:r>
+        <w:t xml:space="preserve">En el menú, ingrese a </w:t>
+      </w:r>
+      <w:r>
+        <w:rPr>
+          <w:b/>
+          <w:bCs/>
+        </w:rPr>
+        <w:t xml:space="preserve">Compras y Pagos → Recepción de Orden de Compra</w:t>
+      </w:r>
+      <w:r>
+        <w:t xml:space="preserve">.</w:t>
+      </w:r>
+    </w:p>
+    <w:p>
+      <w:pPr>
+        <w:pStyle w:val="ListParagraph"/>
+        <w:numPr>
+          <w:ilvl w:val="0"/>
+          <w:numId w:val="22"/>
+        </w:numPr>
+        <w:spacing w:after="60" w:line="360" w:lineRule="auto"/>
+      </w:pPr>
+      <w:r>
+        <w:t xml:space="preserve">Seleccione la orden de compra a recepcionar.</w:t>
+      </w:r>
+    </w:p>
+    <w:p>
+      <w:pPr>
+        <w:pStyle w:val="ListParagraph"/>
+        <w:numPr>
+          <w:ilvl w:val="0"/>
+          <w:numId w:val="22"/>
+        </w:numPr>
+        <w:spacing w:after="60" w:line="360" w:lineRule="auto"/>
+      </w:pPr>
+      <w:r>
+        <w:t xml:space="preserve">Indique las </w:t>
+      </w:r>
+      <w:r>
+        <w:rPr>
+          <w:b/>
+          <w:bCs/>
+        </w:rPr>
+        <w:t xml:space="preserve">cantidades recibidas</w:t>
+      </w:r>
+      <w:r>
+        <w:t xml:space="preserve"> por producto y confirme. El sistema </w:t>
+      </w:r>
+      <w:r>
+        <w:rPr>
+          <w:b/>
+          <w:bCs/>
+        </w:rPr>
+        <w:t xml:space="preserve">ingresa el stock</w:t>
+      </w:r>
+      <w:r>
+        <w:t xml:space="preserve"> de los productos recibidos.</w:t>
+      </w:r>
+    </w:p>
+    <w:tbl>
+      <w:tblPr>
+        <w:tblW w:type="pct" w:w="100%"/>
+        <w:tblBorders>
+          <w:top w:val="single" w:color="auto" w:sz="4"/>
+          <w:left w:val="single" w:color="auto" w:sz="4"/>
+          <w:bottom w:val="single" w:color="auto" w:sz="4"/>
+          <w:right w:val="single" w:color="auto" w:sz="4"/>
+          <w:insideH w:val="single" w:color="auto" w:sz="4"/>
+          <w:insideV w:val="single" w:color="auto" w:sz="4"/>
+        </w:tblBorders>
+      </w:tblPr>
+      <w:tblGrid>
+        <w:gridCol w:w="100"/>
+      </w:tblGrid>
+      <w:tr>
+        <w:tc>
+          <w:tcPr>
+            <w:tcBorders>
+              <w:top w:val="dashed" w:color="9AA5B1" w:sz="6"/>
+              <w:left w:val="dashed" w:color="9AA5B1" w:sz="6"/>
+              <w:bottom w:val="dashed" w:color="9AA5B1" w:sz="6"/>
+              <w:right w:val="dashed" w:color="9AA5B1" w:sz="6"/>
+            </w:tcBorders>
+            <w:shd w:fill="F5F7FA" w:val="clear"/>
+            <w:tcMar>
+              <w:top w:type="dxa" w:w="300"/>
+              <w:left w:type="dxa" w:w="160"/>
+              <w:bottom w:type="dxa" w:w="300"/>
+              <w:right w:type="dxa" w:w="160"/>
+            </w:tcMar>
+          </w:tcPr>
+          <w:p>
+            <w:pPr>
+              <w:spacing w:after="40"/>
+              <w:jc w:val="center"/>
+            </w:pPr>
+            <w:r>
+              <w:rPr>
+                <w:b/>
+                <w:bCs/>
+                <w:color w:val="6B7683"/>
+                <w:sz w:val="22"/>
+                <w:szCs w:val="22"/>
+              </w:rPr>
+              <w:t xml:space="preserve">[ FIGURA PENDIENTE DE CAPTURA ]</w:t>
+            </w:r>
+          </w:p>
+          <w:p>
+            <w:pPr>
+              <w:spacing w:after="0"/>
+              <w:jc w:val="center"/>
+            </w:pPr>
+            <w:r>
+              <w:rPr>
+                <w:i/>
+                <w:iCs/>
+                <w:color w:val="9AA5B1"/>
+                <w:sz w:val="20"/>
+                <w:szCs w:val="20"/>
+              </w:rPr>
+              <w:t xml:space="preserve">08_oc_recepcion_01.png</w:t>
+            </w:r>
+          </w:p>
+        </w:tc>
+      </w:tr>
+    </w:tbl>
+    <w:p>
+      <w:pPr>
+        <w:spacing w:after="200"/>
+        <w:jc w:val="center"/>
+      </w:pPr>
+      <w:r>
+        <w:rPr>
+          <w:i/>
+          <w:iCs/>
+          <w:sz w:val="20"/>
+          <w:szCs w:val="20"/>
+        </w:rPr>
+        <w:t xml:space="preserve">Figura 32. Recepción de una orden de compra.</w:t>
+      </w:r>
+    </w:p>
+    <w:tbl>
+      <w:tblPr>
+        <w:tblW w:type="pct" w:w="100%"/>
+        <w:tblBorders>
+          <w:top w:val="single" w:color="auto" w:sz="4"/>
+          <w:left w:val="single" w:color="auto" w:sz="4"/>
+          <w:bottom w:val="single" w:color="auto" w:sz="4"/>
+          <w:right w:val="single" w:color="auto" w:sz="4"/>
+          <w:insideH w:val="single" w:color="auto" w:sz="4"/>
+          <w:insideV w:val="single" w:color="auto" w:sz="4"/>
+        </w:tblBorders>
+      </w:tblPr>
+      <w:tblGrid>
+        <w:gridCol w:w="100"/>
+      </w:tblGrid>
+      <w:tr>
+        <w:tc>
+          <w:tcPr>
+            <w:tcBorders>
+              <w:top w:val="single" w:color="2E6DA4" w:sz="2"/>
+              <w:left w:val="single" w:color="2E6DA4" w:sz="24"/>
+              <w:bottom w:val="single" w:color="2E6DA4" w:sz="2"/>
+              <w:right w:val="single" w:color="2E6DA4" w:sz="2"/>
+            </w:tcBorders>
+            <w:shd w:fill="E8F1FB" w:val="clear"/>
+            <w:tcMar>
+              <w:top w:type="dxa" w:w="80"/>
+              <w:left w:type="dxa" w:w="160"/>
+              <w:bottom w:type="dxa" w:w="80"/>
+              <w:right w:type="dxa" w:w="160"/>
+            </w:tcMar>
+          </w:tcPr>
+          <w:p>
+            <w:pPr>
+              <w:spacing w:after="0" w:line="300"/>
+              <w:jc w:val="both"/>
+            </w:pPr>
+            <w:r>
+              <w:rPr>
+                <w:b/>
+                <w:bCs/>
+                <w:color w:val="2E6DA4"/>
+              </w:rPr>
+              <w:t xml:space="preserve">Nota: </w:t>
+            </w:r>
+            <w:r>
+              <w:t xml:space="preserve">La recepción puede ser </w:t>
+            </w:r>
+            <w:r>
+              <w:rPr>
+                <w:b/>
+                <w:bCs/>
+              </w:rPr>
+              <w:t xml:space="preserve">parcial</w:t>
+            </w:r>
+            <w:r>
+              <w:t xml:space="preserve">: el stock se actualiza con lo efectivamente recibido.</w:t>
+            </w:r>
+          </w:p>
+        </w:tc>
+      </w:tr>
+    </w:tbl>
+    <w:p>
+      <w:pPr>
+        <w:pageBreakBefore/>
+      </w:pPr>
+      <w:r>
+        <w:t xml:space="preserve"/>
+      </w:r>
+    </w:p>
+    <w:p>
+      <w:pPr>
+        <w:pStyle w:val="Heading2"/>
+        <w:spacing w:after="120" w:before="200"/>
+      </w:pPr>
+      <w:r>
+        <w:rPr>
+          <w:b/>
+          <w:bCs/>
+        </w:rPr>
+        <w:t xml:space="preserve">8.4. Registrar la factura del proveedor</w:t>
+      </w:r>
+    </w:p>
+    <w:p>
+      <w:pPr>
+        <w:spacing w:after="160" w:line="360" w:lineRule="auto"/>
+        <w:jc w:val="both"/>
+      </w:pPr>
+      <w:r>
+        <w:rPr>
+          <w:b/>
+          <w:bCs/>
+        </w:rPr>
+        <w:t xml:space="preserve">Rol: </w:t>
+      </w:r>
+      <w:r>
+        <w:t xml:space="preserve">Comprador.</w:t>
+      </w:r>
+    </w:p>
+    <w:p>
+      <w:pPr>
+        <w:spacing w:after="160" w:line="360" w:lineRule="auto"/>
+        <w:jc w:val="both"/>
+      </w:pPr>
+      <w:r>
+        <w:rPr>
+          <w:b/>
+          <w:bCs/>
+        </w:rPr>
+        <w:t xml:space="preserve">Objetivo: </w:t>
+      </w:r>
+      <w:r>
+        <w:t xml:space="preserve">registrar la factura emitida por el proveedor por la compra.</w:t>
+      </w:r>
+    </w:p>
+    <w:p>
+      <w:pPr>
+        <w:pStyle w:val="Heading3"/>
+        <w:spacing w:after="60" w:before="160"/>
+      </w:pPr>
+      <w:r>
+        <w:rPr>
+          <w:b/>
+          <w:bCs/>
+        </w:rPr>
+        <w:t xml:space="preserve">Pasos</w:t>
+      </w:r>
+    </w:p>
+    <w:p>
+      <w:pPr>
+        <w:pStyle w:val="ListParagraph"/>
+        <w:numPr>
+          <w:ilvl w:val="0"/>
+          <w:numId w:val="23"/>
+        </w:numPr>
+        <w:spacing w:after="60" w:line="360" w:lineRule="auto"/>
+      </w:pPr>
+      <w:r>
+        <w:t xml:space="preserve">En el menú, ingrese a </w:t>
+      </w:r>
+      <w:r>
+        <w:rPr>
+          <w:b/>
+          <w:bCs/>
+        </w:rPr>
+        <w:t xml:space="preserve">Compras y Pagos → Proceso de Compras</w:t>
+      </w:r>
+      <w:r>
+        <w:t xml:space="preserve">. Se muestra la lista de comprobantes de compra.</w:t>
+      </w:r>
+    </w:p>
+    <w:p>
+      <w:pPr>
+        <w:pStyle w:val="ListParagraph"/>
+        <w:numPr>
+          <w:ilvl w:val="0"/>
+          <w:numId w:val="23"/>
+        </w:numPr>
+        <w:spacing w:after="60" w:line="360" w:lineRule="auto"/>
+      </w:pPr>
+      <w:r>
+        <w:t xml:space="preserve">Presione </w:t>
+      </w:r>
+      <w:r>
+        <w:rPr>
+          <w:b/>
+          <w:bCs/>
+        </w:rPr>
+        <w:t xml:space="preserve">Crear</w:t>
+      </w:r>
+      <w:r>
+        <w:t xml:space="preserve"> para registrar una nueva factura.</w:t>
+      </w:r>
+    </w:p>
+    <w:p>
+      <w:pPr>
+        <w:pStyle w:val="ListParagraph"/>
+        <w:numPr>
+          <w:ilvl w:val="0"/>
+          <w:numId w:val="23"/>
+        </w:numPr>
+        <w:spacing w:after="60" w:line="360" w:lineRule="auto"/>
+      </w:pPr>
+      <w:r>
+        <w:t xml:space="preserve">Seleccione el </w:t>
+      </w:r>
+      <w:r>
+        <w:rPr>
+          <w:b/>
+          <w:bCs/>
+        </w:rPr>
+        <w:t xml:space="preserve">Proveedor</w:t>
+      </w:r>
+      <w:r>
+        <w:t xml:space="preserve"> e ingrese los datos del comprobante: </w:t>
+      </w:r>
+      <w:r>
+        <w:rPr>
+          <w:b/>
+          <w:bCs/>
+        </w:rPr>
+        <w:t xml:space="preserve">Nro. Comprobante</w:t>
+      </w:r>
+      <w:r>
+        <w:t xml:space="preserve">, </w:t>
+      </w:r>
+      <w:r>
+        <w:rPr>
+          <w:b/>
+          <w:bCs/>
+        </w:rPr>
+        <w:t xml:space="preserve">Nro. de Timbrado</w:t>
+      </w:r>
+      <w:r>
+        <w:t xml:space="preserve"> con sus fechas y la </w:t>
+      </w:r>
+      <w:r>
+        <w:rPr>
+          <w:b/>
+          <w:bCs/>
+        </w:rPr>
+        <w:t xml:space="preserve">Fecha de Emisión</w:t>
+      </w:r>
+      <w:r>
+        <w:t xml:space="preserve">.</w:t>
+      </w:r>
+    </w:p>
+    <w:p>
+      <w:pPr>
+        <w:pStyle w:val="ListParagraph"/>
+        <w:numPr>
+          <w:ilvl w:val="0"/>
+          <w:numId w:val="23"/>
+        </w:numPr>
+        <w:spacing w:after="60" w:line="360" w:lineRule="auto"/>
+      </w:pPr>
+      <w:r>
+        <w:t xml:space="preserve">Indique la </w:t>
+      </w:r>
+      <w:r>
+        <w:rPr>
+          <w:b/>
+          <w:bCs/>
+        </w:rPr>
+        <w:t xml:space="preserve">Condición</w:t>
+      </w:r>
+      <w:r>
+        <w:t xml:space="preserve"> (Contado o Crédito) y agregue los productos con su cantidad y precio.</w:t>
+      </w:r>
+    </w:p>
+    <w:p>
+      <w:pPr>
+        <w:pStyle w:val="ListParagraph"/>
+        <w:numPr>
+          <w:ilvl w:val="0"/>
+          <w:numId w:val="23"/>
+        </w:numPr>
+        <w:spacing w:after="60" w:line="360" w:lineRule="auto"/>
+      </w:pPr>
+      <w:r>
+        <w:t xml:space="preserve">Presione </w:t>
+      </w:r>
+      <w:r>
+        <w:rPr>
+          <w:b/>
+          <w:bCs/>
+        </w:rPr>
+        <w:t xml:space="preserve">Crear</w:t>
+      </w:r>
+      <w:r>
+        <w:t xml:space="preserve">. La factura queda registrada.</w:t>
+      </w:r>
+    </w:p>
+    <w:tbl>
+      <w:tblPr>
+        <w:tblW w:type="pct" w:w="100%"/>
+        <w:tblBorders>
+          <w:top w:val="single" w:color="auto" w:sz="4"/>
+          <w:left w:val="single" w:color="auto" w:sz="4"/>
+          <w:bottom w:val="single" w:color="auto" w:sz="4"/>
+          <w:right w:val="single" w:color="auto" w:sz="4"/>
+          <w:insideH w:val="single" w:color="auto" w:sz="4"/>
+          <w:insideV w:val="single" w:color="auto" w:sz="4"/>
+        </w:tblBorders>
+      </w:tblPr>
+      <w:tblGrid>
+        <w:gridCol w:w="100"/>
+      </w:tblGrid>
+      <w:tr>
+        <w:tc>
+          <w:tcPr>
+            <w:tcBorders>
+              <w:top w:val="dashed" w:color="9AA5B1" w:sz="6"/>
+              <w:left w:val="dashed" w:color="9AA5B1" w:sz="6"/>
+              <w:bottom w:val="dashed" w:color="9AA5B1" w:sz="6"/>
+              <w:right w:val="dashed" w:color="9AA5B1" w:sz="6"/>
+            </w:tcBorders>
+            <w:shd w:fill="F5F7FA" w:val="clear"/>
+            <w:tcMar>
+              <w:top w:type="dxa" w:w="300"/>
+              <w:left w:type="dxa" w:w="160"/>
+              <w:bottom w:type="dxa" w:w="300"/>
+              <w:right w:type="dxa" w:w="160"/>
+            </w:tcMar>
+          </w:tcPr>
+          <w:p>
+            <w:pPr>
+              <w:spacing w:after="40"/>
+              <w:jc w:val="center"/>
+            </w:pPr>
+            <w:r>
+              <w:rPr>
+                <w:b/>
+                <w:bCs/>
+                <w:color w:val="6B7683"/>
+                <w:sz w:val="22"/>
+                <w:szCs w:val="22"/>
+              </w:rPr>
+              <w:t xml:space="preserve">[ FIGURA PENDIENTE DE CAPTURA ]</w:t>
+            </w:r>
+          </w:p>
+          <w:p>
+            <w:pPr>
+              <w:spacing w:after="0"/>
+              <w:jc w:val="center"/>
+            </w:pPr>
+            <w:r>
+              <w:rPr>
+                <w:i/>
+                <w:iCs/>
+                <w:color w:val="9AA5B1"/>
+                <w:sz w:val="20"/>
+                <w:szCs w:val="20"/>
+              </w:rPr>
+              <w:t xml:space="preserve">08_factura_prov_01.png</w:t>
+            </w:r>
+          </w:p>
+        </w:tc>
+      </w:tr>
+    </w:tbl>
+    <w:p>
+      <w:pPr>
+        <w:spacing w:after="200"/>
+        <w:jc w:val="center"/>
+      </w:pPr>
+      <w:r>
+        <w:rPr>
+          <w:i/>
+          <w:iCs/>
+          <w:sz w:val="20"/>
+          <w:szCs w:val="20"/>
+        </w:rPr>
+        <w:t xml:space="preserve">Figura 33. Registro de la factura del proveedor.</w:t>
+      </w:r>
+    </w:p>
+    <w:tbl>
+      <w:tblPr>
+        <w:tblW w:type="pct" w:w="100%"/>
+        <w:tblBorders>
+          <w:top w:val="single" w:color="auto" w:sz="4"/>
+          <w:left w:val="single" w:color="auto" w:sz="4"/>
+          <w:bottom w:val="single" w:color="auto" w:sz="4"/>
+          <w:right w:val="single" w:color="auto" w:sz="4"/>
+          <w:insideH w:val="single" w:color="auto" w:sz="4"/>
+          <w:insideV w:val="single" w:color="auto" w:sz="4"/>
+        </w:tblBorders>
+      </w:tblPr>
+      <w:tblGrid>
+        <w:gridCol w:w="100"/>
+      </w:tblGrid>
+      <w:tr>
+        <w:tc>
+          <w:tcPr>
+            <w:tcBorders>
+              <w:top w:val="single" w:color="2E6DA4" w:sz="2"/>
+              <w:left w:val="single" w:color="2E6DA4" w:sz="24"/>
+              <w:bottom w:val="single" w:color="2E6DA4" w:sz="2"/>
+              <w:right w:val="single" w:color="2E6DA4" w:sz="2"/>
+            </w:tcBorders>
+            <w:shd w:fill="E8F1FB" w:val="clear"/>
+            <w:tcMar>
+              <w:top w:type="dxa" w:w="80"/>
+              <w:left w:type="dxa" w:w="160"/>
+              <w:bottom w:type="dxa" w:w="80"/>
+              <w:right w:type="dxa" w:w="160"/>
+            </w:tcMar>
+          </w:tcPr>
+          <w:p>
+            <w:pPr>
+              <w:spacing w:after="0" w:line="300"/>
+              <w:jc w:val="both"/>
+            </w:pPr>
+            <w:r>
+              <w:rPr>
+                <w:b/>
+                <w:bCs/>
+                <w:color w:val="2E6DA4"/>
+              </w:rPr>
+              <w:t xml:space="preserve">Nota: </w:t>
+            </w:r>
+            <w:r>
+              <w:t xml:space="preserve">Una factura a </w:t>
+            </w:r>
+            <w:r>
+              <w:rPr>
+                <w:b/>
+                <w:bCs/>
+              </w:rPr>
+              <w:t xml:space="preserve">crédito</w:t>
+            </w:r>
+            <w:r>
+              <w:t xml:space="preserve"> genera la </w:t>
+            </w:r>
+            <w:r>
+              <w:rPr>
+                <w:b/>
+                <w:bCs/>
+              </w:rPr>
+              <w:t xml:space="preserve">cuenta por pagar</w:t>
+            </w:r>
+            <w:r>
+              <w:t xml:space="preserve"> correspondiente, con vencimiento según el plazo de pago del proveedor.</w:t>
+            </w:r>
+          </w:p>
+        </w:tc>
+      </w:tr>
+    </w:tbl>
+    <w:p>
+      <w:pPr>
+        <w:pageBreakBefore/>
+      </w:pPr>
+      <w:r>
+        <w:t xml:space="preserve"/>
+      </w:r>
+    </w:p>
+    <w:p>
+      <w:pPr>
+        <w:pStyle w:val="Heading2"/>
+        <w:spacing w:after="120" w:before="200"/>
+      </w:pPr>
+      <w:r>
+        <w:rPr>
+          <w:b/>
+          <w:bCs/>
+        </w:rPr>
+        <w:t xml:space="preserve">8.5. Generar una orden de pago</w:t>
+      </w:r>
+    </w:p>
+    <w:p>
+      <w:pPr>
+        <w:spacing w:after="160" w:line="360" w:lineRule="auto"/>
+        <w:jc w:val="both"/>
+      </w:pPr>
+      <w:r>
+        <w:rPr>
+          <w:b/>
+          <w:bCs/>
+        </w:rPr>
+        <w:t xml:space="preserve">Rol: </w:t>
+      </w:r>
+      <w:r>
+        <w:t xml:space="preserve">Comprador.</w:t>
+      </w:r>
+    </w:p>
+    <w:p>
+      <w:pPr>
+        <w:spacing w:after="160" w:line="360" w:lineRule="auto"/>
+        <w:jc w:val="both"/>
+      </w:pPr>
+      <w:r>
+        <w:rPr>
+          <w:b/>
+          <w:bCs/>
+        </w:rPr>
+        <w:t xml:space="preserve">Objetivo: </w:t>
+      </w:r>
+      <w:r>
+        <w:t xml:space="preserve">preparar el pago de una o varias facturas pendientes de un proveedor.</w:t>
+      </w:r>
+    </w:p>
+    <w:p>
+      <w:pPr>
+        <w:pStyle w:val="Heading3"/>
+        <w:spacing w:after="60" w:before="160"/>
+      </w:pPr>
+      <w:r>
+        <w:rPr>
+          <w:b/>
+          <w:bCs/>
+        </w:rPr>
+        <w:t xml:space="preserve">Pasos</w:t>
+      </w:r>
+    </w:p>
+    <w:p>
+      <w:pPr>
+        <w:pStyle w:val="ListParagraph"/>
+        <w:numPr>
+          <w:ilvl w:val="0"/>
+          <w:numId w:val="24"/>
+        </w:numPr>
+        <w:spacing w:after="60" w:line="360" w:lineRule="auto"/>
+      </w:pPr>
+      <w:r>
+        <w:t xml:space="preserve">En el menú, ingrese a </w:t>
+      </w:r>
+      <w:r>
+        <w:rPr>
+          <w:b/>
+          <w:bCs/>
+        </w:rPr>
+        <w:t xml:space="preserve">Compras y Pagos → Deuda a Proveedores</w:t>
+      </w:r>
+      <w:r>
+        <w:t xml:space="preserve">. Se muestran las facturas pendientes de pago con su saldo y vencimiento.</w:t>
+      </w:r>
+    </w:p>
+    <w:p>
+      <w:pPr>
+        <w:pStyle w:val="ListParagraph"/>
+        <w:numPr>
+          <w:ilvl w:val="0"/>
+          <w:numId w:val="24"/>
+        </w:numPr>
+        <w:spacing w:after="60" w:line="360" w:lineRule="auto"/>
+      </w:pPr>
+      <w:r>
+        <w:t xml:space="preserve">Seleccione las facturas a pagar e indique el importe.</w:t>
+      </w:r>
+    </w:p>
+    <w:p>
+      <w:pPr>
+        <w:pStyle w:val="ListParagraph"/>
+        <w:numPr>
+          <w:ilvl w:val="0"/>
+          <w:numId w:val="24"/>
+        </w:numPr>
+        <w:spacing w:after="60" w:line="360" w:lineRule="auto"/>
+      </w:pPr>
+      <w:r>
+        <w:t xml:space="preserve">Presione </w:t>
+      </w:r>
+      <w:r>
+        <w:rPr>
+          <w:b/>
+          <w:bCs/>
+        </w:rPr>
+        <w:t xml:space="preserve">Generar Orden de Pago</w:t>
+      </w:r>
+      <w:r>
+        <w:t xml:space="preserve">. La orden se crea en estado </w:t>
+      </w:r>
+      <w:r>
+        <w:rPr>
+          <w:b/>
+          <w:bCs/>
+        </w:rPr>
+        <w:t xml:space="preserve">Borrador</w:t>
+      </w:r>
+      <w:r>
+        <w:t xml:space="preserve"> (todavía no baja el saldo de la deuda).</w:t>
+      </w:r>
+    </w:p>
+    <w:tbl>
+      <w:tblPr>
+        <w:tblW w:type="pct" w:w="100%"/>
+        <w:tblBorders>
+          <w:top w:val="single" w:color="auto" w:sz="4"/>
+          <w:left w:val="single" w:color="auto" w:sz="4"/>
+          <w:bottom w:val="single" w:color="auto" w:sz="4"/>
+          <w:right w:val="single" w:color="auto" w:sz="4"/>
+          <w:insideH w:val="single" w:color="auto" w:sz="4"/>
+          <w:insideV w:val="single" w:color="auto" w:sz="4"/>
+        </w:tblBorders>
+      </w:tblPr>
+      <w:tblGrid>
+        <w:gridCol w:w="100"/>
+      </w:tblGrid>
+      <w:tr>
+        <w:tc>
+          <w:tcPr>
+            <w:tcBorders>
+              <w:top w:val="dashed" w:color="9AA5B1" w:sz="6"/>
+              <w:left w:val="dashed" w:color="9AA5B1" w:sz="6"/>
+              <w:bottom w:val="dashed" w:color="9AA5B1" w:sz="6"/>
+              <w:right w:val="dashed" w:color="9AA5B1" w:sz="6"/>
+            </w:tcBorders>
+            <w:shd w:fill="F5F7FA" w:val="clear"/>
+            <w:tcMar>
+              <w:top w:type="dxa" w:w="300"/>
+              <w:left w:type="dxa" w:w="160"/>
+              <w:bottom w:type="dxa" w:w="300"/>
+              <w:right w:type="dxa" w:w="160"/>
+            </w:tcMar>
+          </w:tcPr>
+          <w:p>
+            <w:pPr>
+              <w:spacing w:after="40"/>
+              <w:jc w:val="center"/>
+            </w:pPr>
+            <w:r>
+              <w:rPr>
+                <w:b/>
+                <w:bCs/>
+                <w:color w:val="6B7683"/>
+                <w:sz w:val="22"/>
+                <w:szCs w:val="22"/>
+              </w:rPr>
+              <w:t xml:space="preserve">[ FIGURA PENDIENTE DE CAPTURA ]</w:t>
+            </w:r>
+          </w:p>
+          <w:p>
+            <w:pPr>
+              <w:spacing w:after="0"/>
+              <w:jc w:val="center"/>
+            </w:pPr>
+            <w:r>
+              <w:rPr>
+                <w:i/>
+                <w:iCs/>
+                <w:color w:val="9AA5B1"/>
+                <w:sz w:val="20"/>
+                <w:szCs w:val="20"/>
+              </w:rPr>
+              <w:t xml:space="preserve">08_op_generar_01.png</w:t>
+            </w:r>
+          </w:p>
+        </w:tc>
+      </w:tr>
+    </w:tbl>
+    <w:p>
+      <w:pPr>
+        <w:spacing w:after="200"/>
+        <w:jc w:val="center"/>
+      </w:pPr>
+      <w:r>
+        <w:rPr>
+          <w:i/>
+          <w:iCs/>
+          <w:sz w:val="20"/>
+          <w:szCs w:val="20"/>
+        </w:rPr>
+        <w:t xml:space="preserve">Figura 34. Deuda a proveedores y generación de la orden de pago.</w:t>
+      </w:r>
+    </w:p>
+    <w:p>
+      <w:pPr>
+        <w:pageBreakBefore/>
+      </w:pPr>
+      <w:r>
+        <w:t xml:space="preserve"/>
+      </w:r>
+    </w:p>
+    <w:p>
+      <w:pPr>
+        <w:pStyle w:val="Heading2"/>
+        <w:spacing w:after="120" w:before="200"/>
+      </w:pPr>
+      <w:r>
+        <w:rPr>
+          <w:b/>
+          <w:bCs/>
+        </w:rPr>
+        <w:t xml:space="preserve">8.6. Confirmar o anular una orden de pago</w:t>
+      </w:r>
+    </w:p>
+    <w:p>
+      <w:pPr>
+        <w:spacing w:after="160" w:line="360" w:lineRule="auto"/>
+        <w:jc w:val="both"/>
+      </w:pPr>
+      <w:r>
+        <w:rPr>
+          <w:b/>
+          <w:bCs/>
+        </w:rPr>
+        <w:t xml:space="preserve">Rol: </w:t>
+      </w:r>
+      <w:r>
+        <w:t xml:space="preserve">Supervisor.</w:t>
+      </w:r>
+    </w:p>
+    <w:p>
+      <w:pPr>
+        <w:spacing w:after="160" w:line="360" w:lineRule="auto"/>
+        <w:jc w:val="both"/>
+      </w:pPr>
+      <w:r>
+        <w:rPr>
+          <w:b/>
+          <w:bCs/>
+        </w:rPr>
+        <w:t xml:space="preserve">Objetivo: </w:t>
+      </w:r>
+      <w:r>
+        <w:t xml:space="preserve">ejecutar el pago de una orden de pago en borrador, o anularla.</w:t>
+      </w:r>
+    </w:p>
+    <w:p>
+      <w:pPr>
+        <w:pStyle w:val="Heading3"/>
+        <w:spacing w:after="60" w:before="160"/>
+      </w:pPr>
+      <w:r>
+        <w:rPr>
+          <w:b/>
+          <w:bCs/>
+        </w:rPr>
+        <w:t xml:space="preserve">Pasos</w:t>
+      </w:r>
+    </w:p>
+    <w:p>
+      <w:pPr>
+        <w:pStyle w:val="ListParagraph"/>
+        <w:numPr>
+          <w:ilvl w:val="0"/>
+          <w:numId w:val="25"/>
+        </w:numPr>
+        <w:spacing w:after="60" w:line="360" w:lineRule="auto"/>
+      </w:pPr>
+      <w:r>
+        <w:t xml:space="preserve">En el menú, ingrese a </w:t>
+      </w:r>
+      <w:r>
+        <w:rPr>
+          <w:b/>
+          <w:bCs/>
+        </w:rPr>
+        <w:t xml:space="preserve">Compras y Pagos → Órdenes de Pago</w:t>
+      </w:r>
+      <w:r>
+        <w:t xml:space="preserve">. Se muestra la lista de órdenes de pago.</w:t>
+      </w:r>
+    </w:p>
+    <w:p>
+      <w:pPr>
+        <w:pStyle w:val="ListParagraph"/>
+        <w:numPr>
+          <w:ilvl w:val="0"/>
+          <w:numId w:val="25"/>
+        </w:numPr>
+        <w:spacing w:after="60" w:line="360" w:lineRule="auto"/>
+      </w:pPr>
+      <w:r>
+        <w:t xml:space="preserve">Abra la orden en </w:t>
+      </w:r>
+      <w:r>
+        <w:rPr>
+          <w:b/>
+          <w:bCs/>
+        </w:rPr>
+        <w:t xml:space="preserve">Borrador</w:t>
+      </w:r>
+      <w:r>
+        <w:t xml:space="preserve"> y elija </w:t>
+      </w:r>
+      <w:r>
+        <w:rPr>
+          <w:b/>
+          <w:bCs/>
+        </w:rPr>
+        <w:t xml:space="preserve">Resolver</w:t>
+      </w:r>
+      <w:r>
+        <w:t xml:space="preserve">. Se muestra el detalle de los comprobantes aplicados.</w:t>
+      </w:r>
+    </w:p>
+    <w:p>
+      <w:pPr>
+        <w:pStyle w:val="ListParagraph"/>
+        <w:numPr>
+          <w:ilvl w:val="0"/>
+          <w:numId w:val="25"/>
+        </w:numPr>
+        <w:spacing w:after="60" w:line="360" w:lineRule="auto"/>
+      </w:pPr>
+      <w:r>
+        <w:t xml:space="preserve">Para pagar, elija el </w:t>
+      </w:r>
+      <w:r>
+        <w:rPr>
+          <w:b/>
+          <w:bCs/>
+        </w:rPr>
+        <w:t xml:space="preserve">método de pago</w:t>
+      </w:r>
+      <w:r>
+        <w:t xml:space="preserve"> y presione </w:t>
+      </w:r>
+      <w:r>
+        <w:rPr>
+          <w:b/>
+          <w:bCs/>
+        </w:rPr>
+        <w:t xml:space="preserve">Confirmar pago</w:t>
+      </w:r>
+      <w:r>
+        <w:t xml:space="preserve">: el sistema registra el pago y </w:t>
+      </w:r>
+      <w:r>
+        <w:rPr>
+          <w:b/>
+          <w:bCs/>
+        </w:rPr>
+        <w:t xml:space="preserve">baja el saldo</w:t>
+      </w:r>
+      <w:r>
+        <w:t xml:space="preserve"> de la deuda. Para descartarla, presione </w:t>
+      </w:r>
+      <w:r>
+        <w:rPr>
+          <w:b/>
+          <w:bCs/>
+        </w:rPr>
+        <w:t xml:space="preserve">Anular</w:t>
+      </w:r>
+      <w:r>
+        <w:t xml:space="preserve"> (indicando el motivo).</w:t>
+      </w:r>
+    </w:p>
+    <w:tbl>
+      <w:tblPr>
+        <w:tblW w:type="pct" w:w="100%"/>
+        <w:tblBorders>
+          <w:top w:val="single" w:color="auto" w:sz="4"/>
+          <w:left w:val="single" w:color="auto" w:sz="4"/>
+          <w:bottom w:val="single" w:color="auto" w:sz="4"/>
+          <w:right w:val="single" w:color="auto" w:sz="4"/>
+          <w:insideH w:val="single" w:color="auto" w:sz="4"/>
+          <w:insideV w:val="single" w:color="auto" w:sz="4"/>
+        </w:tblBorders>
+      </w:tblPr>
+      <w:tblGrid>
+        <w:gridCol w:w="100"/>
+      </w:tblGrid>
+      <w:tr>
+        <w:tc>
+          <w:tcPr>
+            <w:tcBorders>
+              <w:top w:val="dashed" w:color="9AA5B1" w:sz="6"/>
+              <w:left w:val="dashed" w:color="9AA5B1" w:sz="6"/>
+              <w:bottom w:val="dashed" w:color="9AA5B1" w:sz="6"/>
+              <w:right w:val="dashed" w:color="9AA5B1" w:sz="6"/>
+            </w:tcBorders>
+            <w:shd w:fill="F5F7FA" w:val="clear"/>
+            <w:tcMar>
+              <w:top w:type="dxa" w:w="300"/>
+              <w:left w:type="dxa" w:w="160"/>
+              <w:bottom w:type="dxa" w:w="300"/>
+              <w:right w:type="dxa" w:w="160"/>
+            </w:tcMar>
+          </w:tcPr>
+          <w:p>
+            <w:pPr>
+              <w:spacing w:after="40"/>
+              <w:jc w:val="center"/>
+            </w:pPr>
+            <w:r>
+              <w:rPr>
+                <w:b/>
+                <w:bCs/>
+                <w:color w:val="6B7683"/>
+                <w:sz w:val="22"/>
+                <w:szCs w:val="22"/>
+              </w:rPr>
+              <w:t xml:space="preserve">[ FIGURA PENDIENTE DE CAPTURA ]</w:t>
+            </w:r>
+          </w:p>
+          <w:p>
+            <w:pPr>
+              <w:spacing w:after="0"/>
+              <w:jc w:val="center"/>
+            </w:pPr>
+            <w:r>
+              <w:rPr>
+                <w:i/>
+                <w:iCs/>
+                <w:color w:val="9AA5B1"/>
+                <w:sz w:val="20"/>
+                <w:szCs w:val="20"/>
+              </w:rPr>
+              <w:t xml:space="preserve">08_op_resolver_01.png</w:t>
+            </w:r>
+          </w:p>
+        </w:tc>
+      </w:tr>
+    </w:tbl>
+    <w:p>
+      <w:pPr>
+        <w:spacing w:after="200"/>
+        <w:jc w:val="center"/>
+      </w:pPr>
+      <w:r>
+        <w:rPr>
+          <w:i/>
+          <w:iCs/>
+          <w:sz w:val="20"/>
+          <w:szCs w:val="20"/>
+        </w:rPr>
+        <w:t xml:space="preserve">Figura 35. Resolver la orden de pago: confirmar o anular.</w:t>
+      </w:r>
+    </w:p>
+    <w:p>
+      <w:pPr>
+        <w:pStyle w:val="ListParagraph"/>
+        <w:numPr>
+          <w:ilvl w:val="0"/>
+          <w:numId w:val="25"/>
+        </w:numPr>
+        <w:spacing w:after="60" w:line="360" w:lineRule="auto"/>
+      </w:pPr>
+      <w:r>
+        <w:t xml:space="preserve">Puede imprimir el </w:t>
+      </w:r>
+      <w:r>
+        <w:rPr>
+          <w:b/>
+          <w:bCs/>
+        </w:rPr>
+        <w:t xml:space="preserve">documento de la orden de pago</w:t>
+      </w:r>
+      <w:r>
+        <w:t xml:space="preserve">.</w:t>
+      </w:r>
+    </w:p>
+    <w:tbl>
+      <w:tblPr>
+        <w:tblW w:type="pct" w:w="100%"/>
+        <w:tblBorders>
+          <w:top w:val="single" w:color="auto" w:sz="4"/>
+          <w:left w:val="single" w:color="auto" w:sz="4"/>
+          <w:bottom w:val="single" w:color="auto" w:sz="4"/>
+          <w:right w:val="single" w:color="auto" w:sz="4"/>
+          <w:insideH w:val="single" w:color="auto" w:sz="4"/>
+          <w:insideV w:val="single" w:color="auto" w:sz="4"/>
+        </w:tblBorders>
+      </w:tblPr>
+      <w:tblGrid>
+        <w:gridCol w:w="100"/>
+      </w:tblGrid>
+      <w:tr>
+        <w:tc>
+          <w:tcPr>
+            <w:tcBorders>
+              <w:top w:val="dashed" w:color="9AA5B1" w:sz="6"/>
+              <w:left w:val="dashed" w:color="9AA5B1" w:sz="6"/>
+              <w:bottom w:val="dashed" w:color="9AA5B1" w:sz="6"/>
+              <w:right w:val="dashed" w:color="9AA5B1" w:sz="6"/>
+            </w:tcBorders>
+            <w:shd w:fill="F5F7FA" w:val="clear"/>
+            <w:tcMar>
+              <w:top w:type="dxa" w:w="300"/>
+              <w:left w:type="dxa" w:w="160"/>
+              <w:bottom w:type="dxa" w:w="300"/>
+              <w:right w:type="dxa" w:w="160"/>
+            </w:tcMar>
+          </w:tcPr>
+          <w:p>
+            <w:pPr>
+              <w:spacing w:after="40"/>
+              <w:jc w:val="center"/>
+            </w:pPr>
+            <w:r>
+              <w:rPr>
+                <w:b/>
+                <w:bCs/>
+                <w:color w:val="6B7683"/>
+                <w:sz w:val="22"/>
+                <w:szCs w:val="22"/>
+              </w:rPr>
+              <w:t xml:space="preserve">[ FIGURA PENDIENTE DE CAPTURA ]</w:t>
+            </w:r>
+          </w:p>
+          <w:p>
+            <w:pPr>
+              <w:spacing w:after="0"/>
+              <w:jc w:val="center"/>
+            </w:pPr>
+            <w:r>
+              <w:rPr>
+                <w:i/>
+                <w:iCs/>
+                <w:color w:val="9AA5B1"/>
+                <w:sz w:val="20"/>
+                <w:szCs w:val="20"/>
+              </w:rPr>
+              <w:t xml:space="preserve">08_op_documento_01.png</w:t>
+            </w:r>
+          </w:p>
+        </w:tc>
+      </w:tr>
+    </w:tbl>
+    <w:p>
+      <w:pPr>
+        <w:spacing w:after="200"/>
+        <w:jc w:val="center"/>
+      </w:pPr>
+      <w:r>
+        <w:rPr>
+          <w:i/>
+          <w:iCs/>
+          <w:sz w:val="20"/>
+          <w:szCs w:val="20"/>
+        </w:rPr>
+        <w:t xml:space="preserve">Figura 36. Documento de la orden de pago.</w:t>
+      </w:r>
+    </w:p>
+    <w:p>
+      <w:pPr>
+        <w:pageBreakBefore/>
+      </w:pPr>
+      <w:r>
+        <w:t xml:space="preserve"/>
+      </w:r>
+    </w:p>
+    <w:p>
+      <w:pPr>
+        <w:pStyle w:val="Heading2"/>
+        <w:spacing w:after="120" w:before="200"/>
+      </w:pPr>
+      <w:r>
+        <w:rPr>
+          <w:b/>
+          <w:bCs/>
+        </w:rPr>
+        <w:t xml:space="preserve">8.7. Registrar una nota de crédito de proveedor</w:t>
+      </w:r>
+    </w:p>
+    <w:p>
+      <w:pPr>
+        <w:spacing w:after="160" w:line="360" w:lineRule="auto"/>
+        <w:jc w:val="both"/>
+      </w:pPr>
+      <w:r>
+        <w:rPr>
+          <w:b/>
+          <w:bCs/>
+        </w:rPr>
+        <w:t xml:space="preserve">Rol: </w:t>
+      </w:r>
+      <w:r>
+        <w:t xml:space="preserve">Comprador.</w:t>
+      </w:r>
+    </w:p>
+    <w:p>
+      <w:pPr>
+        <w:spacing w:after="160" w:line="360" w:lineRule="auto"/>
+        <w:jc w:val="both"/>
+      </w:pPr>
+      <w:r>
+        <w:rPr>
+          <w:b/>
+          <w:bCs/>
+        </w:rPr>
+        <w:t xml:space="preserve">Objetivo: </w:t>
+      </w:r>
+      <w:r>
+        <w:t xml:space="preserve">registrar una nota de crédito emitida por el proveedor sobre una factura de compra.</w:t>
+      </w:r>
+    </w:p>
+    <w:p>
+      <w:pPr>
+        <w:pStyle w:val="Heading3"/>
+        <w:spacing w:after="60" w:before="160"/>
+      </w:pPr>
+      <w:r>
+        <w:rPr>
+          <w:b/>
+          <w:bCs/>
+        </w:rPr>
+        <w:t xml:space="preserve">Pasos</w:t>
+      </w:r>
+    </w:p>
+    <w:p>
+      <w:pPr>
+        <w:pStyle w:val="ListParagraph"/>
+        <w:numPr>
+          <w:ilvl w:val="0"/>
+          <w:numId w:val="26"/>
+        </w:numPr>
+        <w:spacing w:after="60" w:line="360" w:lineRule="auto"/>
+      </w:pPr>
+      <w:r>
+        <w:t xml:space="preserve">En el menú, ingrese a </w:t>
+      </w:r>
+      <w:r>
+        <w:rPr>
+          <w:b/>
+          <w:bCs/>
+        </w:rPr>
+        <w:t xml:space="preserve">Compras y Pagos → Nota de Credito Proveedor</w:t>
+      </w:r>
+      <w:r>
+        <w:t xml:space="preserve">.</w:t>
+      </w:r>
+    </w:p>
+    <w:p>
+      <w:pPr>
+        <w:pStyle w:val="ListParagraph"/>
+        <w:numPr>
+          <w:ilvl w:val="0"/>
+          <w:numId w:val="26"/>
+        </w:numPr>
+        <w:spacing w:after="60" w:line="360" w:lineRule="auto"/>
+      </w:pPr>
+      <w:r>
+        <w:t xml:space="preserve">Seleccione la </w:t>
+      </w:r>
+      <w:r>
+        <w:rPr>
+          <w:b/>
+          <w:bCs/>
+        </w:rPr>
+        <w:t xml:space="preserve">factura</w:t>
+      </w:r>
+      <w:r>
+        <w:t xml:space="preserve"> de compra de origen y el </w:t>
+      </w:r>
+      <w:r>
+        <w:rPr>
+          <w:b/>
+          <w:bCs/>
+        </w:rPr>
+        <w:t xml:space="preserve">motivo</w:t>
+      </w:r>
+      <w:r>
+        <w:t xml:space="preserve"> de la nota de crédito.</w:t>
+      </w:r>
+    </w:p>
+    <w:p>
+      <w:pPr>
+        <w:pStyle w:val="ListParagraph"/>
+        <w:numPr>
+          <w:ilvl w:val="0"/>
+          <w:numId w:val="26"/>
+        </w:numPr>
+        <w:spacing w:after="60" w:line="360" w:lineRule="auto"/>
+      </w:pPr>
+      <w:r>
+        <w:t xml:space="preserve">Indique las líneas o cantidades a acreditar y registre. El sistema </w:t>
+      </w:r>
+      <w:r>
+        <w:rPr>
+          <w:b/>
+          <w:bCs/>
+        </w:rPr>
+        <w:t xml:space="preserve">baja la cuenta por pagar</w:t>
+      </w:r>
+      <w:r>
+        <w:t xml:space="preserve"> y, si el motivo es una </w:t>
+      </w:r>
+      <w:r>
+        <w:rPr>
+          <w:b/>
+          <w:bCs/>
+        </w:rPr>
+        <w:t xml:space="preserve">devolución</w:t>
+      </w:r>
+      <w:r>
+        <w:t xml:space="preserve">, </w:t>
+      </w:r>
+      <w:r>
+        <w:rPr>
+          <w:b/>
+          <w:bCs/>
+        </w:rPr>
+        <w:t xml:space="preserve">descuenta el stock</w:t>
+      </w:r>
+      <w:r>
+        <w:t xml:space="preserve"> correspondiente.</w:t>
+      </w:r>
+    </w:p>
+    <w:tbl>
+      <w:tblPr>
+        <w:tblW w:type="pct" w:w="100%"/>
+        <w:tblBorders>
+          <w:top w:val="single" w:color="auto" w:sz="4"/>
+          <w:left w:val="single" w:color="auto" w:sz="4"/>
+          <w:bottom w:val="single" w:color="auto" w:sz="4"/>
+          <w:right w:val="single" w:color="auto" w:sz="4"/>
+          <w:insideH w:val="single" w:color="auto" w:sz="4"/>
+          <w:insideV w:val="single" w:color="auto" w:sz="4"/>
+        </w:tblBorders>
+      </w:tblPr>
+      <w:tblGrid>
+        <w:gridCol w:w="100"/>
+      </w:tblGrid>
+      <w:tr>
+        <w:tc>
+          <w:tcPr>
+            <w:tcBorders>
+              <w:top w:val="dashed" w:color="9AA5B1" w:sz="6"/>
+              <w:left w:val="dashed" w:color="9AA5B1" w:sz="6"/>
+              <w:bottom w:val="dashed" w:color="9AA5B1" w:sz="6"/>
+              <w:right w:val="dashed" w:color="9AA5B1" w:sz="6"/>
+            </w:tcBorders>
+            <w:shd w:fill="F5F7FA" w:val="clear"/>
+            <w:tcMar>
+              <w:top w:type="dxa" w:w="300"/>
+              <w:left w:type="dxa" w:w="160"/>
+              <w:bottom w:type="dxa" w:w="300"/>
+              <w:right w:type="dxa" w:w="160"/>
+            </w:tcMar>
+          </w:tcPr>
+          <w:p>
+            <w:pPr>
+              <w:spacing w:after="40"/>
+              <w:jc w:val="center"/>
+            </w:pPr>
+            <w:r>
+              <w:rPr>
+                <w:b/>
+                <w:bCs/>
+                <w:color w:val="6B7683"/>
+                <w:sz w:val="22"/>
+                <w:szCs w:val="22"/>
+              </w:rPr>
+              <w:t xml:space="preserve">[ FIGURA PENDIENTE DE CAPTURA ]</w:t>
+            </w:r>
+          </w:p>
+          <w:p>
+            <w:pPr>
+              <w:spacing w:after="0"/>
+              <w:jc w:val="center"/>
+            </w:pPr>
+            <w:r>
+              <w:rPr>
+                <w:i/>
+                <w:iCs/>
+                <w:color w:val="9AA5B1"/>
+                <w:sz w:val="20"/>
+                <w:szCs w:val="20"/>
+              </w:rPr>
+              <w:t xml:space="preserve">08_nc_compra_01.png</w:t>
+            </w:r>
+          </w:p>
+        </w:tc>
+      </w:tr>
+    </w:tbl>
+    <w:p>
+      <w:pPr>
+        <w:spacing w:after="200"/>
+        <w:jc w:val="center"/>
+      </w:pPr>
+      <w:r>
+        <w:rPr>
+          <w:i/>
+          <w:iCs/>
+          <w:sz w:val="20"/>
+          <w:szCs w:val="20"/>
+        </w:rPr>
+        <w:t xml:space="preserve">Figura 37. Registro de una nota de crédito de proveedor.</w:t>
+      </w:r>
+    </w:p>
+    <w:tbl>
+      <w:tblPr>
+        <w:tblW w:type="pct" w:w="100%"/>
+        <w:tblBorders>
+          <w:top w:val="single" w:color="auto" w:sz="4"/>
+          <w:left w:val="single" w:color="auto" w:sz="4"/>
+          <w:bottom w:val="single" w:color="auto" w:sz="4"/>
+          <w:right w:val="single" w:color="auto" w:sz="4"/>
+          <w:insideH w:val="single" w:color="auto" w:sz="4"/>
+          <w:insideV w:val="single" w:color="auto" w:sz="4"/>
+        </w:tblBorders>
+      </w:tblPr>
+      <w:tblGrid>
+        <w:gridCol w:w="100"/>
+      </w:tblGrid>
+      <w:tr>
+        <w:tc>
+          <w:tcPr>
+            <w:tcBorders>
+              <w:top w:val="single" w:color="2E6DA4" w:sz="2"/>
+              <w:left w:val="single" w:color="2E6DA4" w:sz="24"/>
+              <w:bottom w:val="single" w:color="2E6DA4" w:sz="2"/>
+              <w:right w:val="single" w:color="2E6DA4" w:sz="2"/>
+            </w:tcBorders>
+            <w:shd w:fill="E8F1FB" w:val="clear"/>
+            <w:tcMar>
+              <w:top w:type="dxa" w:w="80"/>
+              <w:left w:type="dxa" w:w="160"/>
+              <w:bottom w:type="dxa" w:w="80"/>
+              <w:right w:type="dxa" w:w="160"/>
+            </w:tcMar>
+          </w:tcPr>
+          <w:p>
+            <w:pPr>
+              <w:spacing w:after="0" w:line="300"/>
+              <w:jc w:val="both"/>
+            </w:pPr>
+            <w:r>
+              <w:rPr>
+                <w:b/>
+                <w:bCs/>
+                <w:color w:val="2E6DA4"/>
+              </w:rPr>
+              <w:t xml:space="preserve">Nota: </w:t>
+            </w:r>
+            <w:r>
+              <w:t xml:space="preserve">La nota de crédito la </w:t>
+            </w:r>
+            <w:r>
+              <w:rPr>
+                <w:b/>
+                <w:bCs/>
+              </w:rPr>
+              <w:t xml:space="preserve">emite el proveedor</w:t>
+            </w:r>
+            <w:r>
+              <w:t xml:space="preserve">; el sistema solo la </w:t>
+            </w:r>
+            <w:r>
+              <w:rPr>
+                <w:b/>
+                <w:bCs/>
+              </w:rPr>
+              <w:t xml:space="preserve">captura</w:t>
+            </w:r>
+            <w:r>
+              <w:t xml:space="preserve"> (no genera un documento propio).</w:t>
+            </w:r>
+          </w:p>
+        </w:tc>
+      </w:tr>
+    </w:tbl>
     <w:sectPr>
       <w:headerReference w:type="default" r:id="rId8"/>
       <w:footerReference w:type="default" r:id="rId9"/>
@@ -8916,6 +11255,48 @@
     </w:lvlOverride>
   </w:num>
   <w:num w:numId="19">
+    <w:abstractNumId w:val="3"/>
+    <w:lvlOverride w:ilvl="0">
+      <w:startOverride w:val="1"/>
+    </w:lvlOverride>
+  </w:num>
+  <w:num w:numId="20">
+    <w:abstractNumId w:val="3"/>
+    <w:lvlOverride w:ilvl="0">
+      <w:startOverride w:val="1"/>
+    </w:lvlOverride>
+  </w:num>
+  <w:num w:numId="21">
+    <w:abstractNumId w:val="3"/>
+    <w:lvlOverride w:ilvl="0">
+      <w:startOverride w:val="1"/>
+    </w:lvlOverride>
+  </w:num>
+  <w:num w:numId="22">
+    <w:abstractNumId w:val="3"/>
+    <w:lvlOverride w:ilvl="0">
+      <w:startOverride w:val="1"/>
+    </w:lvlOverride>
+  </w:num>
+  <w:num w:numId="23">
+    <w:abstractNumId w:val="3"/>
+    <w:lvlOverride w:ilvl="0">
+      <w:startOverride w:val="1"/>
+    </w:lvlOverride>
+  </w:num>
+  <w:num w:numId="24">
+    <w:abstractNumId w:val="3"/>
+    <w:lvlOverride w:ilvl="0">
+      <w:startOverride w:val="1"/>
+    </w:lvlOverride>
+  </w:num>
+  <w:num w:numId="25">
+    <w:abstractNumId w:val="3"/>
+    <w:lvlOverride w:ilvl="0">
+      <w:startOverride w:val="1"/>
+    </w:lvlOverride>
+  </w:num>
+  <w:num w:numId="26">
     <w:abstractNumId w:val="3"/>
     <w:lvlOverride w:ilvl="0">
       <w:startOverride w:val="1"/>

</xml_diff>

<commit_message>
docs(manual-usuario): agrega el módulo Inventario (cap. 9)
Tareas: consultar existencias (Reporte Inventario → Existencias), consultar el
historial de movimientos (Movimiento de Stock), realizar un inventario físico
(Proceso de Inventario → Conteo Físico, calcula diferencia) y aprobar el inventario
(Revisión, aplica el ajuste de stock). Encargado de Depósito realiza/consulta;
Supervisor aprueba. Pantallas reales P88/P56/P79/P73/P80.

4 capturas pendientes del alumno. Figuras 1..41 y tablas 1..7.
</commit_message>
<xml_diff>
--- a/doc/manual_usuario/MUESTRA_Manual_Usuario.docx
+++ b/doc/manual_usuario/MUESTRA_Manual_Usuario.docx
@@ -10819,6 +10819,1323 @@
         </w:tc>
       </w:tr>
     </w:tbl>
+    <w:p>
+      <w:pPr>
+        <w:pageBreakBefore/>
+      </w:pPr>
+      <w:r>
+        <w:t xml:space="preserve"/>
+      </w:r>
+    </w:p>
+    <w:p>
+      <w:pPr>
+        <w:pStyle w:val="Heading1"/>
+        <w:spacing w:after="160" w:before="240"/>
+      </w:pPr>
+      <w:r>
+        <w:rPr>
+          <w:b/>
+          <w:bCs/>
+        </w:rPr>
+        <w:t xml:space="preserve">9. Inventario</w:t>
+      </w:r>
+    </w:p>
+    <w:p>
+      <w:pPr>
+        <w:spacing w:after="160" w:before="0" w:line="360" w:lineRule="auto"/>
+        <w:jc w:val="both"/>
+      </w:pPr>
+      <w:r>
+        <w:t xml:space="preserve">Este módulo permite consultar las existencias de productos y el historial de movimientos de stock, y realizar el inventario físico (conteo) con su posterior aprobación para ajustar el stock del sistema. La siguiente tabla indica qué tarea realiza cada rol.</w:t>
+      </w:r>
+    </w:p>
+    <w:tbl>
+      <w:tblPr>
+        <w:tblW w:type="pct" w:w="100%"/>
+        <w:tblBorders>
+          <w:top w:val="single" w:color="auto" w:sz="4"/>
+          <w:left w:val="single" w:color="auto" w:sz="4"/>
+          <w:bottom w:val="single" w:color="auto" w:sz="4"/>
+          <w:right w:val="single" w:color="auto" w:sz="4"/>
+          <w:insideH w:val="single" w:color="auto" w:sz="4"/>
+          <w:insideV w:val="single" w:color="auto" w:sz="4"/>
+        </w:tblBorders>
+      </w:tblPr>
+      <w:tblGrid>
+        <w:gridCol w:w="100"/>
+        <w:gridCol w:w="100"/>
+      </w:tblGrid>
+      <w:tr>
+        <w:trPr>
+          <w:tblHeader/>
+        </w:trPr>
+        <w:tc>
+          <w:tcPr>
+            <w:tcW w:type="pct" w:w="26%"/>
+            <w:tcBorders>
+              <w:top w:val="single" w:color="AAB4C0" w:sz="2"/>
+              <w:left w:val="single" w:color="AAB4C0" w:sz="2"/>
+              <w:bottom w:val="single" w:color="AAB4C0" w:sz="2"/>
+              <w:right w:val="single" w:color="AAB4C0" w:sz="2"/>
+            </w:tcBorders>
+            <w:shd w:fill="DCE9F5" w:val="clear"/>
+            <w:tcMar>
+              <w:top w:type="dxa" w:w="20"/>
+              <w:left w:type="dxa" w:w="70"/>
+              <w:bottom w:type="dxa" w:w="20"/>
+              <w:right w:type="dxa" w:w="70"/>
+            </w:tcMar>
+            <w:vAlign w:val="center"/>
+          </w:tcPr>
+          <w:p>
+            <w:pPr>
+              <w:spacing w:after="0" w:line="240" w:lineRule="auto"/>
+              <w:jc w:val="center"/>
+            </w:pPr>
+            <w:r>
+              <w:rPr>
+                <w:rFonts w:ascii="Times New Roman" w:cs="Times New Roman" w:eastAsia="Times New Roman" w:hAnsi="Times New Roman"/>
+                <w:b/>
+                <w:bCs/>
+                <w:sz w:val="18"/>
+                <w:szCs w:val="18"/>
+              </w:rPr>
+              <w:t xml:space="preserve">Rol</w:t>
+            </w:r>
+          </w:p>
+        </w:tc>
+        <w:tc>
+          <w:tcPr>
+            <w:tcW w:type="pct" w:w="74%"/>
+            <w:tcBorders>
+              <w:top w:val="single" w:color="AAB4C0" w:sz="2"/>
+              <w:left w:val="single" w:color="AAB4C0" w:sz="2"/>
+              <w:bottom w:val="single" w:color="AAB4C0" w:sz="2"/>
+              <w:right w:val="single" w:color="AAB4C0" w:sz="2"/>
+            </w:tcBorders>
+            <w:shd w:fill="DCE9F5" w:val="clear"/>
+            <w:tcMar>
+              <w:top w:type="dxa" w:w="20"/>
+              <w:left w:type="dxa" w:w="70"/>
+              <w:bottom w:type="dxa" w:w="20"/>
+              <w:right w:type="dxa" w:w="70"/>
+            </w:tcMar>
+            <w:vAlign w:val="center"/>
+          </w:tcPr>
+          <w:p>
+            <w:pPr>
+              <w:spacing w:after="0" w:line="240" w:lineRule="auto"/>
+              <w:jc w:val="center"/>
+            </w:pPr>
+            <w:r>
+              <w:rPr>
+                <w:rFonts w:ascii="Times New Roman" w:cs="Times New Roman" w:eastAsia="Times New Roman" w:hAnsi="Times New Roman"/>
+                <w:b/>
+                <w:bCs/>
+                <w:sz w:val="18"/>
+                <w:szCs w:val="18"/>
+              </w:rPr>
+              <w:t xml:space="preserve">Tareas</w:t>
+            </w:r>
+          </w:p>
+        </w:tc>
+      </w:tr>
+      <w:tr>
+        <w:tc>
+          <w:tcPr>
+            <w:tcW w:type="pct" w:w="26%"/>
+            <w:tcBorders>
+              <w:top w:val="single" w:color="AAB4C0" w:sz="2"/>
+              <w:left w:val="single" w:color="AAB4C0" w:sz="2"/>
+              <w:bottom w:val="single" w:color="AAB4C0" w:sz="2"/>
+              <w:right w:val="single" w:color="AAB4C0" w:sz="2"/>
+            </w:tcBorders>
+            <w:tcMar>
+              <w:top w:type="dxa" w:w="20"/>
+              <w:left w:type="dxa" w:w="70"/>
+              <w:bottom w:type="dxa" w:w="20"/>
+              <w:right w:type="dxa" w:w="70"/>
+            </w:tcMar>
+            <w:vAlign w:val="center"/>
+          </w:tcPr>
+          <w:p>
+            <w:pPr>
+              <w:spacing w:after="0" w:line="240" w:lineRule="auto"/>
+              <w:jc w:val="left"/>
+            </w:pPr>
+            <w:r>
+              <w:rPr>
+                <w:rFonts w:ascii="Times New Roman" w:cs="Times New Roman" w:eastAsia="Times New Roman" w:hAnsi="Times New Roman"/>
+                <w:sz w:val="18"/>
+                <w:szCs w:val="18"/>
+              </w:rPr>
+              <w:t xml:space="preserve">Encargado de Depósito</w:t>
+            </w:r>
+          </w:p>
+        </w:tc>
+        <w:tc>
+          <w:tcPr>
+            <w:tcW w:type="pct" w:w="74%"/>
+            <w:tcBorders>
+              <w:top w:val="single" w:color="AAB4C0" w:sz="2"/>
+              <w:left w:val="single" w:color="AAB4C0" w:sz="2"/>
+              <w:bottom w:val="single" w:color="AAB4C0" w:sz="2"/>
+              <w:right w:val="single" w:color="AAB4C0" w:sz="2"/>
+            </w:tcBorders>
+            <w:tcMar>
+              <w:top w:type="dxa" w:w="20"/>
+              <w:left w:type="dxa" w:w="70"/>
+              <w:bottom w:type="dxa" w:w="20"/>
+              <w:right w:type="dxa" w:w="70"/>
+            </w:tcMar>
+            <w:vAlign w:val="center"/>
+          </w:tcPr>
+          <w:p>
+            <w:pPr>
+              <w:spacing w:after="0" w:line="240" w:lineRule="auto"/>
+              <w:jc w:val="left"/>
+            </w:pPr>
+            <w:r>
+              <w:rPr>
+                <w:rFonts w:ascii="Times New Roman" w:cs="Times New Roman" w:eastAsia="Times New Roman" w:hAnsi="Times New Roman"/>
+                <w:sz w:val="18"/>
+                <w:szCs w:val="18"/>
+              </w:rPr>
+              <w:t xml:space="preserve">Consultar existencias · Consultar el historial de movimientos · Realizar un inventario físico.</w:t>
+            </w:r>
+          </w:p>
+        </w:tc>
+      </w:tr>
+      <w:tr>
+        <w:tc>
+          <w:tcPr>
+            <w:tcW w:type="pct" w:w="26%"/>
+            <w:tcBorders>
+              <w:top w:val="single" w:color="AAB4C0" w:sz="2"/>
+              <w:left w:val="single" w:color="AAB4C0" w:sz="2"/>
+              <w:bottom w:val="single" w:color="AAB4C0" w:sz="2"/>
+              <w:right w:val="single" w:color="AAB4C0" w:sz="2"/>
+            </w:tcBorders>
+            <w:tcMar>
+              <w:top w:type="dxa" w:w="20"/>
+              <w:left w:type="dxa" w:w="70"/>
+              <w:bottom w:type="dxa" w:w="20"/>
+              <w:right w:type="dxa" w:w="70"/>
+            </w:tcMar>
+            <w:vAlign w:val="center"/>
+          </w:tcPr>
+          <w:p>
+            <w:pPr>
+              <w:spacing w:after="0" w:line="240" w:lineRule="auto"/>
+              <w:jc w:val="left"/>
+            </w:pPr>
+            <w:r>
+              <w:rPr>
+                <w:rFonts w:ascii="Times New Roman" w:cs="Times New Roman" w:eastAsia="Times New Roman" w:hAnsi="Times New Roman"/>
+                <w:sz w:val="18"/>
+                <w:szCs w:val="18"/>
+              </w:rPr>
+              <w:t xml:space="preserve">Supervisor</w:t>
+            </w:r>
+          </w:p>
+        </w:tc>
+        <w:tc>
+          <w:tcPr>
+            <w:tcW w:type="pct" w:w="74%"/>
+            <w:tcBorders>
+              <w:top w:val="single" w:color="AAB4C0" w:sz="2"/>
+              <w:left w:val="single" w:color="AAB4C0" w:sz="2"/>
+              <w:bottom w:val="single" w:color="AAB4C0" w:sz="2"/>
+              <w:right w:val="single" w:color="AAB4C0" w:sz="2"/>
+            </w:tcBorders>
+            <w:tcMar>
+              <w:top w:type="dxa" w:w="20"/>
+              <w:left w:type="dxa" w:w="70"/>
+              <w:bottom w:type="dxa" w:w="20"/>
+              <w:right w:type="dxa" w:w="70"/>
+            </w:tcMar>
+            <w:vAlign w:val="center"/>
+          </w:tcPr>
+          <w:p>
+            <w:pPr>
+              <w:spacing w:after="0" w:line="240" w:lineRule="auto"/>
+              <w:jc w:val="left"/>
+            </w:pPr>
+            <w:r>
+              <w:rPr>
+                <w:rFonts w:ascii="Times New Roman" w:cs="Times New Roman" w:eastAsia="Times New Roman" w:hAnsi="Times New Roman"/>
+                <w:sz w:val="18"/>
+                <w:szCs w:val="18"/>
+              </w:rPr>
+              <w:t xml:space="preserve">Aprobar un inventario físico.</w:t>
+            </w:r>
+          </w:p>
+        </w:tc>
+      </w:tr>
+    </w:tbl>
+    <w:p>
+      <w:pPr>
+        <w:spacing w:after="200"/>
+        <w:jc w:val="center"/>
+      </w:pPr>
+      <w:r>
+        <w:rPr>
+          <w:i/>
+          <w:iCs/>
+          <w:sz w:val="20"/>
+          <w:szCs w:val="20"/>
+        </w:rPr>
+        <w:t xml:space="preserve">Tabla 7. Roles y tareas del módulo Inventario.</w:t>
+      </w:r>
+    </w:p>
+    <w:p>
+      <w:pPr>
+        <w:pStyle w:val="Heading2"/>
+        <w:spacing w:after="120" w:before="200"/>
+      </w:pPr>
+      <w:r>
+        <w:rPr>
+          <w:b/>
+          <w:bCs/>
+        </w:rPr>
+        <w:t xml:space="preserve">9.1. Consultar existencias</w:t>
+      </w:r>
+    </w:p>
+    <w:p>
+      <w:pPr>
+        <w:spacing w:after="160" w:line="360" w:lineRule="auto"/>
+        <w:jc w:val="both"/>
+      </w:pPr>
+      <w:r>
+        <w:rPr>
+          <w:b/>
+          <w:bCs/>
+        </w:rPr>
+        <w:t xml:space="preserve">Rol: </w:t>
+      </w:r>
+      <w:r>
+        <w:t xml:space="preserve">Encargado de Depósito.</w:t>
+      </w:r>
+    </w:p>
+    <w:p>
+      <w:pPr>
+        <w:spacing w:after="160" w:line="360" w:lineRule="auto"/>
+        <w:jc w:val="both"/>
+      </w:pPr>
+      <w:r>
+        <w:rPr>
+          <w:b/>
+          <w:bCs/>
+        </w:rPr>
+        <w:t xml:space="preserve">Objetivo: </w:t>
+      </w:r>
+      <w:r>
+        <w:t xml:space="preserve">ver el stock disponible de los productos por oficina.</w:t>
+      </w:r>
+    </w:p>
+    <w:p>
+      <w:pPr>
+        <w:pStyle w:val="Heading3"/>
+        <w:spacing w:after="60" w:before="160"/>
+      </w:pPr>
+      <w:r>
+        <w:rPr>
+          <w:b/>
+          <w:bCs/>
+        </w:rPr>
+        <w:t xml:space="preserve">Pasos</w:t>
+      </w:r>
+    </w:p>
+    <w:p>
+      <w:pPr>
+        <w:pStyle w:val="ListParagraph"/>
+        <w:numPr>
+          <w:ilvl w:val="0"/>
+          <w:numId w:val="27"/>
+        </w:numPr>
+        <w:spacing w:after="60" w:line="360" w:lineRule="auto"/>
+      </w:pPr>
+      <w:r>
+        <w:t xml:space="preserve">En el menú, ingrese a </w:t>
+      </w:r>
+      <w:r>
+        <w:rPr>
+          <w:b/>
+          <w:bCs/>
+        </w:rPr>
+        <w:t xml:space="preserve">Productos e Inventario → Reporte Inventario → Existencias</w:t>
+      </w:r>
+      <w:r>
+        <w:t xml:space="preserve">.</w:t>
+      </w:r>
+    </w:p>
+    <w:p>
+      <w:pPr>
+        <w:pStyle w:val="ListParagraph"/>
+        <w:numPr>
+          <w:ilvl w:val="0"/>
+          <w:numId w:val="27"/>
+        </w:numPr>
+        <w:spacing w:after="60" w:line="360" w:lineRule="auto"/>
+      </w:pPr>
+      <w:r>
+        <w:t xml:space="preserve">Si lo necesita, filtre por </w:t>
+      </w:r>
+      <w:r>
+        <w:rPr>
+          <w:b/>
+          <w:bCs/>
+        </w:rPr>
+        <w:t xml:space="preserve">Oficina</w:t>
+      </w:r>
+      <w:r>
+        <w:t xml:space="preserve"> (u otros filtros disponibles).</w:t>
+      </w:r>
+    </w:p>
+    <w:p>
+      <w:pPr>
+        <w:pStyle w:val="ListParagraph"/>
+        <w:numPr>
+          <w:ilvl w:val="0"/>
+          <w:numId w:val="27"/>
+        </w:numPr>
+        <w:spacing w:after="60" w:line="360" w:lineRule="auto"/>
+      </w:pPr>
+      <w:r>
+        <w:t xml:space="preserve">Consulte la lista de productos con su </w:t>
+      </w:r>
+      <w:r>
+        <w:rPr>
+          <w:b/>
+          <w:bCs/>
+        </w:rPr>
+        <w:t xml:space="preserve">cantidad en existencia</w:t>
+      </w:r>
+      <w:r>
+        <w:t xml:space="preserve">.</w:t>
+      </w:r>
+    </w:p>
+    <w:tbl>
+      <w:tblPr>
+        <w:tblW w:type="pct" w:w="100%"/>
+        <w:tblBorders>
+          <w:top w:val="single" w:color="auto" w:sz="4"/>
+          <w:left w:val="single" w:color="auto" w:sz="4"/>
+          <w:bottom w:val="single" w:color="auto" w:sz="4"/>
+          <w:right w:val="single" w:color="auto" w:sz="4"/>
+          <w:insideH w:val="single" w:color="auto" w:sz="4"/>
+          <w:insideV w:val="single" w:color="auto" w:sz="4"/>
+        </w:tblBorders>
+      </w:tblPr>
+      <w:tblGrid>
+        <w:gridCol w:w="100"/>
+      </w:tblGrid>
+      <w:tr>
+        <w:tc>
+          <w:tcPr>
+            <w:tcBorders>
+              <w:top w:val="dashed" w:color="9AA5B1" w:sz="6"/>
+              <w:left w:val="dashed" w:color="9AA5B1" w:sz="6"/>
+              <w:bottom w:val="dashed" w:color="9AA5B1" w:sz="6"/>
+              <w:right w:val="dashed" w:color="9AA5B1" w:sz="6"/>
+            </w:tcBorders>
+            <w:shd w:fill="F5F7FA" w:val="clear"/>
+            <w:tcMar>
+              <w:top w:type="dxa" w:w="300"/>
+              <w:left w:type="dxa" w:w="160"/>
+              <w:bottom w:type="dxa" w:w="300"/>
+              <w:right w:type="dxa" w:w="160"/>
+            </w:tcMar>
+          </w:tcPr>
+          <w:p>
+            <w:pPr>
+              <w:spacing w:after="40"/>
+              <w:jc w:val="center"/>
+            </w:pPr>
+            <w:r>
+              <w:rPr>
+                <w:b/>
+                <w:bCs/>
+                <w:color w:val="6B7683"/>
+                <w:sz w:val="22"/>
+                <w:szCs w:val="22"/>
+              </w:rPr>
+              <w:t xml:space="preserve">[ FIGURA PENDIENTE DE CAPTURA ]</w:t>
+            </w:r>
+          </w:p>
+          <w:p>
+            <w:pPr>
+              <w:spacing w:after="0"/>
+              <w:jc w:val="center"/>
+            </w:pPr>
+            <w:r>
+              <w:rPr>
+                <w:i/>
+                <w:iCs/>
+                <w:color w:val="9AA5B1"/>
+                <w:sz w:val="20"/>
+                <w:szCs w:val="20"/>
+              </w:rPr>
+              <w:t xml:space="preserve">09_existencias_01.png</w:t>
+            </w:r>
+          </w:p>
+        </w:tc>
+      </w:tr>
+    </w:tbl>
+    <w:p>
+      <w:pPr>
+        <w:spacing w:after="200"/>
+        <w:jc w:val="center"/>
+      </w:pPr>
+      <w:r>
+        <w:rPr>
+          <w:i/>
+          <w:iCs/>
+          <w:sz w:val="20"/>
+          <w:szCs w:val="20"/>
+        </w:rPr>
+        <w:t xml:space="preserve">Figura 38. Existencias: stock por producto.</w:t>
+      </w:r>
+    </w:p>
+    <w:p>
+      <w:pPr>
+        <w:pageBreakBefore/>
+      </w:pPr>
+      <w:r>
+        <w:t xml:space="preserve"/>
+      </w:r>
+    </w:p>
+    <w:p>
+      <w:pPr>
+        <w:pStyle w:val="Heading2"/>
+        <w:spacing w:after="120" w:before="200"/>
+      </w:pPr>
+      <w:r>
+        <w:rPr>
+          <w:b/>
+          <w:bCs/>
+        </w:rPr>
+        <w:t xml:space="preserve">9.2. Consultar el historial de movimientos de stock</w:t>
+      </w:r>
+    </w:p>
+    <w:p>
+      <w:pPr>
+        <w:spacing w:after="160" w:line="360" w:lineRule="auto"/>
+        <w:jc w:val="both"/>
+      </w:pPr>
+      <w:r>
+        <w:rPr>
+          <w:b/>
+          <w:bCs/>
+        </w:rPr>
+        <w:t xml:space="preserve">Rol: </w:t>
+      </w:r>
+      <w:r>
+        <w:t xml:space="preserve">Encargado de Depósito.</w:t>
+      </w:r>
+    </w:p>
+    <w:p>
+      <w:pPr>
+        <w:spacing w:after="160" w:line="360" w:lineRule="auto"/>
+        <w:jc w:val="both"/>
+      </w:pPr>
+      <w:r>
+        <w:rPr>
+          <w:b/>
+          <w:bCs/>
+        </w:rPr>
+        <w:t xml:space="preserve">Objetivo: </w:t>
+      </w:r>
+      <w:r>
+        <w:t xml:space="preserve">revisar las entradas y salidas de stock de los productos.</w:t>
+      </w:r>
+    </w:p>
+    <w:p>
+      <w:pPr>
+        <w:pStyle w:val="Heading3"/>
+        <w:spacing w:after="60" w:before="160"/>
+      </w:pPr>
+      <w:r>
+        <w:rPr>
+          <w:b/>
+          <w:bCs/>
+        </w:rPr>
+        <w:t xml:space="preserve">Pasos</w:t>
+      </w:r>
+    </w:p>
+    <w:p>
+      <w:pPr>
+        <w:pStyle w:val="ListParagraph"/>
+        <w:numPr>
+          <w:ilvl w:val="0"/>
+          <w:numId w:val="28"/>
+        </w:numPr>
+        <w:spacing w:after="60" w:line="360" w:lineRule="auto"/>
+      </w:pPr>
+      <w:r>
+        <w:t xml:space="preserve">En el menú, ingrese a </w:t>
+      </w:r>
+      <w:r>
+        <w:rPr>
+          <w:b/>
+          <w:bCs/>
+        </w:rPr>
+        <w:t xml:space="preserve">Productos e Inventario → Reporte Inventario → Movimiento de Stock</w:t>
+      </w:r>
+      <w:r>
+        <w:t xml:space="preserve">.</w:t>
+      </w:r>
+    </w:p>
+    <w:p>
+      <w:pPr>
+        <w:pStyle w:val="ListParagraph"/>
+        <w:numPr>
+          <w:ilvl w:val="0"/>
+          <w:numId w:val="28"/>
+        </w:numPr>
+        <w:spacing w:after="60" w:line="360" w:lineRule="auto"/>
+      </w:pPr>
+      <w:r>
+        <w:t xml:space="preserve">Consulte los movimientos con su </w:t>
+      </w:r>
+      <w:r>
+        <w:rPr>
+          <w:b/>
+          <w:bCs/>
+        </w:rPr>
+        <w:t xml:space="preserve">fecha</w:t>
+      </w:r>
+      <w:r>
+        <w:t xml:space="preserve">, </w:t>
+      </w:r>
+      <w:r>
+        <w:rPr>
+          <w:b/>
+          <w:bCs/>
+        </w:rPr>
+        <w:t xml:space="preserve">tipo</w:t>
+      </w:r>
+      <w:r>
+        <w:t xml:space="preserve"> (entrada o salida) y </w:t>
+      </w:r>
+      <w:r>
+        <w:rPr>
+          <w:b/>
+          <w:bCs/>
+        </w:rPr>
+        <w:t xml:space="preserve">cantidad</w:t>
+      </w:r>
+      <w:r>
+        <w:t xml:space="preserve">. Puede filtrar por producto o período.</w:t>
+      </w:r>
+    </w:p>
+    <w:tbl>
+      <w:tblPr>
+        <w:tblW w:type="pct" w:w="100%"/>
+        <w:tblBorders>
+          <w:top w:val="single" w:color="auto" w:sz="4"/>
+          <w:left w:val="single" w:color="auto" w:sz="4"/>
+          <w:bottom w:val="single" w:color="auto" w:sz="4"/>
+          <w:right w:val="single" w:color="auto" w:sz="4"/>
+          <w:insideH w:val="single" w:color="auto" w:sz="4"/>
+          <w:insideV w:val="single" w:color="auto" w:sz="4"/>
+        </w:tblBorders>
+      </w:tblPr>
+      <w:tblGrid>
+        <w:gridCol w:w="100"/>
+      </w:tblGrid>
+      <w:tr>
+        <w:tc>
+          <w:tcPr>
+            <w:tcBorders>
+              <w:top w:val="dashed" w:color="9AA5B1" w:sz="6"/>
+              <w:left w:val="dashed" w:color="9AA5B1" w:sz="6"/>
+              <w:bottom w:val="dashed" w:color="9AA5B1" w:sz="6"/>
+              <w:right w:val="dashed" w:color="9AA5B1" w:sz="6"/>
+            </w:tcBorders>
+            <w:shd w:fill="F5F7FA" w:val="clear"/>
+            <w:tcMar>
+              <w:top w:type="dxa" w:w="300"/>
+              <w:left w:type="dxa" w:w="160"/>
+              <w:bottom w:type="dxa" w:w="300"/>
+              <w:right w:type="dxa" w:w="160"/>
+            </w:tcMar>
+          </w:tcPr>
+          <w:p>
+            <w:pPr>
+              <w:spacing w:after="40"/>
+              <w:jc w:val="center"/>
+            </w:pPr>
+            <w:r>
+              <w:rPr>
+                <w:b/>
+                <w:bCs/>
+                <w:color w:val="6B7683"/>
+                <w:sz w:val="22"/>
+                <w:szCs w:val="22"/>
+              </w:rPr>
+              <w:t xml:space="preserve">[ FIGURA PENDIENTE DE CAPTURA ]</w:t>
+            </w:r>
+          </w:p>
+          <w:p>
+            <w:pPr>
+              <w:spacing w:after="0"/>
+              <w:jc w:val="center"/>
+            </w:pPr>
+            <w:r>
+              <w:rPr>
+                <w:i/>
+                <w:iCs/>
+                <w:color w:val="9AA5B1"/>
+                <w:sz w:val="20"/>
+                <w:szCs w:val="20"/>
+              </w:rPr>
+              <w:t xml:space="preserve">09_movimientos_01.png</w:t>
+            </w:r>
+          </w:p>
+        </w:tc>
+      </w:tr>
+    </w:tbl>
+    <w:p>
+      <w:pPr>
+        <w:spacing w:after="200"/>
+        <w:jc w:val="center"/>
+      </w:pPr>
+      <w:r>
+        <w:rPr>
+          <w:i/>
+          <w:iCs/>
+          <w:sz w:val="20"/>
+          <w:szCs w:val="20"/>
+        </w:rPr>
+        <w:t xml:space="preserve">Figura 39. Historial de movimientos de stock.</w:t>
+      </w:r>
+    </w:p>
+    <w:tbl>
+      <w:tblPr>
+        <w:tblW w:type="pct" w:w="100%"/>
+        <w:tblBorders>
+          <w:top w:val="single" w:color="auto" w:sz="4"/>
+          <w:left w:val="single" w:color="auto" w:sz="4"/>
+          <w:bottom w:val="single" w:color="auto" w:sz="4"/>
+          <w:right w:val="single" w:color="auto" w:sz="4"/>
+          <w:insideH w:val="single" w:color="auto" w:sz="4"/>
+          <w:insideV w:val="single" w:color="auto" w:sz="4"/>
+        </w:tblBorders>
+      </w:tblPr>
+      <w:tblGrid>
+        <w:gridCol w:w="100"/>
+      </w:tblGrid>
+      <w:tr>
+        <w:tc>
+          <w:tcPr>
+            <w:tcBorders>
+              <w:top w:val="single" w:color="2E6DA4" w:sz="2"/>
+              <w:left w:val="single" w:color="2E6DA4" w:sz="24"/>
+              <w:bottom w:val="single" w:color="2E6DA4" w:sz="2"/>
+              <w:right w:val="single" w:color="2E6DA4" w:sz="2"/>
+            </w:tcBorders>
+            <w:shd w:fill="E8F1FB" w:val="clear"/>
+            <w:tcMar>
+              <w:top w:type="dxa" w:w="80"/>
+              <w:left w:type="dxa" w:w="160"/>
+              <w:bottom w:type="dxa" w:w="80"/>
+              <w:right w:type="dxa" w:w="160"/>
+            </w:tcMar>
+          </w:tcPr>
+          <w:p>
+            <w:pPr>
+              <w:spacing w:after="0" w:line="300"/>
+              <w:jc w:val="both"/>
+            </w:pPr>
+            <w:r>
+              <w:rPr>
+                <w:b/>
+                <w:bCs/>
+                <w:color w:val="2E6DA4"/>
+              </w:rPr>
+              <w:t xml:space="preserve">Nota: </w:t>
+            </w:r>
+            <w:r>
+              <w:t xml:space="preserve">Los movimientos reflejan las </w:t>
+            </w:r>
+            <w:r>
+              <w:rPr>
+                <w:b/>
+                <w:bCs/>
+              </w:rPr>
+              <w:t xml:space="preserve">ventas</w:t>
+            </w:r>
+            <w:r>
+              <w:t xml:space="preserve"> (salidas), las </w:t>
+            </w:r>
+            <w:r>
+              <w:rPr>
+                <w:b/>
+                <w:bCs/>
+              </w:rPr>
+              <w:t xml:space="preserve">recepciones</w:t>
+            </w:r>
+            <w:r>
+              <w:t xml:space="preserve"> de compra (entradas), las </w:t>
+            </w:r>
+            <w:r>
+              <w:rPr>
+                <w:b/>
+                <w:bCs/>
+              </w:rPr>
+              <w:t xml:space="preserve">transferencias</w:t>
+            </w:r>
+            <w:r>
+              <w:t xml:space="preserve"> entre depósitos y los </w:t>
+            </w:r>
+            <w:r>
+              <w:rPr>
+                <w:b/>
+                <w:bCs/>
+              </w:rPr>
+              <w:t xml:space="preserve">ajustes</w:t>
+            </w:r>
+            <w:r>
+              <w:t xml:space="preserve"> de inventario.</w:t>
+            </w:r>
+          </w:p>
+        </w:tc>
+      </w:tr>
+    </w:tbl>
+    <w:p>
+      <w:pPr>
+        <w:pageBreakBefore/>
+      </w:pPr>
+      <w:r>
+        <w:t xml:space="preserve"/>
+      </w:r>
+    </w:p>
+    <w:p>
+      <w:pPr>
+        <w:pStyle w:val="Heading2"/>
+        <w:spacing w:after="120" w:before="200"/>
+      </w:pPr>
+      <w:r>
+        <w:rPr>
+          <w:b/>
+          <w:bCs/>
+        </w:rPr>
+        <w:t xml:space="preserve">9.3. Realizar un inventario físico</w:t>
+      </w:r>
+    </w:p>
+    <w:p>
+      <w:pPr>
+        <w:spacing w:after="160" w:line="360" w:lineRule="auto"/>
+        <w:jc w:val="both"/>
+      </w:pPr>
+      <w:r>
+        <w:rPr>
+          <w:b/>
+          <w:bCs/>
+        </w:rPr>
+        <w:t xml:space="preserve">Rol: </w:t>
+      </w:r>
+      <w:r>
+        <w:t xml:space="preserve">Encargado de Depósito.</w:t>
+      </w:r>
+    </w:p>
+    <w:p>
+      <w:pPr>
+        <w:spacing w:after="160" w:line="360" w:lineRule="auto"/>
+        <w:jc w:val="both"/>
+      </w:pPr>
+      <w:r>
+        <w:rPr>
+          <w:b/>
+          <w:bCs/>
+        </w:rPr>
+        <w:t xml:space="preserve">Objetivo: </w:t>
+      </w:r>
+      <w:r>
+        <w:t xml:space="preserve">registrar el conteo real de los productos para compararlo con el stock del sistema.</w:t>
+      </w:r>
+    </w:p>
+    <w:p>
+      <w:pPr>
+        <w:pStyle w:val="Heading3"/>
+        <w:spacing w:after="60" w:before="160"/>
+      </w:pPr>
+      <w:r>
+        <w:rPr>
+          <w:b/>
+          <w:bCs/>
+        </w:rPr>
+        <w:t xml:space="preserve">Pasos</w:t>
+      </w:r>
+    </w:p>
+    <w:p>
+      <w:pPr>
+        <w:pStyle w:val="ListParagraph"/>
+        <w:numPr>
+          <w:ilvl w:val="0"/>
+          <w:numId w:val="29"/>
+        </w:numPr>
+        <w:spacing w:after="60" w:line="360" w:lineRule="auto"/>
+      </w:pPr>
+      <w:r>
+        <w:t xml:space="preserve">En el menú, ingrese a </w:t>
+      </w:r>
+      <w:r>
+        <w:rPr>
+          <w:b/>
+          <w:bCs/>
+        </w:rPr>
+        <w:t xml:space="preserve">Productos e Inventario → Proceso de Inventario</w:t>
+      </w:r>
+      <w:r>
+        <w:t xml:space="preserve"> y </w:t>
+      </w:r>
+      <w:r>
+        <w:rPr>
+          <w:b/>
+          <w:bCs/>
+        </w:rPr>
+        <w:t xml:space="preserve">Cree</w:t>
+      </w:r>
+      <w:r>
+        <w:t xml:space="preserve"> un nuevo proceso de inventario, indicando el alcance (por ejemplo, la oficina).</w:t>
+      </w:r>
+    </w:p>
+    <w:p>
+      <w:pPr>
+        <w:pStyle w:val="ListParagraph"/>
+        <w:numPr>
+          <w:ilvl w:val="0"/>
+          <w:numId w:val="29"/>
+        </w:numPr>
+        <w:spacing w:after="60" w:line="360" w:lineRule="auto"/>
+      </w:pPr>
+      <w:r>
+        <w:t xml:space="preserve">Ingrese a </w:t>
+      </w:r>
+      <w:r>
+        <w:rPr>
+          <w:b/>
+          <w:bCs/>
+        </w:rPr>
+        <w:t xml:space="preserve">Conteo Físico</w:t>
+      </w:r>
+      <w:r>
+        <w:t xml:space="preserve"> y registre la </w:t>
+      </w:r>
+      <w:r>
+        <w:rPr>
+          <w:b/>
+          <w:bCs/>
+        </w:rPr>
+        <w:t xml:space="preserve">cantidad contada</w:t>
+      </w:r>
+      <w:r>
+        <w:t xml:space="preserve"> de cada producto.</w:t>
+      </w:r>
+    </w:p>
+    <w:p>
+      <w:pPr>
+        <w:pStyle w:val="ListParagraph"/>
+        <w:numPr>
+          <w:ilvl w:val="0"/>
+          <w:numId w:val="29"/>
+        </w:numPr>
+        <w:spacing w:after="60" w:line="360" w:lineRule="auto"/>
+      </w:pPr>
+      <w:r>
+        <w:t xml:space="preserve">Guarde el conteo. El sistema calcula la </w:t>
+      </w:r>
+      <w:r>
+        <w:rPr>
+          <w:b/>
+          <w:bCs/>
+        </w:rPr>
+        <w:t xml:space="preserve">diferencia</w:t>
+      </w:r>
+      <w:r>
+        <w:t xml:space="preserve"> contra el stock registrado.</w:t>
+      </w:r>
+    </w:p>
+    <w:tbl>
+      <w:tblPr>
+        <w:tblW w:type="pct" w:w="100%"/>
+        <w:tblBorders>
+          <w:top w:val="single" w:color="auto" w:sz="4"/>
+          <w:left w:val="single" w:color="auto" w:sz="4"/>
+          <w:bottom w:val="single" w:color="auto" w:sz="4"/>
+          <w:right w:val="single" w:color="auto" w:sz="4"/>
+          <w:insideH w:val="single" w:color="auto" w:sz="4"/>
+          <w:insideV w:val="single" w:color="auto" w:sz="4"/>
+        </w:tblBorders>
+      </w:tblPr>
+      <w:tblGrid>
+        <w:gridCol w:w="100"/>
+      </w:tblGrid>
+      <w:tr>
+        <w:tc>
+          <w:tcPr>
+            <w:tcBorders>
+              <w:top w:val="dashed" w:color="9AA5B1" w:sz="6"/>
+              <w:left w:val="dashed" w:color="9AA5B1" w:sz="6"/>
+              <w:bottom w:val="dashed" w:color="9AA5B1" w:sz="6"/>
+              <w:right w:val="dashed" w:color="9AA5B1" w:sz="6"/>
+            </w:tcBorders>
+            <w:shd w:fill="F5F7FA" w:val="clear"/>
+            <w:tcMar>
+              <w:top w:type="dxa" w:w="300"/>
+              <w:left w:type="dxa" w:w="160"/>
+              <w:bottom w:type="dxa" w:w="300"/>
+              <w:right w:type="dxa" w:w="160"/>
+            </w:tcMar>
+          </w:tcPr>
+          <w:p>
+            <w:pPr>
+              <w:spacing w:after="40"/>
+              <w:jc w:val="center"/>
+            </w:pPr>
+            <w:r>
+              <w:rPr>
+                <w:b/>
+                <w:bCs/>
+                <w:color w:val="6B7683"/>
+                <w:sz w:val="22"/>
+                <w:szCs w:val="22"/>
+              </w:rPr>
+              <w:t xml:space="preserve">[ FIGURA PENDIENTE DE CAPTURA ]</w:t>
+            </w:r>
+          </w:p>
+          <w:p>
+            <w:pPr>
+              <w:spacing w:after="0"/>
+              <w:jc w:val="center"/>
+            </w:pPr>
+            <w:r>
+              <w:rPr>
+                <w:i/>
+                <w:iCs/>
+                <w:color w:val="9AA5B1"/>
+                <w:sz w:val="20"/>
+                <w:szCs w:val="20"/>
+              </w:rPr>
+              <w:t xml:space="preserve">09_conteo_01.png</w:t>
+            </w:r>
+          </w:p>
+        </w:tc>
+      </w:tr>
+    </w:tbl>
+    <w:p>
+      <w:pPr>
+        <w:spacing w:after="200"/>
+        <w:jc w:val="center"/>
+      </w:pPr>
+      <w:r>
+        <w:rPr>
+          <w:i/>
+          <w:iCs/>
+          <w:sz w:val="20"/>
+          <w:szCs w:val="20"/>
+        </w:rPr>
+        <w:t xml:space="preserve">Figura 40. Conteo físico de productos.</w:t>
+      </w:r>
+    </w:p>
+    <w:tbl>
+      <w:tblPr>
+        <w:tblW w:type="pct" w:w="100%"/>
+        <w:tblBorders>
+          <w:top w:val="single" w:color="auto" w:sz="4"/>
+          <w:left w:val="single" w:color="auto" w:sz="4"/>
+          <w:bottom w:val="single" w:color="auto" w:sz="4"/>
+          <w:right w:val="single" w:color="auto" w:sz="4"/>
+          <w:insideH w:val="single" w:color="auto" w:sz="4"/>
+          <w:insideV w:val="single" w:color="auto" w:sz="4"/>
+        </w:tblBorders>
+      </w:tblPr>
+      <w:tblGrid>
+        <w:gridCol w:w="100"/>
+      </w:tblGrid>
+      <w:tr>
+        <w:tc>
+          <w:tcPr>
+            <w:tcBorders>
+              <w:top w:val="single" w:color="2E6DA4" w:sz="2"/>
+              <w:left w:val="single" w:color="2E6DA4" w:sz="24"/>
+              <w:bottom w:val="single" w:color="2E6DA4" w:sz="2"/>
+              <w:right w:val="single" w:color="2E6DA4" w:sz="2"/>
+            </w:tcBorders>
+            <w:shd w:fill="E8F1FB" w:val="clear"/>
+            <w:tcMar>
+              <w:top w:type="dxa" w:w="80"/>
+              <w:left w:type="dxa" w:w="160"/>
+              <w:bottom w:type="dxa" w:w="80"/>
+              <w:right w:type="dxa" w:w="160"/>
+            </w:tcMar>
+          </w:tcPr>
+          <w:p>
+            <w:pPr>
+              <w:spacing w:after="0" w:line="300"/>
+              <w:jc w:val="both"/>
+            </w:pPr>
+            <w:r>
+              <w:rPr>
+                <w:b/>
+                <w:bCs/>
+                <w:color w:val="2E6DA4"/>
+              </w:rPr>
+              <w:t xml:space="preserve">Nota: </w:t>
+            </w:r>
+            <w:r>
+              <w:t xml:space="preserve">El </w:t>
+            </w:r>
+            <w:r>
+              <w:rPr>
+                <w:b/>
+                <w:bCs/>
+              </w:rPr>
+              <w:t xml:space="preserve">ajuste</w:t>
+            </w:r>
+            <w:r>
+              <w:t xml:space="preserve"> de stock se aplica recién cuando el inventario se </w:t>
+            </w:r>
+            <w:r>
+              <w:rPr>
+                <w:b/>
+                <w:bCs/>
+              </w:rPr>
+              <w:t xml:space="preserve">aprueba</w:t>
+            </w:r>
+            <w:r>
+              <w:t xml:space="preserve"> (ver 9.4).</w:t>
+            </w:r>
+          </w:p>
+        </w:tc>
+      </w:tr>
+    </w:tbl>
+    <w:p>
+      <w:pPr>
+        <w:pageBreakBefore/>
+      </w:pPr>
+      <w:r>
+        <w:t xml:space="preserve"/>
+      </w:r>
+    </w:p>
+    <w:p>
+      <w:pPr>
+        <w:pStyle w:val="Heading2"/>
+        <w:spacing w:after="120" w:before="200"/>
+      </w:pPr>
+      <w:r>
+        <w:rPr>
+          <w:b/>
+          <w:bCs/>
+        </w:rPr>
+        <w:t xml:space="preserve">9.4. Aprobar un inventario físico</w:t>
+      </w:r>
+    </w:p>
+    <w:p>
+      <w:pPr>
+        <w:spacing w:after="160" w:line="360" w:lineRule="auto"/>
+        <w:jc w:val="both"/>
+      </w:pPr>
+      <w:r>
+        <w:rPr>
+          <w:b/>
+          <w:bCs/>
+        </w:rPr>
+        <w:t xml:space="preserve">Rol: </w:t>
+      </w:r>
+      <w:r>
+        <w:t xml:space="preserve">Supervisor.</w:t>
+      </w:r>
+    </w:p>
+    <w:p>
+      <w:pPr>
+        <w:spacing w:after="160" w:line="360" w:lineRule="auto"/>
+        <w:jc w:val="both"/>
+      </w:pPr>
+      <w:r>
+        <w:rPr>
+          <w:b/>
+          <w:bCs/>
+        </w:rPr>
+        <w:t xml:space="preserve">Objetivo: </w:t>
+      </w:r>
+      <w:r>
+        <w:t xml:space="preserve">revisar las diferencias del conteo y aprobar el ajuste de stock.</w:t>
+      </w:r>
+    </w:p>
+    <w:p>
+      <w:pPr>
+        <w:pStyle w:val="Heading3"/>
+        <w:spacing w:after="60" w:before="160"/>
+      </w:pPr>
+      <w:r>
+        <w:rPr>
+          <w:b/>
+          <w:bCs/>
+        </w:rPr>
+        <w:t xml:space="preserve">Pasos</w:t>
+      </w:r>
+    </w:p>
+    <w:p>
+      <w:pPr>
+        <w:pStyle w:val="ListParagraph"/>
+        <w:numPr>
+          <w:ilvl w:val="0"/>
+          <w:numId w:val="30"/>
+        </w:numPr>
+        <w:spacing w:after="60" w:line="360" w:lineRule="auto"/>
+      </w:pPr>
+      <w:r>
+        <w:t xml:space="preserve">En el menú, ingrese a </w:t>
+      </w:r>
+      <w:r>
+        <w:rPr>
+          <w:b/>
+          <w:bCs/>
+        </w:rPr>
+        <w:t xml:space="preserve">Productos e Inventario → Revisión</w:t>
+      </w:r>
+      <w:r>
+        <w:t xml:space="preserve">.</w:t>
+      </w:r>
+    </w:p>
+    <w:p>
+      <w:pPr>
+        <w:pStyle w:val="ListParagraph"/>
+        <w:numPr>
+          <w:ilvl w:val="0"/>
+          <w:numId w:val="30"/>
+        </w:numPr>
+        <w:spacing w:after="60" w:line="360" w:lineRule="auto"/>
+      </w:pPr>
+      <w:r>
+        <w:t xml:space="preserve">Abra el inventario a revisar y compare las </w:t>
+      </w:r>
+      <w:r>
+        <w:rPr>
+          <w:b/>
+          <w:bCs/>
+        </w:rPr>
+        <w:t xml:space="preserve">cantidades contadas</w:t>
+      </w:r>
+      <w:r>
+        <w:t xml:space="preserve"> con las del sistema.</w:t>
+      </w:r>
+    </w:p>
+    <w:p>
+      <w:pPr>
+        <w:pStyle w:val="ListParagraph"/>
+        <w:numPr>
+          <w:ilvl w:val="0"/>
+          <w:numId w:val="30"/>
+        </w:numPr>
+        <w:spacing w:after="60" w:line="360" w:lineRule="auto"/>
+      </w:pPr>
+      <w:r>
+        <w:rPr>
+          <w:b/>
+          <w:bCs/>
+        </w:rPr>
+        <w:t xml:space="preserve">Apruebe</w:t>
+      </w:r>
+      <w:r>
+        <w:t xml:space="preserve"> el inventario. El sistema </w:t>
+      </w:r>
+      <w:r>
+        <w:rPr>
+          <w:b/>
+          <w:bCs/>
+        </w:rPr>
+        <w:t xml:space="preserve">ajusta el stock</w:t>
+      </w:r>
+      <w:r>
+        <w:t xml:space="preserve"> para que coincida con lo contado.</w:t>
+      </w:r>
+    </w:p>
+    <w:tbl>
+      <w:tblPr>
+        <w:tblW w:type="pct" w:w="100%"/>
+        <w:tblBorders>
+          <w:top w:val="single" w:color="auto" w:sz="4"/>
+          <w:left w:val="single" w:color="auto" w:sz="4"/>
+          <w:bottom w:val="single" w:color="auto" w:sz="4"/>
+          <w:right w:val="single" w:color="auto" w:sz="4"/>
+          <w:insideH w:val="single" w:color="auto" w:sz="4"/>
+          <w:insideV w:val="single" w:color="auto" w:sz="4"/>
+        </w:tblBorders>
+      </w:tblPr>
+      <w:tblGrid>
+        <w:gridCol w:w="100"/>
+      </w:tblGrid>
+      <w:tr>
+        <w:tc>
+          <w:tcPr>
+            <w:tcBorders>
+              <w:top w:val="dashed" w:color="9AA5B1" w:sz="6"/>
+              <w:left w:val="dashed" w:color="9AA5B1" w:sz="6"/>
+              <w:bottom w:val="dashed" w:color="9AA5B1" w:sz="6"/>
+              <w:right w:val="dashed" w:color="9AA5B1" w:sz="6"/>
+            </w:tcBorders>
+            <w:shd w:fill="F5F7FA" w:val="clear"/>
+            <w:tcMar>
+              <w:top w:type="dxa" w:w="300"/>
+              <w:left w:type="dxa" w:w="160"/>
+              <w:bottom w:type="dxa" w:w="300"/>
+              <w:right w:type="dxa" w:w="160"/>
+            </w:tcMar>
+          </w:tcPr>
+          <w:p>
+            <w:pPr>
+              <w:spacing w:after="40"/>
+              <w:jc w:val="center"/>
+            </w:pPr>
+            <w:r>
+              <w:rPr>
+                <w:b/>
+                <w:bCs/>
+                <w:color w:val="6B7683"/>
+                <w:sz w:val="22"/>
+                <w:szCs w:val="22"/>
+              </w:rPr>
+              <w:t xml:space="preserve">[ FIGURA PENDIENTE DE CAPTURA ]</w:t>
+            </w:r>
+          </w:p>
+          <w:p>
+            <w:pPr>
+              <w:spacing w:after="0"/>
+              <w:jc w:val="center"/>
+            </w:pPr>
+            <w:r>
+              <w:rPr>
+                <w:i/>
+                <w:iCs/>
+                <w:color w:val="9AA5B1"/>
+                <w:sz w:val="20"/>
+                <w:szCs w:val="20"/>
+              </w:rPr>
+              <w:t xml:space="preserve">09_revision_01.png</w:t>
+            </w:r>
+          </w:p>
+        </w:tc>
+      </w:tr>
+    </w:tbl>
+    <w:p>
+      <w:pPr>
+        <w:spacing w:after="200"/>
+        <w:jc w:val="center"/>
+      </w:pPr>
+      <w:r>
+        <w:rPr>
+          <w:i/>
+          <w:iCs/>
+          <w:sz w:val="20"/>
+          <w:szCs w:val="20"/>
+        </w:rPr>
+        <w:t xml:space="preserve">Figura 41. Revisión y aprobación del inventario físico.</w:t>
+      </w:r>
+    </w:p>
     <w:sectPr>
       <w:headerReference w:type="default" r:id="rId8"/>
       <w:footerReference w:type="default" r:id="rId9"/>
@@ -11297,6 +12614,30 @@
     </w:lvlOverride>
   </w:num>
   <w:num w:numId="26">
+    <w:abstractNumId w:val="3"/>
+    <w:lvlOverride w:ilvl="0">
+      <w:startOverride w:val="1"/>
+    </w:lvlOverride>
+  </w:num>
+  <w:num w:numId="27">
+    <w:abstractNumId w:val="3"/>
+    <w:lvlOverride w:ilvl="0">
+      <w:startOverride w:val="1"/>
+    </w:lvlOverride>
+  </w:num>
+  <w:num w:numId="28">
+    <w:abstractNumId w:val="3"/>
+    <w:lvlOverride w:ilvl="0">
+      <w:startOverride w:val="1"/>
+    </w:lvlOverride>
+  </w:num>
+  <w:num w:numId="29">
+    <w:abstractNumId w:val="3"/>
+    <w:lvlOverride w:ilvl="0">
+      <w:startOverride w:val="1"/>
+    </w:lvlOverride>
+  </w:num>
+  <w:num w:numId="30">
     <w:abstractNumId w:val="3"/>
     <w:lvlOverride w:ilvl="0">
       <w:startOverride w:val="1"/>

</xml_diff>

<commit_message>
docs(manual-usuario): agrega Documentos fiscales, Reportes y Administración (10-12)
Completa la cobertura de módulos del manual.
- Cap. 10 Documentos fiscales: imprimir el documento (KuDE) de un comprobante
  (leyenda "sin validez fiscal") y gestionar talonarios (Configuración → Talonarios).
- Cap. 11 Reportes gerenciales (Gerente): consultar dashboards (Ventas/Cobros/
  Inventario/Compras), generar informes por filtros y definir metas.
- Cap. 12 Administración (Administrador): gestionar empleados, restablecer la
  contraseña de un empleado (botón Restablecer/Reenviar credenciales de F28),
  roles y privilegios (Seguridad), catálogos/parámetros (Configuración) y
  configuración de cajas/oficinas.

Manual completo: caps 1-12, 50 páginas, tablas 1..10, figuras 1..51.
</commit_message>
<xml_diff>
--- a/doc/manual_usuario/MUESTRA_Manual_Usuario.docx
+++ b/doc/manual_usuario/MUESTRA_Manual_Usuario.docx
@@ -12134,6 +12134,3262 @@
           <w:szCs w:val="20"/>
         </w:rPr>
         <w:t xml:space="preserve">Figura 41. Revisión y aprobación del inventario físico.</w:t>
+      </w:r>
+    </w:p>
+    <w:p>
+      <w:pPr>
+        <w:pageBreakBefore/>
+      </w:pPr>
+      <w:r>
+        <w:t xml:space="preserve"/>
+      </w:r>
+    </w:p>
+    <w:p>
+      <w:pPr>
+        <w:pStyle w:val="Heading1"/>
+        <w:spacing w:after="160" w:before="240"/>
+      </w:pPr>
+      <w:r>
+        <w:rPr>
+          <w:b/>
+          <w:bCs/>
+        </w:rPr>
+        <w:t xml:space="preserve">10. Documentos fiscales</w:t>
+      </w:r>
+    </w:p>
+    <w:p>
+      <w:pPr>
+        <w:spacing w:after="160" w:before="0" w:line="360" w:lineRule="auto"/>
+        <w:jc w:val="both"/>
+      </w:pPr>
+      <w:r>
+        <w:t xml:space="preserve">El sistema genera documentos impresos de los comprobantes (KuDE): factura, recibo y nota de crédito, entre otros. Son representaciones gráficas para el cliente y llevan la leyenda «sin validez fiscal», ya que no están integradas al sistema nacional de facturación electrónica. La emisión de comprobantes se controla mediante talonarios, que administra el Administrador. La siguiente tabla indica qué tarea realiza cada rol.</w:t>
+      </w:r>
+    </w:p>
+    <w:tbl>
+      <w:tblPr>
+        <w:tblW w:type="pct" w:w="100%"/>
+        <w:tblBorders>
+          <w:top w:val="single" w:color="auto" w:sz="4"/>
+          <w:left w:val="single" w:color="auto" w:sz="4"/>
+          <w:bottom w:val="single" w:color="auto" w:sz="4"/>
+          <w:right w:val="single" w:color="auto" w:sz="4"/>
+          <w:insideH w:val="single" w:color="auto" w:sz="4"/>
+          <w:insideV w:val="single" w:color="auto" w:sz="4"/>
+        </w:tblBorders>
+      </w:tblPr>
+      <w:tblGrid>
+        <w:gridCol w:w="100"/>
+        <w:gridCol w:w="100"/>
+      </w:tblGrid>
+      <w:tr>
+        <w:trPr>
+          <w:tblHeader/>
+        </w:trPr>
+        <w:tc>
+          <w:tcPr>
+            <w:tcW w:type="pct" w:w="30%"/>
+            <w:tcBorders>
+              <w:top w:val="single" w:color="AAB4C0" w:sz="2"/>
+              <w:left w:val="single" w:color="AAB4C0" w:sz="2"/>
+              <w:bottom w:val="single" w:color="AAB4C0" w:sz="2"/>
+              <w:right w:val="single" w:color="AAB4C0" w:sz="2"/>
+            </w:tcBorders>
+            <w:shd w:fill="DCE9F5" w:val="clear"/>
+            <w:tcMar>
+              <w:top w:type="dxa" w:w="20"/>
+              <w:left w:type="dxa" w:w="70"/>
+              <w:bottom w:type="dxa" w:w="20"/>
+              <w:right w:type="dxa" w:w="70"/>
+            </w:tcMar>
+            <w:vAlign w:val="center"/>
+          </w:tcPr>
+          <w:p>
+            <w:pPr>
+              <w:spacing w:after="0" w:line="240" w:lineRule="auto"/>
+              <w:jc w:val="center"/>
+            </w:pPr>
+            <w:r>
+              <w:rPr>
+                <w:rFonts w:ascii="Times New Roman" w:cs="Times New Roman" w:eastAsia="Times New Roman" w:hAnsi="Times New Roman"/>
+                <w:b/>
+                <w:bCs/>
+                <w:sz w:val="18"/>
+                <w:szCs w:val="18"/>
+              </w:rPr>
+              <w:t xml:space="preserve">Rol</w:t>
+            </w:r>
+          </w:p>
+        </w:tc>
+        <w:tc>
+          <w:tcPr>
+            <w:tcW w:type="pct" w:w="70%"/>
+            <w:tcBorders>
+              <w:top w:val="single" w:color="AAB4C0" w:sz="2"/>
+              <w:left w:val="single" w:color="AAB4C0" w:sz="2"/>
+              <w:bottom w:val="single" w:color="AAB4C0" w:sz="2"/>
+              <w:right w:val="single" w:color="AAB4C0" w:sz="2"/>
+            </w:tcBorders>
+            <w:shd w:fill="DCE9F5" w:val="clear"/>
+            <w:tcMar>
+              <w:top w:type="dxa" w:w="20"/>
+              <w:left w:type="dxa" w:w="70"/>
+              <w:bottom w:type="dxa" w:w="20"/>
+              <w:right w:type="dxa" w:w="70"/>
+            </w:tcMar>
+            <w:vAlign w:val="center"/>
+          </w:tcPr>
+          <w:p>
+            <w:pPr>
+              <w:spacing w:after="0" w:line="240" w:lineRule="auto"/>
+              <w:jc w:val="center"/>
+            </w:pPr>
+            <w:r>
+              <w:rPr>
+                <w:rFonts w:ascii="Times New Roman" w:cs="Times New Roman" w:eastAsia="Times New Roman" w:hAnsi="Times New Roman"/>
+                <w:b/>
+                <w:bCs/>
+                <w:sz w:val="18"/>
+                <w:szCs w:val="18"/>
+              </w:rPr>
+              <w:t xml:space="preserve">Tareas</w:t>
+            </w:r>
+          </w:p>
+        </w:tc>
+      </w:tr>
+      <w:tr>
+        <w:tc>
+          <w:tcPr>
+            <w:tcW w:type="pct" w:w="30%"/>
+            <w:tcBorders>
+              <w:top w:val="single" w:color="AAB4C0" w:sz="2"/>
+              <w:left w:val="single" w:color="AAB4C0" w:sz="2"/>
+              <w:bottom w:val="single" w:color="AAB4C0" w:sz="2"/>
+              <w:right w:val="single" w:color="AAB4C0" w:sz="2"/>
+            </w:tcBorders>
+            <w:tcMar>
+              <w:top w:type="dxa" w:w="20"/>
+              <w:left w:type="dxa" w:w="70"/>
+              <w:bottom w:type="dxa" w:w="20"/>
+              <w:right w:type="dxa" w:w="70"/>
+            </w:tcMar>
+            <w:vAlign w:val="center"/>
+          </w:tcPr>
+          <w:p>
+            <w:pPr>
+              <w:spacing w:after="0" w:line="240" w:lineRule="auto"/>
+              <w:jc w:val="left"/>
+            </w:pPr>
+            <w:r>
+              <w:rPr>
+                <w:rFonts w:ascii="Times New Roman" w:cs="Times New Roman" w:eastAsia="Times New Roman" w:hAnsi="Times New Roman"/>
+                <w:sz w:val="18"/>
+                <w:szCs w:val="18"/>
+              </w:rPr>
+              <w:t xml:space="preserve">Cajero / Supervisor</w:t>
+            </w:r>
+          </w:p>
+        </w:tc>
+        <w:tc>
+          <w:tcPr>
+            <w:tcW w:type="pct" w:w="70%"/>
+            <w:tcBorders>
+              <w:top w:val="single" w:color="AAB4C0" w:sz="2"/>
+              <w:left w:val="single" w:color="AAB4C0" w:sz="2"/>
+              <w:bottom w:val="single" w:color="AAB4C0" w:sz="2"/>
+              <w:right w:val="single" w:color="AAB4C0" w:sz="2"/>
+            </w:tcBorders>
+            <w:tcMar>
+              <w:top w:type="dxa" w:w="20"/>
+              <w:left w:type="dxa" w:w="70"/>
+              <w:bottom w:type="dxa" w:w="20"/>
+              <w:right w:type="dxa" w:w="70"/>
+            </w:tcMar>
+            <w:vAlign w:val="center"/>
+          </w:tcPr>
+          <w:p>
+            <w:pPr>
+              <w:spacing w:after="0" w:line="240" w:lineRule="auto"/>
+              <w:jc w:val="left"/>
+            </w:pPr>
+            <w:r>
+              <w:rPr>
+                <w:rFonts w:ascii="Times New Roman" w:cs="Times New Roman" w:eastAsia="Times New Roman" w:hAnsi="Times New Roman"/>
+                <w:sz w:val="18"/>
+                <w:szCs w:val="18"/>
+              </w:rPr>
+              <w:t xml:space="preserve">Imprimir el documento (KuDE) de un comprobante.</w:t>
+            </w:r>
+          </w:p>
+        </w:tc>
+      </w:tr>
+      <w:tr>
+        <w:tc>
+          <w:tcPr>
+            <w:tcW w:type="pct" w:w="30%"/>
+            <w:tcBorders>
+              <w:top w:val="single" w:color="AAB4C0" w:sz="2"/>
+              <w:left w:val="single" w:color="AAB4C0" w:sz="2"/>
+              <w:bottom w:val="single" w:color="AAB4C0" w:sz="2"/>
+              <w:right w:val="single" w:color="AAB4C0" w:sz="2"/>
+            </w:tcBorders>
+            <w:tcMar>
+              <w:top w:type="dxa" w:w="20"/>
+              <w:left w:type="dxa" w:w="70"/>
+              <w:bottom w:type="dxa" w:w="20"/>
+              <w:right w:type="dxa" w:w="70"/>
+            </w:tcMar>
+            <w:vAlign w:val="center"/>
+          </w:tcPr>
+          <w:p>
+            <w:pPr>
+              <w:spacing w:after="0" w:line="240" w:lineRule="auto"/>
+              <w:jc w:val="left"/>
+            </w:pPr>
+            <w:r>
+              <w:rPr>
+                <w:rFonts w:ascii="Times New Roman" w:cs="Times New Roman" w:eastAsia="Times New Roman" w:hAnsi="Times New Roman"/>
+                <w:sz w:val="18"/>
+                <w:szCs w:val="18"/>
+              </w:rPr>
+              <w:t xml:space="preserve">Administrador</w:t>
+            </w:r>
+          </w:p>
+        </w:tc>
+        <w:tc>
+          <w:tcPr>
+            <w:tcW w:type="pct" w:w="70%"/>
+            <w:tcBorders>
+              <w:top w:val="single" w:color="AAB4C0" w:sz="2"/>
+              <w:left w:val="single" w:color="AAB4C0" w:sz="2"/>
+              <w:bottom w:val="single" w:color="AAB4C0" w:sz="2"/>
+              <w:right w:val="single" w:color="AAB4C0" w:sz="2"/>
+            </w:tcBorders>
+            <w:tcMar>
+              <w:top w:type="dxa" w:w="20"/>
+              <w:left w:type="dxa" w:w="70"/>
+              <w:bottom w:type="dxa" w:w="20"/>
+              <w:right w:type="dxa" w:w="70"/>
+            </w:tcMar>
+            <w:vAlign w:val="center"/>
+          </w:tcPr>
+          <w:p>
+            <w:pPr>
+              <w:spacing w:after="0" w:line="240" w:lineRule="auto"/>
+              <w:jc w:val="left"/>
+            </w:pPr>
+            <w:r>
+              <w:rPr>
+                <w:rFonts w:ascii="Times New Roman" w:cs="Times New Roman" w:eastAsia="Times New Roman" w:hAnsi="Times New Roman"/>
+                <w:sz w:val="18"/>
+                <w:szCs w:val="18"/>
+              </w:rPr>
+              <w:t xml:space="preserve">Gestionar los talonarios.</w:t>
+            </w:r>
+          </w:p>
+        </w:tc>
+      </w:tr>
+    </w:tbl>
+    <w:p>
+      <w:pPr>
+        <w:spacing w:after="200"/>
+        <w:jc w:val="center"/>
+      </w:pPr>
+      <w:r>
+        <w:rPr>
+          <w:i/>
+          <w:iCs/>
+          <w:sz w:val="20"/>
+          <w:szCs w:val="20"/>
+        </w:rPr>
+        <w:t xml:space="preserve">Tabla 8. Roles y tareas del módulo Documentos fiscales.</w:t>
+      </w:r>
+    </w:p>
+    <w:p>
+      <w:pPr>
+        <w:pStyle w:val="Heading2"/>
+        <w:spacing w:after="120" w:before="200"/>
+      </w:pPr>
+      <w:r>
+        <w:rPr>
+          <w:b/>
+          <w:bCs/>
+        </w:rPr>
+        <w:t xml:space="preserve">10.1. Imprimir el documento de un comprobante</w:t>
+      </w:r>
+    </w:p>
+    <w:p>
+      <w:pPr>
+        <w:spacing w:after="160" w:line="360" w:lineRule="auto"/>
+        <w:jc w:val="both"/>
+      </w:pPr>
+      <w:r>
+        <w:rPr>
+          <w:b/>
+          <w:bCs/>
+        </w:rPr>
+        <w:t xml:space="preserve">Rol: </w:t>
+      </w:r>
+      <w:r>
+        <w:t xml:space="preserve">Cajero o Supervisor, según el comprobante.</w:t>
+      </w:r>
+    </w:p>
+    <w:p>
+      <w:pPr>
+        <w:spacing w:after="160" w:line="360" w:lineRule="auto"/>
+        <w:jc w:val="both"/>
+      </w:pPr>
+      <w:r>
+        <w:rPr>
+          <w:b/>
+          <w:bCs/>
+        </w:rPr>
+        <w:t xml:space="preserve">Objetivo: </w:t>
+      </w:r>
+      <w:r>
+        <w:t xml:space="preserve">obtener el documento impreso (KuDE) de una factura, recibo o nota de crédito.</w:t>
+      </w:r>
+    </w:p>
+    <w:p>
+      <w:pPr>
+        <w:pStyle w:val="Heading3"/>
+        <w:spacing w:after="60" w:before="160"/>
+      </w:pPr>
+      <w:r>
+        <w:rPr>
+          <w:b/>
+          <w:bCs/>
+        </w:rPr>
+        <w:t xml:space="preserve">Pasos</w:t>
+      </w:r>
+    </w:p>
+    <w:p>
+      <w:pPr>
+        <w:pStyle w:val="ListParagraph"/>
+        <w:numPr>
+          <w:ilvl w:val="0"/>
+          <w:numId w:val="31"/>
+        </w:numPr>
+        <w:spacing w:after="60" w:line="360" w:lineRule="auto"/>
+      </w:pPr>
+      <w:r>
+        <w:t xml:space="preserve">Ubique el comprobante en su módulo: la </w:t>
+      </w:r>
+      <w:r>
+        <w:rPr>
+          <w:b/>
+          <w:bCs/>
+        </w:rPr>
+        <w:t xml:space="preserve">factura</w:t>
+      </w:r>
+      <w:r>
+        <w:t xml:space="preserve"> al emitirla o desde la lista de comprobantes (ver 5.2); el </w:t>
+      </w:r>
+      <w:r>
+        <w:rPr>
+          <w:b/>
+          <w:bCs/>
+        </w:rPr>
+        <w:t xml:space="preserve">recibo</w:t>
+      </w:r>
+      <w:r>
+        <w:t xml:space="preserve"> desde Cobranzas (ver 6.1 y 6.2); la </w:t>
+      </w:r>
+      <w:r>
+        <w:rPr>
+          <w:b/>
+          <w:bCs/>
+        </w:rPr>
+        <w:t xml:space="preserve">nota de crédito</w:t>
+      </w:r>
+      <w:r>
+        <w:t xml:space="preserve"> desde Notas de Crédito (ver 7.3).</w:t>
+      </w:r>
+    </w:p>
+    <w:p>
+      <w:pPr>
+        <w:pStyle w:val="ListParagraph"/>
+        <w:numPr>
+          <w:ilvl w:val="0"/>
+          <w:numId w:val="31"/>
+        </w:numPr>
+        <w:spacing w:after="60" w:line="360" w:lineRule="auto"/>
+      </w:pPr>
+      <w:r>
+        <w:t xml:space="preserve">Abra el </w:t>
+      </w:r>
+      <w:r>
+        <w:rPr>
+          <w:b/>
+          <w:bCs/>
+        </w:rPr>
+        <w:t xml:space="preserve">documento</w:t>
+      </w:r>
+      <w:r>
+        <w:t xml:space="preserve"> del comprobante. Se muestra en pantalla, listo para </w:t>
+      </w:r>
+      <w:r>
+        <w:rPr>
+          <w:b/>
+          <w:bCs/>
+        </w:rPr>
+        <w:t xml:space="preserve">imprimir</w:t>
+      </w:r>
+      <w:r>
+        <w:t xml:space="preserve"> o </w:t>
+      </w:r>
+      <w:r>
+        <w:rPr>
+          <w:b/>
+          <w:bCs/>
+        </w:rPr>
+        <w:t xml:space="preserve">guardar</w:t>
+      </w:r>
+      <w:r>
+        <w:t xml:space="preserve"> (por ejemplo, en PDF desde el navegador).</w:t>
+      </w:r>
+    </w:p>
+    <w:tbl>
+      <w:tblPr>
+        <w:tblW w:type="pct" w:w="100%"/>
+        <w:tblBorders>
+          <w:top w:val="single" w:color="auto" w:sz="4"/>
+          <w:left w:val="single" w:color="auto" w:sz="4"/>
+          <w:bottom w:val="single" w:color="auto" w:sz="4"/>
+          <w:right w:val="single" w:color="auto" w:sz="4"/>
+          <w:insideH w:val="single" w:color="auto" w:sz="4"/>
+          <w:insideV w:val="single" w:color="auto" w:sz="4"/>
+        </w:tblBorders>
+      </w:tblPr>
+      <w:tblGrid>
+        <w:gridCol w:w="100"/>
+      </w:tblGrid>
+      <w:tr>
+        <w:tc>
+          <w:tcPr>
+            <w:tcBorders>
+              <w:top w:val="dashed" w:color="9AA5B1" w:sz="6"/>
+              <w:left w:val="dashed" w:color="9AA5B1" w:sz="6"/>
+              <w:bottom w:val="dashed" w:color="9AA5B1" w:sz="6"/>
+              <w:right w:val="dashed" w:color="9AA5B1" w:sz="6"/>
+            </w:tcBorders>
+            <w:shd w:fill="F5F7FA" w:val="clear"/>
+            <w:tcMar>
+              <w:top w:type="dxa" w:w="300"/>
+              <w:left w:type="dxa" w:w="160"/>
+              <w:bottom w:type="dxa" w:w="300"/>
+              <w:right w:type="dxa" w:w="160"/>
+            </w:tcMar>
+          </w:tcPr>
+          <w:p>
+            <w:pPr>
+              <w:spacing w:after="40"/>
+              <w:jc w:val="center"/>
+            </w:pPr>
+            <w:r>
+              <w:rPr>
+                <w:b/>
+                <w:bCs/>
+                <w:color w:val="6B7683"/>
+                <w:sz w:val="22"/>
+                <w:szCs w:val="22"/>
+              </w:rPr>
+              <w:t xml:space="preserve">[ FIGURA PENDIENTE DE CAPTURA ]</w:t>
+            </w:r>
+          </w:p>
+          <w:p>
+            <w:pPr>
+              <w:spacing w:after="0"/>
+              <w:jc w:val="center"/>
+            </w:pPr>
+            <w:r>
+              <w:rPr>
+                <w:i/>
+                <w:iCs/>
+                <w:color w:val="9AA5B1"/>
+                <w:sz w:val="20"/>
+                <w:szCs w:val="20"/>
+              </w:rPr>
+              <w:t xml:space="preserve">10_kude_documento_01.png</w:t>
+            </w:r>
+          </w:p>
+        </w:tc>
+      </w:tr>
+    </w:tbl>
+    <w:p>
+      <w:pPr>
+        <w:spacing w:after="200"/>
+        <w:jc w:val="center"/>
+      </w:pPr>
+      <w:r>
+        <w:rPr>
+          <w:i/>
+          <w:iCs/>
+          <w:sz w:val="20"/>
+          <w:szCs w:val="20"/>
+        </w:rPr>
+        <w:t xml:space="preserve">Figura 42. Documento (KuDE) de un comprobante.</w:t>
+      </w:r>
+    </w:p>
+    <w:tbl>
+      <w:tblPr>
+        <w:tblW w:type="pct" w:w="100%"/>
+        <w:tblBorders>
+          <w:top w:val="single" w:color="auto" w:sz="4"/>
+          <w:left w:val="single" w:color="auto" w:sz="4"/>
+          <w:bottom w:val="single" w:color="auto" w:sz="4"/>
+          <w:right w:val="single" w:color="auto" w:sz="4"/>
+          <w:insideH w:val="single" w:color="auto" w:sz="4"/>
+          <w:insideV w:val="single" w:color="auto" w:sz="4"/>
+        </w:tblBorders>
+      </w:tblPr>
+      <w:tblGrid>
+        <w:gridCol w:w="100"/>
+      </w:tblGrid>
+      <w:tr>
+        <w:tc>
+          <w:tcPr>
+            <w:tcBorders>
+              <w:top w:val="single" w:color="2E6DA4" w:sz="2"/>
+              <w:left w:val="single" w:color="2E6DA4" w:sz="24"/>
+              <w:bottom w:val="single" w:color="2E6DA4" w:sz="2"/>
+              <w:right w:val="single" w:color="2E6DA4" w:sz="2"/>
+            </w:tcBorders>
+            <w:shd w:fill="E8F1FB" w:val="clear"/>
+            <w:tcMar>
+              <w:top w:type="dxa" w:w="80"/>
+              <w:left w:type="dxa" w:w="160"/>
+              <w:bottom w:type="dxa" w:w="80"/>
+              <w:right w:type="dxa" w:w="160"/>
+            </w:tcMar>
+          </w:tcPr>
+          <w:p>
+            <w:pPr>
+              <w:spacing w:after="0" w:line="300"/>
+              <w:jc w:val="both"/>
+            </w:pPr>
+            <w:r>
+              <w:rPr>
+                <w:b/>
+                <w:bCs/>
+                <w:color w:val="2E6DA4"/>
+              </w:rPr>
+              <w:t xml:space="preserve">Nota: </w:t>
+            </w:r>
+            <w:r>
+              <w:t xml:space="preserve">Los documentos llevan la leyenda </w:t>
+            </w:r>
+            <w:r>
+              <w:rPr>
+                <w:b/>
+                <w:bCs/>
+              </w:rPr>
+              <w:t xml:space="preserve">«sin validez fiscal»</w:t>
+            </w:r>
+            <w:r>
+              <w:t xml:space="preserve">: son una representación gráfica del comprobante para entregar al cliente.</w:t>
+            </w:r>
+          </w:p>
+        </w:tc>
+      </w:tr>
+    </w:tbl>
+    <w:p>
+      <w:pPr>
+        <w:pageBreakBefore/>
+      </w:pPr>
+      <w:r>
+        <w:t xml:space="preserve"/>
+      </w:r>
+    </w:p>
+    <w:p>
+      <w:pPr>
+        <w:pStyle w:val="Heading2"/>
+        <w:spacing w:after="120" w:before="200"/>
+      </w:pPr>
+      <w:r>
+        <w:rPr>
+          <w:b/>
+          <w:bCs/>
+        </w:rPr>
+        <w:t xml:space="preserve">10.2. Gestionar los talonarios</w:t>
+      </w:r>
+    </w:p>
+    <w:p>
+      <w:pPr>
+        <w:spacing w:after="160" w:line="360" w:lineRule="auto"/>
+        <w:jc w:val="both"/>
+      </w:pPr>
+      <w:r>
+        <w:rPr>
+          <w:b/>
+          <w:bCs/>
+        </w:rPr>
+        <w:t xml:space="preserve">Rol: </w:t>
+      </w:r>
+      <w:r>
+        <w:t xml:space="preserve">Administrador.</w:t>
+      </w:r>
+    </w:p>
+    <w:p>
+      <w:pPr>
+        <w:spacing w:after="160" w:line="360" w:lineRule="auto"/>
+        <w:jc w:val="both"/>
+      </w:pPr>
+      <w:r>
+        <w:rPr>
+          <w:b/>
+          <w:bCs/>
+        </w:rPr>
+        <w:t xml:space="preserve">Objetivo: </w:t>
+      </w:r>
+      <w:r>
+        <w:t xml:space="preserve">administrar los talonarios que habilitan la numeración de los comprobantes.</w:t>
+      </w:r>
+    </w:p>
+    <w:p>
+      <w:pPr>
+        <w:pStyle w:val="Heading3"/>
+        <w:spacing w:after="60" w:before="160"/>
+      </w:pPr>
+      <w:r>
+        <w:rPr>
+          <w:b/>
+          <w:bCs/>
+        </w:rPr>
+        <w:t xml:space="preserve">Pasos</w:t>
+      </w:r>
+    </w:p>
+    <w:p>
+      <w:pPr>
+        <w:pStyle w:val="ListParagraph"/>
+        <w:numPr>
+          <w:ilvl w:val="0"/>
+          <w:numId w:val="32"/>
+        </w:numPr>
+        <w:spacing w:after="60" w:line="360" w:lineRule="auto"/>
+      </w:pPr>
+      <w:r>
+        <w:t xml:space="preserve">En el menú, ingrese a </w:t>
+      </w:r>
+      <w:r>
+        <w:rPr>
+          <w:b/>
+          <w:bCs/>
+        </w:rPr>
+        <w:t xml:space="preserve">Configuración → Talonarios</w:t>
+      </w:r>
+      <w:r>
+        <w:t xml:space="preserve">. Se muestra la lista de talonarios.</w:t>
+      </w:r>
+    </w:p>
+    <w:p>
+      <w:pPr>
+        <w:pStyle w:val="ListParagraph"/>
+        <w:numPr>
+          <w:ilvl w:val="0"/>
+          <w:numId w:val="32"/>
+        </w:numPr>
+        <w:spacing w:after="60" w:line="360" w:lineRule="auto"/>
+      </w:pPr>
+      <w:r>
+        <w:t xml:space="preserve">Para crear o editar uno, indique el </w:t>
+      </w:r>
+      <w:r>
+        <w:rPr>
+          <w:b/>
+          <w:bCs/>
+        </w:rPr>
+        <w:t xml:space="preserve">tipo de comprobante</w:t>
+      </w:r>
+      <w:r>
+        <w:t xml:space="preserve"> (factura, recibo o nota de crédito), el </w:t>
+      </w:r>
+      <w:r>
+        <w:rPr>
+          <w:b/>
+          <w:bCs/>
+        </w:rPr>
+        <w:t xml:space="preserve">timbrado</w:t>
+      </w:r>
+      <w:r>
+        <w:t xml:space="preserve"> y su vigencia, la </w:t>
+      </w:r>
+      <w:r>
+        <w:rPr>
+          <w:b/>
+          <w:bCs/>
+        </w:rPr>
+        <w:t xml:space="preserve">caja</w:t>
+      </w:r>
+      <w:r>
+        <w:t xml:space="preserve"> asociada y su </w:t>
+      </w:r>
+      <w:r>
+        <w:rPr>
+          <w:b/>
+          <w:bCs/>
+        </w:rPr>
+        <w:t xml:space="preserve">punto de expedición</w:t>
+      </w:r>
+      <w:r>
+        <w:t xml:space="preserve">.</w:t>
+      </w:r>
+    </w:p>
+    <w:p>
+      <w:pPr>
+        <w:pStyle w:val="ListParagraph"/>
+        <w:numPr>
+          <w:ilvl w:val="0"/>
+          <w:numId w:val="32"/>
+        </w:numPr>
+        <w:spacing w:after="60" w:line="360" w:lineRule="auto"/>
+      </w:pPr>
+      <w:r>
+        <w:t xml:space="preserve">Guarde. El talonario queda disponible para emitir comprobantes de ese tipo.</w:t>
+      </w:r>
+    </w:p>
+    <w:tbl>
+      <w:tblPr>
+        <w:tblW w:type="pct" w:w="100%"/>
+        <w:tblBorders>
+          <w:top w:val="single" w:color="auto" w:sz="4"/>
+          <w:left w:val="single" w:color="auto" w:sz="4"/>
+          <w:bottom w:val="single" w:color="auto" w:sz="4"/>
+          <w:right w:val="single" w:color="auto" w:sz="4"/>
+          <w:insideH w:val="single" w:color="auto" w:sz="4"/>
+          <w:insideV w:val="single" w:color="auto" w:sz="4"/>
+        </w:tblBorders>
+      </w:tblPr>
+      <w:tblGrid>
+        <w:gridCol w:w="100"/>
+      </w:tblGrid>
+      <w:tr>
+        <w:tc>
+          <w:tcPr>
+            <w:tcBorders>
+              <w:top w:val="dashed" w:color="9AA5B1" w:sz="6"/>
+              <w:left w:val="dashed" w:color="9AA5B1" w:sz="6"/>
+              <w:bottom w:val="dashed" w:color="9AA5B1" w:sz="6"/>
+              <w:right w:val="dashed" w:color="9AA5B1" w:sz="6"/>
+            </w:tcBorders>
+            <w:shd w:fill="F5F7FA" w:val="clear"/>
+            <w:tcMar>
+              <w:top w:type="dxa" w:w="300"/>
+              <w:left w:type="dxa" w:w="160"/>
+              <w:bottom w:type="dxa" w:w="300"/>
+              <w:right w:type="dxa" w:w="160"/>
+            </w:tcMar>
+          </w:tcPr>
+          <w:p>
+            <w:pPr>
+              <w:spacing w:after="40"/>
+              <w:jc w:val="center"/>
+            </w:pPr>
+            <w:r>
+              <w:rPr>
+                <w:b/>
+                <w:bCs/>
+                <w:color w:val="6B7683"/>
+                <w:sz w:val="22"/>
+                <w:szCs w:val="22"/>
+              </w:rPr>
+              <w:t xml:space="preserve">[ FIGURA PENDIENTE DE CAPTURA ]</w:t>
+            </w:r>
+          </w:p>
+          <w:p>
+            <w:pPr>
+              <w:spacing w:after="0"/>
+              <w:jc w:val="center"/>
+            </w:pPr>
+            <w:r>
+              <w:rPr>
+                <w:i/>
+                <w:iCs/>
+                <w:color w:val="9AA5B1"/>
+                <w:sz w:val="20"/>
+                <w:szCs w:val="20"/>
+              </w:rPr>
+              <w:t xml:space="preserve">10_talonarios_01.png</w:t>
+            </w:r>
+          </w:p>
+        </w:tc>
+      </w:tr>
+    </w:tbl>
+    <w:p>
+      <w:pPr>
+        <w:spacing w:after="200"/>
+        <w:jc w:val="center"/>
+      </w:pPr>
+      <w:r>
+        <w:rPr>
+          <w:i/>
+          <w:iCs/>
+          <w:sz w:val="20"/>
+          <w:szCs w:val="20"/>
+        </w:rPr>
+        <w:t xml:space="preserve">Figura 43. Gestión de talonarios.</w:t>
+      </w:r>
+    </w:p>
+    <w:tbl>
+      <w:tblPr>
+        <w:tblW w:type="pct" w:w="100%"/>
+        <w:tblBorders>
+          <w:top w:val="single" w:color="auto" w:sz="4"/>
+          <w:left w:val="single" w:color="auto" w:sz="4"/>
+          <w:bottom w:val="single" w:color="auto" w:sz="4"/>
+          <w:right w:val="single" w:color="auto" w:sz="4"/>
+          <w:insideH w:val="single" w:color="auto" w:sz="4"/>
+          <w:insideV w:val="single" w:color="auto" w:sz="4"/>
+        </w:tblBorders>
+      </w:tblPr>
+      <w:tblGrid>
+        <w:gridCol w:w="100"/>
+      </w:tblGrid>
+      <w:tr>
+        <w:tc>
+          <w:tcPr>
+            <w:tcBorders>
+              <w:top w:val="single" w:color="C0392B" w:sz="2"/>
+              <w:left w:val="single" w:color="C0392B" w:sz="24"/>
+              <w:bottom w:val="single" w:color="C0392B" w:sz="2"/>
+              <w:right w:val="single" w:color="C0392B" w:sz="2"/>
+            </w:tcBorders>
+            <w:shd w:fill="FDECEA" w:val="clear"/>
+            <w:tcMar>
+              <w:top w:type="dxa" w:w="80"/>
+              <w:left w:type="dxa" w:w="160"/>
+              <w:bottom w:type="dxa" w:w="80"/>
+              <w:right w:type="dxa" w:w="160"/>
+            </w:tcMar>
+          </w:tcPr>
+          <w:p>
+            <w:pPr>
+              <w:spacing w:after="0" w:line="300"/>
+              <w:jc w:val="both"/>
+            </w:pPr>
+            <w:r>
+              <w:rPr>
+                <w:b/>
+                <w:bCs/>
+                <w:color w:val="C0392B"/>
+              </w:rPr>
+              <w:t xml:space="preserve">Importante: </w:t>
+            </w:r>
+            <w:r>
+              <w:t xml:space="preserve">Cada caja puede tener </w:t>
+            </w:r>
+            <w:r>
+              <w:rPr>
+                <w:b/>
+                <w:bCs/>
+              </w:rPr>
+              <w:t xml:space="preserve">un solo talonario activo</w:t>
+            </w:r>
+            <w:r>
+              <w:t xml:space="preserve"> por tipo de comprobante. El punto de expedición se define en la configuración de la caja (ver 12.5).</w:t>
+            </w:r>
+          </w:p>
+        </w:tc>
+      </w:tr>
+    </w:tbl>
+    <w:p>
+      <w:pPr>
+        <w:pageBreakBefore/>
+      </w:pPr>
+      <w:r>
+        <w:t xml:space="preserve"/>
+      </w:r>
+    </w:p>
+    <w:p>
+      <w:pPr>
+        <w:pStyle w:val="Heading1"/>
+        <w:spacing w:after="160" w:before="240"/>
+      </w:pPr>
+      <w:r>
+        <w:rPr>
+          <w:b/>
+          <w:bCs/>
+        </w:rPr>
+        <w:t xml:space="preserve">11. Reportes gerenciales</w:t>
+      </w:r>
+    </w:p>
+    <w:p>
+      <w:pPr>
+        <w:spacing w:after="160" w:before="0" w:line="360" w:lineRule="auto"/>
+        <w:jc w:val="both"/>
+      </w:pPr>
+      <w:r>
+        <w:t xml:space="preserve">Los reportes gerenciales resumen la información de ventas, cobros, inventario y compras en tableros interactivos (dashboards) y en informes imprimibles, y permiten definir las metas por período. Estas herramientas están dirigidas al Gerente. La siguiente tabla indica qué tarea realiza cada rol.</w:t>
+      </w:r>
+    </w:p>
+    <w:tbl>
+      <w:tblPr>
+        <w:tblW w:type="pct" w:w="100%"/>
+        <w:tblBorders>
+          <w:top w:val="single" w:color="auto" w:sz="4"/>
+          <w:left w:val="single" w:color="auto" w:sz="4"/>
+          <w:bottom w:val="single" w:color="auto" w:sz="4"/>
+          <w:right w:val="single" w:color="auto" w:sz="4"/>
+          <w:insideH w:val="single" w:color="auto" w:sz="4"/>
+          <w:insideV w:val="single" w:color="auto" w:sz="4"/>
+        </w:tblBorders>
+      </w:tblPr>
+      <w:tblGrid>
+        <w:gridCol w:w="100"/>
+        <w:gridCol w:w="100"/>
+      </w:tblGrid>
+      <w:tr>
+        <w:trPr>
+          <w:tblHeader/>
+        </w:trPr>
+        <w:tc>
+          <w:tcPr>
+            <w:tcW w:type="pct" w:w="26%"/>
+            <w:tcBorders>
+              <w:top w:val="single" w:color="AAB4C0" w:sz="2"/>
+              <w:left w:val="single" w:color="AAB4C0" w:sz="2"/>
+              <w:bottom w:val="single" w:color="AAB4C0" w:sz="2"/>
+              <w:right w:val="single" w:color="AAB4C0" w:sz="2"/>
+            </w:tcBorders>
+            <w:shd w:fill="DCE9F5" w:val="clear"/>
+            <w:tcMar>
+              <w:top w:type="dxa" w:w="20"/>
+              <w:left w:type="dxa" w:w="70"/>
+              <w:bottom w:type="dxa" w:w="20"/>
+              <w:right w:type="dxa" w:w="70"/>
+            </w:tcMar>
+            <w:vAlign w:val="center"/>
+          </w:tcPr>
+          <w:p>
+            <w:pPr>
+              <w:spacing w:after="0" w:line="240" w:lineRule="auto"/>
+              <w:jc w:val="center"/>
+            </w:pPr>
+            <w:r>
+              <w:rPr>
+                <w:rFonts w:ascii="Times New Roman" w:cs="Times New Roman" w:eastAsia="Times New Roman" w:hAnsi="Times New Roman"/>
+                <w:b/>
+                <w:bCs/>
+                <w:sz w:val="18"/>
+                <w:szCs w:val="18"/>
+              </w:rPr>
+              <w:t xml:space="preserve">Rol</w:t>
+            </w:r>
+          </w:p>
+        </w:tc>
+        <w:tc>
+          <w:tcPr>
+            <w:tcW w:type="pct" w:w="74%"/>
+            <w:tcBorders>
+              <w:top w:val="single" w:color="AAB4C0" w:sz="2"/>
+              <w:left w:val="single" w:color="AAB4C0" w:sz="2"/>
+              <w:bottom w:val="single" w:color="AAB4C0" w:sz="2"/>
+              <w:right w:val="single" w:color="AAB4C0" w:sz="2"/>
+            </w:tcBorders>
+            <w:shd w:fill="DCE9F5" w:val="clear"/>
+            <w:tcMar>
+              <w:top w:type="dxa" w:w="20"/>
+              <w:left w:type="dxa" w:w="70"/>
+              <w:bottom w:type="dxa" w:w="20"/>
+              <w:right w:type="dxa" w:w="70"/>
+            </w:tcMar>
+            <w:vAlign w:val="center"/>
+          </w:tcPr>
+          <w:p>
+            <w:pPr>
+              <w:spacing w:after="0" w:line="240" w:lineRule="auto"/>
+              <w:jc w:val="center"/>
+            </w:pPr>
+            <w:r>
+              <w:rPr>
+                <w:rFonts w:ascii="Times New Roman" w:cs="Times New Roman" w:eastAsia="Times New Roman" w:hAnsi="Times New Roman"/>
+                <w:b/>
+                <w:bCs/>
+                <w:sz w:val="18"/>
+                <w:szCs w:val="18"/>
+              </w:rPr>
+              <w:t xml:space="preserve">Tareas</w:t>
+            </w:r>
+          </w:p>
+        </w:tc>
+      </w:tr>
+      <w:tr>
+        <w:tc>
+          <w:tcPr>
+            <w:tcW w:type="pct" w:w="26%"/>
+            <w:tcBorders>
+              <w:top w:val="single" w:color="AAB4C0" w:sz="2"/>
+              <w:left w:val="single" w:color="AAB4C0" w:sz="2"/>
+              <w:bottom w:val="single" w:color="AAB4C0" w:sz="2"/>
+              <w:right w:val="single" w:color="AAB4C0" w:sz="2"/>
+            </w:tcBorders>
+            <w:tcMar>
+              <w:top w:type="dxa" w:w="20"/>
+              <w:left w:type="dxa" w:w="70"/>
+              <w:bottom w:type="dxa" w:w="20"/>
+              <w:right w:type="dxa" w:w="70"/>
+            </w:tcMar>
+            <w:vAlign w:val="center"/>
+          </w:tcPr>
+          <w:p>
+            <w:pPr>
+              <w:spacing w:after="0" w:line="240" w:lineRule="auto"/>
+              <w:jc w:val="left"/>
+            </w:pPr>
+            <w:r>
+              <w:rPr>
+                <w:rFonts w:ascii="Times New Roman" w:cs="Times New Roman" w:eastAsia="Times New Roman" w:hAnsi="Times New Roman"/>
+                <w:sz w:val="18"/>
+                <w:szCs w:val="18"/>
+              </w:rPr>
+              <w:t xml:space="preserve">Gerente</w:t>
+            </w:r>
+          </w:p>
+        </w:tc>
+        <w:tc>
+          <w:tcPr>
+            <w:tcW w:type="pct" w:w="74%"/>
+            <w:tcBorders>
+              <w:top w:val="single" w:color="AAB4C0" w:sz="2"/>
+              <w:left w:val="single" w:color="AAB4C0" w:sz="2"/>
+              <w:bottom w:val="single" w:color="AAB4C0" w:sz="2"/>
+              <w:right w:val="single" w:color="AAB4C0" w:sz="2"/>
+            </w:tcBorders>
+            <w:tcMar>
+              <w:top w:type="dxa" w:w="20"/>
+              <w:left w:type="dxa" w:w="70"/>
+              <w:bottom w:type="dxa" w:w="20"/>
+              <w:right w:type="dxa" w:w="70"/>
+            </w:tcMar>
+            <w:vAlign w:val="center"/>
+          </w:tcPr>
+          <w:p>
+            <w:pPr>
+              <w:spacing w:after="0" w:line="240" w:lineRule="auto"/>
+              <w:jc w:val="left"/>
+            </w:pPr>
+            <w:r>
+              <w:rPr>
+                <w:rFonts w:ascii="Times New Roman" w:cs="Times New Roman" w:eastAsia="Times New Roman" w:hAnsi="Times New Roman"/>
+                <w:sz w:val="18"/>
+                <w:szCs w:val="18"/>
+              </w:rPr>
+              <w:t xml:space="preserve">Consultar un dashboard gerencial · Generar un informe · Definir las metas.</w:t>
+            </w:r>
+          </w:p>
+        </w:tc>
+      </w:tr>
+    </w:tbl>
+    <w:p>
+      <w:pPr>
+        <w:spacing w:after="200"/>
+        <w:jc w:val="center"/>
+      </w:pPr>
+      <w:r>
+        <w:rPr>
+          <w:i/>
+          <w:iCs/>
+          <w:sz w:val="20"/>
+          <w:szCs w:val="20"/>
+        </w:rPr>
+        <w:t xml:space="preserve">Tabla 9. Roles y tareas del módulo Reportes gerenciales.</w:t>
+      </w:r>
+    </w:p>
+    <w:p>
+      <w:pPr>
+        <w:pStyle w:val="Heading2"/>
+        <w:spacing w:after="120" w:before="200"/>
+      </w:pPr>
+      <w:r>
+        <w:rPr>
+          <w:b/>
+          <w:bCs/>
+        </w:rPr>
+        <w:t xml:space="preserve">11.1. Consultar un dashboard gerencial</w:t>
+      </w:r>
+    </w:p>
+    <w:p>
+      <w:pPr>
+        <w:spacing w:after="160" w:line="360" w:lineRule="auto"/>
+        <w:jc w:val="both"/>
+      </w:pPr>
+      <w:r>
+        <w:rPr>
+          <w:b/>
+          <w:bCs/>
+        </w:rPr>
+        <w:t xml:space="preserve">Rol: </w:t>
+      </w:r>
+      <w:r>
+        <w:t xml:space="preserve">Gerente.</w:t>
+      </w:r>
+    </w:p>
+    <w:p>
+      <w:pPr>
+        <w:spacing w:after="160" w:line="360" w:lineRule="auto"/>
+        <w:jc w:val="both"/>
+      </w:pPr>
+      <w:r>
+        <w:rPr>
+          <w:b/>
+          <w:bCs/>
+        </w:rPr>
+        <w:t xml:space="preserve">Objetivo: </w:t>
+      </w:r>
+      <w:r>
+        <w:t xml:space="preserve">revisar los indicadores y gráficos de un módulo.</w:t>
+      </w:r>
+    </w:p>
+    <w:p>
+      <w:pPr>
+        <w:pStyle w:val="Heading3"/>
+        <w:spacing w:after="60" w:before="160"/>
+      </w:pPr>
+      <w:r>
+        <w:rPr>
+          <w:b/>
+          <w:bCs/>
+        </w:rPr>
+        <w:t xml:space="preserve">Pasos</w:t>
+      </w:r>
+    </w:p>
+    <w:p>
+      <w:pPr>
+        <w:pStyle w:val="ListParagraph"/>
+        <w:numPr>
+          <w:ilvl w:val="0"/>
+          <w:numId w:val="33"/>
+        </w:numPr>
+        <w:spacing w:after="60" w:line="360" w:lineRule="auto"/>
+      </w:pPr>
+      <w:r>
+        <w:t xml:space="preserve">En el menú, ingrese al tablero del módulo que desea consultar: </w:t>
+      </w:r>
+      <w:r>
+        <w:rPr>
+          <w:b/>
+          <w:bCs/>
+        </w:rPr>
+        <w:t xml:space="preserve">Ventas</w:t>
+      </w:r>
+      <w:r>
+        <w:t xml:space="preserve"> (Dashboard interactivo de Ventas), </w:t>
+      </w:r>
+      <w:r>
+        <w:rPr>
+          <w:b/>
+          <w:bCs/>
+        </w:rPr>
+        <w:t xml:space="preserve">Cobros</w:t>
+      </w:r>
+      <w:r>
+        <w:t xml:space="preserve"> (Dashboard de Cobros), </w:t>
+      </w:r>
+      <w:r>
+        <w:rPr>
+          <w:b/>
+          <w:bCs/>
+        </w:rPr>
+        <w:t xml:space="preserve">Inventario</w:t>
+      </w:r>
+      <w:r>
+        <w:t xml:space="preserve"> (Dashboard de Inventario) o </w:t>
+      </w:r>
+      <w:r>
+        <w:rPr>
+          <w:b/>
+          <w:bCs/>
+        </w:rPr>
+        <w:t xml:space="preserve">Compras</w:t>
+      </w:r>
+      <w:r>
+        <w:t xml:space="preserve"> (Dashboard de Compras).</w:t>
+      </w:r>
+    </w:p>
+    <w:p>
+      <w:pPr>
+        <w:pStyle w:val="ListParagraph"/>
+        <w:numPr>
+          <w:ilvl w:val="0"/>
+          <w:numId w:val="33"/>
+        </w:numPr>
+        <w:spacing w:after="60" w:line="360" w:lineRule="auto"/>
+      </w:pPr>
+      <w:r>
+        <w:t xml:space="preserve">Elija el </w:t>
+      </w:r>
+      <w:r>
+        <w:rPr>
+          <w:b/>
+          <w:bCs/>
+        </w:rPr>
+        <w:t xml:space="preserve">período</w:t>
+      </w:r>
+      <w:r>
+        <w:t xml:space="preserve"> (por ejemplo, el mes) con el selector del tablero.</w:t>
+      </w:r>
+    </w:p>
+    <w:p>
+      <w:pPr>
+        <w:pStyle w:val="ListParagraph"/>
+        <w:numPr>
+          <w:ilvl w:val="0"/>
+          <w:numId w:val="33"/>
+        </w:numPr>
+        <w:spacing w:after="60" w:line="360" w:lineRule="auto"/>
+      </w:pPr>
+      <w:r>
+        <w:t xml:space="preserve">Consulte los </w:t>
+      </w:r>
+      <w:r>
+        <w:rPr>
+          <w:b/>
+          <w:bCs/>
+        </w:rPr>
+        <w:t xml:space="preserve">indicadores</w:t>
+      </w:r>
+      <w:r>
+        <w:t xml:space="preserve"> (KPIs) y los </w:t>
+      </w:r>
+      <w:r>
+        <w:rPr>
+          <w:b/>
+          <w:bCs/>
+        </w:rPr>
+        <w:t xml:space="preserve">gráficos</w:t>
+      </w:r>
+      <w:r>
+        <w:t xml:space="preserve"> del módulo.</w:t>
+      </w:r>
+    </w:p>
+    <w:tbl>
+      <w:tblPr>
+        <w:tblW w:type="pct" w:w="100%"/>
+        <w:tblBorders>
+          <w:top w:val="single" w:color="auto" w:sz="4"/>
+          <w:left w:val="single" w:color="auto" w:sz="4"/>
+          <w:bottom w:val="single" w:color="auto" w:sz="4"/>
+          <w:right w:val="single" w:color="auto" w:sz="4"/>
+          <w:insideH w:val="single" w:color="auto" w:sz="4"/>
+          <w:insideV w:val="single" w:color="auto" w:sz="4"/>
+        </w:tblBorders>
+      </w:tblPr>
+      <w:tblGrid>
+        <w:gridCol w:w="100"/>
+      </w:tblGrid>
+      <w:tr>
+        <w:tc>
+          <w:tcPr>
+            <w:tcBorders>
+              <w:top w:val="dashed" w:color="9AA5B1" w:sz="6"/>
+              <w:left w:val="dashed" w:color="9AA5B1" w:sz="6"/>
+              <w:bottom w:val="dashed" w:color="9AA5B1" w:sz="6"/>
+              <w:right w:val="dashed" w:color="9AA5B1" w:sz="6"/>
+            </w:tcBorders>
+            <w:shd w:fill="F5F7FA" w:val="clear"/>
+            <w:tcMar>
+              <w:top w:type="dxa" w:w="300"/>
+              <w:left w:type="dxa" w:w="160"/>
+              <w:bottom w:type="dxa" w:w="300"/>
+              <w:right w:type="dxa" w:w="160"/>
+            </w:tcMar>
+          </w:tcPr>
+          <w:p>
+            <w:pPr>
+              <w:spacing w:after="40"/>
+              <w:jc w:val="center"/>
+            </w:pPr>
+            <w:r>
+              <w:rPr>
+                <w:b/>
+                <w:bCs/>
+                <w:color w:val="6B7683"/>
+                <w:sz w:val="22"/>
+                <w:szCs w:val="22"/>
+              </w:rPr>
+              <w:t xml:space="preserve">[ FIGURA PENDIENTE DE CAPTURA ]</w:t>
+            </w:r>
+          </w:p>
+          <w:p>
+            <w:pPr>
+              <w:spacing w:after="0"/>
+              <w:jc w:val="center"/>
+            </w:pPr>
+            <w:r>
+              <w:rPr>
+                <w:i/>
+                <w:iCs/>
+                <w:color w:val="9AA5B1"/>
+                <w:sz w:val="20"/>
+                <w:szCs w:val="20"/>
+              </w:rPr>
+              <w:t xml:space="preserve">11_dashboard_01.png</w:t>
+            </w:r>
+          </w:p>
+        </w:tc>
+      </w:tr>
+    </w:tbl>
+    <w:p>
+      <w:pPr>
+        <w:spacing w:after="200"/>
+        <w:jc w:val="center"/>
+      </w:pPr>
+      <w:r>
+        <w:rPr>
+          <w:i/>
+          <w:iCs/>
+          <w:sz w:val="20"/>
+          <w:szCs w:val="20"/>
+        </w:rPr>
+        <w:t xml:space="preserve">Figura 44. Dashboard gerencial de un módulo.</w:t>
+      </w:r>
+    </w:p>
+    <w:p>
+      <w:pPr>
+        <w:pageBreakBefore/>
+      </w:pPr>
+      <w:r>
+        <w:t xml:space="preserve"/>
+      </w:r>
+    </w:p>
+    <w:p>
+      <w:pPr>
+        <w:pStyle w:val="Heading2"/>
+        <w:spacing w:after="120" w:before="200"/>
+      </w:pPr>
+      <w:r>
+        <w:rPr>
+          <w:b/>
+          <w:bCs/>
+        </w:rPr>
+        <w:t xml:space="preserve">11.2. Generar un informe</w:t>
+      </w:r>
+    </w:p>
+    <w:p>
+      <w:pPr>
+        <w:spacing w:after="160" w:line="360" w:lineRule="auto"/>
+        <w:jc w:val="both"/>
+      </w:pPr>
+      <w:r>
+        <w:rPr>
+          <w:b/>
+          <w:bCs/>
+        </w:rPr>
+        <w:t xml:space="preserve">Rol: </w:t>
+      </w:r>
+      <w:r>
+        <w:t xml:space="preserve">Gerente.</w:t>
+      </w:r>
+    </w:p>
+    <w:p>
+      <w:pPr>
+        <w:spacing w:after="160" w:line="360" w:lineRule="auto"/>
+        <w:jc w:val="both"/>
+      </w:pPr>
+      <w:r>
+        <w:rPr>
+          <w:b/>
+          <w:bCs/>
+        </w:rPr>
+        <w:t xml:space="preserve">Objetivo: </w:t>
+      </w:r>
+      <w:r>
+        <w:t xml:space="preserve">obtener un informe imprimible filtrado por los criterios que necesite.</w:t>
+      </w:r>
+    </w:p>
+    <w:p>
+      <w:pPr>
+        <w:pStyle w:val="Heading3"/>
+        <w:spacing w:after="60" w:before="160"/>
+      </w:pPr>
+      <w:r>
+        <w:rPr>
+          <w:b/>
+          <w:bCs/>
+        </w:rPr>
+        <w:t xml:space="preserve">Pasos</w:t>
+      </w:r>
+    </w:p>
+    <w:p>
+      <w:pPr>
+        <w:pStyle w:val="ListParagraph"/>
+        <w:numPr>
+          <w:ilvl w:val="0"/>
+          <w:numId w:val="34"/>
+        </w:numPr>
+        <w:spacing w:after="60" w:line="360" w:lineRule="auto"/>
+      </w:pPr>
+      <w:r>
+        <w:t xml:space="preserve">Desde el </w:t>
+      </w:r>
+      <w:r>
+        <w:rPr>
+          <w:b/>
+          <w:bCs/>
+        </w:rPr>
+        <w:t xml:space="preserve">dashboard</w:t>
+      </w:r>
+      <w:r>
+        <w:t xml:space="preserve"> del módulo, presione el botón para </w:t>
+      </w:r>
+      <w:r>
+        <w:rPr>
+          <w:b/>
+          <w:bCs/>
+        </w:rPr>
+        <w:t xml:space="preserve">generar el informe</w:t>
+      </w:r>
+      <w:r>
+        <w:t xml:space="preserve"> (por ejemplo, «Generar Informe de Ventas»).</w:t>
+      </w:r>
+    </w:p>
+    <w:p>
+      <w:pPr>
+        <w:pStyle w:val="ListParagraph"/>
+        <w:numPr>
+          <w:ilvl w:val="0"/>
+          <w:numId w:val="34"/>
+        </w:numPr>
+        <w:spacing w:after="60" w:line="360" w:lineRule="auto"/>
+      </w:pPr>
+      <w:r>
+        <w:t xml:space="preserve">Elija los </w:t>
+      </w:r>
+      <w:r>
+        <w:rPr>
+          <w:b/>
+          <w:bCs/>
+        </w:rPr>
+        <w:t xml:space="preserve">filtros</w:t>
+      </w:r>
+      <w:r>
+        <w:t xml:space="preserve">: rango de fechas o período, sucursal y los demás criterios disponibles.</w:t>
+      </w:r>
+    </w:p>
+    <w:p>
+      <w:pPr>
+        <w:pStyle w:val="ListParagraph"/>
+        <w:numPr>
+          <w:ilvl w:val="0"/>
+          <w:numId w:val="34"/>
+        </w:numPr>
+        <w:spacing w:after="60" w:line="360" w:lineRule="auto"/>
+      </w:pPr>
+      <w:r>
+        <w:t xml:space="preserve">Genere el informe. Se muestra en pantalla, listo para </w:t>
+      </w:r>
+      <w:r>
+        <w:rPr>
+          <w:b/>
+          <w:bCs/>
+        </w:rPr>
+        <w:t xml:space="preserve">imprimir</w:t>
+      </w:r>
+      <w:r>
+        <w:t xml:space="preserve"> o </w:t>
+      </w:r>
+      <w:r>
+        <w:rPr>
+          <w:b/>
+          <w:bCs/>
+        </w:rPr>
+        <w:t xml:space="preserve">guardar</w:t>
+      </w:r>
+      <w:r>
+        <w:t xml:space="preserve">.</w:t>
+      </w:r>
+    </w:p>
+    <w:tbl>
+      <w:tblPr>
+        <w:tblW w:type="pct" w:w="100%"/>
+        <w:tblBorders>
+          <w:top w:val="single" w:color="auto" w:sz="4"/>
+          <w:left w:val="single" w:color="auto" w:sz="4"/>
+          <w:bottom w:val="single" w:color="auto" w:sz="4"/>
+          <w:right w:val="single" w:color="auto" w:sz="4"/>
+          <w:insideH w:val="single" w:color="auto" w:sz="4"/>
+          <w:insideV w:val="single" w:color="auto" w:sz="4"/>
+        </w:tblBorders>
+      </w:tblPr>
+      <w:tblGrid>
+        <w:gridCol w:w="100"/>
+      </w:tblGrid>
+      <w:tr>
+        <w:tc>
+          <w:tcPr>
+            <w:tcBorders>
+              <w:top w:val="dashed" w:color="9AA5B1" w:sz="6"/>
+              <w:left w:val="dashed" w:color="9AA5B1" w:sz="6"/>
+              <w:bottom w:val="dashed" w:color="9AA5B1" w:sz="6"/>
+              <w:right w:val="dashed" w:color="9AA5B1" w:sz="6"/>
+            </w:tcBorders>
+            <w:shd w:fill="F5F7FA" w:val="clear"/>
+            <w:tcMar>
+              <w:top w:type="dxa" w:w="300"/>
+              <w:left w:type="dxa" w:w="160"/>
+              <w:bottom w:type="dxa" w:w="300"/>
+              <w:right w:type="dxa" w:w="160"/>
+            </w:tcMar>
+          </w:tcPr>
+          <w:p>
+            <w:pPr>
+              <w:spacing w:after="40"/>
+              <w:jc w:val="center"/>
+            </w:pPr>
+            <w:r>
+              <w:rPr>
+                <w:b/>
+                <w:bCs/>
+                <w:color w:val="6B7683"/>
+                <w:sz w:val="22"/>
+                <w:szCs w:val="22"/>
+              </w:rPr>
+              <w:t xml:space="preserve">[ FIGURA PENDIENTE DE CAPTURA ]</w:t>
+            </w:r>
+          </w:p>
+          <w:p>
+            <w:pPr>
+              <w:spacing w:after="0"/>
+              <w:jc w:val="center"/>
+            </w:pPr>
+            <w:r>
+              <w:rPr>
+                <w:i/>
+                <w:iCs/>
+                <w:color w:val="9AA5B1"/>
+                <w:sz w:val="20"/>
+                <w:szCs w:val="20"/>
+              </w:rPr>
+              <w:t xml:space="preserve">11_informe_01.png</w:t>
+            </w:r>
+          </w:p>
+        </w:tc>
+      </w:tr>
+    </w:tbl>
+    <w:p>
+      <w:pPr>
+        <w:spacing w:after="200"/>
+        <w:jc w:val="center"/>
+      </w:pPr>
+      <w:r>
+        <w:rPr>
+          <w:i/>
+          <w:iCs/>
+          <w:sz w:val="20"/>
+          <w:szCs w:val="20"/>
+        </w:rPr>
+        <w:t xml:space="preserve">Figura 45. Generador de informe gerencial.</w:t>
+      </w:r>
+    </w:p>
+    <w:p>
+      <w:pPr>
+        <w:pageBreakBefore/>
+      </w:pPr>
+      <w:r>
+        <w:t xml:space="preserve"/>
+      </w:r>
+    </w:p>
+    <w:p>
+      <w:pPr>
+        <w:pStyle w:val="Heading2"/>
+        <w:spacing w:after="120" w:before="200"/>
+      </w:pPr>
+      <w:r>
+        <w:rPr>
+          <w:b/>
+          <w:bCs/>
+        </w:rPr>
+        <w:t xml:space="preserve">11.3. Definir las metas</w:t>
+      </w:r>
+    </w:p>
+    <w:p>
+      <w:pPr>
+        <w:spacing w:after="160" w:line="360" w:lineRule="auto"/>
+        <w:jc w:val="both"/>
+      </w:pPr>
+      <w:r>
+        <w:rPr>
+          <w:b/>
+          <w:bCs/>
+        </w:rPr>
+        <w:t xml:space="preserve">Rol: </w:t>
+      </w:r>
+      <w:r>
+        <w:t xml:space="preserve">Gerente.</w:t>
+      </w:r>
+    </w:p>
+    <w:p>
+      <w:pPr>
+        <w:spacing w:after="160" w:line="360" w:lineRule="auto"/>
+        <w:jc w:val="both"/>
+      </w:pPr>
+      <w:r>
+        <w:rPr>
+          <w:b/>
+          <w:bCs/>
+        </w:rPr>
+        <w:t xml:space="preserve">Objetivo: </w:t>
+      </w:r>
+      <w:r>
+        <w:t xml:space="preserve">cargar las metas de venta y de cobranza por período.</w:t>
+      </w:r>
+    </w:p>
+    <w:p>
+      <w:pPr>
+        <w:pStyle w:val="Heading3"/>
+        <w:spacing w:after="60" w:before="160"/>
+      </w:pPr>
+      <w:r>
+        <w:rPr>
+          <w:b/>
+          <w:bCs/>
+        </w:rPr>
+        <w:t xml:space="preserve">Pasos</w:t>
+      </w:r>
+    </w:p>
+    <w:p>
+      <w:pPr>
+        <w:pStyle w:val="ListParagraph"/>
+        <w:numPr>
+          <w:ilvl w:val="0"/>
+          <w:numId w:val="35"/>
+        </w:numPr>
+        <w:spacing w:after="60" w:line="360" w:lineRule="auto"/>
+      </w:pPr>
+      <w:r>
+        <w:t xml:space="preserve">En el menú, ingrese a </w:t>
+      </w:r>
+      <w:r>
+        <w:rPr>
+          <w:b/>
+          <w:bCs/>
+        </w:rPr>
+        <w:t xml:space="preserve">Ventas → Metas de Venta</w:t>
+      </w:r>
+      <w:r>
+        <w:t xml:space="preserve"> o a </w:t>
+      </w:r>
+      <w:r>
+        <w:rPr>
+          <w:b/>
+          <w:bCs/>
+        </w:rPr>
+        <w:t xml:space="preserve">Metas de Cobranza</w:t>
+      </w:r>
+      <w:r>
+        <w:t xml:space="preserve">, según corresponda.</w:t>
+      </w:r>
+    </w:p>
+    <w:p>
+      <w:pPr>
+        <w:pStyle w:val="ListParagraph"/>
+        <w:numPr>
+          <w:ilvl w:val="0"/>
+          <w:numId w:val="35"/>
+        </w:numPr>
+        <w:spacing w:after="60" w:line="360" w:lineRule="auto"/>
+      </w:pPr>
+      <w:r>
+        <w:t xml:space="preserve">Cree o edite una meta indicando el </w:t>
+      </w:r>
+      <w:r>
+        <w:rPr>
+          <w:b/>
+          <w:bCs/>
+        </w:rPr>
+        <w:t xml:space="preserve">período</w:t>
+      </w:r>
+      <w:r>
+        <w:t xml:space="preserve"> (mes), la </w:t>
+      </w:r>
+      <w:r>
+        <w:rPr>
+          <w:b/>
+          <w:bCs/>
+        </w:rPr>
+        <w:t xml:space="preserve">sucursal</w:t>
+      </w:r>
+      <w:r>
+        <w:t xml:space="preserve"> o el </w:t>
+      </w:r>
+      <w:r>
+        <w:rPr>
+          <w:b/>
+          <w:bCs/>
+        </w:rPr>
+        <w:t xml:space="preserve">vendedor/cobrador</w:t>
+      </w:r>
+      <w:r>
+        <w:t xml:space="preserve"> y el </w:t>
+      </w:r>
+      <w:r>
+        <w:rPr>
+          <w:b/>
+          <w:bCs/>
+        </w:rPr>
+        <w:t xml:space="preserve">monto</w:t>
+      </w:r>
+      <w:r>
+        <w:t xml:space="preserve"> de la meta.</w:t>
+      </w:r>
+    </w:p>
+    <w:p>
+      <w:pPr>
+        <w:pStyle w:val="ListParagraph"/>
+        <w:numPr>
+          <w:ilvl w:val="0"/>
+          <w:numId w:val="35"/>
+        </w:numPr>
+        <w:spacing w:after="60" w:line="360" w:lineRule="auto"/>
+      </w:pPr>
+      <w:r>
+        <w:t xml:space="preserve">Guarde. La meta se compara con lo realizado en el dashboard del módulo.</w:t>
+      </w:r>
+    </w:p>
+    <w:tbl>
+      <w:tblPr>
+        <w:tblW w:type="pct" w:w="100%"/>
+        <w:tblBorders>
+          <w:top w:val="single" w:color="auto" w:sz="4"/>
+          <w:left w:val="single" w:color="auto" w:sz="4"/>
+          <w:bottom w:val="single" w:color="auto" w:sz="4"/>
+          <w:right w:val="single" w:color="auto" w:sz="4"/>
+          <w:insideH w:val="single" w:color="auto" w:sz="4"/>
+          <w:insideV w:val="single" w:color="auto" w:sz="4"/>
+        </w:tblBorders>
+      </w:tblPr>
+      <w:tblGrid>
+        <w:gridCol w:w="100"/>
+      </w:tblGrid>
+      <w:tr>
+        <w:tc>
+          <w:tcPr>
+            <w:tcBorders>
+              <w:top w:val="dashed" w:color="9AA5B1" w:sz="6"/>
+              <w:left w:val="dashed" w:color="9AA5B1" w:sz="6"/>
+              <w:bottom w:val="dashed" w:color="9AA5B1" w:sz="6"/>
+              <w:right w:val="dashed" w:color="9AA5B1" w:sz="6"/>
+            </w:tcBorders>
+            <w:shd w:fill="F5F7FA" w:val="clear"/>
+            <w:tcMar>
+              <w:top w:type="dxa" w:w="300"/>
+              <w:left w:type="dxa" w:w="160"/>
+              <w:bottom w:type="dxa" w:w="300"/>
+              <w:right w:type="dxa" w:w="160"/>
+            </w:tcMar>
+          </w:tcPr>
+          <w:p>
+            <w:pPr>
+              <w:spacing w:after="40"/>
+              <w:jc w:val="center"/>
+            </w:pPr>
+            <w:r>
+              <w:rPr>
+                <w:b/>
+                <w:bCs/>
+                <w:color w:val="6B7683"/>
+                <w:sz w:val="22"/>
+                <w:szCs w:val="22"/>
+              </w:rPr>
+              <w:t xml:space="preserve">[ FIGURA PENDIENTE DE CAPTURA ]</w:t>
+            </w:r>
+          </w:p>
+          <w:p>
+            <w:pPr>
+              <w:spacing w:after="0"/>
+              <w:jc w:val="center"/>
+            </w:pPr>
+            <w:r>
+              <w:rPr>
+                <w:i/>
+                <w:iCs/>
+                <w:color w:val="9AA5B1"/>
+                <w:sz w:val="20"/>
+                <w:szCs w:val="20"/>
+              </w:rPr>
+              <w:t xml:space="preserve">11_metas_01.png</w:t>
+            </w:r>
+          </w:p>
+        </w:tc>
+      </w:tr>
+    </w:tbl>
+    <w:p>
+      <w:pPr>
+        <w:spacing w:after="200"/>
+        <w:jc w:val="center"/>
+      </w:pPr>
+      <w:r>
+        <w:rPr>
+          <w:i/>
+          <w:iCs/>
+          <w:sz w:val="20"/>
+          <w:szCs w:val="20"/>
+        </w:rPr>
+        <w:t xml:space="preserve">Figura 46. Definición de metas.</w:t>
+      </w:r>
+    </w:p>
+    <w:p>
+      <w:pPr>
+        <w:pageBreakBefore/>
+      </w:pPr>
+      <w:r>
+        <w:t xml:space="preserve"/>
+      </w:r>
+    </w:p>
+    <w:p>
+      <w:pPr>
+        <w:pStyle w:val="Heading1"/>
+        <w:spacing w:after="160" w:before="240"/>
+      </w:pPr>
+      <w:r>
+        <w:rPr>
+          <w:b/>
+          <w:bCs/>
+        </w:rPr>
+        <w:t xml:space="preserve">12. Administración</w:t>
+      </w:r>
+    </w:p>
+    <w:p>
+      <w:pPr>
+        <w:spacing w:after="160" w:before="0" w:line="360" w:lineRule="auto"/>
+        <w:jc w:val="both"/>
+      </w:pPr>
+      <w:r>
+        <w:t xml:space="preserve">Estas tareas son responsabilidad del Administrador: gestionar los usuarios (empleados) y sus roles, definir roles y privilegios, configurar los catálogos y parámetros del sistema, y configurar las cajas y oficinas. La siguiente tabla indica qué tarea realiza cada rol.</w:t>
+      </w:r>
+    </w:p>
+    <w:tbl>
+      <w:tblPr>
+        <w:tblW w:type="pct" w:w="100%"/>
+        <w:tblBorders>
+          <w:top w:val="single" w:color="auto" w:sz="4"/>
+          <w:left w:val="single" w:color="auto" w:sz="4"/>
+          <w:bottom w:val="single" w:color="auto" w:sz="4"/>
+          <w:right w:val="single" w:color="auto" w:sz="4"/>
+          <w:insideH w:val="single" w:color="auto" w:sz="4"/>
+          <w:insideV w:val="single" w:color="auto" w:sz="4"/>
+        </w:tblBorders>
+      </w:tblPr>
+      <w:tblGrid>
+        <w:gridCol w:w="100"/>
+        <w:gridCol w:w="100"/>
+      </w:tblGrid>
+      <w:tr>
+        <w:trPr>
+          <w:tblHeader/>
+        </w:trPr>
+        <w:tc>
+          <w:tcPr>
+            <w:tcW w:type="pct" w:w="26%"/>
+            <w:tcBorders>
+              <w:top w:val="single" w:color="AAB4C0" w:sz="2"/>
+              <w:left w:val="single" w:color="AAB4C0" w:sz="2"/>
+              <w:bottom w:val="single" w:color="AAB4C0" w:sz="2"/>
+              <w:right w:val="single" w:color="AAB4C0" w:sz="2"/>
+            </w:tcBorders>
+            <w:shd w:fill="DCE9F5" w:val="clear"/>
+            <w:tcMar>
+              <w:top w:type="dxa" w:w="20"/>
+              <w:left w:type="dxa" w:w="70"/>
+              <w:bottom w:type="dxa" w:w="20"/>
+              <w:right w:type="dxa" w:w="70"/>
+            </w:tcMar>
+            <w:vAlign w:val="center"/>
+          </w:tcPr>
+          <w:p>
+            <w:pPr>
+              <w:spacing w:after="0" w:line="240" w:lineRule="auto"/>
+              <w:jc w:val="center"/>
+            </w:pPr>
+            <w:r>
+              <w:rPr>
+                <w:rFonts w:ascii="Times New Roman" w:cs="Times New Roman" w:eastAsia="Times New Roman" w:hAnsi="Times New Roman"/>
+                <w:b/>
+                <w:bCs/>
+                <w:sz w:val="18"/>
+                <w:szCs w:val="18"/>
+              </w:rPr>
+              <w:t xml:space="preserve">Rol</w:t>
+            </w:r>
+          </w:p>
+        </w:tc>
+        <w:tc>
+          <w:tcPr>
+            <w:tcW w:type="pct" w:w="74%"/>
+            <w:tcBorders>
+              <w:top w:val="single" w:color="AAB4C0" w:sz="2"/>
+              <w:left w:val="single" w:color="AAB4C0" w:sz="2"/>
+              <w:bottom w:val="single" w:color="AAB4C0" w:sz="2"/>
+              <w:right w:val="single" w:color="AAB4C0" w:sz="2"/>
+            </w:tcBorders>
+            <w:shd w:fill="DCE9F5" w:val="clear"/>
+            <w:tcMar>
+              <w:top w:type="dxa" w:w="20"/>
+              <w:left w:type="dxa" w:w="70"/>
+              <w:bottom w:type="dxa" w:w="20"/>
+              <w:right w:type="dxa" w:w="70"/>
+            </w:tcMar>
+            <w:vAlign w:val="center"/>
+          </w:tcPr>
+          <w:p>
+            <w:pPr>
+              <w:spacing w:after="0" w:line="240" w:lineRule="auto"/>
+              <w:jc w:val="center"/>
+            </w:pPr>
+            <w:r>
+              <w:rPr>
+                <w:rFonts w:ascii="Times New Roman" w:cs="Times New Roman" w:eastAsia="Times New Roman" w:hAnsi="Times New Roman"/>
+                <w:b/>
+                <w:bCs/>
+                <w:sz w:val="18"/>
+                <w:szCs w:val="18"/>
+              </w:rPr>
+              <w:t xml:space="preserve">Tareas</w:t>
+            </w:r>
+          </w:p>
+        </w:tc>
+      </w:tr>
+      <w:tr>
+        <w:tc>
+          <w:tcPr>
+            <w:tcW w:type="pct" w:w="26%"/>
+            <w:tcBorders>
+              <w:top w:val="single" w:color="AAB4C0" w:sz="2"/>
+              <w:left w:val="single" w:color="AAB4C0" w:sz="2"/>
+              <w:bottom w:val="single" w:color="AAB4C0" w:sz="2"/>
+              <w:right w:val="single" w:color="AAB4C0" w:sz="2"/>
+            </w:tcBorders>
+            <w:tcMar>
+              <w:top w:type="dxa" w:w="20"/>
+              <w:left w:type="dxa" w:w="70"/>
+              <w:bottom w:type="dxa" w:w="20"/>
+              <w:right w:type="dxa" w:w="70"/>
+            </w:tcMar>
+            <w:vAlign w:val="center"/>
+          </w:tcPr>
+          <w:p>
+            <w:pPr>
+              <w:spacing w:after="0" w:line="240" w:lineRule="auto"/>
+              <w:jc w:val="left"/>
+            </w:pPr>
+            <w:r>
+              <w:rPr>
+                <w:rFonts w:ascii="Times New Roman" w:cs="Times New Roman" w:eastAsia="Times New Roman" w:hAnsi="Times New Roman"/>
+                <w:sz w:val="18"/>
+                <w:szCs w:val="18"/>
+              </w:rPr>
+              <w:t xml:space="preserve">Administrador</w:t>
+            </w:r>
+          </w:p>
+        </w:tc>
+        <w:tc>
+          <w:tcPr>
+            <w:tcW w:type="pct" w:w="74%"/>
+            <w:tcBorders>
+              <w:top w:val="single" w:color="AAB4C0" w:sz="2"/>
+              <w:left w:val="single" w:color="AAB4C0" w:sz="2"/>
+              <w:bottom w:val="single" w:color="AAB4C0" w:sz="2"/>
+              <w:right w:val="single" w:color="AAB4C0" w:sz="2"/>
+            </w:tcBorders>
+            <w:tcMar>
+              <w:top w:type="dxa" w:w="20"/>
+              <w:left w:type="dxa" w:w="70"/>
+              <w:bottom w:type="dxa" w:w="20"/>
+              <w:right w:type="dxa" w:w="70"/>
+            </w:tcMar>
+            <w:vAlign w:val="center"/>
+          </w:tcPr>
+          <w:p>
+            <w:pPr>
+              <w:spacing w:after="0" w:line="240" w:lineRule="auto"/>
+              <w:jc w:val="left"/>
+            </w:pPr>
+            <w:r>
+              <w:rPr>
+                <w:rFonts w:ascii="Times New Roman" w:cs="Times New Roman" w:eastAsia="Times New Roman" w:hAnsi="Times New Roman"/>
+                <w:sz w:val="18"/>
+                <w:szCs w:val="18"/>
+              </w:rPr>
+              <w:t xml:space="preserve">Gestionar usuarios (empleados) · Restablecer la contraseña de un empleado · Gestionar roles y privilegios · Configurar catálogos y parámetros · Configurar cajas y oficinas.</w:t>
+            </w:r>
+          </w:p>
+        </w:tc>
+      </w:tr>
+    </w:tbl>
+    <w:p>
+      <w:pPr>
+        <w:spacing w:after="200"/>
+        <w:jc w:val="center"/>
+      </w:pPr>
+      <w:r>
+        <w:rPr>
+          <w:i/>
+          <w:iCs/>
+          <w:sz w:val="20"/>
+          <w:szCs w:val="20"/>
+        </w:rPr>
+        <w:t xml:space="preserve">Tabla 10. Roles y tareas del módulo Administración.</w:t>
+      </w:r>
+    </w:p>
+    <w:p>
+      <w:pPr>
+        <w:pStyle w:val="Heading2"/>
+        <w:spacing w:after="120" w:before="200"/>
+      </w:pPr>
+      <w:r>
+        <w:rPr>
+          <w:b/>
+          <w:bCs/>
+        </w:rPr>
+        <w:t xml:space="preserve">12.1. Gestionar usuarios (empleados)</w:t>
+      </w:r>
+    </w:p>
+    <w:p>
+      <w:pPr>
+        <w:spacing w:after="160" w:line="360" w:lineRule="auto"/>
+        <w:jc w:val="both"/>
+      </w:pPr>
+      <w:r>
+        <w:rPr>
+          <w:b/>
+          <w:bCs/>
+        </w:rPr>
+        <w:t xml:space="preserve">Rol: </w:t>
+      </w:r>
+      <w:r>
+        <w:t xml:space="preserve">Administrador.</w:t>
+      </w:r>
+    </w:p>
+    <w:p>
+      <w:pPr>
+        <w:spacing w:after="160" w:line="360" w:lineRule="auto"/>
+        <w:jc w:val="both"/>
+      </w:pPr>
+      <w:r>
+        <w:rPr>
+          <w:b/>
+          <w:bCs/>
+        </w:rPr>
+        <w:t xml:space="preserve">Objetivo: </w:t>
+      </w:r>
+      <w:r>
+        <w:t xml:space="preserve">registrar o modificar los empleados que usan el sistema y asignarles su rol.</w:t>
+      </w:r>
+    </w:p>
+    <w:p>
+      <w:pPr>
+        <w:pStyle w:val="Heading3"/>
+        <w:spacing w:after="60" w:before="160"/>
+      </w:pPr>
+      <w:r>
+        <w:rPr>
+          <w:b/>
+          <w:bCs/>
+        </w:rPr>
+        <w:t xml:space="preserve">Pasos</w:t>
+      </w:r>
+    </w:p>
+    <w:p>
+      <w:pPr>
+        <w:pStyle w:val="ListParagraph"/>
+        <w:numPr>
+          <w:ilvl w:val="0"/>
+          <w:numId w:val="36"/>
+        </w:numPr>
+        <w:spacing w:after="60" w:line="360" w:lineRule="auto"/>
+      </w:pPr>
+      <w:r>
+        <w:t xml:space="preserve">En el menú, ingrese a </w:t>
+      </w:r>
+      <w:r>
+        <w:rPr>
+          <w:b/>
+          <w:bCs/>
+        </w:rPr>
+        <w:t xml:space="preserve">Personas → Empleados</w:t>
+      </w:r>
+      <w:r>
+        <w:t xml:space="preserve">. Se muestra la lista de empleados.</w:t>
+      </w:r>
+    </w:p>
+    <w:p>
+      <w:pPr>
+        <w:pStyle w:val="ListParagraph"/>
+        <w:numPr>
+          <w:ilvl w:val="0"/>
+          <w:numId w:val="36"/>
+        </w:numPr>
+        <w:spacing w:after="60" w:line="360" w:lineRule="auto"/>
+      </w:pPr>
+      <w:r>
+        <w:t xml:space="preserve">Presione </w:t>
+      </w:r>
+      <w:r>
+        <w:rPr>
+          <w:b/>
+          <w:bCs/>
+        </w:rPr>
+        <w:t xml:space="preserve">Crear</w:t>
+      </w:r>
+      <w:r>
+        <w:t xml:space="preserve"> para registrar un empleado nuevo, o abra uno existente para editarlo.</w:t>
+      </w:r>
+    </w:p>
+    <w:p>
+      <w:pPr>
+        <w:pStyle w:val="ListParagraph"/>
+        <w:numPr>
+          <w:ilvl w:val="0"/>
+          <w:numId w:val="36"/>
+        </w:numPr>
+        <w:spacing w:after="60" w:line="360" w:lineRule="auto"/>
+      </w:pPr>
+      <w:r>
+        <w:t xml:space="preserve">Complete sus datos (nombre, documento, correo, usuario) y asigne el </w:t>
+      </w:r>
+      <w:r>
+        <w:rPr>
+          <w:b/>
+          <w:bCs/>
+        </w:rPr>
+        <w:t xml:space="preserve">rol</w:t>
+      </w:r>
+      <w:r>
+        <w:t xml:space="preserve"> que le corresponde.</w:t>
+      </w:r>
+    </w:p>
+    <w:p>
+      <w:pPr>
+        <w:pStyle w:val="ListParagraph"/>
+        <w:numPr>
+          <w:ilvl w:val="0"/>
+          <w:numId w:val="36"/>
+        </w:numPr>
+        <w:spacing w:after="60" w:line="360" w:lineRule="auto"/>
+      </w:pPr>
+      <w:r>
+        <w:t xml:space="preserve">Guarde. El empleado queda habilitado para ingresar al sistema con las opciones de su rol.</w:t>
+      </w:r>
+    </w:p>
+    <w:tbl>
+      <w:tblPr>
+        <w:tblW w:type="pct" w:w="100%"/>
+        <w:tblBorders>
+          <w:top w:val="single" w:color="auto" w:sz="4"/>
+          <w:left w:val="single" w:color="auto" w:sz="4"/>
+          <w:bottom w:val="single" w:color="auto" w:sz="4"/>
+          <w:right w:val="single" w:color="auto" w:sz="4"/>
+          <w:insideH w:val="single" w:color="auto" w:sz="4"/>
+          <w:insideV w:val="single" w:color="auto" w:sz="4"/>
+        </w:tblBorders>
+      </w:tblPr>
+      <w:tblGrid>
+        <w:gridCol w:w="100"/>
+      </w:tblGrid>
+      <w:tr>
+        <w:tc>
+          <w:tcPr>
+            <w:tcBorders>
+              <w:top w:val="dashed" w:color="9AA5B1" w:sz="6"/>
+              <w:left w:val="dashed" w:color="9AA5B1" w:sz="6"/>
+              <w:bottom w:val="dashed" w:color="9AA5B1" w:sz="6"/>
+              <w:right w:val="dashed" w:color="9AA5B1" w:sz="6"/>
+            </w:tcBorders>
+            <w:shd w:fill="F5F7FA" w:val="clear"/>
+            <w:tcMar>
+              <w:top w:type="dxa" w:w="300"/>
+              <w:left w:type="dxa" w:w="160"/>
+              <w:bottom w:type="dxa" w:w="300"/>
+              <w:right w:type="dxa" w:w="160"/>
+            </w:tcMar>
+          </w:tcPr>
+          <w:p>
+            <w:pPr>
+              <w:spacing w:after="40"/>
+              <w:jc w:val="center"/>
+            </w:pPr>
+            <w:r>
+              <w:rPr>
+                <w:b/>
+                <w:bCs/>
+                <w:color w:val="6B7683"/>
+                <w:sz w:val="22"/>
+                <w:szCs w:val="22"/>
+              </w:rPr>
+              <w:t xml:space="preserve">[ FIGURA PENDIENTE DE CAPTURA ]</w:t>
+            </w:r>
+          </w:p>
+          <w:p>
+            <w:pPr>
+              <w:spacing w:after="0"/>
+              <w:jc w:val="center"/>
+            </w:pPr>
+            <w:r>
+              <w:rPr>
+                <w:i/>
+                <w:iCs/>
+                <w:color w:val="9AA5B1"/>
+                <w:sz w:val="20"/>
+                <w:szCs w:val="20"/>
+              </w:rPr>
+              <w:t xml:space="preserve">12_empleados_01.png</w:t>
+            </w:r>
+          </w:p>
+        </w:tc>
+      </w:tr>
+    </w:tbl>
+    <w:p>
+      <w:pPr>
+        <w:spacing w:after="200"/>
+        <w:jc w:val="center"/>
+      </w:pPr>
+      <w:r>
+        <w:rPr>
+          <w:i/>
+          <w:iCs/>
+          <w:sz w:val="20"/>
+          <w:szCs w:val="20"/>
+        </w:rPr>
+        <w:t xml:space="preserve">Figura 47. Alta y edición de un empleado.</w:t>
+      </w:r>
+    </w:p>
+    <w:p>
+      <w:pPr>
+        <w:pageBreakBefore/>
+      </w:pPr>
+      <w:r>
+        <w:t xml:space="preserve"/>
+      </w:r>
+    </w:p>
+    <w:p>
+      <w:pPr>
+        <w:pStyle w:val="Heading2"/>
+        <w:spacing w:after="120" w:before="200"/>
+      </w:pPr>
+      <w:r>
+        <w:rPr>
+          <w:b/>
+          <w:bCs/>
+        </w:rPr>
+        <w:t xml:space="preserve">12.2. Restablecer la contraseña de un empleado</w:t>
+      </w:r>
+    </w:p>
+    <w:p>
+      <w:pPr>
+        <w:spacing w:after="160" w:line="360" w:lineRule="auto"/>
+        <w:jc w:val="both"/>
+      </w:pPr>
+      <w:r>
+        <w:rPr>
+          <w:b/>
+          <w:bCs/>
+        </w:rPr>
+        <w:t xml:space="preserve">Rol: </w:t>
+      </w:r>
+      <w:r>
+        <w:t xml:space="preserve">Administrador.</w:t>
+      </w:r>
+    </w:p>
+    <w:p>
+      <w:pPr>
+        <w:spacing w:after="160" w:line="360" w:lineRule="auto"/>
+        <w:jc w:val="both"/>
+      </w:pPr>
+      <w:r>
+        <w:rPr>
+          <w:b/>
+          <w:bCs/>
+        </w:rPr>
+        <w:t xml:space="preserve">Objetivo: </w:t>
+      </w:r>
+      <w:r>
+        <w:t xml:space="preserve">generar un enlace para que un empleado defina una nueva contraseña y desbloquear su cuenta.</w:t>
+      </w:r>
+    </w:p>
+    <w:p>
+      <w:pPr>
+        <w:pStyle w:val="Heading3"/>
+        <w:spacing w:after="60" w:before="160"/>
+      </w:pPr>
+      <w:r>
+        <w:rPr>
+          <w:b/>
+          <w:bCs/>
+        </w:rPr>
+        <w:t xml:space="preserve">Pasos</w:t>
+      </w:r>
+    </w:p>
+    <w:p>
+      <w:pPr>
+        <w:pStyle w:val="ListParagraph"/>
+        <w:numPr>
+          <w:ilvl w:val="0"/>
+          <w:numId w:val="37"/>
+        </w:numPr>
+        <w:spacing w:after="60" w:line="360" w:lineRule="auto"/>
+      </w:pPr>
+      <w:r>
+        <w:t xml:space="preserve">En </w:t>
+      </w:r>
+      <w:r>
+        <w:rPr>
+          <w:b/>
+          <w:bCs/>
+        </w:rPr>
+        <w:t xml:space="preserve">Personas → Empleados</w:t>
+      </w:r>
+      <w:r>
+        <w:t xml:space="preserve">, abra el empleado en cuestión.</w:t>
+      </w:r>
+    </w:p>
+    <w:p>
+      <w:pPr>
+        <w:pStyle w:val="ListParagraph"/>
+        <w:numPr>
+          <w:ilvl w:val="0"/>
+          <w:numId w:val="37"/>
+        </w:numPr>
+        <w:spacing w:after="60" w:line="360" w:lineRule="auto"/>
+      </w:pPr>
+      <w:r>
+        <w:t xml:space="preserve">Presione </w:t>
+      </w:r>
+      <w:r>
+        <w:rPr>
+          <w:b/>
+          <w:bCs/>
+        </w:rPr>
+        <w:t xml:space="preserve">Restablecer / Reenviar credenciales</w:t>
+      </w:r>
+      <w:r>
+        <w:t xml:space="preserve">. El sistema genera un </w:t>
+      </w:r>
+      <w:r>
+        <w:rPr>
+          <w:b/>
+          <w:bCs/>
+        </w:rPr>
+        <w:t xml:space="preserve">enlace</w:t>
+      </w:r>
+      <w:r>
+        <w:t xml:space="preserve"> de restablecimiento, lo muestra en pantalla y </w:t>
+      </w:r>
+      <w:r>
+        <w:rPr>
+          <w:b/>
+          <w:bCs/>
+        </w:rPr>
+        <w:t xml:space="preserve">desbloquea</w:t>
+      </w:r>
+      <w:r>
+        <w:t xml:space="preserve"> la cuenta.</w:t>
+      </w:r>
+    </w:p>
+    <w:p>
+      <w:pPr>
+        <w:pStyle w:val="ListParagraph"/>
+        <w:numPr>
+          <w:ilvl w:val="0"/>
+          <w:numId w:val="37"/>
+        </w:numPr>
+        <w:spacing w:after="60" w:line="360" w:lineRule="auto"/>
+      </w:pPr>
+      <w:r>
+        <w:t xml:space="preserve">Entregue ese enlace al empleado. Al abrirlo, podrá definir su nueva contraseña (ver 2.2).</w:t>
+      </w:r>
+    </w:p>
+    <w:tbl>
+      <w:tblPr>
+        <w:tblW w:type="pct" w:w="100%"/>
+        <w:tblBorders>
+          <w:top w:val="single" w:color="auto" w:sz="4"/>
+          <w:left w:val="single" w:color="auto" w:sz="4"/>
+          <w:bottom w:val="single" w:color="auto" w:sz="4"/>
+          <w:right w:val="single" w:color="auto" w:sz="4"/>
+          <w:insideH w:val="single" w:color="auto" w:sz="4"/>
+          <w:insideV w:val="single" w:color="auto" w:sz="4"/>
+        </w:tblBorders>
+      </w:tblPr>
+      <w:tblGrid>
+        <w:gridCol w:w="100"/>
+      </w:tblGrid>
+      <w:tr>
+        <w:tc>
+          <w:tcPr>
+            <w:tcBorders>
+              <w:top w:val="dashed" w:color="9AA5B1" w:sz="6"/>
+              <w:left w:val="dashed" w:color="9AA5B1" w:sz="6"/>
+              <w:bottom w:val="dashed" w:color="9AA5B1" w:sz="6"/>
+              <w:right w:val="dashed" w:color="9AA5B1" w:sz="6"/>
+            </w:tcBorders>
+            <w:shd w:fill="F5F7FA" w:val="clear"/>
+            <w:tcMar>
+              <w:top w:type="dxa" w:w="300"/>
+              <w:left w:type="dxa" w:w="160"/>
+              <w:bottom w:type="dxa" w:w="300"/>
+              <w:right w:type="dxa" w:w="160"/>
+            </w:tcMar>
+          </w:tcPr>
+          <w:p>
+            <w:pPr>
+              <w:spacing w:after="40"/>
+              <w:jc w:val="center"/>
+            </w:pPr>
+            <w:r>
+              <w:rPr>
+                <w:b/>
+                <w:bCs/>
+                <w:color w:val="6B7683"/>
+                <w:sz w:val="22"/>
+                <w:szCs w:val="22"/>
+              </w:rPr>
+              <w:t xml:space="preserve">[ FIGURA PENDIENTE DE CAPTURA ]</w:t>
+            </w:r>
+          </w:p>
+          <w:p>
+            <w:pPr>
+              <w:spacing w:after="0"/>
+              <w:jc w:val="center"/>
+            </w:pPr>
+            <w:r>
+              <w:rPr>
+                <w:i/>
+                <w:iCs/>
+                <w:color w:val="9AA5B1"/>
+                <w:sz w:val="20"/>
+                <w:szCs w:val="20"/>
+              </w:rPr>
+              <w:t xml:space="preserve">12_reset_01.png</w:t>
+            </w:r>
+          </w:p>
+        </w:tc>
+      </w:tr>
+    </w:tbl>
+    <w:p>
+      <w:pPr>
+        <w:spacing w:after="200"/>
+        <w:jc w:val="center"/>
+      </w:pPr>
+      <w:r>
+        <w:rPr>
+          <w:i/>
+          <w:iCs/>
+          <w:sz w:val="20"/>
+          <w:szCs w:val="20"/>
+        </w:rPr>
+        <w:t xml:space="preserve">Figura 48. Restablecer las credenciales de un empleado.</w:t>
+      </w:r>
+    </w:p>
+    <w:tbl>
+      <w:tblPr>
+        <w:tblW w:type="pct" w:w="100%"/>
+        <w:tblBorders>
+          <w:top w:val="single" w:color="auto" w:sz="4"/>
+          <w:left w:val="single" w:color="auto" w:sz="4"/>
+          <w:bottom w:val="single" w:color="auto" w:sz="4"/>
+          <w:right w:val="single" w:color="auto" w:sz="4"/>
+          <w:insideH w:val="single" w:color="auto" w:sz="4"/>
+          <w:insideV w:val="single" w:color="auto" w:sz="4"/>
+        </w:tblBorders>
+      </w:tblPr>
+      <w:tblGrid>
+        <w:gridCol w:w="100"/>
+      </w:tblGrid>
+      <w:tr>
+        <w:tc>
+          <w:tcPr>
+            <w:tcBorders>
+              <w:top w:val="single" w:color="2E6DA4" w:sz="2"/>
+              <w:left w:val="single" w:color="2E6DA4" w:sz="24"/>
+              <w:bottom w:val="single" w:color="2E6DA4" w:sz="2"/>
+              <w:right w:val="single" w:color="2E6DA4" w:sz="2"/>
+            </w:tcBorders>
+            <w:shd w:fill="E8F1FB" w:val="clear"/>
+            <w:tcMar>
+              <w:top w:type="dxa" w:w="80"/>
+              <w:left w:type="dxa" w:w="160"/>
+              <w:bottom w:type="dxa" w:w="80"/>
+              <w:right w:type="dxa" w:w="160"/>
+            </w:tcMar>
+          </w:tcPr>
+          <w:p>
+            <w:pPr>
+              <w:spacing w:after="0" w:line="300"/>
+              <w:jc w:val="both"/>
+            </w:pPr>
+            <w:r>
+              <w:rPr>
+                <w:b/>
+                <w:bCs/>
+                <w:color w:val="2E6DA4"/>
+              </w:rPr>
+              <w:t xml:space="preserve">Nota: </w:t>
+            </w:r>
+            <w:r>
+              <w:t xml:space="preserve">El enlace también se envía por correo al empleado; entregarlo en pantalla es la vía directa para cuando el correo no llegue.</w:t>
+            </w:r>
+          </w:p>
+        </w:tc>
+      </w:tr>
+    </w:tbl>
+    <w:p>
+      <w:pPr>
+        <w:pageBreakBefore/>
+      </w:pPr>
+      <w:r>
+        <w:t xml:space="preserve"/>
+      </w:r>
+    </w:p>
+    <w:p>
+      <w:pPr>
+        <w:pStyle w:val="Heading2"/>
+        <w:spacing w:after="120" w:before="200"/>
+      </w:pPr>
+      <w:r>
+        <w:rPr>
+          <w:b/>
+          <w:bCs/>
+        </w:rPr>
+        <w:t xml:space="preserve">12.3. Gestionar roles y privilegios</w:t>
+      </w:r>
+    </w:p>
+    <w:p>
+      <w:pPr>
+        <w:spacing w:after="160" w:line="360" w:lineRule="auto"/>
+        <w:jc w:val="both"/>
+      </w:pPr>
+      <w:r>
+        <w:rPr>
+          <w:b/>
+          <w:bCs/>
+        </w:rPr>
+        <w:t xml:space="preserve">Rol: </w:t>
+      </w:r>
+      <w:r>
+        <w:t xml:space="preserve">Administrador.</w:t>
+      </w:r>
+    </w:p>
+    <w:p>
+      <w:pPr>
+        <w:spacing w:after="160" w:line="360" w:lineRule="auto"/>
+        <w:jc w:val="both"/>
+      </w:pPr>
+      <w:r>
+        <w:rPr>
+          <w:b/>
+          <w:bCs/>
+        </w:rPr>
+        <w:t xml:space="preserve">Objetivo: </w:t>
+      </w:r>
+      <w:r>
+        <w:t xml:space="preserve">definir los roles del sistema y los privilegios (accesos) que tiene cada uno.</w:t>
+      </w:r>
+    </w:p>
+    <w:p>
+      <w:pPr>
+        <w:pStyle w:val="Heading3"/>
+        <w:spacing w:after="60" w:before="160"/>
+      </w:pPr>
+      <w:r>
+        <w:rPr>
+          <w:b/>
+          <w:bCs/>
+        </w:rPr>
+        <w:t xml:space="preserve">Pasos</w:t>
+      </w:r>
+    </w:p>
+    <w:p>
+      <w:pPr>
+        <w:pStyle w:val="ListParagraph"/>
+        <w:numPr>
+          <w:ilvl w:val="0"/>
+          <w:numId w:val="38"/>
+        </w:numPr>
+        <w:spacing w:after="60" w:line="360" w:lineRule="auto"/>
+      </w:pPr>
+      <w:r>
+        <w:t xml:space="preserve">En el menú, ingrese a </w:t>
+      </w:r>
+      <w:r>
+        <w:rPr>
+          <w:b/>
+          <w:bCs/>
+        </w:rPr>
+        <w:t xml:space="preserve">Configuración → Roles</w:t>
+      </w:r>
+      <w:r>
+        <w:t xml:space="preserve"> para ver o crear los roles.</w:t>
+      </w:r>
+    </w:p>
+    <w:p>
+      <w:pPr>
+        <w:pStyle w:val="ListParagraph"/>
+        <w:numPr>
+          <w:ilvl w:val="0"/>
+          <w:numId w:val="38"/>
+        </w:numPr>
+        <w:spacing w:after="60" w:line="360" w:lineRule="auto"/>
+      </w:pPr>
+      <w:r>
+        <w:t xml:space="preserve">Ingrese a </w:t>
+      </w:r>
+      <w:r>
+        <w:rPr>
+          <w:b/>
+          <w:bCs/>
+        </w:rPr>
+        <w:t xml:space="preserve">Seguridad → Roles - Privilegios</w:t>
+      </w:r>
+      <w:r>
+        <w:t xml:space="preserve"> para asignar a cada rol los </w:t>
+      </w:r>
+      <w:r>
+        <w:rPr>
+          <w:b/>
+          <w:bCs/>
+        </w:rPr>
+        <w:t xml:space="preserve">privilegios</w:t>
+      </w:r>
+      <w:r>
+        <w:t xml:space="preserve"> que le corresponden.</w:t>
+      </w:r>
+    </w:p>
+    <w:p>
+      <w:pPr>
+        <w:pStyle w:val="ListParagraph"/>
+        <w:numPr>
+          <w:ilvl w:val="0"/>
+          <w:numId w:val="38"/>
+        </w:numPr>
+        <w:spacing w:after="60" w:line="360" w:lineRule="auto"/>
+      </w:pPr>
+      <w:r>
+        <w:t xml:space="preserve">Guarde. Los cambios determinan qué opciones del menú y qué tareas puede realizar cada rol.</w:t>
+      </w:r>
+    </w:p>
+    <w:tbl>
+      <w:tblPr>
+        <w:tblW w:type="pct" w:w="100%"/>
+        <w:tblBorders>
+          <w:top w:val="single" w:color="auto" w:sz="4"/>
+          <w:left w:val="single" w:color="auto" w:sz="4"/>
+          <w:bottom w:val="single" w:color="auto" w:sz="4"/>
+          <w:right w:val="single" w:color="auto" w:sz="4"/>
+          <w:insideH w:val="single" w:color="auto" w:sz="4"/>
+          <w:insideV w:val="single" w:color="auto" w:sz="4"/>
+        </w:tblBorders>
+      </w:tblPr>
+      <w:tblGrid>
+        <w:gridCol w:w="100"/>
+      </w:tblGrid>
+      <w:tr>
+        <w:tc>
+          <w:tcPr>
+            <w:tcBorders>
+              <w:top w:val="dashed" w:color="9AA5B1" w:sz="6"/>
+              <w:left w:val="dashed" w:color="9AA5B1" w:sz="6"/>
+              <w:bottom w:val="dashed" w:color="9AA5B1" w:sz="6"/>
+              <w:right w:val="dashed" w:color="9AA5B1" w:sz="6"/>
+            </w:tcBorders>
+            <w:shd w:fill="F5F7FA" w:val="clear"/>
+            <w:tcMar>
+              <w:top w:type="dxa" w:w="300"/>
+              <w:left w:type="dxa" w:w="160"/>
+              <w:bottom w:type="dxa" w:w="300"/>
+              <w:right w:type="dxa" w:w="160"/>
+            </w:tcMar>
+          </w:tcPr>
+          <w:p>
+            <w:pPr>
+              <w:spacing w:after="40"/>
+              <w:jc w:val="center"/>
+            </w:pPr>
+            <w:r>
+              <w:rPr>
+                <w:b/>
+                <w:bCs/>
+                <w:color w:val="6B7683"/>
+                <w:sz w:val="22"/>
+                <w:szCs w:val="22"/>
+              </w:rPr>
+              <w:t xml:space="preserve">[ FIGURA PENDIENTE DE CAPTURA ]</w:t>
+            </w:r>
+          </w:p>
+          <w:p>
+            <w:pPr>
+              <w:spacing w:after="0"/>
+              <w:jc w:val="center"/>
+            </w:pPr>
+            <w:r>
+              <w:rPr>
+                <w:i/>
+                <w:iCs/>
+                <w:color w:val="9AA5B1"/>
+                <w:sz w:val="20"/>
+                <w:szCs w:val="20"/>
+              </w:rPr>
+              <w:t xml:space="preserve">12_roles_01.png</w:t>
+            </w:r>
+          </w:p>
+        </w:tc>
+      </w:tr>
+    </w:tbl>
+    <w:p>
+      <w:pPr>
+        <w:spacing w:after="200"/>
+        <w:jc w:val="center"/>
+      </w:pPr>
+      <w:r>
+        <w:rPr>
+          <w:i/>
+          <w:iCs/>
+          <w:sz w:val="20"/>
+          <w:szCs w:val="20"/>
+        </w:rPr>
+        <w:t xml:space="preserve">Figura 49. Asignación de privilegios a los roles.</w:t>
+      </w:r>
+    </w:p>
+    <w:p>
+      <w:pPr>
+        <w:pageBreakBefore/>
+      </w:pPr>
+      <w:r>
+        <w:t xml:space="preserve"/>
+      </w:r>
+    </w:p>
+    <w:p>
+      <w:pPr>
+        <w:pStyle w:val="Heading2"/>
+        <w:spacing w:after="120" w:before="200"/>
+      </w:pPr>
+      <w:r>
+        <w:rPr>
+          <w:b/>
+          <w:bCs/>
+        </w:rPr>
+        <w:t xml:space="preserve">12.4. Configurar catálogos y parámetros</w:t>
+      </w:r>
+    </w:p>
+    <w:p>
+      <w:pPr>
+        <w:spacing w:after="160" w:line="360" w:lineRule="auto"/>
+        <w:jc w:val="both"/>
+      </w:pPr>
+      <w:r>
+        <w:rPr>
+          <w:b/>
+          <w:bCs/>
+        </w:rPr>
+        <w:t xml:space="preserve">Rol: </w:t>
+      </w:r>
+      <w:r>
+        <w:t xml:space="preserve">Administrador.</w:t>
+      </w:r>
+    </w:p>
+    <w:p>
+      <w:pPr>
+        <w:spacing w:after="160" w:line="360" w:lineRule="auto"/>
+        <w:jc w:val="both"/>
+      </w:pPr>
+      <w:r>
+        <w:rPr>
+          <w:b/>
+          <w:bCs/>
+        </w:rPr>
+        <w:t xml:space="preserve">Objetivo: </w:t>
+      </w:r>
+      <w:r>
+        <w:t xml:space="preserve">mantener los catálogos base que utiliza el sistema.</w:t>
+      </w:r>
+    </w:p>
+    <w:p>
+      <w:pPr>
+        <w:pStyle w:val="Heading3"/>
+        <w:spacing w:after="60" w:before="160"/>
+      </w:pPr>
+      <w:r>
+        <w:rPr>
+          <w:b/>
+          <w:bCs/>
+        </w:rPr>
+        <w:t xml:space="preserve">Pasos</w:t>
+      </w:r>
+    </w:p>
+    <w:p>
+      <w:pPr>
+        <w:pStyle w:val="ListParagraph"/>
+        <w:numPr>
+          <w:ilvl w:val="0"/>
+          <w:numId w:val="39"/>
+        </w:numPr>
+        <w:spacing w:after="60" w:line="360" w:lineRule="auto"/>
+      </w:pPr>
+      <w:r>
+        <w:t xml:space="preserve">En el menú, ingrese a </w:t>
+      </w:r>
+      <w:r>
+        <w:rPr>
+          <w:b/>
+          <w:bCs/>
+        </w:rPr>
+        <w:t xml:space="preserve">Configuración</w:t>
+      </w:r>
+      <w:r>
+        <w:t xml:space="preserve"> y elija el catálogo a mantener: </w:t>
+      </w:r>
+      <w:r>
+        <w:rPr>
+          <w:b/>
+          <w:bCs/>
+        </w:rPr>
+        <w:t xml:space="preserve">Monedas</w:t>
+      </w:r>
+      <w:r>
+        <w:t xml:space="preserve">, </w:t>
+      </w:r>
+      <w:r>
+        <w:rPr>
+          <w:b/>
+          <w:bCs/>
+        </w:rPr>
+        <w:t xml:space="preserve">Planes de Cuota</w:t>
+      </w:r>
+      <w:r>
+        <w:t xml:space="preserve">, </w:t>
+      </w:r>
+      <w:r>
+        <w:rPr>
+          <w:b/>
+          <w:bCs/>
+        </w:rPr>
+        <w:t xml:space="preserve">Formas de Pago</w:t>
+      </w:r>
+      <w:r>
+        <w:t xml:space="preserve">, </w:t>
+      </w:r>
+      <w:r>
+        <w:rPr>
+          <w:b/>
+          <w:bCs/>
+        </w:rPr>
+        <w:t xml:space="preserve">Métodos de Pago</w:t>
+      </w:r>
+      <w:r>
+        <w:t xml:space="preserve"> o </w:t>
+      </w:r>
+      <w:r>
+        <w:rPr>
+          <w:b/>
+          <w:bCs/>
+        </w:rPr>
+        <w:t xml:space="preserve">Talonarios</w:t>
+      </w:r>
+      <w:r>
+        <w:t xml:space="preserve"> (ver 10.2).</w:t>
+      </w:r>
+    </w:p>
+    <w:p>
+      <w:pPr>
+        <w:pStyle w:val="ListParagraph"/>
+        <w:numPr>
+          <w:ilvl w:val="0"/>
+          <w:numId w:val="39"/>
+        </w:numPr>
+        <w:spacing w:after="60" w:line="360" w:lineRule="auto"/>
+      </w:pPr>
+      <w:r>
+        <w:t xml:space="preserve">Cree o edite los registros según sea necesario y guarde.</w:t>
+      </w:r>
+    </w:p>
+    <w:tbl>
+      <w:tblPr>
+        <w:tblW w:type="pct" w:w="100%"/>
+        <w:tblBorders>
+          <w:top w:val="single" w:color="auto" w:sz="4"/>
+          <w:left w:val="single" w:color="auto" w:sz="4"/>
+          <w:bottom w:val="single" w:color="auto" w:sz="4"/>
+          <w:right w:val="single" w:color="auto" w:sz="4"/>
+          <w:insideH w:val="single" w:color="auto" w:sz="4"/>
+          <w:insideV w:val="single" w:color="auto" w:sz="4"/>
+        </w:tblBorders>
+      </w:tblPr>
+      <w:tblGrid>
+        <w:gridCol w:w="100"/>
+      </w:tblGrid>
+      <w:tr>
+        <w:tc>
+          <w:tcPr>
+            <w:tcBorders>
+              <w:top w:val="dashed" w:color="9AA5B1" w:sz="6"/>
+              <w:left w:val="dashed" w:color="9AA5B1" w:sz="6"/>
+              <w:bottom w:val="dashed" w:color="9AA5B1" w:sz="6"/>
+              <w:right w:val="dashed" w:color="9AA5B1" w:sz="6"/>
+            </w:tcBorders>
+            <w:shd w:fill="F5F7FA" w:val="clear"/>
+            <w:tcMar>
+              <w:top w:type="dxa" w:w="300"/>
+              <w:left w:type="dxa" w:w="160"/>
+              <w:bottom w:type="dxa" w:w="300"/>
+              <w:right w:type="dxa" w:w="160"/>
+            </w:tcMar>
+          </w:tcPr>
+          <w:p>
+            <w:pPr>
+              <w:spacing w:after="40"/>
+              <w:jc w:val="center"/>
+            </w:pPr>
+            <w:r>
+              <w:rPr>
+                <w:b/>
+                <w:bCs/>
+                <w:color w:val="6B7683"/>
+                <w:sz w:val="22"/>
+                <w:szCs w:val="22"/>
+              </w:rPr>
+              <w:t xml:space="preserve">[ FIGURA PENDIENTE DE CAPTURA ]</w:t>
+            </w:r>
+          </w:p>
+          <w:p>
+            <w:pPr>
+              <w:spacing w:after="0"/>
+              <w:jc w:val="center"/>
+            </w:pPr>
+            <w:r>
+              <w:rPr>
+                <w:i/>
+                <w:iCs/>
+                <w:color w:val="9AA5B1"/>
+                <w:sz w:val="20"/>
+                <w:szCs w:val="20"/>
+              </w:rPr>
+              <w:t xml:space="preserve">12_config_01.png</w:t>
+            </w:r>
+          </w:p>
+        </w:tc>
+      </w:tr>
+    </w:tbl>
+    <w:p>
+      <w:pPr>
+        <w:spacing w:after="200"/>
+        <w:jc w:val="center"/>
+      </w:pPr>
+      <w:r>
+        <w:rPr>
+          <w:i/>
+          <w:iCs/>
+          <w:sz w:val="20"/>
+          <w:szCs w:val="20"/>
+        </w:rPr>
+        <w:t xml:space="preserve">Figura 50. Configuración de catálogos del sistema.</w:t>
+      </w:r>
+    </w:p>
+    <w:tbl>
+      <w:tblPr>
+        <w:tblW w:type="pct" w:w="100%"/>
+        <w:tblBorders>
+          <w:top w:val="single" w:color="auto" w:sz="4"/>
+          <w:left w:val="single" w:color="auto" w:sz="4"/>
+          <w:bottom w:val="single" w:color="auto" w:sz="4"/>
+          <w:right w:val="single" w:color="auto" w:sz="4"/>
+          <w:insideH w:val="single" w:color="auto" w:sz="4"/>
+          <w:insideV w:val="single" w:color="auto" w:sz="4"/>
+        </w:tblBorders>
+      </w:tblPr>
+      <w:tblGrid>
+        <w:gridCol w:w="100"/>
+      </w:tblGrid>
+      <w:tr>
+        <w:tc>
+          <w:tcPr>
+            <w:tcBorders>
+              <w:top w:val="single" w:color="2E6DA4" w:sz="2"/>
+              <w:left w:val="single" w:color="2E6DA4" w:sz="24"/>
+              <w:bottom w:val="single" w:color="2E6DA4" w:sz="2"/>
+              <w:right w:val="single" w:color="2E6DA4" w:sz="2"/>
+            </w:tcBorders>
+            <w:shd w:fill="E8F1FB" w:val="clear"/>
+            <w:tcMar>
+              <w:top w:type="dxa" w:w="80"/>
+              <w:left w:type="dxa" w:w="160"/>
+              <w:bottom w:type="dxa" w:w="80"/>
+              <w:right w:type="dxa" w:w="160"/>
+            </w:tcMar>
+          </w:tcPr>
+          <w:p>
+            <w:pPr>
+              <w:spacing w:after="0" w:line="300"/>
+              <w:jc w:val="both"/>
+            </w:pPr>
+            <w:r>
+              <w:rPr>
+                <w:b/>
+                <w:bCs/>
+                <w:color w:val="2E6DA4"/>
+              </w:rPr>
+              <w:t xml:space="preserve">Nota: </w:t>
+            </w:r>
+            <w:r>
+              <w:t xml:space="preserve">Estos catálogos son la base de la operación: por ejemplo, las </w:t>
+            </w:r>
+            <w:r>
+              <w:rPr>
+                <w:b/>
+                <w:bCs/>
+              </w:rPr>
+              <w:t xml:space="preserve">formas</w:t>
+            </w:r>
+            <w:r>
+              <w:t xml:space="preserve"> y </w:t>
+            </w:r>
+            <w:r>
+              <w:rPr>
+                <w:b/>
+                <w:bCs/>
+              </w:rPr>
+              <w:t xml:space="preserve">métodos de pago</w:t>
+            </w:r>
+            <w:r>
+              <w:t xml:space="preserve"> aparecen al facturar y cobrar, y los </w:t>
+            </w:r>
+            <w:r>
+              <w:rPr>
+                <w:b/>
+                <w:bCs/>
+              </w:rPr>
+              <w:t xml:space="preserve">planes de cuota</w:t>
+            </w:r>
+            <w:r>
+              <w:t xml:space="preserve">, al vender a crédito.</w:t>
+            </w:r>
+          </w:p>
+        </w:tc>
+      </w:tr>
+    </w:tbl>
+    <w:p>
+      <w:pPr>
+        <w:pageBreakBefore/>
+      </w:pPr>
+      <w:r>
+        <w:t xml:space="preserve"/>
+      </w:r>
+    </w:p>
+    <w:p>
+      <w:pPr>
+        <w:pStyle w:val="Heading2"/>
+        <w:spacing w:after="120" w:before="200"/>
+      </w:pPr>
+      <w:r>
+        <w:rPr>
+          <w:b/>
+          <w:bCs/>
+        </w:rPr>
+        <w:t xml:space="preserve">12.5. Configurar cajas y oficinas</w:t>
+      </w:r>
+    </w:p>
+    <w:p>
+      <w:pPr>
+        <w:spacing w:after="160" w:line="360" w:lineRule="auto"/>
+        <w:jc w:val="both"/>
+      </w:pPr>
+      <w:r>
+        <w:rPr>
+          <w:b/>
+          <w:bCs/>
+        </w:rPr>
+        <w:t xml:space="preserve">Rol: </w:t>
+      </w:r>
+      <w:r>
+        <w:t xml:space="preserve">Administrador.</w:t>
+      </w:r>
+    </w:p>
+    <w:p>
+      <w:pPr>
+        <w:spacing w:after="160" w:line="360" w:lineRule="auto"/>
+        <w:jc w:val="both"/>
+      </w:pPr>
+      <w:r>
+        <w:rPr>
+          <w:b/>
+          <w:bCs/>
+        </w:rPr>
+        <w:t xml:space="preserve">Objetivo: </w:t>
+      </w:r>
+      <w:r>
+        <w:t xml:space="preserve">dar de alta y configurar las oficinas (sucursales) y sus cajas.</w:t>
+      </w:r>
+    </w:p>
+    <w:p>
+      <w:pPr>
+        <w:pStyle w:val="Heading3"/>
+        <w:spacing w:after="60" w:before="160"/>
+      </w:pPr>
+      <w:r>
+        <w:rPr>
+          <w:b/>
+          <w:bCs/>
+        </w:rPr>
+        <w:t xml:space="preserve">Pasos</w:t>
+      </w:r>
+    </w:p>
+    <w:p>
+      <w:pPr>
+        <w:pStyle w:val="ListParagraph"/>
+        <w:numPr>
+          <w:ilvl w:val="0"/>
+          <w:numId w:val="40"/>
+        </w:numPr>
+        <w:spacing w:after="60" w:line="360" w:lineRule="auto"/>
+      </w:pPr>
+      <w:r>
+        <w:t xml:space="preserve">Para las oficinas, ingrese a </w:t>
+      </w:r>
+      <w:r>
+        <w:rPr>
+          <w:b/>
+          <w:bCs/>
+        </w:rPr>
+        <w:t xml:space="preserve">Personas → Oficinas</w:t>
+      </w:r>
+      <w:r>
+        <w:t xml:space="preserve"> y registre o edite cada sucursal.</w:t>
+      </w:r>
+    </w:p>
+    <w:p>
+      <w:pPr>
+        <w:pStyle w:val="ListParagraph"/>
+        <w:numPr>
+          <w:ilvl w:val="0"/>
+          <w:numId w:val="40"/>
+        </w:numPr>
+        <w:spacing w:after="60" w:line="360" w:lineRule="auto"/>
+      </w:pPr>
+      <w:r>
+        <w:t xml:space="preserve">Para las cajas, ingrese a </w:t>
+      </w:r>
+      <w:r>
+        <w:rPr>
+          <w:b/>
+          <w:bCs/>
+        </w:rPr>
+        <w:t xml:space="preserve">Configuración de Cajas</w:t>
+      </w:r>
+      <w:r>
+        <w:t xml:space="preserve"> y configure cada caja: la </w:t>
+      </w:r>
+      <w:r>
+        <w:rPr>
+          <w:b/>
+          <w:bCs/>
+        </w:rPr>
+        <w:t xml:space="preserve">oficina</w:t>
+      </w:r>
+      <w:r>
+        <w:t xml:space="preserve"> a la que pertenece y su </w:t>
+      </w:r>
+      <w:r>
+        <w:rPr>
+          <w:b/>
+          <w:bCs/>
+        </w:rPr>
+        <w:t xml:space="preserve">punto de expedición</w:t>
+      </w:r>
+      <w:r>
+        <w:t xml:space="preserve">.</w:t>
+      </w:r>
+    </w:p>
+    <w:p>
+      <w:pPr>
+        <w:pStyle w:val="ListParagraph"/>
+        <w:numPr>
+          <w:ilvl w:val="0"/>
+          <w:numId w:val="40"/>
+        </w:numPr>
+        <w:spacing w:after="60" w:line="360" w:lineRule="auto"/>
+      </w:pPr>
+      <w:r>
+        <w:t xml:space="preserve">Guarde. Las cajas quedan disponibles para que los cajeros las abran y operen (ver 5.1).</w:t>
+      </w:r>
+    </w:p>
+    <w:tbl>
+      <w:tblPr>
+        <w:tblW w:type="pct" w:w="100%"/>
+        <w:tblBorders>
+          <w:top w:val="single" w:color="auto" w:sz="4"/>
+          <w:left w:val="single" w:color="auto" w:sz="4"/>
+          <w:bottom w:val="single" w:color="auto" w:sz="4"/>
+          <w:right w:val="single" w:color="auto" w:sz="4"/>
+          <w:insideH w:val="single" w:color="auto" w:sz="4"/>
+          <w:insideV w:val="single" w:color="auto" w:sz="4"/>
+        </w:tblBorders>
+      </w:tblPr>
+      <w:tblGrid>
+        <w:gridCol w:w="100"/>
+      </w:tblGrid>
+      <w:tr>
+        <w:tc>
+          <w:tcPr>
+            <w:tcBorders>
+              <w:top w:val="dashed" w:color="9AA5B1" w:sz="6"/>
+              <w:left w:val="dashed" w:color="9AA5B1" w:sz="6"/>
+              <w:bottom w:val="dashed" w:color="9AA5B1" w:sz="6"/>
+              <w:right w:val="dashed" w:color="9AA5B1" w:sz="6"/>
+            </w:tcBorders>
+            <w:shd w:fill="F5F7FA" w:val="clear"/>
+            <w:tcMar>
+              <w:top w:type="dxa" w:w="300"/>
+              <w:left w:type="dxa" w:w="160"/>
+              <w:bottom w:type="dxa" w:w="300"/>
+              <w:right w:type="dxa" w:w="160"/>
+            </w:tcMar>
+          </w:tcPr>
+          <w:p>
+            <w:pPr>
+              <w:spacing w:after="40"/>
+              <w:jc w:val="center"/>
+            </w:pPr>
+            <w:r>
+              <w:rPr>
+                <w:b/>
+                <w:bCs/>
+                <w:color w:val="6B7683"/>
+                <w:sz w:val="22"/>
+                <w:szCs w:val="22"/>
+              </w:rPr>
+              <w:t xml:space="preserve">[ FIGURA PENDIENTE DE CAPTURA ]</w:t>
+            </w:r>
+          </w:p>
+          <w:p>
+            <w:pPr>
+              <w:spacing w:after="0"/>
+              <w:jc w:val="center"/>
+            </w:pPr>
+            <w:r>
+              <w:rPr>
+                <w:i/>
+                <w:iCs/>
+                <w:color w:val="9AA5B1"/>
+                <w:sz w:val="20"/>
+                <w:szCs w:val="20"/>
+              </w:rPr>
+              <w:t xml:space="preserve">12_cajas_01.png</w:t>
+            </w:r>
+          </w:p>
+        </w:tc>
+      </w:tr>
+    </w:tbl>
+    <w:p>
+      <w:pPr>
+        <w:spacing w:after="200"/>
+        <w:jc w:val="center"/>
+      </w:pPr>
+      <w:r>
+        <w:rPr>
+          <w:i/>
+          <w:iCs/>
+          <w:sz w:val="20"/>
+          <w:szCs w:val="20"/>
+        </w:rPr>
+        <w:t xml:space="preserve">Figura 51. Configuración de cajas y oficinas.</w:t>
       </w:r>
     </w:p>
     <w:sectPr>
@@ -12638,6 +15894,66 @@
     </w:lvlOverride>
   </w:num>
   <w:num w:numId="30">
+    <w:abstractNumId w:val="3"/>
+    <w:lvlOverride w:ilvl="0">
+      <w:startOverride w:val="1"/>
+    </w:lvlOverride>
+  </w:num>
+  <w:num w:numId="31">
+    <w:abstractNumId w:val="3"/>
+    <w:lvlOverride w:ilvl="0">
+      <w:startOverride w:val="1"/>
+    </w:lvlOverride>
+  </w:num>
+  <w:num w:numId="32">
+    <w:abstractNumId w:val="3"/>
+    <w:lvlOverride w:ilvl="0">
+      <w:startOverride w:val="1"/>
+    </w:lvlOverride>
+  </w:num>
+  <w:num w:numId="33">
+    <w:abstractNumId w:val="3"/>
+    <w:lvlOverride w:ilvl="0">
+      <w:startOverride w:val="1"/>
+    </w:lvlOverride>
+  </w:num>
+  <w:num w:numId="34">
+    <w:abstractNumId w:val="3"/>
+    <w:lvlOverride w:ilvl="0">
+      <w:startOverride w:val="1"/>
+    </w:lvlOverride>
+  </w:num>
+  <w:num w:numId="35">
+    <w:abstractNumId w:val="3"/>
+    <w:lvlOverride w:ilvl="0">
+      <w:startOverride w:val="1"/>
+    </w:lvlOverride>
+  </w:num>
+  <w:num w:numId="36">
+    <w:abstractNumId w:val="3"/>
+    <w:lvlOverride w:ilvl="0">
+      <w:startOverride w:val="1"/>
+    </w:lvlOverride>
+  </w:num>
+  <w:num w:numId="37">
+    <w:abstractNumId w:val="3"/>
+    <w:lvlOverride w:ilvl="0">
+      <w:startOverride w:val="1"/>
+    </w:lvlOverride>
+  </w:num>
+  <w:num w:numId="38">
+    <w:abstractNumId w:val="3"/>
+    <w:lvlOverride w:ilvl="0">
+      <w:startOverride w:val="1"/>
+    </w:lvlOverride>
+  </w:num>
+  <w:num w:numId="39">
+    <w:abstractNumId w:val="3"/>
+    <w:lvlOverride w:ilvl="0">
+      <w:startOverride w:val="1"/>
+    </w:lvlOverride>
+  </w:num>
+  <w:num w:numId="40">
     <w:abstractNumId w:val="3"/>
     <w:lvlOverride w:ilvl="0">
       <w:startOverride w:val="1"/>

</xml_diff>